<commit_message>
Update some changes related to generating report and not adding unnecessary data
</commit_message>
<xml_diff>
--- a/template.docx
+++ b/template.docx
@@ -162,7 +162,7 @@
                 <w:szCs w:val="22"/>
                 <w:lang w:val="en-BE"/>
               </w:rPr>
-              <w:t>customer_name</w:t>
+              <w:t>customer_name|default</w:t>
             </w:r>
             <w:proofErr w:type="spellEnd"/>
             <w:r>
@@ -172,17 +172,18 @@
                 <w:szCs w:val="22"/>
                 <w:lang w:val="en-BE"/>
               </w:rPr>
-              <w:t>}}</w:t>
-            </w:r>
-          </w:p>
-          <w:p>
-            <w:pPr>
-              <w:spacing w:line="240" w:lineRule="auto"/>
-              <w:jc w:val="center"/>
-              <w:rPr>
-                <w:rFonts w:ascii="Times New Roman" w:eastAsiaTheme="minorEastAsia" w:hAnsi="Times New Roman" w:cs="Times New Roman"/>
-                <w:sz w:val="22"/>
-                <w:szCs w:val="22"/>
+              <w:t>('N/A')}}</w:t>
+            </w:r>
+          </w:p>
+          <w:p>
+            <w:pPr>
+              <w:spacing w:line="240" w:lineRule="auto"/>
+              <w:jc w:val="center"/>
+              <w:rPr>
+                <w:rFonts w:ascii="Times New Roman" w:eastAsiaTheme="minorEastAsia" w:hAnsi="Times New Roman" w:cs="Times New Roman"/>
+                <w:sz w:val="22"/>
+                <w:szCs w:val="22"/>
+                <w:lang w:val="en-BE"/>
               </w:rPr>
             </w:pPr>
           </w:p>
@@ -259,6 +260,15 @@
               <w:t>project_name</w:t>
             </w:r>
             <w:proofErr w:type="spellEnd"/>
+            <w:r>
+              <w:rPr>
+                <w:rFonts w:ascii="Times New Roman" w:eastAsiaTheme="minorEastAsia" w:hAnsi="Times New Roman"/>
+                <w:sz w:val="22"/>
+                <w:szCs w:val="22"/>
+                <w:lang w:val="en-BE"/>
+              </w:rPr>
+              <w:t>|default('N/A')</w:t>
+            </w:r>
             <w:r>
               <w:rPr>
                 <w:rFonts w:ascii="Times New Roman" w:eastAsiaTheme="minorEastAsia" w:hAnsi="Times New Roman" w:cs="Times New Roman"/>
@@ -334,7 +344,7 @@
               <w:spacing w:line="240" w:lineRule="auto"/>
               <w:jc w:val="center"/>
               <w:rPr>
-                <w:rFonts w:ascii="Times New Roman" w:eastAsiaTheme="minorEastAsia" w:hAnsi="Times New Roman" w:cs="Times New Roman"/>
+                <w:rFonts w:ascii="Times New Roman" w:eastAsiaTheme="minorEastAsia" w:hAnsi="Times New Roman"/>
                 <w:sz w:val="22"/>
                 <w:szCs w:val="22"/>
                 <w:lang w:val="en-BE"/>
@@ -360,6 +370,39 @@
               <w:t>project_location</w:t>
             </w:r>
             <w:proofErr w:type="spellEnd"/>
+            <w:r>
+              <w:rPr>
+                <w:rFonts w:ascii="Times New Roman" w:eastAsiaTheme="minorEastAsia" w:hAnsi="Times New Roman"/>
+                <w:sz w:val="22"/>
+                <w:szCs w:val="22"/>
+                <w:lang w:val="en-BE"/>
+              </w:rPr>
+              <w:t>|default('N/A')</w:t>
+            </w:r>
+          </w:p>
+          <w:p>
+            <w:pPr>
+              <w:spacing w:line="240" w:lineRule="auto"/>
+              <w:jc w:val="center"/>
+              <w:rPr>
+                <w:rFonts w:ascii="Times New Roman" w:eastAsiaTheme="minorEastAsia" w:hAnsi="Times New Roman"/>
+                <w:sz w:val="22"/>
+                <w:szCs w:val="22"/>
+                <w:lang w:val="en-BE"/>
+              </w:rPr>
+            </w:pPr>
+          </w:p>
+          <w:p>
+            <w:pPr>
+              <w:spacing w:line="240" w:lineRule="auto"/>
+              <w:jc w:val="center"/>
+              <w:rPr>
+                <w:rFonts w:ascii="Times New Roman" w:eastAsiaTheme="minorEastAsia" w:hAnsi="Times New Roman" w:cs="Times New Roman"/>
+                <w:sz w:val="22"/>
+                <w:szCs w:val="22"/>
+                <w:lang w:val="en-BE"/>
+              </w:rPr>
+            </w:pPr>
             <w:r>
               <w:rPr>
                 <w:rFonts w:ascii="Times New Roman" w:eastAsiaTheme="minorEastAsia" w:hAnsi="Times New Roman" w:cs="Times New Roman"/>
@@ -527,7 +570,7 @@
               <w:spacing w:line="240" w:lineRule="auto"/>
               <w:jc w:val="center"/>
               <w:rPr>
-                <w:rFonts w:ascii="Times New Roman" w:eastAsiaTheme="minorEastAsia" w:hAnsi="Times New Roman" w:cs="Times New Roman"/>
+                <w:rFonts w:ascii="Times New Roman" w:eastAsiaTheme="minorEastAsia" w:hAnsi="Times New Roman"/>
                 <w:sz w:val="22"/>
                 <w:szCs w:val="22"/>
                 <w:lang w:val="en-BE"/>
@@ -553,6 +596,27 @@
               <w:t>customer_email</w:t>
             </w:r>
             <w:proofErr w:type="spellEnd"/>
+            <w:r>
+              <w:rPr>
+                <w:rFonts w:ascii="Times New Roman" w:eastAsiaTheme="minorEastAsia" w:hAnsi="Times New Roman"/>
+                <w:sz w:val="22"/>
+                <w:szCs w:val="22"/>
+                <w:lang w:val="en-BE"/>
+              </w:rPr>
+              <w:t>|default('N/A')</w:t>
+            </w:r>
+          </w:p>
+          <w:p>
+            <w:pPr>
+              <w:spacing w:line="240" w:lineRule="auto"/>
+              <w:jc w:val="center"/>
+              <w:rPr>
+                <w:rFonts w:ascii="Times New Roman" w:eastAsiaTheme="minorEastAsia" w:hAnsi="Times New Roman"/>
+                <w:sz w:val="22"/>
+                <w:szCs w:val="22"/>
+                <w:lang w:val="en-BE"/>
+              </w:rPr>
+            </w:pPr>
             <w:r>
               <w:rPr>
                 <w:rFonts w:ascii="Times New Roman" w:eastAsiaTheme="minorEastAsia" w:hAnsi="Times New Roman" w:cs="Times New Roman"/>
@@ -637,7 +701,7 @@
               <w:spacing w:line="240" w:lineRule="auto"/>
               <w:jc w:val="center"/>
               <w:rPr>
-                <w:rFonts w:ascii="Times New Roman" w:eastAsiaTheme="minorEastAsia" w:hAnsi="Times New Roman" w:cs="Times New Roman"/>
+                <w:rFonts w:ascii="Times New Roman" w:eastAsiaTheme="minorEastAsia" w:hAnsi="Times New Roman"/>
                 <w:sz w:val="22"/>
                 <w:szCs w:val="22"/>
                 <w:lang w:val="en-BE"/>
@@ -663,6 +727,39 @@
               <w:t>customer_mobile</w:t>
             </w:r>
             <w:proofErr w:type="spellEnd"/>
+            <w:r>
+              <w:rPr>
+                <w:rFonts w:ascii="Times New Roman" w:eastAsiaTheme="minorEastAsia" w:hAnsi="Times New Roman"/>
+                <w:sz w:val="22"/>
+                <w:szCs w:val="22"/>
+                <w:lang w:val="en-BE"/>
+              </w:rPr>
+              <w:t>|default('N/A')</w:t>
+            </w:r>
+          </w:p>
+          <w:p>
+            <w:pPr>
+              <w:spacing w:line="240" w:lineRule="auto"/>
+              <w:jc w:val="center"/>
+              <w:rPr>
+                <w:rFonts w:ascii="Times New Roman" w:eastAsiaTheme="minorEastAsia" w:hAnsi="Times New Roman"/>
+                <w:sz w:val="22"/>
+                <w:szCs w:val="22"/>
+                <w:lang w:val="en-BE"/>
+              </w:rPr>
+            </w:pPr>
+          </w:p>
+          <w:p>
+            <w:pPr>
+              <w:spacing w:line="240" w:lineRule="auto"/>
+              <w:jc w:val="center"/>
+              <w:rPr>
+                <w:rFonts w:ascii="Times New Roman" w:eastAsiaTheme="minorEastAsia" w:hAnsi="Times New Roman" w:cs="Times New Roman"/>
+                <w:sz w:val="22"/>
+                <w:szCs w:val="22"/>
+                <w:lang w:val="en-BE"/>
+              </w:rPr>
+            </w:pPr>
             <w:r>
               <w:rPr>
                 <w:rFonts w:ascii="Times New Roman" w:eastAsiaTheme="minorEastAsia" w:hAnsi="Times New Roman" w:cs="Times New Roman"/>
@@ -898,30 +995,46 @@
           <w:p>
             <w:pPr>
               <w:spacing w:line="240" w:lineRule="auto"/>
-              <w:jc w:val="left"/>
-              <w:rPr>
-                <w:rFonts w:ascii="Times New Roman" w:eastAsiaTheme="minorEastAsia" w:hAnsi="Times New Roman" w:cs="Times New Roman"/>
-                <w:sz w:val="22"/>
-                <w:szCs w:val="22"/>
-                <w:lang w:val="en-BE"/>
-              </w:rPr>
-            </w:pPr>
-            <w:r>
-              <w:rPr>
-                <w:rFonts w:ascii="Times New Roman" w:eastAsiaTheme="minorEastAsia" w:hAnsi="Times New Roman" w:cs="Times New Roman"/>
-                <w:sz w:val="22"/>
-                <w:szCs w:val="22"/>
-                <w:lang w:val="en-BE"/>
-              </w:rPr>
-              <w:t>{{application}}</w:t>
-            </w:r>
-          </w:p>
-          <w:p>
-            <w:pPr>
-              <w:spacing w:line="240" w:lineRule="auto"/>
-              <w:jc w:val="left"/>
-              <w:rPr>
-                <w:rFonts w:ascii="Times New Roman" w:eastAsiaTheme="minorEastAsia" w:hAnsi="Times New Roman" w:cs="Times New Roman"/>
+              <w:rPr>
+                <w:rFonts w:ascii="Times New Roman" w:eastAsiaTheme="minorEastAsia" w:hAnsi="Times New Roman"/>
+                <w:sz w:val="22"/>
+                <w:szCs w:val="22"/>
+                <w:lang w:val="en-BE"/>
+              </w:rPr>
+            </w:pPr>
+            <w:r>
+              <w:rPr>
+                <w:rFonts w:ascii="Times New Roman" w:eastAsiaTheme="minorEastAsia" w:hAnsi="Times New Roman" w:cs="Times New Roman"/>
+                <w:sz w:val="22"/>
+                <w:szCs w:val="22"/>
+                <w:lang w:val="en-BE"/>
+              </w:rPr>
+              <w:t>{{application</w:t>
+            </w:r>
+            <w:r>
+              <w:rPr>
+                <w:rFonts w:ascii="Times New Roman" w:eastAsiaTheme="minorEastAsia" w:hAnsi="Times New Roman"/>
+                <w:sz w:val="22"/>
+                <w:szCs w:val="22"/>
+                <w:lang w:val="en-BE"/>
+              </w:rPr>
+              <w:t>|default('N/A')</w:t>
+            </w:r>
+            <w:r>
+              <w:rPr>
+                <w:rFonts w:ascii="Times New Roman" w:eastAsiaTheme="minorEastAsia" w:hAnsi="Times New Roman" w:cs="Times New Roman"/>
+                <w:sz w:val="22"/>
+                <w:szCs w:val="22"/>
+                <w:lang w:val="en-BE"/>
+              </w:rPr>
+              <w:t>}}</w:t>
+            </w:r>
+          </w:p>
+          <w:p>
+            <w:pPr>
+              <w:spacing w:line="240" w:lineRule="auto"/>
+              <w:rPr>
+                <w:rFonts w:ascii="Times New Roman" w:eastAsiaTheme="minorEastAsia" w:hAnsi="Times New Roman"/>
                 <w:sz w:val="22"/>
                 <w:szCs w:val="22"/>
                 <w:lang w:val="en-BE"/>
@@ -936,8 +1049,9 @@
                 <w:szCs w:val="22"/>
                 <w:lang w:val="en-BE"/>
               </w:rPr>
-              <w:t>Short Description of the Task / Overall Operation</w:t>
-            </w:r>
+              <w:t xml:space="preserve">Short Description of the Task / Overall </w:t>
+            </w:r>
+            <w:proofErr w:type="gramStart"/>
             <w:r>
               <w:rPr>
                 <w:rFonts w:ascii="Times New Roman" w:eastAsiaTheme="minorEastAsia" w:hAnsi="Times New Roman" w:cs="Times New Roman"/>
@@ -947,7 +1061,7 @@
                 <w:szCs w:val="22"/>
                 <w:lang w:val="en-BE"/>
               </w:rPr>
-              <w:t xml:space="preserve"> :</w:t>
+              <w:t>Operation</w:t>
             </w:r>
             <w:r>
               <w:rPr>
@@ -958,6 +1072,18 @@
                 <w:szCs w:val="22"/>
                 <w:lang w:val="en-BE"/>
               </w:rPr>
+              <w:t xml:space="preserve"> :</w:t>
+            </w:r>
+            <w:proofErr w:type="gramEnd"/>
+            <w:r>
+              <w:rPr>
+                <w:rFonts w:ascii="Times New Roman" w:eastAsiaTheme="minorEastAsia" w:hAnsi="Times New Roman" w:cs="Times New Roman"/>
+                <w:b/>
+                <w:bCs/>
+                <w:sz w:val="22"/>
+                <w:szCs w:val="22"/>
+                <w:lang w:val="en-BE"/>
+              </w:rPr>
               <w:br/>
             </w:r>
             <w:r>
@@ -980,6 +1106,15 @@
               <w:t>task_description</w:t>
             </w:r>
             <w:proofErr w:type="spellEnd"/>
+            <w:r>
+              <w:rPr>
+                <w:rFonts w:ascii="Times New Roman" w:eastAsiaTheme="minorEastAsia" w:hAnsi="Times New Roman"/>
+                <w:sz w:val="22"/>
+                <w:szCs w:val="22"/>
+                <w:lang w:val="en-BE"/>
+              </w:rPr>
+              <w:t>|default('N/A')</w:t>
+            </w:r>
             <w:r>
               <w:rPr>
                 <w:rFonts w:ascii="Times New Roman" w:eastAsiaTheme="minorEastAsia" w:hAnsi="Times New Roman" w:cs="Times New Roman"/>
@@ -1171,9 +1306,8 @@
           <w:p>
             <w:pPr>
               <w:spacing w:line="240" w:lineRule="auto"/>
-              <w:jc w:val="left"/>
-              <w:rPr>
-                <w:rFonts w:ascii="Times New Roman" w:eastAsiaTheme="minorEastAsia" w:hAnsi="Times New Roman" w:cs="Times New Roman"/>
+              <w:rPr>
+                <w:rFonts w:ascii="Times New Roman" w:eastAsiaTheme="minorEastAsia" w:hAnsi="Times New Roman"/>
                 <w:sz w:val="22"/>
                 <w:szCs w:val="22"/>
                 <w:lang w:val="en-BE"/>
@@ -1199,6 +1333,15 @@
               <w:t>warehouse_area</w:t>
             </w:r>
             <w:proofErr w:type="spellEnd"/>
+            <w:r>
+              <w:rPr>
+                <w:rFonts w:ascii="Times New Roman" w:eastAsiaTheme="minorEastAsia" w:hAnsi="Times New Roman"/>
+                <w:sz w:val="22"/>
+                <w:szCs w:val="22"/>
+                <w:lang w:val="en-BE"/>
+              </w:rPr>
+              <w:t>|default('N/A')</w:t>
+            </w:r>
             <w:r>
               <w:rPr>
                 <w:rFonts w:ascii="Times New Roman" w:eastAsiaTheme="minorEastAsia" w:hAnsi="Times New Roman" w:cs="Times New Roman"/>
@@ -1349,31 +1492,50 @@
           <w:p>
             <w:pPr>
               <w:spacing w:line="240" w:lineRule="auto"/>
-              <w:jc w:val="left"/>
-              <w:rPr>
-                <w:rFonts w:ascii="Times New Roman" w:eastAsiaTheme="minorEastAsia" w:hAnsi="Times New Roman" w:cs="Times New Roman"/>
-                <w:sz w:val="22"/>
-                <w:szCs w:val="22"/>
-                <w:lang w:val="en-BE"/>
-              </w:rPr>
-            </w:pPr>
-            <w:r>
-              <w:rPr>
-                <w:rFonts w:ascii="Times New Roman" w:eastAsiaTheme="minorEastAsia" w:hAnsi="Times New Roman" w:cs="Times New Roman"/>
-                <w:sz w:val="22"/>
-                <w:szCs w:val="22"/>
-                <w:lang w:val="en-BE"/>
-              </w:rPr>
-              <w:t>Aisle Width:</w:t>
-            </w:r>
-            <w:r>
-              <w:rPr>
-                <w:rFonts w:ascii="Times New Roman" w:eastAsiaTheme="minorEastAsia" w:hAnsi="Times New Roman" w:cs="Times New Roman"/>
-                <w:sz w:val="22"/>
-                <w:szCs w:val="22"/>
-                <w:lang w:val="en-BE"/>
-              </w:rPr>
-              <w:t>{{</w:t>
+              <w:rPr>
+                <w:rFonts w:ascii="Times New Roman" w:eastAsiaTheme="minorEastAsia" w:hAnsi="Times New Roman"/>
+                <w:sz w:val="22"/>
+                <w:szCs w:val="22"/>
+                <w:lang w:val="en-BE"/>
+              </w:rPr>
+            </w:pPr>
+            <w:r>
+              <w:rPr>
+                <w:rFonts w:ascii="Times New Roman" w:eastAsiaTheme="minorEastAsia" w:hAnsi="Times New Roman" w:cs="Times New Roman"/>
+                <w:sz w:val="22"/>
+                <w:szCs w:val="22"/>
+                <w:lang w:val="en-BE"/>
+              </w:rPr>
+              <w:t xml:space="preserve">Aisle </w:t>
+            </w:r>
+            <w:proofErr w:type="gramStart"/>
+            <w:r>
+              <w:rPr>
+                <w:rFonts w:ascii="Times New Roman" w:eastAsiaTheme="minorEastAsia" w:hAnsi="Times New Roman" w:cs="Times New Roman"/>
+                <w:sz w:val="22"/>
+                <w:szCs w:val="22"/>
+                <w:lang w:val="en-BE"/>
+              </w:rPr>
+              <w:t>Width:</w:t>
+            </w:r>
+            <w:r>
+              <w:rPr>
+                <w:rFonts w:ascii="Times New Roman" w:eastAsiaTheme="minorEastAsia" w:hAnsi="Times New Roman" w:cs="Times New Roman"/>
+                <w:sz w:val="22"/>
+                <w:szCs w:val="22"/>
+                <w:lang w:val="en-BE"/>
+              </w:rPr>
+              <w:t>{</w:t>
+            </w:r>
+            <w:proofErr w:type="gramEnd"/>
+            <w:r>
+              <w:rPr>
+                <w:rFonts w:ascii="Times New Roman" w:eastAsiaTheme="minorEastAsia" w:hAnsi="Times New Roman" w:cs="Times New Roman"/>
+                <w:sz w:val="22"/>
+                <w:szCs w:val="22"/>
+                <w:lang w:val="en-BE"/>
+              </w:rPr>
+              <w:t>{</w:t>
             </w:r>
             <w:proofErr w:type="spellStart"/>
             <w:r>
@@ -1388,6 +1550,15 @@
             <w:proofErr w:type="spellEnd"/>
             <w:r>
               <w:rPr>
+                <w:rFonts w:ascii="Times New Roman" w:eastAsiaTheme="minorEastAsia" w:hAnsi="Times New Roman"/>
+                <w:sz w:val="22"/>
+                <w:szCs w:val="22"/>
+                <w:lang w:val="en-BE"/>
+              </w:rPr>
+              <w:t>|default('N/A')</w:t>
+            </w:r>
+            <w:r>
+              <w:rPr>
                 <w:rFonts w:ascii="Times New Roman" w:eastAsiaTheme="minorEastAsia" w:hAnsi="Times New Roman" w:cs="Times New Roman"/>
                 <w:sz w:val="22"/>
                 <w:szCs w:val="22"/>
@@ -1399,9 +1570,8 @@
           <w:p>
             <w:pPr>
               <w:spacing w:line="240" w:lineRule="auto"/>
-              <w:jc w:val="left"/>
-              <w:rPr>
-                <w:rFonts w:ascii="Times New Roman" w:eastAsiaTheme="minorEastAsia" w:hAnsi="Times New Roman" w:cs="Times New Roman"/>
+              <w:rPr>
+                <w:rFonts w:ascii="Times New Roman" w:eastAsiaTheme="minorEastAsia" w:hAnsi="Times New Roman"/>
                 <w:sz w:val="22"/>
                 <w:szCs w:val="22"/>
                 <w:lang w:val="en-BE"/>
@@ -1429,6 +1599,15 @@
             <w:proofErr w:type="spellEnd"/>
             <w:r>
               <w:rPr>
+                <w:rFonts w:ascii="Times New Roman" w:eastAsiaTheme="minorEastAsia" w:hAnsi="Times New Roman"/>
+                <w:sz w:val="22"/>
+                <w:szCs w:val="22"/>
+                <w:lang w:val="en-BE"/>
+              </w:rPr>
+              <w:t>|default('N/A')</w:t>
+            </w:r>
+            <w:r>
+              <w:rPr>
                 <w:rFonts w:ascii="Times New Roman" w:eastAsiaTheme="minorEastAsia" w:hAnsi="Times New Roman" w:cs="Times New Roman"/>
                 <w:sz w:val="22"/>
                 <w:szCs w:val="22"/>
@@ -1440,9 +1619,8 @@
           <w:p>
             <w:pPr>
               <w:spacing w:line="240" w:lineRule="auto"/>
-              <w:jc w:val="left"/>
-              <w:rPr>
-                <w:rFonts w:ascii="Times New Roman" w:eastAsiaTheme="minorEastAsia" w:hAnsi="Times New Roman" w:cs="Times New Roman"/>
+              <w:rPr>
+                <w:rFonts w:ascii="Times New Roman" w:eastAsiaTheme="minorEastAsia" w:hAnsi="Times New Roman"/>
                 <w:sz w:val="22"/>
                 <w:szCs w:val="22"/>
                 <w:lang w:val="en-BE"/>
@@ -1470,6 +1648,15 @@
             <w:proofErr w:type="spellEnd"/>
             <w:r>
               <w:rPr>
+                <w:rFonts w:ascii="Times New Roman" w:eastAsiaTheme="minorEastAsia" w:hAnsi="Times New Roman"/>
+                <w:sz w:val="22"/>
+                <w:szCs w:val="22"/>
+                <w:lang w:val="en-BE"/>
+              </w:rPr>
+              <w:t>|default('N/A')</w:t>
+            </w:r>
+            <w:r>
+              <w:rPr>
                 <w:rFonts w:ascii="Times New Roman" w:eastAsiaTheme="minorEastAsia" w:hAnsi="Times New Roman" w:cs="Times New Roman"/>
                 <w:sz w:val="22"/>
                 <w:szCs w:val="22"/>
@@ -1481,9 +1668,8 @@
           <w:p>
             <w:pPr>
               <w:spacing w:line="240" w:lineRule="auto"/>
-              <w:jc w:val="left"/>
-              <w:rPr>
-                <w:rFonts w:ascii="Times New Roman" w:eastAsiaTheme="minorEastAsia" w:hAnsi="Times New Roman" w:cs="Times New Roman"/>
+              <w:rPr>
+                <w:rFonts w:ascii="Times New Roman" w:eastAsiaTheme="minorEastAsia" w:hAnsi="Times New Roman"/>
                 <w:sz w:val="22"/>
                 <w:szCs w:val="22"/>
                 <w:lang w:val="en-BE"/>
@@ -1509,6 +1695,15 @@
               <w:t>unloading_aisle_mm</w:t>
             </w:r>
             <w:proofErr w:type="spellEnd"/>
+            <w:r>
+              <w:rPr>
+                <w:rFonts w:ascii="Times New Roman" w:eastAsiaTheme="minorEastAsia" w:hAnsi="Times New Roman"/>
+                <w:sz w:val="22"/>
+                <w:szCs w:val="22"/>
+                <w:lang w:val="en-BE"/>
+              </w:rPr>
+              <w:t>|default('N/A')</w:t>
+            </w:r>
             <w:r>
               <w:rPr>
                 <w:rFonts w:ascii="Times New Roman" w:eastAsiaTheme="minorEastAsia" w:hAnsi="Times New Roman" w:cs="Times New Roman"/>
@@ -1644,9 +1839,8 @@
           <w:p>
             <w:pPr>
               <w:spacing w:line="240" w:lineRule="auto"/>
-              <w:jc w:val="left"/>
-              <w:rPr>
-                <w:rFonts w:ascii="Times New Roman" w:eastAsiaTheme="minorEastAsia" w:hAnsi="Times New Roman" w:cs="Times New Roman"/>
+              <w:rPr>
+                <w:rFonts w:ascii="Times New Roman" w:eastAsiaTheme="minorEastAsia" w:hAnsi="Times New Roman"/>
                 <w:sz w:val="22"/>
                 <w:szCs w:val="22"/>
                 <w:lang w:val="en-BE"/>
@@ -1674,6 +1868,15 @@
             <w:proofErr w:type="spellEnd"/>
             <w:r>
               <w:rPr>
+                <w:rFonts w:ascii="Times New Roman" w:eastAsiaTheme="minorEastAsia" w:hAnsi="Times New Roman"/>
+                <w:sz w:val="22"/>
+                <w:szCs w:val="22"/>
+                <w:lang w:val="en-BE"/>
+              </w:rPr>
+              <w:t>|default('N/A')</w:t>
+            </w:r>
+            <w:r>
+              <w:rPr>
                 <w:rFonts w:ascii="Times New Roman" w:eastAsiaTheme="minorEastAsia" w:hAnsi="Times New Roman" w:cs="Times New Roman"/>
                 <w:sz w:val="22"/>
                 <w:szCs w:val="22"/>
@@ -1681,26 +1884,54 @@
               </w:rPr>
               <w:t>}}</w:t>
             </w:r>
-          </w:p>
-          <w:p>
-            <w:pPr>
-              <w:spacing w:line="240" w:lineRule="auto"/>
-              <w:jc w:val="left"/>
-              <w:rPr>
-                <w:rFonts w:ascii="Times New Roman" w:eastAsiaTheme="minorEastAsia" w:hAnsi="Times New Roman" w:cs="Times New Roman"/>
-                <w:sz w:val="22"/>
-                <w:szCs w:val="22"/>
-                <w:lang w:val="en-BE"/>
-              </w:rPr>
-            </w:pPr>
-            <w:r>
-              <w:rPr>
-                <w:rFonts w:ascii="Times New Roman" w:eastAsiaTheme="minorEastAsia" w:hAnsi="Times New Roman" w:cs="Times New Roman"/>
-                <w:sz w:val="22"/>
-                <w:szCs w:val="22"/>
-                <w:lang w:val="en-BE"/>
-              </w:rPr>
-              <w:t>{{</w:t>
+            <w:r>
+              <w:rPr>
+                <w:rFonts w:ascii="Times New Roman" w:eastAsiaTheme="minorEastAsia" w:hAnsi="Times New Roman" w:cs="Times New Roman"/>
+                <w:sz w:val="22"/>
+                <w:szCs w:val="22"/>
+                <w:lang w:val="en-BE"/>
+              </w:rPr>
+              <w:t>m</w:t>
+            </w:r>
+          </w:p>
+          <w:p>
+            <w:pPr>
+              <w:spacing w:line="240" w:lineRule="auto"/>
+              <w:rPr>
+                <w:rFonts w:ascii="Times New Roman" w:eastAsiaTheme="minorEastAsia" w:hAnsi="Times New Roman"/>
+                <w:sz w:val="22"/>
+                <w:szCs w:val="22"/>
+                <w:lang w:val="en-BE"/>
+              </w:rPr>
+            </w:pPr>
+            <w:proofErr w:type="gramStart"/>
+            <w:r>
+              <w:rPr>
+                <w:rFonts w:ascii="Times New Roman" w:eastAsiaTheme="minorEastAsia" w:hAnsi="Times New Roman" w:cs="Times New Roman"/>
+                <w:sz w:val="22"/>
+                <w:szCs w:val="22"/>
+                <w:lang w:val="en-BE"/>
+              </w:rPr>
+              <w:t>Level:</w:t>
+            </w:r>
+            <w:r>
+              <w:rPr>
+                <w:rFonts w:ascii="Times New Roman" w:eastAsiaTheme="minorEastAsia" w:hAnsi="Times New Roman" w:cs="Times New Roman"/>
+                <w:sz w:val="22"/>
+                <w:szCs w:val="22"/>
+                <w:lang w:val="en-BE"/>
+              </w:rPr>
+              <w:t>{</w:t>
+            </w:r>
+            <w:proofErr w:type="gramEnd"/>
+            <w:r>
+              <w:rPr>
+                <w:rFonts w:ascii="Times New Roman" w:eastAsiaTheme="minorEastAsia" w:hAnsi="Times New Roman" w:cs="Times New Roman"/>
+                <w:sz w:val="22"/>
+                <w:szCs w:val="22"/>
+                <w:lang w:val="en-BE"/>
+              </w:rPr>
+              <w:t>{</w:t>
             </w:r>
             <w:proofErr w:type="spellStart"/>
             <w:r>
@@ -1713,6 +1944,15 @@
               <w:t>boxes_stacked</w:t>
             </w:r>
             <w:proofErr w:type="spellEnd"/>
+            <w:r>
+              <w:rPr>
+                <w:rFonts w:ascii="Times New Roman" w:eastAsiaTheme="minorEastAsia" w:hAnsi="Times New Roman"/>
+                <w:sz w:val="22"/>
+                <w:szCs w:val="22"/>
+                <w:lang w:val="en-BE"/>
+              </w:rPr>
+              <w:t>|default('N/A')</w:t>
+            </w:r>
             <w:r>
               <w:rPr>
                 <w:rFonts w:ascii="Times New Roman" w:eastAsiaTheme="minorEastAsia" w:hAnsi="Times New Roman" w:cs="Times New Roman"/>
@@ -1838,9 +2078,8 @@
           <w:p>
             <w:pPr>
               <w:spacing w:line="240" w:lineRule="auto"/>
-              <w:jc w:val="left"/>
-              <w:rPr>
-                <w:rFonts w:ascii="Times New Roman" w:eastAsiaTheme="minorEastAsia" w:hAnsi="Times New Roman" w:cs="Times New Roman"/>
+              <w:rPr>
+                <w:rFonts w:ascii="Times New Roman" w:eastAsiaTheme="minorEastAsia" w:hAnsi="Times New Roman"/>
                 <w:sz w:val="22"/>
                 <w:szCs w:val="22"/>
                 <w:lang w:val="en-BE"/>
@@ -1866,6 +2105,15 @@
               <w:t>clearance_height_m</w:t>
             </w:r>
             <w:proofErr w:type="spellEnd"/>
+            <w:r>
+              <w:rPr>
+                <w:rFonts w:ascii="Times New Roman" w:eastAsiaTheme="minorEastAsia" w:hAnsi="Times New Roman"/>
+                <w:sz w:val="22"/>
+                <w:szCs w:val="22"/>
+                <w:lang w:val="en-BE"/>
+              </w:rPr>
+              <w:t>|default('N/A')</w:t>
+            </w:r>
             <w:r>
               <w:rPr>
                 <w:rFonts w:ascii="Times New Roman" w:eastAsiaTheme="minorEastAsia" w:hAnsi="Times New Roman" w:cs="Times New Roman"/>
@@ -2006,9 +2254,8 @@
           <w:p>
             <w:pPr>
               <w:spacing w:line="240" w:lineRule="auto"/>
-              <w:jc w:val="left"/>
-              <w:rPr>
-                <w:rFonts w:ascii="Times New Roman" w:eastAsiaTheme="minorEastAsia" w:hAnsi="Times New Roman" w:cs="Times New Roman"/>
+              <w:rPr>
+                <w:rFonts w:ascii="Times New Roman" w:eastAsiaTheme="minorEastAsia" w:hAnsi="Times New Roman"/>
                 <w:sz w:val="22"/>
                 <w:szCs w:val="22"/>
                 <w:lang w:val="en-BE"/>
@@ -2034,6 +2281,15 @@
               <w:t>storage_locations</w:t>
             </w:r>
             <w:proofErr w:type="spellEnd"/>
+            <w:r>
+              <w:rPr>
+                <w:rFonts w:ascii="Times New Roman" w:eastAsiaTheme="minorEastAsia" w:hAnsi="Times New Roman"/>
+                <w:sz w:val="22"/>
+                <w:szCs w:val="22"/>
+                <w:lang w:val="en-BE"/>
+              </w:rPr>
+              <w:t>|default('N/A')</w:t>
+            </w:r>
             <w:r>
               <w:rPr>
                 <w:rFonts w:ascii="Times New Roman" w:eastAsiaTheme="minorEastAsia" w:hAnsi="Times New Roman" w:cs="Times New Roman"/>
@@ -2165,9 +2421,8 @@
           <w:p>
             <w:pPr>
               <w:spacing w:line="240" w:lineRule="auto"/>
-              <w:jc w:val="left"/>
-              <w:rPr>
-                <w:rFonts w:ascii="Times New Roman" w:eastAsiaTheme="minorEastAsia" w:hAnsi="Times New Roman" w:cs="Times New Roman"/>
+              <w:rPr>
+                <w:rFonts w:ascii="Times New Roman" w:eastAsiaTheme="minorEastAsia" w:hAnsi="Times New Roman"/>
                 <w:sz w:val="22"/>
                 <w:szCs w:val="22"/>
                 <w:lang w:val="en-BE"/>
@@ -2193,6 +2448,15 @@
               <w:t>ramp_gradient_deg</w:t>
             </w:r>
             <w:proofErr w:type="spellEnd"/>
+            <w:r>
+              <w:rPr>
+                <w:rFonts w:ascii="Times New Roman" w:eastAsiaTheme="minorEastAsia" w:hAnsi="Times New Roman"/>
+                <w:sz w:val="22"/>
+                <w:szCs w:val="22"/>
+                <w:lang w:val="en-BE"/>
+              </w:rPr>
+              <w:t>|default('N/A')</w:t>
+            </w:r>
             <w:r>
               <w:rPr>
                 <w:rFonts w:ascii="Times New Roman" w:eastAsiaTheme="minorEastAsia" w:hAnsi="Times New Roman" w:cs="Times New Roman"/>
@@ -2332,9 +2596,8 @@
           <w:p>
             <w:pPr>
               <w:spacing w:line="240" w:lineRule="auto"/>
-              <w:jc w:val="left"/>
-              <w:rPr>
-                <w:rFonts w:ascii="Times New Roman" w:eastAsiaTheme="minorEastAsia" w:hAnsi="Times New Roman" w:cs="Times New Roman"/>
+              <w:rPr>
+                <w:rFonts w:ascii="Times New Roman" w:eastAsiaTheme="minorEastAsia" w:hAnsi="Times New Roman"/>
                 <w:sz w:val="22"/>
                 <w:szCs w:val="22"/>
                 <w:lang w:val="en-BE"/>
@@ -2360,6 +2623,15 @@
               <w:t>special_layout</w:t>
             </w:r>
             <w:proofErr w:type="spellEnd"/>
+            <w:r>
+              <w:rPr>
+                <w:rFonts w:ascii="Times New Roman" w:eastAsiaTheme="minorEastAsia" w:hAnsi="Times New Roman"/>
+                <w:sz w:val="22"/>
+                <w:szCs w:val="22"/>
+                <w:lang w:val="en-BE"/>
+              </w:rPr>
+              <w:t>|default('N/A')</w:t>
+            </w:r>
             <w:r>
               <w:rPr>
                 <w:rFonts w:ascii="Times New Roman" w:eastAsiaTheme="minorEastAsia" w:hAnsi="Times New Roman" w:cs="Times New Roman"/>
@@ -2430,9 +2702,8 @@
           <w:p>
             <w:pPr>
               <w:spacing w:line="240" w:lineRule="auto"/>
-              <w:jc w:val="left"/>
-              <w:rPr>
-                <w:rFonts w:ascii="Times New Roman" w:eastAsiaTheme="minorEastAsia" w:hAnsi="Times New Roman" w:cs="Times New Roman"/>
+              <w:rPr>
+                <w:rFonts w:ascii="Times New Roman" w:eastAsiaTheme="minorEastAsia" w:hAnsi="Times New Roman"/>
                 <w:sz w:val="22"/>
                 <w:szCs w:val="22"/>
                 <w:lang w:val="en-BE"/>
@@ -2460,6 +2731,15 @@
             <w:proofErr w:type="spellEnd"/>
             <w:r>
               <w:rPr>
+                <w:rFonts w:ascii="Times New Roman" w:eastAsiaTheme="minorEastAsia" w:hAnsi="Times New Roman"/>
+                <w:sz w:val="22"/>
+                <w:szCs w:val="22"/>
+                <w:lang w:val="en-BE"/>
+              </w:rPr>
+              <w:t>|default('N/A')</w:t>
+            </w:r>
+            <w:r>
+              <w:rPr>
                 <w:rFonts w:ascii="Times New Roman" w:eastAsiaTheme="minorEastAsia" w:hAnsi="Times New Roman" w:cs="Times New Roman"/>
                 <w:sz w:val="22"/>
                 <w:szCs w:val="22"/>
@@ -2471,21 +2751,21 @@
           <w:p>
             <w:pPr>
               <w:spacing w:line="240" w:lineRule="auto"/>
-              <w:jc w:val="left"/>
-              <w:rPr>
-                <w:rFonts w:ascii="Times New Roman" w:eastAsiaTheme="minorEastAsia" w:hAnsi="Times New Roman" w:cs="Times New Roman"/>
-                <w:sz w:val="22"/>
-                <w:szCs w:val="22"/>
-                <w:lang w:val="en-BE"/>
-              </w:rPr>
-            </w:pPr>
-            <w:r>
-              <w:rPr>
-                <w:rFonts w:ascii="Times New Roman" w:eastAsiaTheme="minorEastAsia" w:hAnsi="Times New Roman" w:cs="Times New Roman"/>
-                <w:sz w:val="22"/>
-                <w:szCs w:val="22"/>
-                <w:lang w:val="en-BE"/>
-              </w:rPr>
+              <w:rPr>
+                <w:rFonts w:ascii="Times New Roman" w:eastAsiaTheme="minorEastAsia" w:hAnsi="Times New Roman"/>
+                <w:sz w:val="22"/>
+                <w:szCs w:val="22"/>
+                <w:lang w:val="en-BE"/>
+              </w:rPr>
+            </w:pPr>
+            <w:r>
+              <w:rPr>
+                <w:rFonts w:ascii="Times New Roman" w:eastAsiaTheme="minorEastAsia" w:hAnsi="Times New Roman" w:cs="Times New Roman"/>
+                <w:sz w:val="22"/>
+                <w:szCs w:val="22"/>
+                <w:lang w:val="en-BE"/>
+              </w:rPr>
+              <w:lastRenderedPageBreak/>
               <w:t xml:space="preserve"> Aisle Width in Operation Zone: {{</w:t>
             </w:r>
             <w:proofErr w:type="spellStart"/>
@@ -2499,6 +2779,15 @@
               <w:t>cross_docking_aisle</w:t>
             </w:r>
             <w:proofErr w:type="spellEnd"/>
+            <w:r>
+              <w:rPr>
+                <w:rFonts w:ascii="Times New Roman" w:eastAsiaTheme="minorEastAsia" w:hAnsi="Times New Roman"/>
+                <w:sz w:val="22"/>
+                <w:szCs w:val="22"/>
+                <w:lang w:val="en-BE"/>
+              </w:rPr>
+              <w:t>|default('N/A')</w:t>
+            </w:r>
             <w:r>
               <w:rPr>
                 <w:rFonts w:ascii="Times New Roman" w:eastAsiaTheme="minorEastAsia" w:hAnsi="Times New Roman" w:cs="Times New Roman"/>
@@ -2549,6 +2838,133 @@
           <w:p>
             <w:pPr>
               <w:spacing w:line="240" w:lineRule="auto"/>
+              <w:rPr>
+                <w:rFonts w:ascii="Times New Roman" w:eastAsiaTheme="minorEastAsia" w:hAnsi="Times New Roman"/>
+                <w:sz w:val="22"/>
+                <w:szCs w:val="22"/>
+                <w:lang w:val="en-BE"/>
+              </w:rPr>
+            </w:pPr>
+            <w:r>
+              <w:rPr>
+                <w:rFonts w:ascii="Times New Roman" w:eastAsiaTheme="minorEastAsia" w:hAnsi="Times New Roman" w:cs="Times New Roman"/>
+                <w:sz w:val="22"/>
+                <w:szCs w:val="22"/>
+                <w:lang w:val="en-BE"/>
+              </w:rPr>
+              <w:t xml:space="preserve">Pickup </w:t>
+            </w:r>
+            <w:proofErr w:type="gramStart"/>
+            <w:r>
+              <w:rPr>
+                <w:rFonts w:ascii="Times New Roman" w:eastAsiaTheme="minorEastAsia" w:hAnsi="Times New Roman" w:cs="Times New Roman"/>
+                <w:sz w:val="22"/>
+                <w:szCs w:val="22"/>
+                <w:lang w:val="en-BE"/>
+              </w:rPr>
+              <w:t>Type:</w:t>
+            </w:r>
+            <w:r>
+              <w:rPr>
+                <w:rFonts w:ascii="Times New Roman" w:eastAsiaTheme="minorEastAsia" w:hAnsi="Times New Roman" w:cs="Times New Roman"/>
+                <w:sz w:val="22"/>
+                <w:szCs w:val="22"/>
+                <w:lang w:val="en-BE"/>
+              </w:rPr>
+              <w:t>{</w:t>
+            </w:r>
+            <w:proofErr w:type="gramEnd"/>
+            <w:r>
+              <w:rPr>
+                <w:rFonts w:ascii="Times New Roman" w:eastAsiaTheme="minorEastAsia" w:hAnsi="Times New Roman" w:cs="Times New Roman"/>
+                <w:sz w:val="22"/>
+                <w:szCs w:val="22"/>
+                <w:lang w:val="en-BE"/>
+              </w:rPr>
+              <w:t>{</w:t>
+            </w:r>
+            <w:proofErr w:type="spellStart"/>
+            <w:r>
+              <w:rPr>
+                <w:rFonts w:ascii="Times New Roman" w:eastAsiaTheme="minorEastAsia" w:hAnsi="Times New Roman" w:cs="Times New Roman"/>
+                <w:sz w:val="22"/>
+                <w:szCs w:val="22"/>
+                <w:lang w:val="en-BE"/>
+              </w:rPr>
+              <w:t>pickup_type</w:t>
+            </w:r>
+            <w:proofErr w:type="spellEnd"/>
+            <w:r>
+              <w:rPr>
+                <w:rFonts w:ascii="Times New Roman" w:eastAsiaTheme="minorEastAsia" w:hAnsi="Times New Roman"/>
+                <w:sz w:val="22"/>
+                <w:szCs w:val="22"/>
+                <w:lang w:val="en-BE"/>
+              </w:rPr>
+              <w:t>|default('N/A')</w:t>
+            </w:r>
+            <w:r>
+              <w:rPr>
+                <w:rFonts w:ascii="Times New Roman" w:eastAsiaTheme="minorEastAsia" w:hAnsi="Times New Roman" w:cs="Times New Roman"/>
+                <w:sz w:val="22"/>
+                <w:szCs w:val="22"/>
+                <w:lang w:val="en-BE"/>
+              </w:rPr>
+              <w:t xml:space="preserve">}} </w:t>
+            </w:r>
+          </w:p>
+          <w:p>
+            <w:pPr>
+              <w:spacing w:line="240" w:lineRule="auto"/>
+              <w:rPr>
+                <w:rFonts w:ascii="Times New Roman" w:eastAsiaTheme="minorEastAsia" w:hAnsi="Times New Roman"/>
+                <w:sz w:val="22"/>
+                <w:szCs w:val="22"/>
+                <w:lang w:val="en-BE"/>
+              </w:rPr>
+            </w:pPr>
+            <w:r>
+              <w:rPr>
+                <w:rFonts w:ascii="Times New Roman" w:eastAsiaTheme="minorEastAsia" w:hAnsi="Times New Roman" w:cs="Times New Roman"/>
+                <w:sz w:val="22"/>
+                <w:szCs w:val="22"/>
+                <w:lang w:val="en-BE"/>
+              </w:rPr>
+              <w:t>Stacking Type (if Ground pickup): {{</w:t>
+            </w:r>
+            <w:proofErr w:type="spellStart"/>
+            <w:r>
+              <w:rPr>
+                <w:rFonts w:ascii="Times New Roman" w:eastAsiaTheme="minorEastAsia" w:hAnsi="Times New Roman" w:cs="Times New Roman"/>
+                <w:sz w:val="22"/>
+                <w:szCs w:val="22"/>
+                <w:lang w:val="en-BE"/>
+              </w:rPr>
+              <w:t>stacking_type</w:t>
+            </w:r>
+            <w:proofErr w:type="spellEnd"/>
+            <w:r>
+              <w:rPr>
+                <w:rFonts w:ascii="Times New Roman" w:eastAsiaTheme="minorEastAsia" w:hAnsi="Times New Roman"/>
+                <w:sz w:val="22"/>
+                <w:szCs w:val="22"/>
+                <w:lang w:val="en-BE"/>
+              </w:rPr>
+              <w:t>|default('N/A')</w:t>
+            </w:r>
+            <w:r>
+              <w:rPr>
+                <w:rFonts w:ascii="Times New Roman" w:eastAsiaTheme="minorEastAsia" w:hAnsi="Times New Roman" w:cs="Times New Roman"/>
+                <w:sz w:val="22"/>
+                <w:szCs w:val="22"/>
+                <w:lang w:val="en-BE"/>
+              </w:rPr>
+              <w:t xml:space="preserve">}} </w:t>
+            </w:r>
+          </w:p>
+          <w:p>
+            <w:pPr>
+              <w:spacing w:line="240" w:lineRule="auto"/>
               <w:jc w:val="left"/>
               <w:rPr>
                 <w:rFonts w:ascii="Times New Roman" w:eastAsiaTheme="minorEastAsia" w:hAnsi="Times New Roman" w:cs="Times New Roman"/>
@@ -2564,7 +2980,16 @@
                 <w:szCs w:val="22"/>
                 <w:lang w:val="en-BE"/>
               </w:rPr>
-              <w:t>Pickup Type:</w:t>
+              <w:t>Storage Layout Description (Floor Stacking):</w:t>
+            </w:r>
+            <w:r>
+              <w:rPr>
+                <w:rFonts w:ascii="Times New Roman" w:eastAsiaTheme="minorEastAsia" w:hAnsi="Times New Roman" w:cs="Times New Roman"/>
+                <w:sz w:val="22"/>
+                <w:szCs w:val="22"/>
+                <w:lang w:val="en-BE"/>
+              </w:rPr>
+              <w:t xml:space="preserve"> </w:t>
             </w:r>
             <w:r>
               <w:rPr>
@@ -2583,11 +3008,20 @@
                 <w:szCs w:val="22"/>
                 <w:lang w:val="en-BE"/>
               </w:rPr>
-              <w:t>pickup_type</w:t>
+              <w:t>storage_layout</w:t>
             </w:r>
             <w:proofErr w:type="spellEnd"/>
             <w:r>
               <w:rPr>
+                <w:rFonts w:ascii="Times New Roman" w:eastAsiaTheme="minorEastAsia" w:hAnsi="Times New Roman"/>
+                <w:sz w:val="22"/>
+                <w:szCs w:val="22"/>
+                <w:lang w:val="en-BE"/>
+              </w:rPr>
+              <w:t>|default('N/A')</w:t>
+            </w:r>
+            <w:r>
+              <w:rPr>
                 <w:rFonts w:ascii="Times New Roman" w:eastAsiaTheme="minorEastAsia" w:hAnsi="Times New Roman" w:cs="Times New Roman"/>
                 <w:sz w:val="22"/>
                 <w:szCs w:val="22"/>
@@ -2599,6 +3033,104 @@
           <w:p>
             <w:pPr>
               <w:spacing w:line="240" w:lineRule="auto"/>
+              <w:rPr>
+                <w:rFonts w:ascii="Times New Roman" w:eastAsiaTheme="minorEastAsia" w:hAnsi="Times New Roman"/>
+                <w:sz w:val="22"/>
+                <w:szCs w:val="22"/>
+                <w:lang w:val="en-BE"/>
+              </w:rPr>
+            </w:pPr>
+            <w:r>
+              <w:rPr>
+                <w:rFonts w:ascii="Times New Roman" w:eastAsiaTheme="minorEastAsia" w:hAnsi="Times New Roman" w:cs="Times New Roman"/>
+                <w:sz w:val="22"/>
+                <w:szCs w:val="22"/>
+                <w:lang w:val="en-BE"/>
+              </w:rPr>
+              <w:t>Distance between 2 boxes stacked next to each other (Floor Stacking): {{</w:t>
+            </w:r>
+            <w:proofErr w:type="spellStart"/>
+            <w:r>
+              <w:rPr>
+                <w:rFonts w:ascii="Times New Roman" w:eastAsiaTheme="minorEastAsia" w:hAnsi="Times New Roman" w:cs="Times New Roman"/>
+                <w:sz w:val="22"/>
+                <w:szCs w:val="22"/>
+                <w:lang w:val="en-BE"/>
+              </w:rPr>
+              <w:t>box_distance_mm</w:t>
+            </w:r>
+            <w:proofErr w:type="spellEnd"/>
+            <w:r>
+              <w:rPr>
+                <w:rFonts w:ascii="Times New Roman" w:eastAsiaTheme="minorEastAsia" w:hAnsi="Times New Roman"/>
+                <w:sz w:val="22"/>
+                <w:szCs w:val="22"/>
+                <w:lang w:val="en-BE"/>
+              </w:rPr>
+              <w:t>|default('N/A')</w:t>
+            </w:r>
+            <w:r>
+              <w:rPr>
+                <w:rFonts w:ascii="Times New Roman" w:eastAsiaTheme="minorEastAsia" w:hAnsi="Times New Roman" w:cs="Times New Roman"/>
+                <w:sz w:val="22"/>
+                <w:szCs w:val="22"/>
+                <w:lang w:val="en-BE"/>
+              </w:rPr>
+              <w:t xml:space="preserve">}} mm </w:t>
+            </w:r>
+          </w:p>
+          <w:p>
+            <w:pPr>
+              <w:spacing w:line="240" w:lineRule="auto"/>
+              <w:rPr>
+                <w:rFonts w:ascii="Times New Roman" w:eastAsiaTheme="minorEastAsia" w:hAnsi="Times New Roman"/>
+                <w:sz w:val="22"/>
+                <w:szCs w:val="22"/>
+                <w:lang w:val="en-BE"/>
+              </w:rPr>
+            </w:pPr>
+            <w:r>
+              <w:rPr>
+                <w:rFonts w:ascii="Times New Roman" w:eastAsiaTheme="minorEastAsia" w:hAnsi="Times New Roman" w:cs="Times New Roman"/>
+                <w:sz w:val="22"/>
+                <w:szCs w:val="22"/>
+                <w:lang w:val="en-BE"/>
+              </w:rPr>
+              <w:t>Aisle Width for Floor Stacking: {{</w:t>
+            </w:r>
+            <w:proofErr w:type="spellStart"/>
+            <w:r>
+              <w:rPr>
+                <w:rFonts w:ascii="Times New Roman" w:eastAsiaTheme="minorEastAsia" w:hAnsi="Times New Roman" w:cs="Times New Roman"/>
+                <w:sz w:val="22"/>
+                <w:szCs w:val="22"/>
+                <w:lang w:val="en-BE"/>
+              </w:rPr>
+              <w:t>aisle_width_mm</w:t>
+            </w:r>
+            <w:proofErr w:type="spellEnd"/>
+            <w:r>
+              <w:rPr>
+                <w:rFonts w:ascii="Times New Roman" w:eastAsiaTheme="minorEastAsia" w:hAnsi="Times New Roman"/>
+                <w:sz w:val="22"/>
+                <w:szCs w:val="22"/>
+                <w:lang w:val="en-BE"/>
+              </w:rPr>
+              <w:t>|default('N/A')</w:t>
+            </w:r>
+            <w:r>
+              <w:rPr>
+                <w:rFonts w:ascii="Times New Roman" w:eastAsiaTheme="minorEastAsia" w:hAnsi="Times New Roman" w:cs="Times New Roman"/>
+                <w:sz w:val="22"/>
+                <w:szCs w:val="22"/>
+                <w:lang w:val="en-BE"/>
+              </w:rPr>
+              <w:t xml:space="preserve">}} mm </w:t>
+            </w:r>
+          </w:p>
+          <w:p>
+            <w:pPr>
+              <w:spacing w:line="240" w:lineRule="auto"/>
               <w:jc w:val="left"/>
               <w:rPr>
                 <w:rFonts w:ascii="Times New Roman" w:eastAsiaTheme="minorEastAsia" w:hAnsi="Times New Roman" w:cs="Times New Roman"/>
@@ -2614,8 +3146,7 @@
                 <w:szCs w:val="22"/>
                 <w:lang w:val="en-BE"/>
               </w:rPr>
-              <w:lastRenderedPageBreak/>
-              <w:t>Stacking Type (if Ground pickup): {{</w:t>
+              <w:t>Aisle Width for Rack Stacking (pallet to pallet): {{</w:t>
             </w:r>
             <w:proofErr w:type="spellStart"/>
             <w:r>
@@ -2625,17 +3156,75 @@
                 <w:szCs w:val="22"/>
                 <w:lang w:val="en-BE"/>
               </w:rPr>
-              <w:t>stacking_type</w:t>
+              <w:t>aisle_width_mm</w:t>
             </w:r>
             <w:proofErr w:type="spellEnd"/>
             <w:r>
               <w:rPr>
-                <w:rFonts w:ascii="Times New Roman" w:eastAsiaTheme="minorEastAsia" w:hAnsi="Times New Roman" w:cs="Times New Roman"/>
-                <w:sz w:val="22"/>
-                <w:szCs w:val="22"/>
-                <w:lang w:val="en-BE"/>
-              </w:rPr>
-              <w:t xml:space="preserve">}} </w:t>
+                <w:rFonts w:ascii="Times New Roman" w:eastAsiaTheme="minorEastAsia" w:hAnsi="Times New Roman"/>
+                <w:sz w:val="22"/>
+                <w:szCs w:val="22"/>
+                <w:lang w:val="en-BE"/>
+              </w:rPr>
+              <w:t>|default('N/A')</w:t>
+            </w:r>
+            <w:r>
+              <w:rPr>
+                <w:rFonts w:ascii="Times New Roman" w:eastAsiaTheme="minorEastAsia" w:hAnsi="Times New Roman" w:cs="Times New Roman"/>
+                <w:sz w:val="22"/>
+                <w:szCs w:val="22"/>
+                <w:lang w:val="en-BE"/>
+              </w:rPr>
+              <w:t xml:space="preserve">}} mm </w:t>
+            </w:r>
+          </w:p>
+          <w:p>
+            <w:pPr>
+              <w:spacing w:line="240" w:lineRule="auto"/>
+              <w:rPr>
+                <w:rFonts w:ascii="Times New Roman" w:eastAsiaTheme="minorEastAsia" w:hAnsi="Times New Roman"/>
+                <w:sz w:val="22"/>
+                <w:szCs w:val="22"/>
+                <w:lang w:val="en-BE"/>
+              </w:rPr>
+            </w:pPr>
+            <w:r>
+              <w:rPr>
+                <w:rFonts w:ascii="Times New Roman" w:eastAsiaTheme="minorEastAsia" w:hAnsi="Times New Roman" w:cs="Times New Roman"/>
+                <w:sz w:val="22"/>
+                <w:szCs w:val="22"/>
+                <w:lang w:val="en-BE"/>
+              </w:rPr>
+              <w:t>Conveyor Height: {{</w:t>
+            </w:r>
+            <w:proofErr w:type="spellStart"/>
+            <w:r>
+              <w:rPr>
+                <w:rFonts w:ascii="Times New Roman" w:eastAsiaTheme="minorEastAsia" w:hAnsi="Times New Roman" w:cs="Times New Roman"/>
+                <w:sz w:val="22"/>
+                <w:szCs w:val="22"/>
+                <w:lang w:val="en-BE"/>
+              </w:rPr>
+              <w:t>conveyor_height</w:t>
+            </w:r>
+            <w:proofErr w:type="spellEnd"/>
+            <w:r>
+              <w:rPr>
+                <w:rFonts w:ascii="Times New Roman" w:eastAsiaTheme="minorEastAsia" w:hAnsi="Times New Roman"/>
+                <w:sz w:val="22"/>
+                <w:szCs w:val="22"/>
+                <w:lang w:val="en-BE"/>
+              </w:rPr>
+              <w:t>|default('N/A')</w:t>
+            </w:r>
+            <w:r>
+              <w:rPr>
+                <w:rFonts w:ascii="Times New Roman" w:eastAsiaTheme="minorEastAsia" w:hAnsi="Times New Roman" w:cs="Times New Roman"/>
+                <w:sz w:val="22"/>
+                <w:szCs w:val="22"/>
+                <w:lang w:val="en-BE"/>
+              </w:rPr>
+              <w:t xml:space="preserve">}} mm </w:t>
             </w:r>
           </w:p>
           <w:p>
@@ -2643,20 +3232,40 @@
               <w:spacing w:line="240" w:lineRule="auto"/>
               <w:jc w:val="left"/>
               <w:rPr>
-                <w:rFonts w:ascii="Times New Roman" w:eastAsiaTheme="minorEastAsia" w:hAnsi="Times New Roman" w:cs="Times New Roman"/>
-                <w:sz w:val="22"/>
-                <w:szCs w:val="22"/>
-                <w:lang w:val="en-BE"/>
-              </w:rPr>
-            </w:pPr>
-            <w:r>
-              <w:rPr>
-                <w:rFonts w:ascii="Times New Roman" w:eastAsiaTheme="minorEastAsia" w:hAnsi="Times New Roman" w:cs="Times New Roman"/>
-                <w:sz w:val="22"/>
-                <w:szCs w:val="22"/>
-                <w:lang w:val="en-BE"/>
-              </w:rPr>
-              <w:t>Storage Layout Description (Floor Stacking): {{</w:t>
+                <w:rFonts w:ascii="Times New Roman" w:eastAsiaTheme="minorEastAsia" w:hAnsi="Times New Roman"/>
+                <w:sz w:val="22"/>
+                <w:szCs w:val="22"/>
+                <w:lang w:val="en-BE"/>
+              </w:rPr>
+            </w:pPr>
+            <w:r>
+              <w:rPr>
+                <w:rFonts w:ascii="Times New Roman" w:eastAsiaTheme="minorEastAsia" w:hAnsi="Times New Roman" w:cs="Times New Roman"/>
+                <w:sz w:val="22"/>
+                <w:szCs w:val="22"/>
+                <w:lang w:val="en-BE"/>
+              </w:rPr>
+              <w:t xml:space="preserve">Does the load arrive at the edge of the </w:t>
+            </w:r>
+            <w:proofErr w:type="gramStart"/>
+            <w:r>
+              <w:rPr>
+                <w:rFonts w:ascii="Times New Roman" w:eastAsiaTheme="minorEastAsia" w:hAnsi="Times New Roman" w:cs="Times New Roman"/>
+                <w:sz w:val="22"/>
+                <w:szCs w:val="22"/>
+                <w:lang w:val="en-BE"/>
+              </w:rPr>
+              <w:t>conveyor?:</w:t>
+            </w:r>
+            <w:proofErr w:type="gramEnd"/>
+            <w:r>
+              <w:rPr>
+                <w:rFonts w:ascii="Times New Roman" w:eastAsiaTheme="minorEastAsia" w:hAnsi="Times New Roman" w:cs="Times New Roman"/>
+                <w:sz w:val="22"/>
+                <w:szCs w:val="22"/>
+                <w:lang w:val="en-BE"/>
+              </w:rPr>
+              <w:t xml:space="preserve"> {{</w:t>
             </w:r>
             <w:proofErr w:type="spellStart"/>
             <w:r>
@@ -2666,17 +3275,47 @@
                 <w:szCs w:val="22"/>
                 <w:lang w:val="en-BE"/>
               </w:rPr>
-              <w:t>storage_layout</w:t>
+              <w:t>load_at_edge</w:t>
             </w:r>
             <w:proofErr w:type="spellEnd"/>
             <w:r>
               <w:rPr>
-                <w:rFonts w:ascii="Times New Roman" w:eastAsiaTheme="minorEastAsia" w:hAnsi="Times New Roman" w:cs="Times New Roman"/>
-                <w:sz w:val="22"/>
-                <w:szCs w:val="22"/>
-                <w:lang w:val="en-BE"/>
-              </w:rPr>
-              <w:t>}} Distance between 2 boxes stacked next to each other (Floor Stacking): {{</w:t>
+                <w:rFonts w:ascii="Times New Roman" w:eastAsiaTheme="minorEastAsia" w:hAnsi="Times New Roman"/>
+                <w:sz w:val="22"/>
+                <w:szCs w:val="22"/>
+                <w:lang w:val="en-BE"/>
+              </w:rPr>
+              <w:t>|default('N/A')</w:t>
+            </w:r>
+            <w:r>
+              <w:rPr>
+                <w:rFonts w:ascii="Times New Roman" w:eastAsiaTheme="minorEastAsia" w:hAnsi="Times New Roman" w:cs="Times New Roman"/>
+                <w:sz w:val="22"/>
+                <w:szCs w:val="22"/>
+                <w:lang w:val="en-BE"/>
+              </w:rPr>
+              <w:t>}}</w:t>
+            </w:r>
+          </w:p>
+          <w:p>
+            <w:pPr>
+              <w:spacing w:line="240" w:lineRule="auto"/>
+              <w:jc w:val="left"/>
+              <w:rPr>
+                <w:rFonts w:ascii="Times New Roman" w:eastAsiaTheme="minorEastAsia" w:hAnsi="Times New Roman"/>
+                <w:sz w:val="22"/>
+                <w:szCs w:val="22"/>
+                <w:lang w:val="en-BE"/>
+              </w:rPr>
+            </w:pPr>
+            <w:r>
+              <w:rPr>
+                <w:rFonts w:ascii="Times New Roman" w:eastAsiaTheme="minorEastAsia" w:hAnsi="Times New Roman" w:cs="Times New Roman"/>
+                <w:sz w:val="22"/>
+                <w:szCs w:val="22"/>
+                <w:lang w:val="en-BE"/>
+              </w:rPr>
+              <w:t xml:space="preserve"> If No - Distance from conveyor edge to pallet: {{</w:t>
             </w:r>
             <w:proofErr w:type="spellStart"/>
             <w:r>
@@ -2686,11 +3325,20 @@
                 <w:szCs w:val="22"/>
                 <w:lang w:val="en-BE"/>
               </w:rPr>
-              <w:t>box_distance_mm</w:t>
+              <w:t>distance_from_edge</w:t>
             </w:r>
             <w:proofErr w:type="spellEnd"/>
             <w:r>
               <w:rPr>
+                <w:rFonts w:ascii="Times New Roman" w:eastAsiaTheme="minorEastAsia" w:hAnsi="Times New Roman"/>
+                <w:sz w:val="22"/>
+                <w:szCs w:val="22"/>
+                <w:lang w:val="en-BE"/>
+              </w:rPr>
+              <w:t>|default('N/A')</w:t>
+            </w:r>
+            <w:r>
+              <w:rPr>
                 <w:rFonts w:ascii="Times New Roman" w:eastAsiaTheme="minorEastAsia" w:hAnsi="Times New Roman" w:cs="Times New Roman"/>
                 <w:sz w:val="22"/>
                 <w:szCs w:val="22"/>
@@ -2702,22 +3350,21 @@
           <w:p>
             <w:pPr>
               <w:spacing w:line="240" w:lineRule="auto"/>
-              <w:jc w:val="left"/>
-              <w:rPr>
-                <w:rFonts w:ascii="Times New Roman" w:eastAsiaTheme="minorEastAsia" w:hAnsi="Times New Roman" w:cs="Times New Roman"/>
-                <w:sz w:val="22"/>
-                <w:szCs w:val="22"/>
-                <w:lang w:val="en-BE"/>
-              </w:rPr>
-            </w:pPr>
-            <w:r>
-              <w:rPr>
-                <w:rFonts w:ascii="Times New Roman" w:eastAsiaTheme="minorEastAsia" w:hAnsi="Times New Roman" w:cs="Times New Roman"/>
-                <w:sz w:val="22"/>
-                <w:szCs w:val="22"/>
-                <w:lang w:val="en-BE"/>
-              </w:rPr>
-              <w:t>Aisle Width for Floor Stacking: {{</w:t>
+              <w:rPr>
+                <w:rFonts w:ascii="Times New Roman" w:eastAsiaTheme="minorEastAsia" w:hAnsi="Times New Roman"/>
+                <w:sz w:val="22"/>
+                <w:szCs w:val="22"/>
+                <w:lang w:val="en-BE"/>
+              </w:rPr>
+            </w:pPr>
+            <w:r>
+              <w:rPr>
+                <w:rFonts w:ascii="Times New Roman" w:eastAsiaTheme="minorEastAsia" w:hAnsi="Times New Roman" w:cs="Times New Roman"/>
+                <w:sz w:val="22"/>
+                <w:szCs w:val="22"/>
+                <w:lang w:val="en-BE"/>
+              </w:rPr>
+              <w:t>[Insert Conveyor Picture here] {{</w:t>
             </w:r>
             <w:proofErr w:type="spellStart"/>
             <w:r>
@@ -2727,193 +3374,18 @@
                 <w:szCs w:val="22"/>
                 <w:lang w:val="en-BE"/>
               </w:rPr>
-              <w:t>aisle_width_mm</w:t>
+              <w:t>conveyor_picture</w:t>
             </w:r>
             <w:proofErr w:type="spellEnd"/>
             <w:r>
               <w:rPr>
-                <w:rFonts w:ascii="Times New Roman" w:eastAsiaTheme="minorEastAsia" w:hAnsi="Times New Roman" w:cs="Times New Roman"/>
-                <w:sz w:val="22"/>
-                <w:szCs w:val="22"/>
-                <w:lang w:val="en-BE"/>
-              </w:rPr>
-              <w:t xml:space="preserve">}} mm </w:t>
-            </w:r>
-          </w:p>
-          <w:p>
-            <w:pPr>
-              <w:spacing w:line="240" w:lineRule="auto"/>
-              <w:jc w:val="left"/>
-              <w:rPr>
-                <w:rFonts w:ascii="Times New Roman" w:eastAsiaTheme="minorEastAsia" w:hAnsi="Times New Roman" w:cs="Times New Roman"/>
-                <w:sz w:val="22"/>
-                <w:szCs w:val="22"/>
-                <w:lang w:val="en-BE"/>
-              </w:rPr>
-            </w:pPr>
-            <w:r>
-              <w:rPr>
-                <w:rFonts w:ascii="Times New Roman" w:eastAsiaTheme="minorEastAsia" w:hAnsi="Times New Roman" w:cs="Times New Roman"/>
-                <w:sz w:val="22"/>
-                <w:szCs w:val="22"/>
-                <w:lang w:val="en-BE"/>
-              </w:rPr>
-              <w:t>Aisle Width for Rack Stacking (pallet to pallet): {{</w:t>
-            </w:r>
-            <w:proofErr w:type="spellStart"/>
-            <w:r>
-              <w:rPr>
-                <w:rFonts w:ascii="Times New Roman" w:eastAsiaTheme="minorEastAsia" w:hAnsi="Times New Roman" w:cs="Times New Roman"/>
-                <w:sz w:val="22"/>
-                <w:szCs w:val="22"/>
-                <w:lang w:val="en-BE"/>
-              </w:rPr>
-              <w:t>aisle_width_mm</w:t>
-            </w:r>
-            <w:proofErr w:type="spellEnd"/>
-            <w:r>
-              <w:rPr>
-                <w:rFonts w:ascii="Times New Roman" w:eastAsiaTheme="minorEastAsia" w:hAnsi="Times New Roman" w:cs="Times New Roman"/>
-                <w:sz w:val="22"/>
-                <w:szCs w:val="22"/>
-                <w:lang w:val="en-BE"/>
-              </w:rPr>
-              <w:t>}} mm Conveyor Height: {{</w:t>
-            </w:r>
-            <w:proofErr w:type="spellStart"/>
-            <w:r>
-              <w:rPr>
-                <w:rFonts w:ascii="Times New Roman" w:eastAsiaTheme="minorEastAsia" w:hAnsi="Times New Roman" w:cs="Times New Roman"/>
-                <w:sz w:val="22"/>
-                <w:szCs w:val="22"/>
-                <w:lang w:val="en-BE"/>
-              </w:rPr>
-              <w:t>conveyor_height</w:t>
-            </w:r>
-            <w:proofErr w:type="spellEnd"/>
-            <w:r>
-              <w:rPr>
-                <w:rFonts w:ascii="Times New Roman" w:eastAsiaTheme="minorEastAsia" w:hAnsi="Times New Roman" w:cs="Times New Roman"/>
-                <w:sz w:val="22"/>
-                <w:szCs w:val="22"/>
-                <w:lang w:val="en-BE"/>
-              </w:rPr>
-              <w:t xml:space="preserve">}} mm </w:t>
-            </w:r>
-          </w:p>
-          <w:p>
-            <w:pPr>
-              <w:spacing w:line="240" w:lineRule="auto"/>
-              <w:jc w:val="left"/>
-              <w:rPr>
-                <w:rFonts w:ascii="Times New Roman" w:eastAsiaTheme="minorEastAsia" w:hAnsi="Times New Roman" w:cs="Times New Roman"/>
-                <w:sz w:val="22"/>
-                <w:szCs w:val="22"/>
-                <w:lang w:val="en-BE"/>
-              </w:rPr>
-            </w:pPr>
-            <w:r>
-              <w:rPr>
-                <w:rFonts w:ascii="Times New Roman" w:eastAsiaTheme="minorEastAsia" w:hAnsi="Times New Roman" w:cs="Times New Roman"/>
-                <w:sz w:val="22"/>
-                <w:szCs w:val="22"/>
-                <w:lang w:val="en-BE"/>
-              </w:rPr>
-              <w:t>Does the load arrive at the edge of the conveyor?: {{</w:t>
-            </w:r>
-            <w:proofErr w:type="spellStart"/>
-            <w:r>
-              <w:rPr>
-                <w:rFonts w:ascii="Times New Roman" w:eastAsiaTheme="minorEastAsia" w:hAnsi="Times New Roman" w:cs="Times New Roman"/>
-                <w:sz w:val="22"/>
-                <w:szCs w:val="22"/>
-                <w:lang w:val="en-BE"/>
-              </w:rPr>
-              <w:t>load_at_edge</w:t>
-            </w:r>
-            <w:proofErr w:type="spellEnd"/>
-            <w:r>
-              <w:rPr>
-                <w:rFonts w:ascii="Times New Roman" w:eastAsiaTheme="minorEastAsia" w:hAnsi="Times New Roman" w:cs="Times New Roman"/>
-                <w:sz w:val="22"/>
-                <w:szCs w:val="22"/>
-                <w:lang w:val="en-BE"/>
-              </w:rPr>
-              <w:t>}}</w:t>
-            </w:r>
-          </w:p>
-          <w:p>
-            <w:pPr>
-              <w:spacing w:line="240" w:lineRule="auto"/>
-              <w:jc w:val="left"/>
-              <w:rPr>
-                <w:rFonts w:ascii="Times New Roman" w:eastAsiaTheme="minorEastAsia" w:hAnsi="Times New Roman" w:cs="Times New Roman"/>
-                <w:sz w:val="22"/>
-                <w:szCs w:val="22"/>
-                <w:lang w:val="en-BE"/>
-              </w:rPr>
-            </w:pPr>
-            <w:r>
-              <w:rPr>
-                <w:rFonts w:ascii="Times New Roman" w:eastAsiaTheme="minorEastAsia" w:hAnsi="Times New Roman" w:cs="Times New Roman"/>
-                <w:sz w:val="22"/>
-                <w:szCs w:val="22"/>
-                <w:lang w:val="en-BE"/>
-              </w:rPr>
-              <w:t xml:space="preserve"> If No - Distance from conveyor edge to pallet: {{</w:t>
-            </w:r>
-            <w:proofErr w:type="spellStart"/>
-            <w:r>
-              <w:rPr>
-                <w:rFonts w:ascii="Times New Roman" w:eastAsiaTheme="minorEastAsia" w:hAnsi="Times New Roman" w:cs="Times New Roman"/>
-                <w:sz w:val="22"/>
-                <w:szCs w:val="22"/>
-                <w:lang w:val="en-BE"/>
-              </w:rPr>
-              <w:t>distance_from_edge</w:t>
-            </w:r>
-            <w:proofErr w:type="spellEnd"/>
-            <w:r>
-              <w:rPr>
-                <w:rFonts w:ascii="Times New Roman" w:eastAsiaTheme="minorEastAsia" w:hAnsi="Times New Roman" w:cs="Times New Roman"/>
-                <w:sz w:val="22"/>
-                <w:szCs w:val="22"/>
-                <w:lang w:val="en-BE"/>
-              </w:rPr>
-              <w:t xml:space="preserve">}} mm </w:t>
-            </w:r>
-          </w:p>
-          <w:p>
-            <w:pPr>
-              <w:spacing w:line="240" w:lineRule="auto"/>
-              <w:jc w:val="left"/>
-              <w:rPr>
-                <w:rFonts w:ascii="Times New Roman" w:eastAsiaTheme="minorEastAsia" w:hAnsi="Times New Roman" w:cs="Times New Roman"/>
-                <w:sz w:val="22"/>
-                <w:szCs w:val="22"/>
-                <w:lang w:val="en-BE"/>
-              </w:rPr>
-            </w:pPr>
-            <w:r>
-              <w:rPr>
-                <w:rFonts w:ascii="Times New Roman" w:eastAsiaTheme="minorEastAsia" w:hAnsi="Times New Roman" w:cs="Times New Roman"/>
-                <w:sz w:val="22"/>
-                <w:szCs w:val="22"/>
-                <w:lang w:val="en-BE"/>
-              </w:rPr>
-              <w:t>[Insert Conveyor Picture here] {{</w:t>
-            </w:r>
-            <w:proofErr w:type="spellStart"/>
-            <w:r>
-              <w:rPr>
-                <w:rFonts w:ascii="Times New Roman" w:eastAsiaTheme="minorEastAsia" w:hAnsi="Times New Roman" w:cs="Times New Roman"/>
-                <w:sz w:val="22"/>
-                <w:szCs w:val="22"/>
-                <w:lang w:val="en-BE"/>
-              </w:rPr>
-              <w:t>conveyor_picture</w:t>
-            </w:r>
-            <w:proofErr w:type="spellEnd"/>
+                <w:rFonts w:ascii="Times New Roman" w:eastAsiaTheme="minorEastAsia" w:hAnsi="Times New Roman"/>
+                <w:sz w:val="22"/>
+                <w:szCs w:val="22"/>
+                <w:lang w:val="en-BE"/>
+              </w:rPr>
+              <w:t>|default('N/A')</w:t>
+            </w:r>
             <w:r>
               <w:rPr>
                 <w:rFonts w:ascii="Times New Roman" w:eastAsiaTheme="minorEastAsia" w:hAnsi="Times New Roman" w:cs="Times New Roman"/>
@@ -2971,9 +3443,8 @@
           <w:p>
             <w:pPr>
               <w:spacing w:line="240" w:lineRule="auto"/>
-              <w:jc w:val="left"/>
-              <w:rPr>
-                <w:rFonts w:ascii="Times New Roman" w:eastAsiaTheme="minorEastAsia" w:hAnsi="Times New Roman" w:cs="Times New Roman"/>
+              <w:rPr>
+                <w:rFonts w:ascii="Times New Roman" w:eastAsiaTheme="minorEastAsia" w:hAnsi="Times New Roman"/>
                 <w:sz w:val="22"/>
                 <w:szCs w:val="22"/>
                 <w:lang w:val="en-BE"/>
@@ -3001,6 +3472,15 @@
             <w:proofErr w:type="spellEnd"/>
             <w:r>
               <w:rPr>
+                <w:rFonts w:ascii="Times New Roman" w:eastAsiaTheme="minorEastAsia" w:hAnsi="Times New Roman"/>
+                <w:sz w:val="22"/>
+                <w:szCs w:val="22"/>
+                <w:lang w:val="en-BE"/>
+              </w:rPr>
+              <w:t>|default('N/A')</w:t>
+            </w:r>
+            <w:r>
+              <w:rPr>
                 <w:rFonts w:ascii="Times New Roman" w:eastAsiaTheme="minorEastAsia" w:hAnsi="Times New Roman" w:cs="Times New Roman"/>
                 <w:sz w:val="22"/>
                 <w:szCs w:val="22"/>
@@ -3012,9 +3492,8 @@
           <w:p>
             <w:pPr>
               <w:spacing w:line="240" w:lineRule="auto"/>
-              <w:jc w:val="left"/>
-              <w:rPr>
-                <w:rFonts w:ascii="Times New Roman" w:eastAsiaTheme="minorEastAsia" w:hAnsi="Times New Roman" w:cs="Times New Roman"/>
+              <w:rPr>
+                <w:rFonts w:ascii="Times New Roman" w:eastAsiaTheme="minorEastAsia" w:hAnsi="Times New Roman"/>
                 <w:sz w:val="22"/>
                 <w:szCs w:val="22"/>
                 <w:lang w:val="en-BE"/>
@@ -3040,6 +3519,15 @@
               <w:t>xna_model</w:t>
             </w:r>
             <w:proofErr w:type="spellEnd"/>
+            <w:r>
+              <w:rPr>
+                <w:rFonts w:ascii="Times New Roman" w:eastAsiaTheme="minorEastAsia" w:hAnsi="Times New Roman"/>
+                <w:sz w:val="22"/>
+                <w:szCs w:val="22"/>
+                <w:lang w:val="en-BE"/>
+              </w:rPr>
+              <w:t>|default('N/A')</w:t>
+            </w:r>
             <w:r>
               <w:rPr>
                 <w:rFonts w:ascii="Times New Roman" w:eastAsiaTheme="minorEastAsia" w:hAnsi="Times New Roman" w:cs="Times New Roman"/>
@@ -3137,6 +3625,7 @@
                 <w:szCs w:val="22"/>
               </w:rPr>
             </w:pPr>
+            <w:proofErr w:type="gramStart"/>
             <w:r>
               <w:rPr>
                 <w:rFonts w:ascii="Times New Roman" w:hAnsi="Times New Roman" w:cs="Times New Roman"/>
@@ -3145,6 +3634,7 @@
               </w:rPr>
               <w:t>Load</w:t>
             </w:r>
+            <w:proofErr w:type="gramEnd"/>
           </w:p>
           <w:p>
             <w:pPr>
@@ -3709,29 +4199,49 @@
             <w:pPr>
               <w:spacing w:line="240" w:lineRule="auto"/>
               <w:rPr>
-                <w:rFonts w:ascii="Times New Roman" w:eastAsiaTheme="minorEastAsia" w:hAnsi="Times New Roman" w:cs="Times New Roman"/>
-                <w:sz w:val="22"/>
-                <w:szCs w:val="22"/>
-                <w:lang w:val="en-BE"/>
-              </w:rPr>
-            </w:pPr>
-            <w:r>
-              <w:rPr>
-                <w:rFonts w:ascii="Times New Roman" w:eastAsiaTheme="minorEastAsia" w:hAnsi="Times New Roman"/>
-                <w:sz w:val="22"/>
-                <w:szCs w:val="22"/>
-                <w:lang w:val="en-BE"/>
-              </w:rPr>
-              <w:t>Pallet type/size:</w:t>
-            </w:r>
-            <w:r>
-              <w:rPr>
-                <w:rFonts w:ascii="Times New Roman" w:eastAsiaTheme="minorEastAsia" w:hAnsi="Times New Roman" w:cs="Times New Roman"/>
-                <w:sz w:val="22"/>
-                <w:szCs w:val="22"/>
-                <w:lang w:val="en-BE"/>
-              </w:rPr>
-              <w:t>{{</w:t>
+                <w:rFonts w:ascii="Times New Roman" w:eastAsiaTheme="minorEastAsia" w:hAnsi="Times New Roman"/>
+                <w:sz w:val="22"/>
+                <w:szCs w:val="22"/>
+                <w:lang w:val="en-BE"/>
+              </w:rPr>
+            </w:pPr>
+            <w:r>
+              <w:rPr>
+                <w:rFonts w:ascii="Times New Roman" w:eastAsiaTheme="minorEastAsia" w:hAnsi="Times New Roman"/>
+                <w:sz w:val="22"/>
+                <w:szCs w:val="22"/>
+                <w:lang w:val="en-BE"/>
+              </w:rPr>
+              <w:t>Pallet type/</w:t>
+            </w:r>
+            <w:proofErr w:type="gramStart"/>
+            <w:r>
+              <w:rPr>
+                <w:rFonts w:ascii="Times New Roman" w:eastAsiaTheme="minorEastAsia" w:hAnsi="Times New Roman"/>
+                <w:sz w:val="22"/>
+                <w:szCs w:val="22"/>
+                <w:lang w:val="en-BE"/>
+              </w:rPr>
+              <w:t>size:</w:t>
+            </w:r>
+            <w:r>
+              <w:rPr>
+                <w:rFonts w:ascii="Times New Roman" w:eastAsiaTheme="minorEastAsia" w:hAnsi="Times New Roman" w:cs="Times New Roman"/>
+                <w:sz w:val="22"/>
+                <w:szCs w:val="22"/>
+                <w:lang w:val="en-BE"/>
+              </w:rPr>
+              <w:t>{</w:t>
+            </w:r>
+            <w:proofErr w:type="gramEnd"/>
+            <w:r>
+              <w:rPr>
+                <w:rFonts w:ascii="Times New Roman" w:eastAsiaTheme="minorEastAsia" w:hAnsi="Times New Roman" w:cs="Times New Roman"/>
+                <w:sz w:val="22"/>
+                <w:szCs w:val="22"/>
+                <w:lang w:val="en-BE"/>
+              </w:rPr>
+              <w:t>{</w:t>
             </w:r>
             <w:proofErr w:type="spellStart"/>
             <w:r>
@@ -3746,6 +4256,15 @@
             <w:proofErr w:type="spellEnd"/>
             <w:r>
               <w:rPr>
+                <w:rFonts w:ascii="Times New Roman" w:eastAsiaTheme="minorEastAsia" w:hAnsi="Times New Roman"/>
+                <w:sz w:val="22"/>
+                <w:szCs w:val="22"/>
+                <w:lang w:val="en-BE"/>
+              </w:rPr>
+              <w:t>|default('N/A')</w:t>
+            </w:r>
+            <w:r>
+              <w:rPr>
                 <w:rFonts w:ascii="Times New Roman" w:eastAsiaTheme="minorEastAsia" w:hAnsi="Times New Roman" w:cs="Times New Roman"/>
                 <w:sz w:val="22"/>
                 <w:szCs w:val="22"/>
@@ -3757,9 +4276,8 @@
           <w:p>
             <w:pPr>
               <w:spacing w:line="240" w:lineRule="auto"/>
-              <w:jc w:val="left"/>
-              <w:rPr>
-                <w:rFonts w:ascii="Times New Roman" w:eastAsiaTheme="minorEastAsia" w:hAnsi="Times New Roman" w:cs="Times New Roman"/>
+              <w:rPr>
+                <w:rFonts w:ascii="Times New Roman" w:eastAsiaTheme="minorEastAsia" w:hAnsi="Times New Roman"/>
                 <w:sz w:val="22"/>
                 <w:szCs w:val="22"/>
                 <w:lang w:val="en-BE"/>
@@ -3787,6 +4305,15 @@
             <w:proofErr w:type="spellEnd"/>
             <w:r>
               <w:rPr>
+                <w:rFonts w:ascii="Times New Roman" w:eastAsiaTheme="minorEastAsia" w:hAnsi="Times New Roman"/>
+                <w:sz w:val="22"/>
+                <w:szCs w:val="22"/>
+                <w:lang w:val="en-BE"/>
+              </w:rPr>
+              <w:t>|default('N/A')</w:t>
+            </w:r>
+            <w:r>
+              <w:rPr>
                 <w:rFonts w:ascii="Times New Roman" w:eastAsiaTheme="minorEastAsia" w:hAnsi="Times New Roman" w:cs="Times New Roman"/>
                 <w:sz w:val="22"/>
                 <w:szCs w:val="22"/>
@@ -3798,9 +4325,8 @@
           <w:p>
             <w:pPr>
               <w:spacing w:line="240" w:lineRule="auto"/>
-              <w:jc w:val="left"/>
-              <w:rPr>
-                <w:rFonts w:ascii="Times New Roman" w:eastAsiaTheme="minorEastAsia" w:hAnsi="Times New Roman" w:cs="Times New Roman"/>
+              <w:rPr>
+                <w:rFonts w:ascii="Times New Roman" w:eastAsiaTheme="minorEastAsia" w:hAnsi="Times New Roman"/>
                 <w:sz w:val="22"/>
                 <w:szCs w:val="22"/>
                 <w:lang w:val="en-BE"/>
@@ -3828,6 +4354,15 @@
             <w:proofErr w:type="spellEnd"/>
             <w:r>
               <w:rPr>
+                <w:rFonts w:ascii="Times New Roman" w:eastAsiaTheme="minorEastAsia" w:hAnsi="Times New Roman"/>
+                <w:sz w:val="22"/>
+                <w:szCs w:val="22"/>
+                <w:lang w:val="en-BE"/>
+              </w:rPr>
+              <w:t>|default('N/A')</w:t>
+            </w:r>
+            <w:r>
+              <w:rPr>
                 <w:rFonts w:ascii="Times New Roman" w:eastAsiaTheme="minorEastAsia" w:hAnsi="Times New Roman" w:cs="Times New Roman"/>
                 <w:sz w:val="22"/>
                 <w:szCs w:val="22"/>
@@ -3839,9 +4374,8 @@
           <w:p>
             <w:pPr>
               <w:spacing w:line="240" w:lineRule="auto"/>
-              <w:jc w:val="left"/>
-              <w:rPr>
-                <w:rFonts w:ascii="Times New Roman" w:eastAsiaTheme="minorEastAsia" w:hAnsi="Times New Roman" w:cs="Times New Roman"/>
+              <w:rPr>
+                <w:rFonts w:ascii="Times New Roman" w:eastAsiaTheme="minorEastAsia" w:hAnsi="Times New Roman"/>
                 <w:sz w:val="22"/>
                 <w:szCs w:val="22"/>
                 <w:lang w:val="en-BE"/>
@@ -3867,6 +4401,15 @@
               <w:t>other_pallet_dimensions</w:t>
             </w:r>
             <w:proofErr w:type="spellEnd"/>
+            <w:r>
+              <w:rPr>
+                <w:rFonts w:ascii="Times New Roman" w:eastAsiaTheme="minorEastAsia" w:hAnsi="Times New Roman"/>
+                <w:sz w:val="22"/>
+                <w:szCs w:val="22"/>
+                <w:lang w:val="en-BE"/>
+              </w:rPr>
+              <w:t>|default('N/A')</w:t>
+            </w:r>
             <w:r>
               <w:rPr>
                 <w:rFonts w:ascii="Times New Roman" w:eastAsiaTheme="minorEastAsia" w:hAnsi="Times New Roman" w:cs="Times New Roman"/>
@@ -4030,7 +4573,7 @@
           <w:p>
             <w:pPr>
               <w:rPr>
-                <w:rFonts w:ascii="Times New Roman" w:eastAsiaTheme="minorEastAsia" w:hAnsi="Times New Roman" w:cs="Times New Roman"/>
+                <w:rFonts w:ascii="Times New Roman" w:eastAsiaTheme="minorEastAsia" w:hAnsi="Times New Roman"/>
                 <w:sz w:val="22"/>
                 <w:szCs w:val="22"/>
                 <w:lang w:val="en-BE"/>
@@ -4058,6 +4601,15 @@
             <w:proofErr w:type="spellEnd"/>
             <w:r>
               <w:rPr>
+                <w:rFonts w:ascii="Times New Roman" w:eastAsiaTheme="minorEastAsia" w:hAnsi="Times New Roman"/>
+                <w:sz w:val="22"/>
+                <w:szCs w:val="22"/>
+                <w:lang w:val="en-BE"/>
+              </w:rPr>
+              <w:t>|default('N/A')</w:t>
+            </w:r>
+            <w:r>
+              <w:rPr>
                 <w:rFonts w:ascii="Times New Roman" w:eastAsiaTheme="minorEastAsia" w:hAnsi="Times New Roman" w:cs="Times New Roman"/>
                 <w:sz w:val="22"/>
                 <w:szCs w:val="22"/>
@@ -4069,7 +4621,7 @@
           <w:p>
             <w:pPr>
               <w:rPr>
-                <w:rFonts w:ascii="Times New Roman" w:eastAsiaTheme="minorEastAsia" w:hAnsi="Times New Roman" w:cs="Times New Roman"/>
+                <w:rFonts w:ascii="Times New Roman" w:eastAsiaTheme="minorEastAsia" w:hAnsi="Times New Roman"/>
                 <w:sz w:val="22"/>
                 <w:szCs w:val="22"/>
                 <w:lang w:val="en-BE"/>
@@ -4095,6 +4647,15 @@
               <w:t>load_dimensions</w:t>
             </w:r>
             <w:proofErr w:type="spellEnd"/>
+            <w:r>
+              <w:rPr>
+                <w:rFonts w:ascii="Times New Roman" w:eastAsiaTheme="minorEastAsia" w:hAnsi="Times New Roman"/>
+                <w:sz w:val="22"/>
+                <w:szCs w:val="22"/>
+                <w:lang w:val="en-BE"/>
+              </w:rPr>
+              <w:t>|default('N/A')</w:t>
+            </w:r>
             <w:r>
               <w:rPr>
                 <w:rFonts w:ascii="Times New Roman" w:eastAsiaTheme="minorEastAsia" w:hAnsi="Times New Roman" w:cs="Times New Roman"/>
@@ -4221,29 +4782,49 @@
             <w:pPr>
               <w:spacing w:line="240" w:lineRule="auto"/>
               <w:rPr>
-                <w:rFonts w:ascii="Times New Roman" w:eastAsiaTheme="minorEastAsia" w:hAnsi="Times New Roman" w:cs="Times New Roman"/>
-                <w:sz w:val="22"/>
-                <w:szCs w:val="22"/>
-                <w:lang w:val="en-BE"/>
-              </w:rPr>
-            </w:pPr>
-            <w:r>
-              <w:rPr>
-                <w:rFonts w:ascii="Times New Roman" w:eastAsiaTheme="minorEastAsia" w:hAnsi="Times New Roman" w:cs="Times New Roman"/>
-                <w:sz w:val="22"/>
-                <w:szCs w:val="22"/>
-                <w:lang w:val="en-BE"/>
-              </w:rPr>
-              <w:t>Peak Efficiency:</w:t>
-            </w:r>
-            <w:r>
-              <w:rPr>
-                <w:rFonts w:ascii="Times New Roman" w:eastAsiaTheme="minorEastAsia" w:hAnsi="Times New Roman" w:cs="Times New Roman"/>
-                <w:sz w:val="22"/>
-                <w:szCs w:val="22"/>
-                <w:lang w:val="en-BE"/>
-              </w:rPr>
-              <w:t>{{</w:t>
+                <w:rFonts w:ascii="Times New Roman" w:eastAsiaTheme="minorEastAsia" w:hAnsi="Times New Roman"/>
+                <w:sz w:val="22"/>
+                <w:szCs w:val="22"/>
+                <w:lang w:val="en-BE"/>
+              </w:rPr>
+            </w:pPr>
+            <w:r>
+              <w:rPr>
+                <w:rFonts w:ascii="Times New Roman" w:eastAsiaTheme="minorEastAsia" w:hAnsi="Times New Roman" w:cs="Times New Roman"/>
+                <w:sz w:val="22"/>
+                <w:szCs w:val="22"/>
+                <w:lang w:val="en-BE"/>
+              </w:rPr>
+              <w:t xml:space="preserve">Peak </w:t>
+            </w:r>
+            <w:proofErr w:type="gramStart"/>
+            <w:r>
+              <w:rPr>
+                <w:rFonts w:ascii="Times New Roman" w:eastAsiaTheme="minorEastAsia" w:hAnsi="Times New Roman" w:cs="Times New Roman"/>
+                <w:sz w:val="22"/>
+                <w:szCs w:val="22"/>
+                <w:lang w:val="en-BE"/>
+              </w:rPr>
+              <w:t>Efficiency:</w:t>
+            </w:r>
+            <w:r>
+              <w:rPr>
+                <w:rFonts w:ascii="Times New Roman" w:eastAsiaTheme="minorEastAsia" w:hAnsi="Times New Roman" w:cs="Times New Roman"/>
+                <w:sz w:val="22"/>
+                <w:szCs w:val="22"/>
+                <w:lang w:val="en-BE"/>
+              </w:rPr>
+              <w:t>{</w:t>
+            </w:r>
+            <w:proofErr w:type="gramEnd"/>
+            <w:r>
+              <w:rPr>
+                <w:rFonts w:ascii="Times New Roman" w:eastAsiaTheme="minorEastAsia" w:hAnsi="Times New Roman" w:cs="Times New Roman"/>
+                <w:sz w:val="22"/>
+                <w:szCs w:val="22"/>
+                <w:lang w:val="en-BE"/>
+              </w:rPr>
+              <w:t>{</w:t>
             </w:r>
             <w:proofErr w:type="spellStart"/>
             <w:r>
@@ -4258,6 +4839,15 @@
             <w:proofErr w:type="spellEnd"/>
             <w:r>
               <w:rPr>
+                <w:rFonts w:ascii="Times New Roman" w:eastAsiaTheme="minorEastAsia" w:hAnsi="Times New Roman"/>
+                <w:sz w:val="22"/>
+                <w:szCs w:val="22"/>
+                <w:lang w:val="en-BE"/>
+              </w:rPr>
+              <w:t>|default('N/A')</w:t>
+            </w:r>
+            <w:r>
+              <w:rPr>
                 <w:rFonts w:ascii="Times New Roman" w:eastAsiaTheme="minorEastAsia" w:hAnsi="Times New Roman" w:cs="Times New Roman"/>
                 <w:sz w:val="22"/>
                 <w:szCs w:val="22"/>
@@ -4270,7 +4860,7 @@
             <w:pPr>
               <w:spacing w:line="240" w:lineRule="auto"/>
               <w:rPr>
-                <w:rFonts w:ascii="Times New Roman" w:eastAsiaTheme="minorEastAsia" w:hAnsi="Times New Roman" w:cs="Times New Roman"/>
+                <w:rFonts w:ascii="Times New Roman" w:eastAsiaTheme="minorEastAsia" w:hAnsi="Times New Roman"/>
                 <w:sz w:val="22"/>
                 <w:szCs w:val="22"/>
                 <w:lang w:val="en-BE"/>
@@ -4298,6 +4888,15 @@
             <w:proofErr w:type="spellEnd"/>
             <w:r>
               <w:rPr>
+                <w:rFonts w:ascii="Times New Roman" w:eastAsiaTheme="minorEastAsia" w:hAnsi="Times New Roman"/>
+                <w:sz w:val="22"/>
+                <w:szCs w:val="22"/>
+                <w:lang w:val="en-BE"/>
+              </w:rPr>
+              <w:t>|default('N/A')</w:t>
+            </w:r>
+            <w:r>
+              <w:rPr>
                 <w:rFonts w:ascii="Times New Roman" w:eastAsiaTheme="minorEastAsia" w:hAnsi="Times New Roman" w:cs="Times New Roman"/>
                 <w:sz w:val="22"/>
                 <w:szCs w:val="22"/>
@@ -4310,7 +4909,7 @@
             <w:pPr>
               <w:spacing w:line="240" w:lineRule="auto"/>
               <w:rPr>
-                <w:rFonts w:ascii="Times New Roman" w:eastAsiaTheme="minorEastAsia" w:hAnsi="Times New Roman" w:cs="Times New Roman"/>
+                <w:rFonts w:ascii="Times New Roman" w:eastAsiaTheme="minorEastAsia" w:hAnsi="Times New Roman"/>
                 <w:sz w:val="22"/>
                 <w:szCs w:val="22"/>
                 <w:lang w:val="en-BE"/>
@@ -4338,6 +4937,15 @@
             <w:proofErr w:type="spellEnd"/>
             <w:r>
               <w:rPr>
+                <w:rFonts w:ascii="Times New Roman" w:eastAsiaTheme="minorEastAsia" w:hAnsi="Times New Roman"/>
+                <w:sz w:val="22"/>
+                <w:szCs w:val="22"/>
+                <w:lang w:val="en-BE"/>
+              </w:rPr>
+              <w:t>|default('N/A')</w:t>
+            </w:r>
+            <w:r>
+              <w:rPr>
                 <w:rFonts w:ascii="Times New Roman" w:eastAsiaTheme="minorEastAsia" w:hAnsi="Times New Roman" w:cs="Times New Roman"/>
                 <w:sz w:val="22"/>
                 <w:szCs w:val="22"/>
@@ -4350,7 +4958,7 @@
             <w:pPr>
               <w:spacing w:line="240" w:lineRule="auto"/>
               <w:rPr>
-                <w:rFonts w:ascii="Times New Roman" w:eastAsiaTheme="minorEastAsia" w:hAnsi="Times New Roman" w:cs="Times New Roman"/>
+                <w:rFonts w:ascii="Times New Roman" w:eastAsiaTheme="minorEastAsia" w:hAnsi="Times New Roman"/>
                 <w:sz w:val="22"/>
                 <w:szCs w:val="22"/>
                 <w:lang w:val="en-BE"/>
@@ -4376,6 +4984,15 @@
               <w:t>pallets_per_hour</w:t>
             </w:r>
             <w:proofErr w:type="spellEnd"/>
+            <w:r>
+              <w:rPr>
+                <w:rFonts w:ascii="Times New Roman" w:eastAsiaTheme="minorEastAsia" w:hAnsi="Times New Roman"/>
+                <w:sz w:val="22"/>
+                <w:szCs w:val="22"/>
+                <w:lang w:val="en-BE"/>
+              </w:rPr>
+              <w:t>|default('N/A')</w:t>
+            </w:r>
             <w:r>
               <w:rPr>
                 <w:rFonts w:ascii="Times New Roman" w:eastAsiaTheme="minorEastAsia" w:hAnsi="Times New Roman" w:cs="Times New Roman"/>
@@ -4565,6 +5182,15 @@
                 <w:szCs w:val="22"/>
                 <w:lang w:val="en-BE"/>
               </w:rPr>
+              <w:t>|default('N/A')</w:t>
+            </w:r>
+            <w:r>
+              <w:rPr>
+                <w:rFonts w:ascii="Times New Roman" w:eastAsiaTheme="minorEastAsia" w:hAnsi="Times New Roman"/>
+                <w:sz w:val="22"/>
+                <w:szCs w:val="22"/>
+                <w:lang w:val="en-BE"/>
+              </w:rPr>
               <w:t xml:space="preserve">}} m </w:t>
             </w:r>
           </w:p>
@@ -4598,6 +5224,15 @@
               <w:t>min_transport_m</w:t>
             </w:r>
             <w:proofErr w:type="spellEnd"/>
+            <w:r>
+              <w:rPr>
+                <w:rFonts w:ascii="Times New Roman" w:eastAsiaTheme="minorEastAsia" w:hAnsi="Times New Roman"/>
+                <w:sz w:val="22"/>
+                <w:szCs w:val="22"/>
+                <w:lang w:val="en-BE"/>
+              </w:rPr>
+              <w:t>|default('N/A')</w:t>
+            </w:r>
             <w:r>
               <w:rPr>
                 <w:rFonts w:ascii="Times New Roman" w:eastAsiaTheme="minorEastAsia" w:hAnsi="Times New Roman"/>
@@ -4627,6 +5262,7 @@
                 <w:szCs w:val="22"/>
                 <w:lang w:val="en-BE"/>
               </w:rPr>
+              <w:lastRenderedPageBreak/>
               <w:t>Average Transport Distance: {{</w:t>
             </w:r>
             <w:proofErr w:type="spellStart"/>
@@ -4640,6 +5276,15 @@
               <w:t>avg_transport_m</w:t>
             </w:r>
             <w:proofErr w:type="spellEnd"/>
+            <w:r>
+              <w:rPr>
+                <w:rFonts w:ascii="Times New Roman" w:eastAsiaTheme="minorEastAsia" w:hAnsi="Times New Roman"/>
+                <w:sz w:val="22"/>
+                <w:szCs w:val="22"/>
+                <w:lang w:val="en-BE"/>
+              </w:rPr>
+              <w:t>|default('N/A')</w:t>
+            </w:r>
             <w:r>
               <w:rPr>
                 <w:rFonts w:ascii="Times New Roman" w:eastAsiaTheme="minorEastAsia" w:hAnsi="Times New Roman"/>
@@ -4665,7 +5310,6 @@
                 <w:rFonts w:ascii="Times New Roman" w:eastAsiaTheme="minorEastAsia" w:hAnsi="Times New Roman" w:cs="Times New Roman"/>
                 <w:sz w:val="22"/>
                 <w:szCs w:val="22"/>
-                <w:lang w:val="fr-BE"/>
               </w:rPr>
             </w:pPr>
           </w:p>
@@ -4691,7 +5335,6 @@
                 <w:rFonts w:ascii="Times New Roman" w:eastAsiaTheme="minorEastAsia" w:hAnsi="Times New Roman" w:cs="Times New Roman"/>
                 <w:sz w:val="22"/>
                 <w:szCs w:val="22"/>
-                <w:lang w:val="fr-BE"/>
               </w:rPr>
             </w:pPr>
           </w:p>
@@ -4710,7 +5353,6 @@
                 <w:rFonts w:ascii="Times New Roman" w:hAnsi="Times New Roman" w:cs="Times New Roman"/>
                 <w:sz w:val="22"/>
                 <w:szCs w:val="22"/>
-                <w:lang w:val="fr-BE"/>
               </w:rPr>
             </w:pPr>
           </w:p>
@@ -4828,9 +5470,8 @@
           <w:p>
             <w:pPr>
               <w:spacing w:line="240" w:lineRule="auto"/>
-              <w:jc w:val="left"/>
-              <w:rPr>
-                <w:rFonts w:ascii="Times New Roman" w:eastAsiaTheme="minorEastAsia" w:hAnsi="Times New Roman" w:cs="Times New Roman"/>
+              <w:rPr>
+                <w:rFonts w:ascii="Times New Roman" w:eastAsiaTheme="minorEastAsia" w:hAnsi="Times New Roman"/>
                 <w:sz w:val="22"/>
                 <w:szCs w:val="22"/>
                 <w:lang w:val="en-BE"/>
@@ -4858,6 +5499,15 @@
             <w:proofErr w:type="spellEnd"/>
             <w:r>
               <w:rPr>
+                <w:rFonts w:ascii="Times New Roman" w:eastAsiaTheme="minorEastAsia" w:hAnsi="Times New Roman"/>
+                <w:sz w:val="22"/>
+                <w:szCs w:val="22"/>
+                <w:lang w:val="en-BE"/>
+              </w:rPr>
+              <w:t>|default('N/A')</w:t>
+            </w:r>
+            <w:r>
+              <w:rPr>
                 <w:rFonts w:ascii="Times New Roman" w:eastAsiaTheme="minorEastAsia" w:hAnsi="Times New Roman" w:cs="Times New Roman"/>
                 <w:sz w:val="22"/>
                 <w:szCs w:val="22"/>
@@ -4869,9 +5519,8 @@
           <w:p>
             <w:pPr>
               <w:spacing w:line="240" w:lineRule="auto"/>
-              <w:jc w:val="left"/>
-              <w:rPr>
-                <w:rFonts w:ascii="Times New Roman" w:eastAsiaTheme="minorEastAsia" w:hAnsi="Times New Roman" w:cs="Times New Roman"/>
+              <w:rPr>
+                <w:rFonts w:ascii="Times New Roman" w:eastAsiaTheme="minorEastAsia" w:hAnsi="Times New Roman"/>
                 <w:sz w:val="22"/>
                 <w:szCs w:val="22"/>
                 <w:lang w:val="en-BE"/>
@@ -4899,6 +5548,15 @@
             <w:proofErr w:type="spellEnd"/>
             <w:r>
               <w:rPr>
+                <w:rFonts w:ascii="Times New Roman" w:eastAsiaTheme="minorEastAsia" w:hAnsi="Times New Roman"/>
+                <w:sz w:val="22"/>
+                <w:szCs w:val="22"/>
+                <w:lang w:val="en-BE"/>
+              </w:rPr>
+              <w:t>|default('N/A')</w:t>
+            </w:r>
+            <w:r>
+              <w:rPr>
                 <w:rFonts w:ascii="Times New Roman" w:eastAsiaTheme="minorEastAsia" w:hAnsi="Times New Roman" w:cs="Times New Roman"/>
                 <w:sz w:val="22"/>
                 <w:szCs w:val="22"/>
@@ -4910,9 +5568,8 @@
           <w:p>
             <w:pPr>
               <w:spacing w:line="240" w:lineRule="auto"/>
-              <w:jc w:val="left"/>
-              <w:rPr>
-                <w:rFonts w:ascii="Times New Roman" w:eastAsiaTheme="minorEastAsia" w:hAnsi="Times New Roman" w:cs="Times New Roman"/>
+              <w:rPr>
+                <w:rFonts w:ascii="Times New Roman" w:eastAsiaTheme="minorEastAsia" w:hAnsi="Times New Roman"/>
                 <w:sz w:val="22"/>
                 <w:szCs w:val="22"/>
                 <w:lang w:val="en-BE"/>
@@ -4938,6 +5595,15 @@
               <w:t>peak_congestion</w:t>
             </w:r>
             <w:proofErr w:type="spellEnd"/>
+            <w:r>
+              <w:rPr>
+                <w:rFonts w:ascii="Times New Roman" w:eastAsiaTheme="minorEastAsia" w:hAnsi="Times New Roman"/>
+                <w:sz w:val="22"/>
+                <w:szCs w:val="22"/>
+                <w:lang w:val="en-BE"/>
+              </w:rPr>
+              <w:t>|default('N/A')</w:t>
+            </w:r>
             <w:r>
               <w:rPr>
                 <w:rFonts w:ascii="Times New Roman" w:eastAsiaTheme="minorEastAsia" w:hAnsi="Times New Roman" w:cs="Times New Roman"/>
@@ -5119,6 +5785,15 @@
                 <w:szCs w:val="22"/>
                 <w:lang w:val="en-BE"/>
               </w:rPr>
+              <w:t>|default('N/A')</w:t>
+            </w:r>
+            <w:r>
+              <w:rPr>
+                <w:rFonts w:ascii="Times New Roman" w:eastAsiaTheme="minorEastAsia" w:hAnsi="Times New Roman"/>
+                <w:sz w:val="22"/>
+                <w:szCs w:val="22"/>
+                <w:lang w:val="en-BE"/>
+              </w:rPr>
               <w:t>}}</w:t>
             </w:r>
           </w:p>
@@ -5289,6 +5964,15 @@
                 <w:szCs w:val="22"/>
                 <w:lang w:val="en-BE"/>
               </w:rPr>
+              <w:t>|default('N/A')</w:t>
+            </w:r>
+            <w:r>
+              <w:rPr>
+                <w:rFonts w:ascii="Times New Roman" w:eastAsiaTheme="minorEastAsia" w:hAnsi="Times New Roman"/>
+                <w:sz w:val="22"/>
+                <w:szCs w:val="22"/>
+                <w:lang w:val="en-BE"/>
+              </w:rPr>
               <w:t xml:space="preserve">}} </w:t>
             </w:r>
           </w:p>
@@ -5329,6 +6013,15 @@
                 <w:szCs w:val="22"/>
                 <w:lang w:val="en-BE"/>
               </w:rPr>
+              <w:t>|default('N/A')</w:t>
+            </w:r>
+            <w:r>
+              <w:rPr>
+                <w:rFonts w:ascii="Times New Roman" w:eastAsiaTheme="minorEastAsia" w:hAnsi="Times New Roman"/>
+                <w:sz w:val="22"/>
+                <w:szCs w:val="22"/>
+                <w:lang w:val="en-BE"/>
+              </w:rPr>
               <w:t xml:space="preserve">}} </w:t>
             </w:r>
           </w:p>
@@ -5369,7 +6062,128 @@
                 <w:szCs w:val="22"/>
                 <w:lang w:val="en-BE"/>
               </w:rPr>
-              <w:t>}} Distances between steps: {{distances}} Photos: [Insert Photos here] {{logistics_image1}} {{logistics_image2}} {{logistics_image3}} etc. CAD / Layout File: {{</w:t>
+              <w:t>|default('N/A')</w:t>
+            </w:r>
+            <w:r>
+              <w:rPr>
+                <w:rFonts w:ascii="Times New Roman" w:eastAsiaTheme="minorEastAsia" w:hAnsi="Times New Roman"/>
+                <w:sz w:val="22"/>
+                <w:szCs w:val="22"/>
+                <w:lang w:val="en-BE"/>
+              </w:rPr>
+              <w:t xml:space="preserve">}} </w:t>
+            </w:r>
+          </w:p>
+          <w:p>
+            <w:pPr>
+              <w:pStyle w:val="NormalWeb"/>
+              <w:rPr>
+                <w:rFonts w:ascii="Times New Roman" w:eastAsiaTheme="minorEastAsia" w:hAnsi="Times New Roman"/>
+                <w:sz w:val="22"/>
+                <w:szCs w:val="22"/>
+                <w:lang w:val="en-BE"/>
+              </w:rPr>
+            </w:pPr>
+            <w:r>
+              <w:rPr>
+                <w:rFonts w:ascii="Times New Roman" w:eastAsiaTheme="minorEastAsia" w:hAnsi="Times New Roman"/>
+                <w:sz w:val="22"/>
+                <w:szCs w:val="22"/>
+                <w:lang w:val="en-BE"/>
+              </w:rPr>
+              <w:t>Distances between steps: {{distances</w:t>
+            </w:r>
+            <w:r>
+              <w:rPr>
+                <w:rFonts w:ascii="Times New Roman" w:eastAsiaTheme="minorEastAsia" w:hAnsi="Times New Roman"/>
+                <w:sz w:val="22"/>
+                <w:szCs w:val="22"/>
+                <w:lang w:val="en-BE"/>
+              </w:rPr>
+              <w:t>|default('N/A')</w:t>
+            </w:r>
+            <w:r>
+              <w:rPr>
+                <w:rFonts w:ascii="Times New Roman" w:eastAsiaTheme="minorEastAsia" w:hAnsi="Times New Roman"/>
+                <w:sz w:val="22"/>
+                <w:szCs w:val="22"/>
+                <w:lang w:val="en-BE"/>
+              </w:rPr>
+              <w:t xml:space="preserve">}} </w:t>
+            </w:r>
+          </w:p>
+          <w:p>
+            <w:pPr>
+              <w:pStyle w:val="NormalWeb"/>
+              <w:rPr>
+                <w:rFonts w:ascii="Times New Roman" w:eastAsiaTheme="minorEastAsia" w:hAnsi="Times New Roman"/>
+                <w:sz w:val="22"/>
+                <w:szCs w:val="22"/>
+                <w:lang w:val="en-BE"/>
+              </w:rPr>
+            </w:pPr>
+            <w:r>
+              <w:rPr>
+                <w:rFonts w:ascii="Times New Roman" w:eastAsiaTheme="minorEastAsia" w:hAnsi="Times New Roman"/>
+                <w:sz w:val="22"/>
+                <w:szCs w:val="22"/>
+                <w:lang w:val="en-BE"/>
+              </w:rPr>
+              <w:t>Photos: [Insert Photos here] {{logistics_image1</w:t>
+            </w:r>
+            <w:r>
+              <w:rPr>
+                <w:rFonts w:ascii="Times New Roman" w:eastAsiaTheme="minorEastAsia" w:hAnsi="Times New Roman"/>
+                <w:sz w:val="22"/>
+                <w:szCs w:val="22"/>
+                <w:lang w:val="en-BE"/>
+              </w:rPr>
+              <w:t>|default('N/A')</w:t>
+            </w:r>
+            <w:r>
+              <w:rPr>
+                <w:rFonts w:ascii="Times New Roman" w:eastAsiaTheme="minorEastAsia" w:hAnsi="Times New Roman"/>
+                <w:sz w:val="22"/>
+                <w:szCs w:val="22"/>
+                <w:lang w:val="en-BE"/>
+              </w:rPr>
+              <w:t>}} {{logistics_image2</w:t>
+            </w:r>
+            <w:r>
+              <w:rPr>
+                <w:rFonts w:ascii="Times New Roman" w:eastAsiaTheme="minorEastAsia" w:hAnsi="Times New Roman"/>
+                <w:sz w:val="22"/>
+                <w:szCs w:val="22"/>
+                <w:lang w:val="en-BE"/>
+              </w:rPr>
+              <w:t>|default('N/A')</w:t>
+            </w:r>
+            <w:r>
+              <w:rPr>
+                <w:rFonts w:ascii="Times New Roman" w:eastAsiaTheme="minorEastAsia" w:hAnsi="Times New Roman"/>
+                <w:sz w:val="22"/>
+                <w:szCs w:val="22"/>
+                <w:lang w:val="en-BE"/>
+              </w:rPr>
+              <w:t>}} {{logistics_image3</w:t>
+            </w:r>
+            <w:r>
+              <w:rPr>
+                <w:rFonts w:ascii="Times New Roman" w:eastAsiaTheme="minorEastAsia" w:hAnsi="Times New Roman"/>
+                <w:sz w:val="22"/>
+                <w:szCs w:val="22"/>
+                <w:lang w:val="en-BE"/>
+              </w:rPr>
+              <w:t>|default('N/A')</w:t>
+            </w:r>
+            <w:r>
+              <w:rPr>
+                <w:rFonts w:ascii="Times New Roman" w:eastAsiaTheme="minorEastAsia" w:hAnsi="Times New Roman"/>
+                <w:sz w:val="22"/>
+                <w:szCs w:val="22"/>
+                <w:lang w:val="en-BE"/>
+              </w:rPr>
+              <w:t>}} etc. CAD / Layout File: {{</w:t>
             </w:r>
             <w:proofErr w:type="spellStart"/>
             <w:r>
@@ -5382,6 +6196,15 @@
               <w:t>cad_filename</w:t>
             </w:r>
             <w:proofErr w:type="spellEnd"/>
+            <w:r>
+              <w:rPr>
+                <w:rFonts w:ascii="Times New Roman" w:eastAsiaTheme="minorEastAsia" w:hAnsi="Times New Roman"/>
+                <w:sz w:val="22"/>
+                <w:szCs w:val="22"/>
+                <w:lang w:val="en-BE"/>
+              </w:rPr>
+              <w:t>|default('N/A')</w:t>
+            </w:r>
             <w:r>
               <w:rPr>
                 <w:rFonts w:ascii="Times New Roman" w:eastAsiaTheme="minorEastAsia" w:hAnsi="Times New Roman"/>
@@ -5582,6 +6405,15 @@
                 <w:szCs w:val="22"/>
                 <w:lang w:val="en-BE"/>
               </w:rPr>
+              <w:t>|default('N/A')</w:t>
+            </w:r>
+            <w:r>
+              <w:rPr>
+                <w:rFonts w:ascii="Times New Roman" w:eastAsiaTheme="minorEastAsia" w:hAnsi="Times New Roman"/>
+                <w:sz w:val="22"/>
+                <w:szCs w:val="22"/>
+                <w:lang w:val="en-BE"/>
+              </w:rPr>
               <w:t>}}</w:t>
             </w:r>
           </w:p>
@@ -5589,7 +6421,7 @@
             <w:pPr>
               <w:spacing w:line="240" w:lineRule="auto"/>
               <w:rPr>
-                <w:rFonts w:ascii="Times New Roman" w:eastAsiaTheme="minorEastAsia" w:hAnsi="Times New Roman" w:cs="Times New Roman"/>
+                <w:rFonts w:ascii="Times New Roman" w:eastAsiaTheme="minorEastAsia" w:hAnsi="Times New Roman"/>
                 <w:sz w:val="22"/>
                 <w:szCs w:val="22"/>
                 <w:lang w:val="en-BE"/>
@@ -5617,6 +6449,15 @@
             <w:proofErr w:type="spellEnd"/>
             <w:r>
               <w:rPr>
+                <w:rFonts w:ascii="Times New Roman" w:eastAsiaTheme="minorEastAsia" w:hAnsi="Times New Roman"/>
+                <w:sz w:val="22"/>
+                <w:szCs w:val="22"/>
+                <w:lang w:val="en-BE"/>
+              </w:rPr>
+              <w:t>|default('N/A')</w:t>
+            </w:r>
+            <w:r>
+              <w:rPr>
                 <w:rFonts w:ascii="Times New Roman" w:eastAsiaTheme="minorEastAsia" w:hAnsi="Times New Roman" w:cs="Times New Roman"/>
                 <w:sz w:val="22"/>
                 <w:szCs w:val="22"/>
@@ -5629,7 +6470,7 @@
             <w:pPr>
               <w:spacing w:line="240" w:lineRule="auto"/>
               <w:rPr>
-                <w:rFonts w:ascii="Times New Roman" w:eastAsiaTheme="minorEastAsia" w:hAnsi="Times New Roman" w:cs="Times New Roman"/>
+                <w:rFonts w:ascii="Times New Roman" w:eastAsiaTheme="minorEastAsia" w:hAnsi="Times New Roman"/>
                 <w:sz w:val="22"/>
                 <w:szCs w:val="22"/>
                 <w:lang w:val="en-BE"/>
@@ -5655,6 +6496,15 @@
               <w:t>charging_stations</w:t>
             </w:r>
             <w:proofErr w:type="spellEnd"/>
+            <w:r>
+              <w:rPr>
+                <w:rFonts w:ascii="Times New Roman" w:eastAsiaTheme="minorEastAsia" w:hAnsi="Times New Roman"/>
+                <w:sz w:val="22"/>
+                <w:szCs w:val="22"/>
+                <w:lang w:val="en-BE"/>
+              </w:rPr>
+              <w:t>|default('N/A')</w:t>
+            </w:r>
             <w:r>
               <w:rPr>
                 <w:rFonts w:ascii="Times New Roman" w:eastAsiaTheme="minorEastAsia" w:hAnsi="Times New Roman" w:cs="Times New Roman"/>
@@ -5806,7 +6656,7 @@
             <w:pPr>
               <w:spacing w:line="240" w:lineRule="auto"/>
               <w:rPr>
-                <w:rFonts w:ascii="Times New Roman" w:eastAsiaTheme="minorEastAsia" w:hAnsi="Times New Roman" w:cs="Times New Roman"/>
+                <w:rFonts w:ascii="Times New Roman" w:eastAsiaTheme="minorEastAsia" w:hAnsi="Times New Roman"/>
                 <w:sz w:val="22"/>
                 <w:szCs w:val="22"/>
                 <w:lang w:val="en-BE"/>
@@ -5832,6 +6682,15 @@
               <w:t>network_coverage</w:t>
             </w:r>
             <w:proofErr w:type="spellEnd"/>
+            <w:r>
+              <w:rPr>
+                <w:rFonts w:ascii="Times New Roman" w:eastAsiaTheme="minorEastAsia" w:hAnsi="Times New Roman"/>
+                <w:sz w:val="22"/>
+                <w:szCs w:val="22"/>
+                <w:lang w:val="en-BE"/>
+              </w:rPr>
+              <w:t>|default('N/A')</w:t>
+            </w:r>
             <w:r>
               <w:rPr>
                 <w:rFonts w:ascii="Times New Roman" w:eastAsiaTheme="minorEastAsia" w:hAnsi="Times New Roman" w:cs="Times New Roman"/>
@@ -6021,7 +6880,7 @@
             <w:pPr>
               <w:spacing w:line="240" w:lineRule="auto"/>
               <w:rPr>
-                <w:rFonts w:ascii="Times New Roman" w:eastAsiaTheme="minorEastAsia" w:hAnsi="Times New Roman" w:cs="Times New Roman"/>
+                <w:rFonts w:ascii="Times New Roman" w:eastAsiaTheme="minorEastAsia" w:hAnsi="Times New Roman"/>
                 <w:sz w:val="22"/>
                 <w:szCs w:val="22"/>
                 <w:lang w:val="en-BE"/>
@@ -6047,6 +6906,15 @@
               <w:t>positioning_req</w:t>
             </w:r>
             <w:proofErr w:type="spellEnd"/>
+            <w:r>
+              <w:rPr>
+                <w:rFonts w:ascii="Times New Roman" w:eastAsiaTheme="minorEastAsia" w:hAnsi="Times New Roman"/>
+                <w:sz w:val="22"/>
+                <w:szCs w:val="22"/>
+                <w:lang w:val="en-BE"/>
+              </w:rPr>
+              <w:t>|default('N/A')</w:t>
+            </w:r>
             <w:r>
               <w:rPr>
                 <w:rFonts w:ascii="Times New Roman" w:eastAsiaTheme="minorEastAsia" w:hAnsi="Times New Roman" w:cs="Times New Roman"/>
@@ -6173,7 +7041,34 @@
                 <w:sz w:val="22"/>
                 <w:szCs w:val="22"/>
               </w:rPr>
-              <w:t>Whether there are related equipment that needs to be docked (elevators, robotic arms, roller shutter doors, telescopic doors, vertical warehouses, winding machines, etc.), etc.:</w:t>
+              <w:t xml:space="preserve">Whether there </w:t>
+            </w:r>
+            <w:proofErr w:type="gramStart"/>
+            <w:r>
+              <w:rPr>
+                <w:rFonts w:ascii="Times New Roman" w:hAnsi="Times New Roman" w:cs="Times New Roman"/>
+                <w:sz w:val="22"/>
+                <w:szCs w:val="22"/>
+              </w:rPr>
+              <w:t>are</w:t>
+            </w:r>
+            <w:proofErr w:type="gramEnd"/>
+            <w:r>
+              <w:rPr>
+                <w:rFonts w:ascii="Times New Roman" w:hAnsi="Times New Roman" w:cs="Times New Roman"/>
+                <w:sz w:val="22"/>
+                <w:szCs w:val="22"/>
+              </w:rPr>
+              <w:t xml:space="preserve"> related </w:t>
+            </w:r>
+            <w:r>
+              <w:rPr>
+                <w:rFonts w:ascii="Times New Roman" w:hAnsi="Times New Roman" w:cs="Times New Roman"/>
+                <w:sz w:val="22"/>
+                <w:szCs w:val="22"/>
+              </w:rPr>
+              <w:lastRenderedPageBreak/>
+              <w:t>equipment that needs to be docked (elevators, robotic arms, roller shutter doors, telescopic doors, vertical warehouses, winding machines, etc.), etc.:</w:t>
             </w:r>
           </w:p>
         </w:tc>
@@ -6190,19 +7085,20 @@
             <w:pPr>
               <w:spacing w:line="240" w:lineRule="auto"/>
               <w:rPr>
-                <w:rFonts w:ascii="Times New Roman" w:eastAsiaTheme="minorEastAsia" w:hAnsi="Times New Roman" w:cs="Times New Roman"/>
-                <w:sz w:val="22"/>
-                <w:szCs w:val="22"/>
-                <w:lang w:val="en-BE"/>
-              </w:rPr>
-            </w:pPr>
-            <w:r>
-              <w:rPr>
-                <w:rFonts w:ascii="Times New Roman" w:eastAsiaTheme="minorEastAsia" w:hAnsi="Times New Roman" w:cs="Times New Roman"/>
-                <w:sz w:val="22"/>
-                <w:szCs w:val="22"/>
-                <w:lang w:val="en-BE"/>
-              </w:rPr>
+                <w:rFonts w:ascii="Times New Roman" w:eastAsiaTheme="minorEastAsia" w:hAnsi="Times New Roman"/>
+                <w:sz w:val="22"/>
+                <w:szCs w:val="22"/>
+                <w:lang w:val="en-BE"/>
+              </w:rPr>
+            </w:pPr>
+            <w:r>
+              <w:rPr>
+                <w:rFonts w:ascii="Times New Roman" w:eastAsiaTheme="minorEastAsia" w:hAnsi="Times New Roman" w:cs="Times New Roman"/>
+                <w:sz w:val="22"/>
+                <w:szCs w:val="22"/>
+                <w:lang w:val="en-BE"/>
+              </w:rPr>
+              <w:lastRenderedPageBreak/>
               <w:t>{{</w:t>
             </w:r>
             <w:proofErr w:type="spellStart"/>
@@ -6216,6 +7112,15 @@
               <w:t>docking_equipment</w:t>
             </w:r>
             <w:proofErr w:type="spellEnd"/>
+            <w:r>
+              <w:rPr>
+                <w:rFonts w:ascii="Times New Roman" w:eastAsiaTheme="minorEastAsia" w:hAnsi="Times New Roman"/>
+                <w:sz w:val="22"/>
+                <w:szCs w:val="22"/>
+                <w:lang w:val="en-BE"/>
+              </w:rPr>
+              <w:t>|default('N/A')</w:t>
+            </w:r>
             <w:r>
               <w:rPr>
                 <w:rFonts w:ascii="Times New Roman" w:eastAsiaTheme="minorEastAsia" w:hAnsi="Times New Roman" w:cs="Times New Roman"/>
@@ -6363,22 +7268,91 @@
           <w:p>
             <w:pPr>
               <w:spacing w:line="240" w:lineRule="auto"/>
+              <w:rPr>
+                <w:rFonts w:ascii="Times New Roman" w:eastAsiaTheme="minorEastAsia" w:hAnsi="Times New Roman"/>
+                <w:sz w:val="22"/>
+                <w:szCs w:val="22"/>
+                <w:lang w:val="en-BE"/>
+              </w:rPr>
+            </w:pPr>
+            <w:r>
+              <w:rPr>
+                <w:rFonts w:ascii="Times New Roman" w:eastAsiaTheme="minorEastAsia" w:hAnsi="Times New Roman" w:cs="Times New Roman"/>
+                <w:sz w:val="22"/>
+                <w:szCs w:val="22"/>
+                <w:lang w:val="en-BE"/>
+              </w:rPr>
+              <w:t xml:space="preserve">Other </w:t>
+            </w:r>
+            <w:proofErr w:type="spellStart"/>
+            <w:r>
+              <w:rPr>
+                <w:rFonts w:ascii="Times New Roman" w:eastAsiaTheme="minorEastAsia" w:hAnsi="Times New Roman" w:cs="Times New Roman"/>
+                <w:sz w:val="22"/>
+                <w:szCs w:val="22"/>
+                <w:lang w:val="en-BE"/>
+              </w:rPr>
+              <w:t>AGVs</w:t>
+            </w:r>
+            <w:proofErr w:type="spellEnd"/>
+            <w:r>
+              <w:rPr>
+                <w:rFonts w:ascii="Times New Roman" w:eastAsiaTheme="minorEastAsia" w:hAnsi="Times New Roman" w:cs="Times New Roman"/>
+                <w:sz w:val="22"/>
+                <w:szCs w:val="22"/>
+                <w:lang w:val="en-BE"/>
+              </w:rPr>
+              <w:t xml:space="preserve"> / AMRs: {{</w:t>
+            </w:r>
+            <w:proofErr w:type="spellStart"/>
+            <w:r>
+              <w:rPr>
+                <w:rFonts w:ascii="Times New Roman" w:eastAsiaTheme="minorEastAsia" w:hAnsi="Times New Roman" w:cs="Times New Roman"/>
+                <w:sz w:val="22"/>
+                <w:szCs w:val="22"/>
+                <w:lang w:val="en-BE"/>
+              </w:rPr>
+              <w:t>other_agvs</w:t>
+            </w:r>
+            <w:proofErr w:type="spellEnd"/>
+            <w:r>
+              <w:rPr>
+                <w:rFonts w:ascii="Times New Roman" w:eastAsiaTheme="minorEastAsia" w:hAnsi="Times New Roman"/>
+                <w:sz w:val="22"/>
+                <w:szCs w:val="22"/>
+                <w:lang w:val="en-BE"/>
+              </w:rPr>
+              <w:t>|default('N/A')</w:t>
+            </w:r>
+            <w:r>
+              <w:rPr>
+                <w:rFonts w:ascii="Times New Roman" w:eastAsiaTheme="minorEastAsia" w:hAnsi="Times New Roman" w:cs="Times New Roman"/>
+                <w:sz w:val="22"/>
+                <w:szCs w:val="22"/>
+                <w:lang w:val="en-BE"/>
+              </w:rPr>
+              <w:t xml:space="preserve">}} </w:t>
+            </w:r>
+          </w:p>
+          <w:p>
+            <w:pPr>
+              <w:spacing w:line="240" w:lineRule="auto"/>
               <w:jc w:val="left"/>
               <w:rPr>
-                <w:rFonts w:ascii="Times New Roman" w:eastAsiaTheme="minorEastAsia" w:hAnsi="Times New Roman" w:cs="Times New Roman"/>
-                <w:sz w:val="22"/>
-                <w:szCs w:val="22"/>
-                <w:lang w:val="en-BE"/>
-              </w:rPr>
-            </w:pPr>
-            <w:r>
-              <w:rPr>
-                <w:rFonts w:ascii="Times New Roman" w:eastAsiaTheme="minorEastAsia" w:hAnsi="Times New Roman" w:cs="Times New Roman"/>
-                <w:sz w:val="22"/>
-                <w:szCs w:val="22"/>
-                <w:lang w:val="en-BE"/>
-              </w:rPr>
-              <w:t xml:space="preserve">Other </w:t>
+                <w:rFonts w:ascii="Times New Roman" w:eastAsiaTheme="minorEastAsia" w:hAnsi="Times New Roman"/>
+                <w:sz w:val="22"/>
+                <w:szCs w:val="22"/>
+                <w:lang w:val="en-BE"/>
+              </w:rPr>
+            </w:pPr>
+            <w:r>
+              <w:rPr>
+                <w:rFonts w:ascii="Times New Roman" w:eastAsiaTheme="minorEastAsia" w:hAnsi="Times New Roman" w:cs="Times New Roman"/>
+                <w:sz w:val="22"/>
+                <w:szCs w:val="22"/>
+                <w:lang w:val="en-BE"/>
+              </w:rPr>
+              <w:t>Other Traffic (Trucks/Forklifts/Pedestrians): {{</w:t>
             </w:r>
             <w:proofErr w:type="spellStart"/>
             <w:r>
@@ -6388,17 +7362,46 @@
                 <w:szCs w:val="22"/>
                 <w:lang w:val="en-BE"/>
               </w:rPr>
-              <w:t>AGVs</w:t>
+              <w:t>other_traffic</w:t>
             </w:r>
             <w:proofErr w:type="spellEnd"/>
             <w:r>
               <w:rPr>
-                <w:rFonts w:ascii="Times New Roman" w:eastAsiaTheme="minorEastAsia" w:hAnsi="Times New Roman" w:cs="Times New Roman"/>
-                <w:sz w:val="22"/>
-                <w:szCs w:val="22"/>
-                <w:lang w:val="en-BE"/>
-              </w:rPr>
-              <w:t xml:space="preserve"> / AMRs: {{</w:t>
+                <w:rFonts w:ascii="Times New Roman" w:eastAsiaTheme="minorEastAsia" w:hAnsi="Times New Roman"/>
+                <w:sz w:val="22"/>
+                <w:szCs w:val="22"/>
+                <w:lang w:val="en-BE"/>
+              </w:rPr>
+              <w:t>|default('N/A')</w:t>
+            </w:r>
+            <w:r>
+              <w:rPr>
+                <w:rFonts w:ascii="Times New Roman" w:eastAsiaTheme="minorEastAsia" w:hAnsi="Times New Roman" w:cs="Times New Roman"/>
+                <w:sz w:val="22"/>
+                <w:szCs w:val="22"/>
+                <w:lang w:val="en-BE"/>
+              </w:rPr>
+              <w:t xml:space="preserve">}} </w:t>
+            </w:r>
+          </w:p>
+          <w:p>
+            <w:pPr>
+              <w:spacing w:line="240" w:lineRule="auto"/>
+              <w:rPr>
+                <w:rFonts w:ascii="Times New Roman" w:eastAsiaTheme="minorEastAsia" w:hAnsi="Times New Roman"/>
+                <w:sz w:val="22"/>
+                <w:szCs w:val="22"/>
+                <w:lang w:val="en-BE"/>
+              </w:rPr>
+            </w:pPr>
+            <w:r>
+              <w:rPr>
+                <w:rFonts w:ascii="Times New Roman" w:eastAsiaTheme="minorEastAsia" w:hAnsi="Times New Roman" w:cs="Times New Roman"/>
+                <w:sz w:val="22"/>
+                <w:szCs w:val="22"/>
+                <w:lang w:val="en-BE"/>
+              </w:rPr>
+              <w:t>Ground Gaps / Depressions: {{</w:t>
             </w:r>
             <w:proofErr w:type="spellStart"/>
             <w:r>
@@ -6408,91 +7411,18 @@
                 <w:szCs w:val="22"/>
                 <w:lang w:val="en-BE"/>
               </w:rPr>
-              <w:t>other_agvs</w:t>
+              <w:t>ground_gaps_mm</w:t>
             </w:r>
             <w:proofErr w:type="spellEnd"/>
             <w:r>
               <w:rPr>
-                <w:rFonts w:ascii="Times New Roman" w:eastAsiaTheme="minorEastAsia" w:hAnsi="Times New Roman" w:cs="Times New Roman"/>
-                <w:sz w:val="22"/>
-                <w:szCs w:val="22"/>
-                <w:lang w:val="en-BE"/>
-              </w:rPr>
-              <w:t xml:space="preserve">}} </w:t>
-            </w:r>
-          </w:p>
-          <w:p>
-            <w:pPr>
-              <w:spacing w:line="240" w:lineRule="auto"/>
-              <w:jc w:val="left"/>
-              <w:rPr>
-                <w:rFonts w:ascii="Times New Roman" w:eastAsiaTheme="minorEastAsia" w:hAnsi="Times New Roman" w:cs="Times New Roman"/>
-                <w:sz w:val="22"/>
-                <w:szCs w:val="22"/>
-                <w:lang w:val="en-BE"/>
-              </w:rPr>
-            </w:pPr>
-            <w:r>
-              <w:rPr>
-                <w:rFonts w:ascii="Times New Roman" w:eastAsiaTheme="minorEastAsia" w:hAnsi="Times New Roman" w:cs="Times New Roman"/>
-                <w:sz w:val="22"/>
-                <w:szCs w:val="22"/>
-                <w:lang w:val="en-BE"/>
-              </w:rPr>
-              <w:t>Other Traffic (Trucks/Forklifts/Pedestrians): {{</w:t>
-            </w:r>
-            <w:proofErr w:type="spellStart"/>
-            <w:r>
-              <w:rPr>
-                <w:rFonts w:ascii="Times New Roman" w:eastAsiaTheme="minorEastAsia" w:hAnsi="Times New Roman" w:cs="Times New Roman"/>
-                <w:sz w:val="22"/>
-                <w:szCs w:val="22"/>
-                <w:lang w:val="en-BE"/>
-              </w:rPr>
-              <w:t>other_traffic</w:t>
-            </w:r>
-            <w:proofErr w:type="spellEnd"/>
-            <w:r>
-              <w:rPr>
-                <w:rFonts w:ascii="Times New Roman" w:eastAsiaTheme="minorEastAsia" w:hAnsi="Times New Roman" w:cs="Times New Roman"/>
-                <w:sz w:val="22"/>
-                <w:szCs w:val="22"/>
-                <w:lang w:val="en-BE"/>
-              </w:rPr>
-              <w:t xml:space="preserve">}} </w:t>
-            </w:r>
-          </w:p>
-          <w:p>
-            <w:pPr>
-              <w:spacing w:line="240" w:lineRule="auto"/>
-              <w:jc w:val="left"/>
-              <w:rPr>
-                <w:rFonts w:ascii="Times New Roman" w:eastAsiaTheme="minorEastAsia" w:hAnsi="Times New Roman" w:cs="Times New Roman"/>
-                <w:sz w:val="22"/>
-                <w:szCs w:val="22"/>
-                <w:lang w:val="en-BE"/>
-              </w:rPr>
-            </w:pPr>
-            <w:r>
-              <w:rPr>
-                <w:rFonts w:ascii="Times New Roman" w:eastAsiaTheme="minorEastAsia" w:hAnsi="Times New Roman" w:cs="Times New Roman"/>
-                <w:sz w:val="22"/>
-                <w:szCs w:val="22"/>
-                <w:lang w:val="en-BE"/>
-              </w:rPr>
-              <w:t>Ground Gaps / Depressions: {{</w:t>
-            </w:r>
-            <w:proofErr w:type="spellStart"/>
-            <w:r>
-              <w:rPr>
-                <w:rFonts w:ascii="Times New Roman" w:eastAsiaTheme="minorEastAsia" w:hAnsi="Times New Roman" w:cs="Times New Roman"/>
-                <w:sz w:val="22"/>
-                <w:szCs w:val="22"/>
-                <w:lang w:val="en-BE"/>
-              </w:rPr>
-              <w:t>ground_gaps_mm</w:t>
-            </w:r>
-            <w:proofErr w:type="spellEnd"/>
+                <w:rFonts w:ascii="Times New Roman" w:eastAsiaTheme="minorEastAsia" w:hAnsi="Times New Roman"/>
+                <w:sz w:val="22"/>
+                <w:szCs w:val="22"/>
+                <w:lang w:val="en-BE"/>
+              </w:rPr>
+              <w:t>|default('N/A')</w:t>
+            </w:r>
             <w:r>
               <w:rPr>
                 <w:rFonts w:ascii="Times New Roman" w:eastAsiaTheme="minorEastAsia" w:hAnsi="Times New Roman" w:cs="Times New Roman"/>
@@ -6651,9 +7581,8 @@
           <w:p>
             <w:pPr>
               <w:spacing w:line="240" w:lineRule="auto"/>
-              <w:jc w:val="left"/>
-              <w:rPr>
-                <w:rFonts w:ascii="Times New Roman" w:eastAsiaTheme="minorEastAsia" w:hAnsi="Times New Roman" w:cs="Times New Roman"/>
+              <w:rPr>
+                <w:rFonts w:ascii="Times New Roman" w:eastAsiaTheme="minorEastAsia" w:hAnsi="Times New Roman"/>
                 <w:sz w:val="22"/>
                 <w:szCs w:val="22"/>
                 <w:lang w:val="en-BE"/>
@@ -6679,6 +7608,15 @@
               <w:t>special_demand</w:t>
             </w:r>
             <w:proofErr w:type="spellEnd"/>
+            <w:r>
+              <w:rPr>
+                <w:rFonts w:ascii="Times New Roman" w:eastAsiaTheme="minorEastAsia" w:hAnsi="Times New Roman"/>
+                <w:sz w:val="22"/>
+                <w:szCs w:val="22"/>
+                <w:lang w:val="en-BE"/>
+              </w:rPr>
+              <w:t>|default('N/A')</w:t>
+            </w:r>
             <w:r>
               <w:rPr>
                 <w:rFonts w:ascii="Times New Roman" w:eastAsiaTheme="minorEastAsia" w:hAnsi="Times New Roman" w:cs="Times New Roman"/>
@@ -6816,9 +7754,8 @@
           <w:p>
             <w:pPr>
               <w:spacing w:line="240" w:lineRule="auto"/>
-              <w:jc w:val="left"/>
-              <w:rPr>
-                <w:rFonts w:ascii="Times New Roman" w:eastAsiaTheme="minorEastAsia" w:hAnsi="Times New Roman" w:cs="Times New Roman"/>
+              <w:rPr>
+                <w:rFonts w:ascii="Times New Roman" w:eastAsiaTheme="minorEastAsia" w:hAnsi="Times New Roman"/>
                 <w:sz w:val="22"/>
                 <w:szCs w:val="22"/>
                 <w:lang w:val="en-BE"/>
@@ -6846,6 +7783,15 @@
             <w:proofErr w:type="spellEnd"/>
             <w:r>
               <w:rPr>
+                <w:rFonts w:ascii="Times New Roman" w:eastAsiaTheme="minorEastAsia" w:hAnsi="Times New Roman"/>
+                <w:sz w:val="22"/>
+                <w:szCs w:val="22"/>
+                <w:lang w:val="en-BE"/>
+              </w:rPr>
+              <w:t>|default('N/A')</w:t>
+            </w:r>
+            <w:r>
+              <w:rPr>
                 <w:rFonts w:ascii="Times New Roman" w:eastAsiaTheme="minorEastAsia" w:hAnsi="Times New Roman" w:cs="Times New Roman"/>
                 <w:sz w:val="22"/>
                 <w:szCs w:val="22"/>
@@ -6866,6 +7812,15 @@
             <w:proofErr w:type="spellEnd"/>
             <w:r>
               <w:rPr>
+                <w:rFonts w:ascii="Times New Roman" w:eastAsiaTheme="minorEastAsia" w:hAnsi="Times New Roman"/>
+                <w:sz w:val="22"/>
+                <w:szCs w:val="22"/>
+                <w:lang w:val="en-BE"/>
+              </w:rPr>
+              <w:t>|default('N/A')</w:t>
+            </w:r>
+            <w:r>
+              <w:rPr>
                 <w:rFonts w:ascii="Times New Roman" w:eastAsiaTheme="minorEastAsia" w:hAnsi="Times New Roman" w:cs="Times New Roman"/>
                 <w:sz w:val="22"/>
                 <w:szCs w:val="22"/>
@@ -6884,6 +7839,15 @@
               <w:t>efficiency_req</w:t>
             </w:r>
             <w:proofErr w:type="spellEnd"/>
+            <w:r>
+              <w:rPr>
+                <w:rFonts w:ascii="Times New Roman" w:eastAsiaTheme="minorEastAsia" w:hAnsi="Times New Roman"/>
+                <w:sz w:val="22"/>
+                <w:szCs w:val="22"/>
+                <w:lang w:val="en-BE"/>
+              </w:rPr>
+              <w:t>|default('N/A')</w:t>
+            </w:r>
             <w:r>
               <w:rPr>
                 <w:rFonts w:ascii="Times New Roman" w:eastAsiaTheme="minorEastAsia" w:hAnsi="Times New Roman" w:cs="Times New Roman"/>
@@ -7000,11 +7964,11 @@
           <w:p>
             <w:pPr>
               <w:spacing w:line="240" w:lineRule="auto"/>
-              <w:jc w:val="left"/>
-              <w:rPr>
-                <w:rFonts w:ascii="Times New Roman" w:eastAsiaTheme="minorEastAsia" w:hAnsi="Times New Roman" w:cs="Times New Roman"/>
-                <w:sz w:val="22"/>
-                <w:szCs w:val="22"/>
+              <w:rPr>
+                <w:rFonts w:ascii="Times New Roman" w:eastAsiaTheme="minorEastAsia" w:hAnsi="Times New Roman"/>
+                <w:sz w:val="22"/>
+                <w:szCs w:val="22"/>
+                <w:lang w:val="en-BE"/>
               </w:rPr>
             </w:pPr>
             <w:r>
@@ -7025,6 +7989,15 @@
               <w:t>special_demand</w:t>
             </w:r>
             <w:proofErr w:type="spellEnd"/>
+            <w:r>
+              <w:rPr>
+                <w:rFonts w:ascii="Times New Roman" w:eastAsiaTheme="minorEastAsia" w:hAnsi="Times New Roman"/>
+                <w:sz w:val="22"/>
+                <w:szCs w:val="22"/>
+                <w:lang w:val="en-BE"/>
+              </w:rPr>
+              <w:t>|default('N/A')</w:t>
+            </w:r>
             <w:r>
               <w:rPr>
                 <w:rFonts w:ascii="Times New Roman" w:eastAsiaTheme="minorEastAsia" w:hAnsi="Times New Roman" w:cs="Times New Roman"/>
@@ -7359,6 +8332,15 @@
                 <w:szCs w:val="22"/>
                 <w:lang w:val="en-BE"/>
               </w:rPr>
+              <w:t>|default('N/A')</w:t>
+            </w:r>
+            <w:r>
+              <w:rPr>
+                <w:rFonts w:ascii="Times New Roman" w:eastAsiaTheme="minorEastAsia" w:hAnsi="Times New Roman"/>
+                <w:sz w:val="22"/>
+                <w:szCs w:val="22"/>
+                <w:lang w:val="en-BE"/>
+              </w:rPr>
               <w:t xml:space="preserve">}} </w:t>
             </w:r>
           </w:p>
@@ -7372,35 +8354,6 @@
                 <w:lang w:val="en-BE"/>
               </w:rPr>
             </w:pPr>
-            <w:r>
-              <w:rPr>
-                <w:rFonts w:ascii="Times New Roman" w:eastAsiaTheme="minorEastAsia" w:hAnsi="Times New Roman"/>
-                <w:sz w:val="22"/>
-                <w:szCs w:val="22"/>
-                <w:lang w:val="en-BE"/>
-              </w:rPr>
-              <w:t>Data Flow &amp; System Integration (WMS, API, ERP, etc.): {{</w:t>
-            </w:r>
-            <w:proofErr w:type="spellStart"/>
-            <w:r>
-              <w:rPr>
-                <w:rFonts w:ascii="Times New Roman" w:eastAsiaTheme="minorEastAsia" w:hAnsi="Times New Roman"/>
-                <w:sz w:val="22"/>
-                <w:szCs w:val="22"/>
-                <w:lang w:val="en-BE"/>
-              </w:rPr>
-              <w:t>data_flow_text</w:t>
-            </w:r>
-            <w:proofErr w:type="spellEnd"/>
-            <w:r>
-              <w:rPr>
-                <w:rFonts w:ascii="Times New Roman" w:eastAsiaTheme="minorEastAsia" w:hAnsi="Times New Roman"/>
-                <w:sz w:val="22"/>
-                <w:szCs w:val="22"/>
-                <w:lang w:val="en-BE"/>
-              </w:rPr>
-              <w:t xml:space="preserve">}} </w:t>
-            </w:r>
           </w:p>
           <w:p>
             <w:pPr>
@@ -7510,7 +8463,73 @@
                 <w:sz w:val="22"/>
                 <w:szCs w:val="22"/>
               </w:rPr>
-              <w:t>{{connections}}</w:t>
+              <w:t>{{connections</w:t>
+            </w:r>
+            <w:r>
+              <w:rPr>
+                <w:rFonts w:ascii="Times New Roman" w:eastAsiaTheme="minorEastAsia" w:hAnsi="Times New Roman"/>
+                <w:sz w:val="22"/>
+                <w:szCs w:val="22"/>
+                <w:lang w:val="en-BE"/>
+              </w:rPr>
+              <w:t>|default('N/A')</w:t>
+            </w:r>
+            <w:r>
+              <w:rPr>
+                <w:rFonts w:ascii="Times New Roman" w:eastAsiaTheme="minorEastAsia" w:hAnsi="Times New Roman" w:cs="Times New Roman"/>
+                <w:sz w:val="22"/>
+                <w:szCs w:val="22"/>
+              </w:rPr>
+              <w:t>}}</w:t>
+            </w:r>
+          </w:p>
+          <w:p>
+            <w:pPr>
+              <w:spacing w:line="240" w:lineRule="auto"/>
+              <w:rPr>
+                <w:rFonts w:ascii="Times New Roman" w:eastAsiaTheme="minorEastAsia" w:hAnsi="Times New Roman"/>
+                <w:sz w:val="22"/>
+                <w:szCs w:val="22"/>
+                <w:lang w:val="en-BE"/>
+              </w:rPr>
+            </w:pPr>
+            <w:r>
+              <w:rPr>
+                <w:rFonts w:ascii="Times New Roman" w:eastAsiaTheme="minorEastAsia" w:hAnsi="Times New Roman"/>
+                <w:sz w:val="22"/>
+                <w:szCs w:val="22"/>
+                <w:lang w:val="en-BE"/>
+              </w:rPr>
+              <w:t>Data Flow &amp; System Integration (WMS, API, ERP, etc.): {{</w:t>
+            </w:r>
+            <w:proofErr w:type="spellStart"/>
+            <w:r>
+              <w:rPr>
+                <w:rFonts w:ascii="Times New Roman" w:eastAsiaTheme="minorEastAsia" w:hAnsi="Times New Roman"/>
+                <w:sz w:val="22"/>
+                <w:szCs w:val="22"/>
+                <w:lang w:val="en-BE"/>
+              </w:rPr>
+              <w:t>data_flow_text</w:t>
+            </w:r>
+            <w:proofErr w:type="spellEnd"/>
+            <w:r>
+              <w:rPr>
+                <w:rFonts w:ascii="Times New Roman" w:eastAsiaTheme="minorEastAsia" w:hAnsi="Times New Roman"/>
+                <w:sz w:val="22"/>
+                <w:szCs w:val="22"/>
+                <w:lang w:val="en-BE"/>
+              </w:rPr>
+              <w:t>|default('N/A')</w:t>
+            </w:r>
+            <w:r>
+              <w:rPr>
+                <w:rFonts w:ascii="Times New Roman" w:eastAsiaTheme="minorEastAsia" w:hAnsi="Times New Roman"/>
+                <w:sz w:val="22"/>
+                <w:szCs w:val="22"/>
+                <w:lang w:val="en-BE"/>
+              </w:rPr>
+              <w:t>}}</w:t>
             </w:r>
           </w:p>
         </w:tc>
@@ -7598,7 +8617,7 @@
             <w:pPr>
               <w:spacing w:line="240" w:lineRule="auto"/>
               <w:rPr>
-                <w:rFonts w:ascii="Times New Roman" w:eastAsiaTheme="minorEastAsia" w:hAnsi="Times New Roman" w:cs="Times New Roman"/>
+                <w:rFonts w:ascii="Times New Roman" w:eastAsiaTheme="minorEastAsia" w:hAnsi="Times New Roman"/>
                 <w:sz w:val="22"/>
                 <w:szCs w:val="22"/>
                 <w:lang w:val="en-BE"/>
@@ -7624,6 +8643,15 @@
               <w:t>connections_details</w:t>
             </w:r>
             <w:proofErr w:type="spellEnd"/>
+            <w:r>
+              <w:rPr>
+                <w:rFonts w:ascii="Times New Roman" w:eastAsiaTheme="minorEastAsia" w:hAnsi="Times New Roman"/>
+                <w:sz w:val="22"/>
+                <w:szCs w:val="22"/>
+                <w:lang w:val="en-BE"/>
+              </w:rPr>
+              <w:t>|default('N/A')</w:t>
+            </w:r>
             <w:r>
               <w:rPr>
                 <w:rFonts w:ascii="Times New Roman" w:eastAsiaTheme="minorEastAsia" w:hAnsi="Times New Roman" w:cs="Times New Roman"/>
@@ -12264,6 +13292,30 @@
 </file>
 
 <file path=customXml/item1.xml><?xml version="1.0" encoding="utf-8"?>
+<b:Sources xmlns:b="http://schemas.openxmlformats.org/officeDocument/2006/bibliography" xmlns="http://schemas.openxmlformats.org/officeDocument/2006/bibliography" SelectedStyle="\APASixthEditionOfficeOnline.xsl" StyleName="APA" Version="6"/>
+</file>
+
+<file path=customXml/item2.xml><?xml version="1.0" encoding="utf-8"?>
+<p:properties xmlns:p="http://schemas.microsoft.com/office/2006/metadata/properties" xmlns:xsi="http://www.w3.org/2001/XMLSchema-instance" xmlns:pc="http://schemas.microsoft.com/office/infopath/2007/PartnerControls">
+  <documentManagement>
+    <lcf76f155ced4ddcb4097134ff3c332f xmlns="bbceff47-94a0-42cc-a34e-bab6fdf630d3">
+      <Terms xmlns="http://schemas.microsoft.com/office/infopath/2007/PartnerControls"/>
+    </lcf76f155ced4ddcb4097134ff3c332f>
+    <TaxCatchAll xmlns="076cc9d1-9a26-4384-96fc-17dbfe6fe8db" xsi:nil="true"/>
+  </documentManagement>
+</p:properties>
+</file>
+
+<file path=customXml/item3.xml><?xml version="1.0" encoding="utf-8"?>
+<?mso-contentType ?>
+<FormTemplates xmlns="http://schemas.microsoft.com/sharepoint/v3/contenttype/forms">
+  <Display>DocumentLibraryForm</Display>
+  <Edit>DocumentLibraryForm</Edit>
+  <New>DocumentLibraryForm</New>
+</FormTemplates>
+</file>
+
+<file path=customXml/item4.xml><?xml version="1.0" encoding="utf-8"?>
 <ct:contentTypeSchema xmlns:ct="http://schemas.microsoft.com/office/2006/metadata/contentType" xmlns:ma="http://schemas.microsoft.com/office/2006/metadata/properties/metaAttributes" ct:_="" ma:_="" ma:contentTypeName="Document" ma:contentTypeID="0x0101000ED1937193E6644B9910A1F8F337BE3A" ma:contentTypeVersion="15" ma:contentTypeDescription="Create a new document." ma:contentTypeScope="" ma:versionID="33d0915d951d370b6a1e09b978e628b3">
   <xsd:schema xmlns:xsd="http://www.w3.org/2001/XMLSchema" xmlns:xs="http://www.w3.org/2001/XMLSchema" xmlns:p="http://schemas.microsoft.com/office/2006/metadata/properties" xmlns:ns2="bbceff47-94a0-42cc-a34e-bab6fdf630d3" xmlns:ns3="076cc9d1-9a26-4384-96fc-17dbfe6fe8db" targetNamespace="http://schemas.microsoft.com/office/2006/metadata/properties" ma:root="true" ma:fieldsID="ca8e0581b507d7ca9a3160f88f47f0fe" ns2:_="" ns3:_="">
     <xsd:import namespace="bbceff47-94a0-42cc-a34e-bab6fdf630d3"/>
@@ -12476,30 +13528,6 @@
 </ct:contentTypeSchema>
 </file>
 
-<file path=customXml/item2.xml><?xml version="1.0" encoding="utf-8"?>
-<?mso-contentType ?>
-<FormTemplates xmlns="http://schemas.microsoft.com/sharepoint/v3/contenttype/forms">
-  <Display>DocumentLibraryForm</Display>
-  <Edit>DocumentLibraryForm</Edit>
-  <New>DocumentLibraryForm</New>
-</FormTemplates>
-</file>
-
-<file path=customXml/item3.xml><?xml version="1.0" encoding="utf-8"?>
-<p:properties xmlns:p="http://schemas.microsoft.com/office/2006/metadata/properties" xmlns:xsi="http://www.w3.org/2001/XMLSchema-instance" xmlns:pc="http://schemas.microsoft.com/office/infopath/2007/PartnerControls">
-  <documentManagement>
-    <lcf76f155ced4ddcb4097134ff3c332f xmlns="bbceff47-94a0-42cc-a34e-bab6fdf630d3">
-      <Terms xmlns="http://schemas.microsoft.com/office/infopath/2007/PartnerControls"/>
-    </lcf76f155ced4ddcb4097134ff3c332f>
-    <TaxCatchAll xmlns="076cc9d1-9a26-4384-96fc-17dbfe6fe8db" xsi:nil="true"/>
-  </documentManagement>
-</p:properties>
-</file>
-
-<file path=customXml/item4.xml><?xml version="1.0" encoding="utf-8"?>
-<b:Sources xmlns:b="http://schemas.openxmlformats.org/officeDocument/2006/bibliography" xmlns="http://schemas.openxmlformats.org/officeDocument/2006/bibliography" SelectedStyle="\APASixthEditionOfficeOnline.xsl" StyleName="APA" Version="6"/>
-</file>
-
 <file path=customXml/item5.xml><?xml version="1.0" encoding="utf-8"?>
 <s:customData xmlns="http://www.wps.cn/officeDocument/2013/wpsCustomData" xmlns:s="http://www.wps.cn/officeDocument/2013/wpsCustomData">
   <customSectProps/>
@@ -12510,6 +13538,33 @@
 </file>
 
 <file path=customXml/itemProps1.xml><?xml version="1.0" encoding="utf-8"?>
+<ds:datastoreItem xmlns:ds="http://schemas.openxmlformats.org/officeDocument/2006/customXml" ds:itemID="{1FF82357-F674-4365-859D-EF5EFE0EDCAE}">
+  <ds:schemaRefs>
+    <ds:schemaRef ds:uri="http://schemas.openxmlformats.org/officeDocument/2006/bibliography"/>
+  </ds:schemaRefs>
+</ds:datastoreItem>
+</file>
+
+<file path=customXml/itemProps2.xml><?xml version="1.0" encoding="utf-8"?>
+<ds:datastoreItem xmlns:ds="http://schemas.openxmlformats.org/officeDocument/2006/customXml" ds:itemID="{92B58BC8-A1B8-4740-9413-5A141DF8AFAB}">
+  <ds:schemaRefs>
+    <ds:schemaRef ds:uri="http://schemas.microsoft.com/office/2006/metadata/properties"/>
+    <ds:schemaRef ds:uri="http://schemas.microsoft.com/office/infopath/2007/PartnerControls"/>
+    <ds:schemaRef ds:uri="bbceff47-94a0-42cc-a34e-bab6fdf630d3"/>
+    <ds:schemaRef ds:uri="076cc9d1-9a26-4384-96fc-17dbfe6fe8db"/>
+  </ds:schemaRefs>
+</ds:datastoreItem>
+</file>
+
+<file path=customXml/itemProps3.xml><?xml version="1.0" encoding="utf-8"?>
+<ds:datastoreItem xmlns:ds="http://schemas.openxmlformats.org/officeDocument/2006/customXml" ds:itemID="{66E6D9ED-0625-4E0B-A950-FCB28CC096CA}">
+  <ds:schemaRefs>
+    <ds:schemaRef ds:uri="http://schemas.microsoft.com/sharepoint/v3/contenttype/forms"/>
+  </ds:schemaRefs>
+</ds:datastoreItem>
+</file>
+
+<file path=customXml/itemProps4.xml><?xml version="1.0" encoding="utf-8"?>
 <ds:datastoreItem xmlns:ds="http://schemas.openxmlformats.org/officeDocument/2006/customXml" ds:itemID="{117EB414-D13B-4D74-9FFC-4E3D989A8CA2}">
   <ds:schemaRefs>
     <ds:schemaRef ds:uri="http://schemas.microsoft.com/office/2006/metadata/contentType"/>
@@ -12528,33 +13583,6 @@
 </ds:datastoreItem>
 </file>
 
-<file path=customXml/itemProps2.xml><?xml version="1.0" encoding="utf-8"?>
-<ds:datastoreItem xmlns:ds="http://schemas.openxmlformats.org/officeDocument/2006/customXml" ds:itemID="{66E6D9ED-0625-4E0B-A950-FCB28CC096CA}">
-  <ds:schemaRefs>
-    <ds:schemaRef ds:uri="http://schemas.microsoft.com/sharepoint/v3/contenttype/forms"/>
-  </ds:schemaRefs>
-</ds:datastoreItem>
-</file>
-
-<file path=customXml/itemProps3.xml><?xml version="1.0" encoding="utf-8"?>
-<ds:datastoreItem xmlns:ds="http://schemas.openxmlformats.org/officeDocument/2006/customXml" ds:itemID="{92B58BC8-A1B8-4740-9413-5A141DF8AFAB}">
-  <ds:schemaRefs>
-    <ds:schemaRef ds:uri="http://schemas.microsoft.com/office/2006/metadata/properties"/>
-    <ds:schemaRef ds:uri="http://schemas.microsoft.com/office/infopath/2007/PartnerControls"/>
-    <ds:schemaRef ds:uri="bbceff47-94a0-42cc-a34e-bab6fdf630d3"/>
-    <ds:schemaRef ds:uri="076cc9d1-9a26-4384-96fc-17dbfe6fe8db"/>
-  </ds:schemaRefs>
-</ds:datastoreItem>
-</file>
-
-<file path=customXml/itemProps4.xml><?xml version="1.0" encoding="utf-8"?>
-<ds:datastoreItem xmlns:ds="http://schemas.openxmlformats.org/officeDocument/2006/customXml" ds:itemID="{1FF82357-F674-4365-859D-EF5EFE0EDCAE}">
-  <ds:schemaRefs>
-    <ds:schemaRef ds:uri="http://schemas.openxmlformats.org/officeDocument/2006/bibliography"/>
-  </ds:schemaRefs>
-</ds:datastoreItem>
-</file>
-
 <file path=customXml/itemProps5.xml><?xml version="1.0" encoding="utf-8"?>
 <ds:datastoreItem xmlns:ds="http://schemas.openxmlformats.org/officeDocument/2006/customXml" ds:itemID="{B1977F7D-205B-4081-913C-38D41E755F92}">
   <ds:schemaRefs>

</xml_diff>

<commit_message>
Updated all the correction felt in test 1
</commit_message>
<xml_diff>
--- a/template.docx
+++ b/template.docx
@@ -161,25 +161,7 @@
                 <w:sz w:val="26"/>
                 <w:szCs w:val="26"/>
               </w:rPr>
-              <w:t>{{</w:t>
-            </w:r>
-            <w:proofErr w:type="spellStart"/>
-            <w:r>
-              <w:rPr>
-                <w:rFonts w:ascii="Times New Roman" w:hAnsi="Times New Roman" w:cs="Times New Roman"/>
-                <w:sz w:val="26"/>
-                <w:szCs w:val="26"/>
-              </w:rPr>
-              <w:t>customer_name|default</w:t>
-            </w:r>
-            <w:proofErr w:type="spellEnd"/>
-            <w:r>
-              <w:rPr>
-                <w:rFonts w:ascii="Times New Roman" w:hAnsi="Times New Roman" w:cs="Times New Roman"/>
-                <w:sz w:val="26"/>
-                <w:szCs w:val="26"/>
-              </w:rPr>
-              <w:t>('')}}</w:t>
+              <w:t>{{customer_name|default('')}}</w:t>
             </w:r>
           </w:p>
         </w:tc>
@@ -240,25 +222,7 @@
                 <w:sz w:val="26"/>
                 <w:szCs w:val="26"/>
               </w:rPr>
-              <w:t>{{</w:t>
-            </w:r>
-            <w:proofErr w:type="spellStart"/>
-            <w:r>
-              <w:rPr>
-                <w:rFonts w:ascii="Times New Roman" w:hAnsi="Times New Roman" w:cs="Times New Roman"/>
-                <w:sz w:val="26"/>
-                <w:szCs w:val="26"/>
-              </w:rPr>
-              <w:t>project_name|default</w:t>
-            </w:r>
-            <w:proofErr w:type="spellEnd"/>
-            <w:r>
-              <w:rPr>
-                <w:rFonts w:ascii="Times New Roman" w:hAnsi="Times New Roman" w:cs="Times New Roman"/>
-                <w:sz w:val="26"/>
-                <w:szCs w:val="26"/>
-              </w:rPr>
-              <w:t>('')}}</w:t>
+              <w:t>{{project_name|default('')}}</w:t>
             </w:r>
           </w:p>
         </w:tc>
@@ -326,25 +290,7 @@
                 <w:sz w:val="26"/>
                 <w:szCs w:val="26"/>
               </w:rPr>
-              <w:t>{{</w:t>
-            </w:r>
-            <w:proofErr w:type="spellStart"/>
-            <w:r>
-              <w:rPr>
-                <w:rFonts w:ascii="Times New Roman" w:hAnsi="Times New Roman" w:cs="Times New Roman"/>
-                <w:sz w:val="26"/>
-                <w:szCs w:val="26"/>
-              </w:rPr>
-              <w:t>project_location|default</w:t>
-            </w:r>
-            <w:proofErr w:type="spellEnd"/>
-            <w:r>
-              <w:rPr>
-                <w:rFonts w:ascii="Times New Roman" w:hAnsi="Times New Roman" w:cs="Times New Roman"/>
-                <w:sz w:val="26"/>
-                <w:szCs w:val="26"/>
-              </w:rPr>
-              <w:t>('')}}</w:t>
+              <w:t>{{project_location|default('')}}</w:t>
             </w:r>
           </w:p>
         </w:tc>
@@ -403,25 +349,7 @@
                 <w:sz w:val="26"/>
                 <w:szCs w:val="26"/>
               </w:rPr>
-              <w:t>{{</w:t>
-            </w:r>
-            <w:proofErr w:type="spellStart"/>
-            <w:r>
-              <w:rPr>
-                <w:rFonts w:ascii="Times New Roman" w:hAnsi="Times New Roman" w:cs="Times New Roman"/>
-                <w:sz w:val="26"/>
-                <w:szCs w:val="26"/>
-              </w:rPr>
-              <w:t>survey_date|default</w:t>
-            </w:r>
-            <w:proofErr w:type="spellEnd"/>
-            <w:r>
-              <w:rPr>
-                <w:rFonts w:ascii="Times New Roman" w:hAnsi="Times New Roman" w:cs="Times New Roman"/>
-                <w:sz w:val="26"/>
-                <w:szCs w:val="26"/>
-              </w:rPr>
-              <w:t>('')}}</w:t>
+              <w:t>{{survey_date|default('')}}</w:t>
             </w:r>
           </w:p>
         </w:tc>
@@ -489,25 +417,7 @@
                 <w:sz w:val="26"/>
                 <w:szCs w:val="26"/>
               </w:rPr>
-              <w:t>{{</w:t>
-            </w:r>
-            <w:proofErr w:type="spellStart"/>
-            <w:r>
-              <w:rPr>
-                <w:rFonts w:ascii="Times New Roman" w:hAnsi="Times New Roman" w:cs="Times New Roman"/>
-                <w:sz w:val="26"/>
-                <w:szCs w:val="26"/>
-              </w:rPr>
-              <w:t>customer_email|default</w:t>
-            </w:r>
-            <w:proofErr w:type="spellEnd"/>
-            <w:r>
-              <w:rPr>
-                <w:rFonts w:ascii="Times New Roman" w:hAnsi="Times New Roman" w:cs="Times New Roman"/>
-                <w:sz w:val="26"/>
-                <w:szCs w:val="26"/>
-              </w:rPr>
-              <w:t>('')}}</w:t>
+              <w:t>{{customer_email|default('')}}</w:t>
             </w:r>
           </w:p>
         </w:tc>
@@ -583,25 +493,7 @@
                 <w:sz w:val="26"/>
                 <w:szCs w:val="26"/>
               </w:rPr>
-              <w:t>{{</w:t>
-            </w:r>
-            <w:proofErr w:type="spellStart"/>
-            <w:r>
-              <w:rPr>
-                <w:rFonts w:ascii="Times New Roman" w:hAnsi="Times New Roman" w:cs="Times New Roman"/>
-                <w:sz w:val="26"/>
-                <w:szCs w:val="26"/>
-              </w:rPr>
-              <w:t>customer_mobile|default</w:t>
-            </w:r>
-            <w:proofErr w:type="spellEnd"/>
-            <w:r>
-              <w:rPr>
-                <w:rFonts w:ascii="Times New Roman" w:hAnsi="Times New Roman" w:cs="Times New Roman"/>
-                <w:sz w:val="26"/>
-                <w:szCs w:val="26"/>
-              </w:rPr>
-              <w:t>('')}}</w:t>
+              <w:t>{{customer_mobile|default('')}}</w:t>
             </w:r>
           </w:p>
         </w:tc>
@@ -819,90 +711,12 @@
             <w:vAlign w:val="center"/>
           </w:tcPr>
           <w:p>
-            <w:pPr>
-              <w:jc w:val="left"/>
-              <w:rPr>
-                <w:rFonts w:ascii="Times New Roman" w:hAnsi="Times New Roman" w:cs="Times New Roman"/>
-                <w:sz w:val="26"/>
-                <w:szCs w:val="26"/>
-              </w:rPr>
-            </w:pPr>
-            <w:r>
-              <w:rPr>
-                <w:rFonts w:ascii="Times New Roman" w:hAnsi="Times New Roman" w:cs="Times New Roman"/>
-                <w:sz w:val="26"/>
-                <w:szCs w:val="26"/>
-              </w:rPr>
-              <w:t>{{</w:t>
-            </w:r>
-            <w:proofErr w:type="spellStart"/>
-            <w:r>
-              <w:rPr>
-                <w:rFonts w:ascii="Times New Roman" w:hAnsi="Times New Roman" w:cs="Times New Roman"/>
-                <w:sz w:val="26"/>
-                <w:szCs w:val="26"/>
-              </w:rPr>
-              <w:t>application|default</w:t>
-            </w:r>
-            <w:proofErr w:type="spellEnd"/>
-            <w:r>
-              <w:rPr>
-                <w:rFonts w:ascii="Times New Roman" w:hAnsi="Times New Roman" w:cs="Times New Roman"/>
-                <w:sz w:val="26"/>
-                <w:szCs w:val="26"/>
-              </w:rPr>
-              <w:t>('')}}</w:t>
-            </w:r>
-            <w:r>
-              <w:rPr>
-                <w:rFonts w:ascii="Times New Roman" w:hAnsi="Times New Roman" w:cs="Times New Roman"/>
-                <w:sz w:val="26"/>
-                <w:szCs w:val="26"/>
-              </w:rPr>
+            <w:r>
+              <w:t>Application(s): {{application}}</w:t>
+            </w:r>
+            <w:r>
               <w:br/>
-            </w:r>
-            <w:r>
-              <w:rPr>
-                <w:rFonts w:ascii="Times New Roman" w:hAnsi="Times New Roman" w:cs="Times New Roman"/>
-                <w:sz w:val="26"/>
-                <w:szCs w:val="26"/>
-              </w:rPr>
-              <w:t>Job-To-Do</w:t>
-            </w:r>
-            <w:r>
-              <w:rPr>
-                <w:rFonts w:ascii="Times New Roman" w:hAnsi="Times New Roman" w:cs="Times New Roman"/>
-                <w:sz w:val="26"/>
-                <w:szCs w:val="26"/>
-              </w:rPr>
-              <w:t xml:space="preserve"> :</w:t>
-            </w:r>
-            <w:r>
-              <w:rPr>
-                <w:rFonts w:ascii="Times New Roman" w:hAnsi="Times New Roman" w:cs="Times New Roman"/>
-                <w:sz w:val="26"/>
-                <w:szCs w:val="26"/>
-              </w:rPr>
-              <w:br/>
-              <w:t>{{</w:t>
-            </w:r>
-            <w:proofErr w:type="spellStart"/>
-            <w:r>
-              <w:rPr>
-                <w:rFonts w:ascii="Times New Roman" w:hAnsi="Times New Roman" w:cs="Times New Roman"/>
-                <w:sz w:val="26"/>
-                <w:szCs w:val="26"/>
-              </w:rPr>
-              <w:t>task_description|default</w:t>
-            </w:r>
-            <w:proofErr w:type="spellEnd"/>
-            <w:r>
-              <w:rPr>
-                <w:rFonts w:ascii="Times New Roman" w:hAnsi="Times New Roman" w:cs="Times New Roman"/>
-                <w:sz w:val="26"/>
-                <w:szCs w:val="26"/>
-              </w:rPr>
-              <w:t>('')}}</w:t>
+              <w:t>Job-To-Do: {{job_to_do}}</w:t>
             </w:r>
           </w:p>
         </w:tc>
@@ -1073,25 +887,7 @@
                 <w:sz w:val="26"/>
                 <w:szCs w:val="26"/>
               </w:rPr>
-              <w:t>{{</w:t>
-            </w:r>
-            <w:proofErr w:type="spellStart"/>
-            <w:r>
-              <w:rPr>
-                <w:rFonts w:ascii="Times New Roman" w:hAnsi="Times New Roman" w:cs="Times New Roman"/>
-                <w:sz w:val="26"/>
-                <w:szCs w:val="26"/>
-              </w:rPr>
-              <w:t>warehouse_area|default</w:t>
-            </w:r>
-            <w:proofErr w:type="spellEnd"/>
-            <w:r>
-              <w:rPr>
-                <w:rFonts w:ascii="Times New Roman" w:hAnsi="Times New Roman" w:cs="Times New Roman"/>
-                <w:sz w:val="26"/>
-                <w:szCs w:val="26"/>
-              </w:rPr>
-              <w:t>('')}}</w:t>
+              <w:t>{{warehouse_area|default('')}}</w:t>
             </w:r>
           </w:p>
         </w:tc>
@@ -1230,43 +1026,7 @@
                 <w:sz w:val="26"/>
                 <w:szCs w:val="26"/>
               </w:rPr>
-              <w:t xml:space="preserve">{% if </w:t>
-            </w:r>
-            <w:proofErr w:type="spellStart"/>
-            <w:r>
-              <w:rPr>
-                <w:rFonts w:ascii="Times New Roman" w:hAnsi="Times New Roman" w:cs="Times New Roman"/>
-                <w:sz w:val="26"/>
-                <w:szCs w:val="26"/>
-              </w:rPr>
-              <w:t>cross_docking_aisle</w:t>
-            </w:r>
-            <w:proofErr w:type="spellEnd"/>
-            <w:r>
-              <w:rPr>
-                <w:rFonts w:ascii="Times New Roman" w:hAnsi="Times New Roman" w:cs="Times New Roman"/>
-                <w:sz w:val="26"/>
-                <w:szCs w:val="26"/>
-              </w:rPr>
-              <w:t xml:space="preserve"> %}Transport / Cross Docking: {{</w:t>
-            </w:r>
-            <w:proofErr w:type="spellStart"/>
-            <w:r>
-              <w:rPr>
-                <w:rFonts w:ascii="Times New Roman" w:hAnsi="Times New Roman" w:cs="Times New Roman"/>
-                <w:sz w:val="26"/>
-                <w:szCs w:val="26"/>
-              </w:rPr>
-              <w:t>cross_docking_aisle|default</w:t>
-            </w:r>
-            <w:proofErr w:type="spellEnd"/>
-            <w:r>
-              <w:rPr>
-                <w:rFonts w:ascii="Times New Roman" w:hAnsi="Times New Roman" w:cs="Times New Roman"/>
-                <w:sz w:val="26"/>
-                <w:szCs w:val="26"/>
-              </w:rPr>
-              <w:t>('')}} m{% endif %}</w:t>
+              <w:t>{% if cross_docking_aisle %}Transport / Cross Docking: {{cross_docking_aisle|default('')}} m{% endif %}</w:t>
             </w:r>
             <w:r>
               <w:rPr>
@@ -1275,43 +1035,7 @@
                 <w:szCs w:val="26"/>
               </w:rPr>
               <w:br/>
-              <w:t xml:space="preserve">{% if </w:t>
-            </w:r>
-            <w:proofErr w:type="spellStart"/>
-            <w:r>
-              <w:rPr>
-                <w:rFonts w:ascii="Times New Roman" w:hAnsi="Times New Roman" w:cs="Times New Roman"/>
-                <w:sz w:val="26"/>
-                <w:szCs w:val="26"/>
-              </w:rPr>
-              <w:t>aisle_width_mm</w:t>
-            </w:r>
-            <w:proofErr w:type="spellEnd"/>
-            <w:r>
-              <w:rPr>
-                <w:rFonts w:ascii="Times New Roman" w:hAnsi="Times New Roman" w:cs="Times New Roman"/>
-                <w:sz w:val="26"/>
-                <w:szCs w:val="26"/>
-              </w:rPr>
-              <w:t xml:space="preserve"> %}Stacking / Conveyor: {{</w:t>
-            </w:r>
-            <w:proofErr w:type="spellStart"/>
-            <w:r>
-              <w:rPr>
-                <w:rFonts w:ascii="Times New Roman" w:hAnsi="Times New Roman" w:cs="Times New Roman"/>
-                <w:sz w:val="26"/>
-                <w:szCs w:val="26"/>
-              </w:rPr>
-              <w:t>aisle_width_mm|default</w:t>
-            </w:r>
-            <w:proofErr w:type="spellEnd"/>
-            <w:r>
-              <w:rPr>
-                <w:rFonts w:ascii="Times New Roman" w:hAnsi="Times New Roman" w:cs="Times New Roman"/>
-                <w:sz w:val="26"/>
-                <w:szCs w:val="26"/>
-              </w:rPr>
-              <w:t>('')}} mm{% endif %}</w:t>
+              <w:t>{% if aisle_width_mm %}Stacking / Conveyor: {{aisle_width_mm|default('')}} mm{% endif %}</w:t>
             </w:r>
             <w:r>
               <w:rPr>
@@ -1320,43 +1044,7 @@
                 <w:szCs w:val="26"/>
               </w:rPr>
               <w:br/>
-              <w:t xml:space="preserve">{% if </w:t>
-            </w:r>
-            <w:proofErr w:type="spellStart"/>
-            <w:r>
-              <w:rPr>
-                <w:rFonts w:ascii="Times New Roman" w:hAnsi="Times New Roman" w:cs="Times New Roman"/>
-                <w:sz w:val="26"/>
-                <w:szCs w:val="26"/>
-              </w:rPr>
-              <w:t>aisle_width_m</w:t>
-            </w:r>
-            <w:proofErr w:type="spellEnd"/>
-            <w:r>
-              <w:rPr>
-                <w:rFonts w:ascii="Times New Roman" w:hAnsi="Times New Roman" w:cs="Times New Roman"/>
-                <w:sz w:val="26"/>
-                <w:szCs w:val="26"/>
-              </w:rPr>
-              <w:t xml:space="preserve"> %}Narrow Aisle: {{</w:t>
-            </w:r>
-            <w:proofErr w:type="spellStart"/>
-            <w:r>
-              <w:rPr>
-                <w:rFonts w:ascii="Times New Roman" w:hAnsi="Times New Roman" w:cs="Times New Roman"/>
-                <w:sz w:val="26"/>
-                <w:szCs w:val="26"/>
-              </w:rPr>
-              <w:t>aisle_width_m|default</w:t>
-            </w:r>
-            <w:proofErr w:type="spellEnd"/>
-            <w:r>
-              <w:rPr>
-                <w:rFonts w:ascii="Times New Roman" w:hAnsi="Times New Roman" w:cs="Times New Roman"/>
-                <w:sz w:val="26"/>
-                <w:szCs w:val="26"/>
-              </w:rPr>
-              <w:t>('')}} m{% endif %}</w:t>
+              <w:t>{% if aisle_width_m %}Narrow Aisle: {{aisle_width_m|default('')}} m{% endif %}</w:t>
             </w:r>
           </w:p>
         </w:tc>
@@ -1479,25 +1167,7 @@
                 <w:sz w:val="26"/>
                 <w:szCs w:val="26"/>
               </w:rPr>
-              <w:t>{{</w:t>
-            </w:r>
-            <w:proofErr w:type="spellStart"/>
-            <w:r>
-              <w:rPr>
-                <w:rFonts w:ascii="Times New Roman" w:hAnsi="Times New Roman" w:cs="Times New Roman"/>
-                <w:sz w:val="26"/>
-                <w:szCs w:val="26"/>
-              </w:rPr>
-              <w:t>max_stacking_height_m|default</w:t>
-            </w:r>
-            <w:proofErr w:type="spellEnd"/>
-            <w:r>
-              <w:rPr>
-                <w:rFonts w:ascii="Times New Roman" w:hAnsi="Times New Roman" w:cs="Times New Roman"/>
-                <w:sz w:val="26"/>
-                <w:szCs w:val="26"/>
-              </w:rPr>
-              <w:t>('')}} m</w:t>
+              <w:t>{{max_stacking_height_m|default('')}} m</w:t>
             </w:r>
             <w:r>
               <w:rPr>
@@ -1506,25 +1176,7 @@
                 <w:szCs w:val="26"/>
               </w:rPr>
               <w:br/>
-              <w:t>Level: {{</w:t>
-            </w:r>
-            <w:proofErr w:type="spellStart"/>
-            <w:r>
-              <w:rPr>
-                <w:rFonts w:ascii="Times New Roman" w:hAnsi="Times New Roman" w:cs="Times New Roman"/>
-                <w:sz w:val="26"/>
-                <w:szCs w:val="26"/>
-              </w:rPr>
-              <w:t>boxes_stacked|default</w:t>
-            </w:r>
-            <w:proofErr w:type="spellEnd"/>
-            <w:r>
-              <w:rPr>
-                <w:rFonts w:ascii="Times New Roman" w:hAnsi="Times New Roman" w:cs="Times New Roman"/>
-                <w:sz w:val="26"/>
-                <w:szCs w:val="26"/>
-              </w:rPr>
-              <w:t>('')}}</w:t>
+              <w:t>Level: {{boxes_stacked|default('')}}</w:t>
             </w:r>
           </w:p>
         </w:tc>
@@ -1631,39 +1283,12 @@
             <w:vAlign w:val="center"/>
           </w:tcPr>
           <w:p>
-            <w:pPr>
-              <w:jc w:val="left"/>
-              <w:rPr>
-                <w:rFonts w:ascii="Times New Roman" w:hAnsi="Times New Roman" w:cs="Times New Roman"/>
-                <w:sz w:val="26"/>
-                <w:szCs w:val="26"/>
-              </w:rPr>
-            </w:pPr>
-            <w:r>
-              <w:rPr>
-                <w:rFonts w:ascii="Times New Roman" w:hAnsi="Times New Roman" w:cs="Times New Roman"/>
-                <w:sz w:val="26"/>
-                <w:szCs w:val="26"/>
-              </w:rPr>
-              <w:t>{{</w:t>
-            </w:r>
-            <w:proofErr w:type="spellStart"/>
-            <w:r>
-              <w:rPr>
-                <w:rFonts w:ascii="Times New Roman" w:hAnsi="Times New Roman" w:cs="Times New Roman"/>
-                <w:sz w:val="26"/>
-                <w:szCs w:val="26"/>
-              </w:rPr>
-              <w:t>clearance_height_m|default</w:t>
-            </w:r>
-            <w:proofErr w:type="spellEnd"/>
-            <w:r>
-              <w:rPr>
-                <w:rFonts w:ascii="Times New Roman" w:hAnsi="Times New Roman" w:cs="Times New Roman"/>
-                <w:sz w:val="26"/>
-                <w:szCs w:val="26"/>
-              </w:rPr>
-              <w:t>('')}} m</w:t>
+            <w:r>
+              <w:t>{% if max_stacking_height_m %}{{max_stacking_height_m}} m{% endif %}</w:t>
+            </w:r>
+            <w:r>
+              <w:br/>
+              <w:t>{% if stacking_level %}Level: {{stacking_level}}{% endif %}</w:t>
             </w:r>
           </w:p>
         </w:tc>
@@ -1799,25 +1424,7 @@
                 <w:sz w:val="26"/>
                 <w:szCs w:val="26"/>
               </w:rPr>
-              <w:t>{{</w:t>
-            </w:r>
-            <w:proofErr w:type="spellStart"/>
-            <w:r>
-              <w:rPr>
-                <w:rFonts w:ascii="Times New Roman" w:hAnsi="Times New Roman" w:cs="Times New Roman"/>
-                <w:sz w:val="26"/>
-                <w:szCs w:val="26"/>
-              </w:rPr>
-              <w:t>storage_locations|default</w:t>
-            </w:r>
-            <w:proofErr w:type="spellEnd"/>
-            <w:r>
-              <w:rPr>
-                <w:rFonts w:ascii="Times New Roman" w:hAnsi="Times New Roman" w:cs="Times New Roman"/>
-                <w:sz w:val="26"/>
-                <w:szCs w:val="26"/>
-              </w:rPr>
-              <w:t>('')}}</w:t>
+              <w:t>{{storage_locations|default('')}}</w:t>
             </w:r>
           </w:p>
         </w:tc>
@@ -1945,25 +1552,7 @@
                 <w:sz w:val="26"/>
                 <w:szCs w:val="26"/>
               </w:rPr>
-              <w:t>{{</w:t>
-            </w:r>
-            <w:proofErr w:type="spellStart"/>
-            <w:r>
-              <w:rPr>
-                <w:rFonts w:ascii="Times New Roman" w:hAnsi="Times New Roman" w:cs="Times New Roman"/>
-                <w:sz w:val="26"/>
-                <w:szCs w:val="26"/>
-              </w:rPr>
-              <w:t>ramp_gradient_deg|default</w:t>
-            </w:r>
-            <w:proofErr w:type="spellEnd"/>
-            <w:r>
-              <w:rPr>
-                <w:rFonts w:ascii="Times New Roman" w:hAnsi="Times New Roman" w:cs="Times New Roman"/>
-                <w:sz w:val="26"/>
-                <w:szCs w:val="26"/>
-              </w:rPr>
-              <w:t>('')}}</w:t>
+              <w:t>{{ramp_gradient_deg|default('')}}</w:t>
             </w:r>
           </w:p>
         </w:tc>
@@ -2040,38 +1629,8 @@
             <w:vAlign w:val="center"/>
           </w:tcPr>
           <w:p>
-            <w:pPr>
-              <w:spacing w:line="240" w:lineRule="auto"/>
-              <w:jc w:val="left"/>
-              <w:rPr>
-                <w:rFonts w:ascii="Times New Roman" w:eastAsiaTheme="minorEastAsia" w:hAnsi="Times New Roman" w:cs="Times New Roman"/>
-                <w:sz w:val="26"/>
-                <w:szCs w:val="26"/>
-              </w:rPr>
-            </w:pPr>
-            <w:r>
-              <w:rPr>
-                <w:rFonts w:ascii="Times New Roman" w:eastAsiaTheme="minorEastAsia" w:hAnsi="Times New Roman" w:cs="Times New Roman"/>
-                <w:sz w:val="26"/>
-                <w:szCs w:val="26"/>
-              </w:rPr>
-              <w:t>O</w:t>
-            </w:r>
-            <w:r>
-              <w:rPr>
-                <w:rFonts w:ascii="Times New Roman" w:eastAsiaTheme="minorEastAsia" w:hAnsi="Times New Roman" w:cs="Times New Roman"/>
-                <w:sz w:val="26"/>
-                <w:szCs w:val="26"/>
-              </w:rPr>
-              <w:t>thers</w:t>
-            </w:r>
-            <w:r>
-              <w:rPr>
-                <w:rFonts w:ascii="Times New Roman" w:eastAsiaTheme="minorEastAsia" w:hAnsi="Times New Roman" w:cs="Times New Roman"/>
-                <w:sz w:val="26"/>
-                <w:szCs w:val="26"/>
-              </w:rPr>
-              <w:t>：</w:t>
+            <w:r>
+              <w:t>{% if clearance_required %}{{clearance_height_m}} m{% endif %}</w:t>
             </w:r>
           </w:p>
         </w:tc>
@@ -2099,25 +1658,7 @@
                 <w:sz w:val="26"/>
                 <w:szCs w:val="26"/>
               </w:rPr>
-              <w:t>{{</w:t>
-            </w:r>
-            <w:proofErr w:type="spellStart"/>
-            <w:r>
-              <w:rPr>
-                <w:rFonts w:ascii="Times New Roman" w:hAnsi="Times New Roman" w:cs="Times New Roman"/>
-                <w:sz w:val="26"/>
-                <w:szCs w:val="26"/>
-              </w:rPr>
-              <w:t>special_layout|default</w:t>
-            </w:r>
-            <w:proofErr w:type="spellEnd"/>
-            <w:r>
-              <w:rPr>
-                <w:rFonts w:ascii="Times New Roman" w:hAnsi="Times New Roman" w:cs="Times New Roman"/>
-                <w:sz w:val="26"/>
-                <w:szCs w:val="26"/>
-              </w:rPr>
-              <w:t>('')}}</w:t>
+              <w:t>{{special_layout|default('')}}</w:t>
             </w:r>
             <w:r>
               <w:rPr>
@@ -2135,25 +1676,7 @@
                 <w:szCs w:val="26"/>
               </w:rPr>
               <w:br/>
-              <w:t xml:space="preserve">{% if </w:t>
-            </w:r>
-            <w:proofErr w:type="spellStart"/>
-            <w:r>
-              <w:rPr>
-                <w:rFonts w:ascii="Times New Roman" w:hAnsi="Times New Roman" w:cs="Times New Roman"/>
-                <w:sz w:val="26"/>
-                <w:szCs w:val="26"/>
-              </w:rPr>
-              <w:t>xpl_sub_type</w:t>
-            </w:r>
-            <w:proofErr w:type="spellEnd"/>
-            <w:r>
-              <w:rPr>
-                <w:rFonts w:ascii="Times New Roman" w:hAnsi="Times New Roman" w:cs="Times New Roman"/>
-                <w:sz w:val="26"/>
-                <w:szCs w:val="26"/>
-              </w:rPr>
-              <w:t xml:space="preserve"> %}Transport / Cross Docking:</w:t>
+              <w:t>{% if xpl_sub_type %}Transport / Cross Docking:</w:t>
             </w:r>
             <w:r>
               <w:rPr>
@@ -2162,25 +1685,7 @@
                 <w:szCs w:val="26"/>
               </w:rPr>
               <w:br/>
-              <w:t>Application Type: {{</w:t>
-            </w:r>
-            <w:proofErr w:type="spellStart"/>
-            <w:r>
-              <w:rPr>
-                <w:rFonts w:ascii="Times New Roman" w:hAnsi="Times New Roman" w:cs="Times New Roman"/>
-                <w:sz w:val="26"/>
-                <w:szCs w:val="26"/>
-              </w:rPr>
-              <w:t>xpl_sub_type|default</w:t>
-            </w:r>
-            <w:proofErr w:type="spellEnd"/>
-            <w:r>
-              <w:rPr>
-                <w:rFonts w:ascii="Times New Roman" w:hAnsi="Times New Roman" w:cs="Times New Roman"/>
-                <w:sz w:val="26"/>
-                <w:szCs w:val="26"/>
-              </w:rPr>
-              <w:t>('')}}{% endif %}</w:t>
+              <w:t>Application Type: {{xpl_sub_type|default('')}}{% endif %}</w:t>
             </w:r>
             <w:r>
               <w:rPr>
@@ -2197,79 +1702,7 @@
                 <w:szCs w:val="26"/>
               </w:rPr>
               <w:br/>
-              <w:t xml:space="preserve">{% if </w:t>
-            </w:r>
-            <w:proofErr w:type="spellStart"/>
-            <w:r>
-              <w:rPr>
-                <w:rFonts w:ascii="Times New Roman" w:hAnsi="Times New Roman" w:cs="Times New Roman"/>
-                <w:sz w:val="26"/>
-                <w:szCs w:val="26"/>
-              </w:rPr>
-              <w:t>pickup_type</w:t>
-            </w:r>
-            <w:proofErr w:type="spellEnd"/>
-            <w:r>
-              <w:rPr>
-                <w:rFonts w:ascii="Times New Roman" w:hAnsi="Times New Roman" w:cs="Times New Roman"/>
-                <w:sz w:val="26"/>
-                <w:szCs w:val="26"/>
-              </w:rPr>
-              <w:t xml:space="preserve"> or </w:t>
-            </w:r>
-            <w:proofErr w:type="spellStart"/>
-            <w:r>
-              <w:rPr>
-                <w:rFonts w:ascii="Times New Roman" w:hAnsi="Times New Roman" w:cs="Times New Roman"/>
-                <w:sz w:val="26"/>
-                <w:szCs w:val="26"/>
-              </w:rPr>
-              <w:t>stacking_type</w:t>
-            </w:r>
-            <w:proofErr w:type="spellEnd"/>
-            <w:r>
-              <w:rPr>
-                <w:rFonts w:ascii="Times New Roman" w:hAnsi="Times New Roman" w:cs="Times New Roman"/>
-                <w:sz w:val="26"/>
-                <w:szCs w:val="26"/>
-              </w:rPr>
-              <w:t xml:space="preserve"> or </w:t>
-            </w:r>
-            <w:proofErr w:type="spellStart"/>
-            <w:r>
-              <w:rPr>
-                <w:rFonts w:ascii="Times New Roman" w:hAnsi="Times New Roman" w:cs="Times New Roman"/>
-                <w:sz w:val="26"/>
-                <w:szCs w:val="26"/>
-              </w:rPr>
-              <w:t>conveyor_height</w:t>
-            </w:r>
-            <w:proofErr w:type="spellEnd"/>
-            <w:r>
-              <w:rPr>
-                <w:rFonts w:ascii="Times New Roman" w:hAnsi="Times New Roman" w:cs="Times New Roman"/>
-                <w:sz w:val="26"/>
-                <w:szCs w:val="26"/>
-              </w:rPr>
-              <w:t xml:space="preserve"> or </w:t>
-            </w:r>
-            <w:proofErr w:type="spellStart"/>
-            <w:r>
-              <w:rPr>
-                <w:rFonts w:ascii="Times New Roman" w:hAnsi="Times New Roman" w:cs="Times New Roman"/>
-                <w:sz w:val="26"/>
-                <w:szCs w:val="26"/>
-              </w:rPr>
-              <w:t>load_at_edge</w:t>
-            </w:r>
-            <w:proofErr w:type="spellEnd"/>
-            <w:r>
-              <w:rPr>
-                <w:rFonts w:ascii="Times New Roman" w:hAnsi="Times New Roman" w:cs="Times New Roman"/>
-                <w:sz w:val="26"/>
-                <w:szCs w:val="26"/>
-              </w:rPr>
-              <w:t xml:space="preserve"> %}Stacking / Conveyor:</w:t>
+              <w:t>{% if pickup_type or stacking_type or conveyor_height or load_at_edge %}Stacking / Conveyor:</w:t>
             </w:r>
             <w:r>
               <w:rPr>
@@ -2278,61 +1711,7 @@
                 <w:szCs w:val="26"/>
               </w:rPr>
               <w:br/>
-              <w:t>Pickup Type: {{</w:t>
-            </w:r>
-            <w:proofErr w:type="spellStart"/>
-            <w:r>
-              <w:rPr>
-                <w:rFonts w:ascii="Times New Roman" w:hAnsi="Times New Roman" w:cs="Times New Roman"/>
-                <w:sz w:val="26"/>
-                <w:szCs w:val="26"/>
-              </w:rPr>
-              <w:t>pickup_type|default</w:t>
-            </w:r>
-            <w:proofErr w:type="spellEnd"/>
-            <w:r>
-              <w:rPr>
-                <w:rFonts w:ascii="Times New Roman" w:hAnsi="Times New Roman" w:cs="Times New Roman"/>
-                <w:sz w:val="26"/>
-                <w:szCs w:val="26"/>
-              </w:rPr>
-              <w:t xml:space="preserve">('')}}{% if </w:t>
-            </w:r>
-            <w:proofErr w:type="spellStart"/>
-            <w:r>
-              <w:rPr>
-                <w:rFonts w:ascii="Times New Roman" w:hAnsi="Times New Roman" w:cs="Times New Roman"/>
-                <w:sz w:val="26"/>
-                <w:szCs w:val="26"/>
-              </w:rPr>
-              <w:t>pickup_type_other</w:t>
-            </w:r>
-            <w:proofErr w:type="spellEnd"/>
-            <w:r>
-              <w:rPr>
-                <w:rFonts w:ascii="Times New Roman" w:hAnsi="Times New Roman" w:cs="Times New Roman"/>
-                <w:sz w:val="26"/>
-                <w:szCs w:val="26"/>
-              </w:rPr>
-              <w:t xml:space="preserve"> %} - {{</w:t>
-            </w:r>
-            <w:proofErr w:type="spellStart"/>
-            <w:r>
-              <w:rPr>
-                <w:rFonts w:ascii="Times New Roman" w:hAnsi="Times New Roman" w:cs="Times New Roman"/>
-                <w:sz w:val="26"/>
-                <w:szCs w:val="26"/>
-              </w:rPr>
-              <w:t>pickup_type_other</w:t>
-            </w:r>
-            <w:proofErr w:type="spellEnd"/>
-            <w:r>
-              <w:rPr>
-                <w:rFonts w:ascii="Times New Roman" w:hAnsi="Times New Roman" w:cs="Times New Roman"/>
-                <w:sz w:val="26"/>
-                <w:szCs w:val="26"/>
-              </w:rPr>
-              <w:t>}}{% endif %}</w:t>
+              <w:t>Pickup Type: {{pickup_type|default('')}}{% if pickup_type_other %} - {{pickup_type_other}}{% endif %}</w:t>
             </w:r>
             <w:r>
               <w:rPr>
@@ -2341,61 +1720,7 @@
                 <w:szCs w:val="26"/>
               </w:rPr>
               <w:br/>
-              <w:t>Stacking Type: {{</w:t>
-            </w:r>
-            <w:proofErr w:type="spellStart"/>
-            <w:r>
-              <w:rPr>
-                <w:rFonts w:ascii="Times New Roman" w:hAnsi="Times New Roman" w:cs="Times New Roman"/>
-                <w:sz w:val="26"/>
-                <w:szCs w:val="26"/>
-              </w:rPr>
-              <w:t>stacking_type|default</w:t>
-            </w:r>
-            <w:proofErr w:type="spellEnd"/>
-            <w:r>
-              <w:rPr>
-                <w:rFonts w:ascii="Times New Roman" w:hAnsi="Times New Roman" w:cs="Times New Roman"/>
-                <w:sz w:val="26"/>
-                <w:szCs w:val="26"/>
-              </w:rPr>
-              <w:t xml:space="preserve">('')}}{% if </w:t>
-            </w:r>
-            <w:proofErr w:type="spellStart"/>
-            <w:r>
-              <w:rPr>
-                <w:rFonts w:ascii="Times New Roman" w:hAnsi="Times New Roman" w:cs="Times New Roman"/>
-                <w:sz w:val="26"/>
-                <w:szCs w:val="26"/>
-              </w:rPr>
-              <w:t>stacking_type_other</w:t>
-            </w:r>
-            <w:proofErr w:type="spellEnd"/>
-            <w:r>
-              <w:rPr>
-                <w:rFonts w:ascii="Times New Roman" w:hAnsi="Times New Roman" w:cs="Times New Roman"/>
-                <w:sz w:val="26"/>
-                <w:szCs w:val="26"/>
-              </w:rPr>
-              <w:t xml:space="preserve"> %} - {{</w:t>
-            </w:r>
-            <w:proofErr w:type="spellStart"/>
-            <w:r>
-              <w:rPr>
-                <w:rFonts w:ascii="Times New Roman" w:hAnsi="Times New Roman" w:cs="Times New Roman"/>
-                <w:sz w:val="26"/>
-                <w:szCs w:val="26"/>
-              </w:rPr>
-              <w:t>stacking_type_other</w:t>
-            </w:r>
-            <w:proofErr w:type="spellEnd"/>
-            <w:r>
-              <w:rPr>
-                <w:rFonts w:ascii="Times New Roman" w:hAnsi="Times New Roman" w:cs="Times New Roman"/>
-                <w:sz w:val="26"/>
-                <w:szCs w:val="26"/>
-              </w:rPr>
-              <w:t>}}{% endif %}</w:t>
+              <w:t>Stacking Type: {{stacking_type|default('')}}{% if stacking_type_other %} - {{stacking_type_other}}{% endif %}</w:t>
             </w:r>
             <w:r>
               <w:rPr>
@@ -2404,25 +1729,7 @@
                 <w:szCs w:val="26"/>
               </w:rPr>
               <w:br/>
-              <w:t>Storage Layout Description: {{</w:t>
-            </w:r>
-            <w:proofErr w:type="spellStart"/>
-            <w:r>
-              <w:rPr>
-                <w:rFonts w:ascii="Times New Roman" w:hAnsi="Times New Roman" w:cs="Times New Roman"/>
-                <w:sz w:val="26"/>
-                <w:szCs w:val="26"/>
-              </w:rPr>
-              <w:t>storage_layout|default</w:t>
-            </w:r>
-            <w:proofErr w:type="spellEnd"/>
-            <w:r>
-              <w:rPr>
-                <w:rFonts w:ascii="Times New Roman" w:hAnsi="Times New Roman" w:cs="Times New Roman"/>
-                <w:sz w:val="26"/>
-                <w:szCs w:val="26"/>
-              </w:rPr>
-              <w:t>('')}}</w:t>
+              <w:t>Storage Layout Description: {{storage_layout|default('')}}</w:t>
             </w:r>
             <w:r>
               <w:rPr>
@@ -2431,25 +1738,7 @@
                 <w:szCs w:val="26"/>
               </w:rPr>
               <w:br/>
-              <w:t>Distance Between Pallets / Boxes: {{</w:t>
-            </w:r>
-            <w:proofErr w:type="spellStart"/>
-            <w:r>
-              <w:rPr>
-                <w:rFonts w:ascii="Times New Roman" w:hAnsi="Times New Roman" w:cs="Times New Roman"/>
-                <w:sz w:val="26"/>
-                <w:szCs w:val="26"/>
-              </w:rPr>
-              <w:t>box_distance_mm|default</w:t>
-            </w:r>
-            <w:proofErr w:type="spellEnd"/>
-            <w:r>
-              <w:rPr>
-                <w:rFonts w:ascii="Times New Roman" w:hAnsi="Times New Roman" w:cs="Times New Roman"/>
-                <w:sz w:val="26"/>
-                <w:szCs w:val="26"/>
-              </w:rPr>
-              <w:t>('')}} mm</w:t>
+              <w:t>Distance Between Pallets / Boxes: {{box_distance_mm|default('')}} mm</w:t>
             </w:r>
             <w:r>
               <w:rPr>
@@ -2458,25 +1747,7 @@
                 <w:szCs w:val="26"/>
               </w:rPr>
               <w:br/>
-              <w:t>Aisle Width: {{</w:t>
-            </w:r>
-            <w:proofErr w:type="spellStart"/>
-            <w:r>
-              <w:rPr>
-                <w:rFonts w:ascii="Times New Roman" w:hAnsi="Times New Roman" w:cs="Times New Roman"/>
-                <w:sz w:val="26"/>
-                <w:szCs w:val="26"/>
-              </w:rPr>
-              <w:t>aisle_width_mm|default</w:t>
-            </w:r>
-            <w:proofErr w:type="spellEnd"/>
-            <w:r>
-              <w:rPr>
-                <w:rFonts w:ascii="Times New Roman" w:hAnsi="Times New Roman" w:cs="Times New Roman"/>
-                <w:sz w:val="26"/>
-                <w:szCs w:val="26"/>
-              </w:rPr>
-              <w:t>('')}} mm</w:t>
+              <w:t>Aisle Width: {{aisle_width_mm|default('')}} mm</w:t>
             </w:r>
             <w:r>
               <w:rPr>
@@ -2485,25 +1756,7 @@
                 <w:szCs w:val="26"/>
               </w:rPr>
               <w:br/>
-              <w:t>Conveyor Height: {{</w:t>
-            </w:r>
-            <w:proofErr w:type="spellStart"/>
-            <w:r>
-              <w:rPr>
-                <w:rFonts w:ascii="Times New Roman" w:hAnsi="Times New Roman" w:cs="Times New Roman"/>
-                <w:sz w:val="26"/>
-                <w:szCs w:val="26"/>
-              </w:rPr>
-              <w:t>conveyor_height|default</w:t>
-            </w:r>
-            <w:proofErr w:type="spellEnd"/>
-            <w:r>
-              <w:rPr>
-                <w:rFonts w:ascii="Times New Roman" w:hAnsi="Times New Roman" w:cs="Times New Roman"/>
-                <w:sz w:val="26"/>
-                <w:szCs w:val="26"/>
-              </w:rPr>
-              <w:t>('')}} mm</w:t>
+              <w:t>Conveyor Height: {{conveyor_height|default('')}} mm</w:t>
             </w:r>
             <w:r>
               <w:rPr>
@@ -2512,25 +1765,7 @@
                 <w:szCs w:val="26"/>
               </w:rPr>
               <w:br/>
-              <w:t>Load arrives at conveyor edge: {{</w:t>
-            </w:r>
-            <w:proofErr w:type="spellStart"/>
-            <w:r>
-              <w:rPr>
-                <w:rFonts w:ascii="Times New Roman" w:hAnsi="Times New Roman" w:cs="Times New Roman"/>
-                <w:sz w:val="26"/>
-                <w:szCs w:val="26"/>
-              </w:rPr>
-              <w:t>load_at_edge|default</w:t>
-            </w:r>
-            <w:proofErr w:type="spellEnd"/>
-            <w:r>
-              <w:rPr>
-                <w:rFonts w:ascii="Times New Roman" w:hAnsi="Times New Roman" w:cs="Times New Roman"/>
-                <w:sz w:val="26"/>
-                <w:szCs w:val="26"/>
-              </w:rPr>
-              <w:t>('')}}</w:t>
+              <w:t>Load arrives at conveyor edge: {{load_at_edge|default('')}}</w:t>
             </w:r>
             <w:r>
               <w:rPr>
@@ -2539,25 +1774,7 @@
                 <w:szCs w:val="26"/>
               </w:rPr>
               <w:br/>
-              <w:t>Distance from conveyor edge to pallet: {{</w:t>
-            </w:r>
-            <w:proofErr w:type="spellStart"/>
-            <w:r>
-              <w:rPr>
-                <w:rFonts w:ascii="Times New Roman" w:hAnsi="Times New Roman" w:cs="Times New Roman"/>
-                <w:sz w:val="26"/>
-                <w:szCs w:val="26"/>
-              </w:rPr>
-              <w:t>distance_from_edge|default</w:t>
-            </w:r>
-            <w:proofErr w:type="spellEnd"/>
-            <w:r>
-              <w:rPr>
-                <w:rFonts w:ascii="Times New Roman" w:hAnsi="Times New Roman" w:cs="Times New Roman"/>
-                <w:sz w:val="26"/>
-                <w:szCs w:val="26"/>
-              </w:rPr>
-              <w:t>('')}} mm</w:t>
+              <w:t>Distance from conveyor edge to pallet: {{distance_from_edge|default('')}} mm</w:t>
             </w:r>
             <w:r>
               <w:rPr>
@@ -2566,25 +1783,7 @@
                 <w:szCs w:val="26"/>
               </w:rPr>
               <w:br/>
-              <w:t>Conveyor Picture: {{</w:t>
-            </w:r>
-            <w:proofErr w:type="spellStart"/>
-            <w:r>
-              <w:rPr>
-                <w:rFonts w:ascii="Times New Roman" w:hAnsi="Times New Roman" w:cs="Times New Roman"/>
-                <w:sz w:val="26"/>
-                <w:szCs w:val="26"/>
-              </w:rPr>
-              <w:t>conveyor_picture_name|default</w:t>
-            </w:r>
-            <w:proofErr w:type="spellEnd"/>
-            <w:r>
-              <w:rPr>
-                <w:rFonts w:ascii="Times New Roman" w:hAnsi="Times New Roman" w:cs="Times New Roman"/>
-                <w:sz w:val="26"/>
-                <w:szCs w:val="26"/>
-              </w:rPr>
-              <w:t>('')}}{% endif %}</w:t>
+              <w:t>Conveyor Picture: {{conveyor_picture_name|default('')}}{% endif %}</w:t>
             </w:r>
             <w:r>
               <w:rPr>
@@ -2601,25 +1800,7 @@
                 <w:szCs w:val="26"/>
               </w:rPr>
               <w:br/>
-              <w:t xml:space="preserve">{% if </w:t>
-            </w:r>
-            <w:proofErr w:type="spellStart"/>
-            <w:r>
-              <w:rPr>
-                <w:rFonts w:ascii="Times New Roman" w:hAnsi="Times New Roman" w:cs="Times New Roman"/>
-                <w:sz w:val="26"/>
-                <w:szCs w:val="26"/>
-              </w:rPr>
-              <w:t>xna_model</w:t>
-            </w:r>
-            <w:proofErr w:type="spellEnd"/>
-            <w:r>
-              <w:rPr>
-                <w:rFonts w:ascii="Times New Roman" w:hAnsi="Times New Roman" w:cs="Times New Roman"/>
-                <w:sz w:val="26"/>
-                <w:szCs w:val="26"/>
-              </w:rPr>
-              <w:t xml:space="preserve"> %}Narrow Aisle:</w:t>
+              <w:t>{% if xna_model %}Narrow Aisle:</w:t>
             </w:r>
             <w:r>
               <w:rPr>
@@ -2628,25 +1809,7 @@
                 <w:szCs w:val="26"/>
               </w:rPr>
               <w:br/>
-              <w:t>Actual Aisle Width: {{</w:t>
-            </w:r>
-            <w:proofErr w:type="spellStart"/>
-            <w:r>
-              <w:rPr>
-                <w:rFonts w:ascii="Times New Roman" w:hAnsi="Times New Roman" w:cs="Times New Roman"/>
-                <w:sz w:val="26"/>
-                <w:szCs w:val="26"/>
-              </w:rPr>
-              <w:t>aisle_width_m|default</w:t>
-            </w:r>
-            <w:proofErr w:type="spellEnd"/>
-            <w:r>
-              <w:rPr>
-                <w:rFonts w:ascii="Times New Roman" w:hAnsi="Times New Roman" w:cs="Times New Roman"/>
-                <w:sz w:val="26"/>
-                <w:szCs w:val="26"/>
-              </w:rPr>
-              <w:t>('')}} m</w:t>
+              <w:t>Actual Aisle Width: {{aisle_width_m|default('')}} m</w:t>
             </w:r>
             <w:r>
               <w:rPr>
@@ -2655,25 +1818,7 @@
                 <w:szCs w:val="26"/>
               </w:rPr>
               <w:br/>
-              <w:t>Preferred Model: {{</w:t>
-            </w:r>
-            <w:proofErr w:type="spellStart"/>
-            <w:r>
-              <w:rPr>
-                <w:rFonts w:ascii="Times New Roman" w:hAnsi="Times New Roman" w:cs="Times New Roman"/>
-                <w:sz w:val="26"/>
-                <w:szCs w:val="26"/>
-              </w:rPr>
-              <w:t>xna_model|default</w:t>
-            </w:r>
-            <w:proofErr w:type="spellEnd"/>
-            <w:r>
-              <w:rPr>
-                <w:rFonts w:ascii="Times New Roman" w:hAnsi="Times New Roman" w:cs="Times New Roman"/>
-                <w:sz w:val="26"/>
-                <w:szCs w:val="26"/>
-              </w:rPr>
-              <w:t>('')}}{% endif %}</w:t>
+              <w:t>Preferred Model: {{xna_model|default('')}}{% endif %}</w:t>
             </w:r>
           </w:p>
         </w:tc>
@@ -2845,25 +1990,7 @@
                 <w:sz w:val="26"/>
                 <w:szCs w:val="26"/>
               </w:rPr>
-              <w:t>Pallet type/size: {{</w:t>
-            </w:r>
-            <w:proofErr w:type="spellStart"/>
-            <w:r>
-              <w:rPr>
-                <w:rFonts w:ascii="Times New Roman" w:hAnsi="Times New Roman" w:cs="Times New Roman"/>
-                <w:sz w:val="26"/>
-                <w:szCs w:val="26"/>
-              </w:rPr>
-              <w:t>pallet_type|default</w:t>
-            </w:r>
-            <w:proofErr w:type="spellEnd"/>
-            <w:r>
-              <w:rPr>
-                <w:rFonts w:ascii="Times New Roman" w:hAnsi="Times New Roman" w:cs="Times New Roman"/>
-                <w:sz w:val="26"/>
-                <w:szCs w:val="26"/>
-              </w:rPr>
-              <w:t>('')}}</w:t>
+              <w:t>Pallet type/size: {{pallet_type|default('')}}</w:t>
             </w:r>
             <w:r>
               <w:rPr>
@@ -2872,25 +1999,7 @@
                 <w:szCs w:val="26"/>
               </w:rPr>
               <w:br/>
-              <w:t>Pallet Width (Fork Entry): {{</w:t>
-            </w:r>
-            <w:proofErr w:type="spellStart"/>
-            <w:r>
-              <w:rPr>
-                <w:rFonts w:ascii="Times New Roman" w:hAnsi="Times New Roman" w:cs="Times New Roman"/>
-                <w:sz w:val="26"/>
-                <w:szCs w:val="26"/>
-              </w:rPr>
-              <w:t>pallet_width_mm|default</w:t>
-            </w:r>
-            <w:proofErr w:type="spellEnd"/>
-            <w:r>
-              <w:rPr>
-                <w:rFonts w:ascii="Times New Roman" w:hAnsi="Times New Roman" w:cs="Times New Roman"/>
-                <w:sz w:val="26"/>
-                <w:szCs w:val="26"/>
-              </w:rPr>
-              <w:t>('')}} mm</w:t>
+              <w:t>Pallet Width (Fork Entry): {{pallet_width_mm|default('')}} mm</w:t>
             </w:r>
             <w:r>
               <w:rPr>
@@ -2899,25 +2008,7 @@
                 <w:szCs w:val="26"/>
               </w:rPr>
               <w:br/>
-              <w:t>If Other pallet type: {{</w:t>
-            </w:r>
-            <w:proofErr w:type="spellStart"/>
-            <w:r>
-              <w:rPr>
-                <w:rFonts w:ascii="Times New Roman" w:hAnsi="Times New Roman" w:cs="Times New Roman"/>
-                <w:sz w:val="26"/>
-                <w:szCs w:val="26"/>
-              </w:rPr>
-              <w:t>other_pallet_type|default</w:t>
-            </w:r>
-            <w:proofErr w:type="spellEnd"/>
-            <w:r>
-              <w:rPr>
-                <w:rFonts w:ascii="Times New Roman" w:hAnsi="Times New Roman" w:cs="Times New Roman"/>
-                <w:sz w:val="26"/>
-                <w:szCs w:val="26"/>
-              </w:rPr>
-              <w:t>('')}}</w:t>
+              <w:t>If Other pallet type: {{other_pallet_type|default('')}}</w:t>
             </w:r>
             <w:r>
               <w:rPr>
@@ -2926,25 +2017,7 @@
                 <w:szCs w:val="26"/>
               </w:rPr>
               <w:br/>
-              <w:t>Load Dimensions (L×W×H): {{</w:t>
-            </w:r>
-            <w:proofErr w:type="spellStart"/>
-            <w:r>
-              <w:rPr>
-                <w:rFonts w:ascii="Times New Roman" w:hAnsi="Times New Roman" w:cs="Times New Roman"/>
-                <w:sz w:val="26"/>
-                <w:szCs w:val="26"/>
-              </w:rPr>
-              <w:t>load_dimensions|default</w:t>
-            </w:r>
-            <w:proofErr w:type="spellEnd"/>
-            <w:r>
-              <w:rPr>
-                <w:rFonts w:ascii="Times New Roman" w:hAnsi="Times New Roman" w:cs="Times New Roman"/>
-                <w:sz w:val="26"/>
-                <w:szCs w:val="26"/>
-              </w:rPr>
-              <w:t>('')}}</w:t>
+              <w:t>Load Dimensions (L×W×H): {{load_dimensions|default('')}}</w:t>
             </w:r>
             <w:r>
               <w:rPr>
@@ -2962,36 +2035,26 @@
                 <w:szCs w:val="26"/>
               </w:rPr>
               <w:br/>
-              <w:t>{{</w:t>
-            </w:r>
-            <w:proofErr w:type="spellStart"/>
-            <w:r>
-              <w:rPr>
-                <w:rFonts w:ascii="Times New Roman" w:hAnsi="Times New Roman" w:cs="Times New Roman"/>
-                <w:sz w:val="26"/>
-                <w:szCs w:val="26"/>
-              </w:rPr>
-              <w:t>pallets_summary|default</w:t>
-            </w:r>
-            <w:proofErr w:type="spellEnd"/>
-            <w:r>
-              <w:rPr>
-                <w:rFonts w:ascii="Times New Roman" w:hAnsi="Times New Roman" w:cs="Times New Roman"/>
-                <w:sz w:val="26"/>
-                <w:szCs w:val="26"/>
-              </w:rPr>
-              <w:t>('')}}</w:t>
-            </w:r>
-          </w:p>
-          <w:p>
-            <w:pPr>
-              <w:jc w:val="left"/>
-              <w:rPr>
-                <w:rFonts w:ascii="Times New Roman" w:hAnsi="Times New Roman" w:cs="Times New Roman"/>
-                <w:sz w:val="26"/>
-                <w:szCs w:val="26"/>
-              </w:rPr>
-            </w:pPr>
+              <w:t>{{pallets_summary|default('')}}</w:t>
+            </w:r>
+          </w:p>
+          <w:p>
+            <w:pPr>
+              <w:jc w:val="left"/>
+              <w:rPr>
+                <w:rFonts w:ascii="Times New Roman" w:hAnsi="Times New Roman" w:cs="Times New Roman"/>
+                <w:sz w:val="26"/>
+                <w:szCs w:val="26"/>
+              </w:rPr>
+            </w:pPr>
+            <w:r>
+              <w:rPr>
+                <w:rFonts w:ascii="Times New Roman" w:hAnsi="Times New Roman" w:cs="Times New Roman"/>
+                <w:sz w:val="26"/>
+                <w:szCs w:val="26"/>
+              </w:rPr>
+              <w:t xml:space="preserve">Other pallet can be picked by normal pallet truck: </w:t>
+            </w:r>
             <w:r>
               <w:rPr>
                 <w:rFonts w:ascii="Times New Roman" w:hAnsi="Times New Roman" w:cs="Times New Roman"/>
@@ -2999,25 +2062,7 @@
                 <w:szCs w:val="26"/>
               </w:rPr>
               <w:lastRenderedPageBreak/>
-              <w:t>Other pallet can be picked by normal pallet truck: {{</w:t>
-            </w:r>
-            <w:proofErr w:type="spellStart"/>
-            <w:r>
-              <w:rPr>
-                <w:rFonts w:ascii="Times New Roman" w:hAnsi="Times New Roman" w:cs="Times New Roman"/>
-                <w:sz w:val="26"/>
-                <w:szCs w:val="26"/>
-              </w:rPr>
-              <w:t>other_pallet_pickable|default</w:t>
-            </w:r>
-            <w:proofErr w:type="spellEnd"/>
-            <w:r>
-              <w:rPr>
-                <w:rFonts w:ascii="Times New Roman" w:hAnsi="Times New Roman" w:cs="Times New Roman"/>
-                <w:sz w:val="26"/>
-                <w:szCs w:val="26"/>
-              </w:rPr>
-              <w:t>('')}}</w:t>
+              <w:t>{{other_pallet_pickable|default('')}}</w:t>
             </w:r>
           </w:p>
         </w:tc>
@@ -3152,25 +2197,7 @@
                 <w:sz w:val="26"/>
                 <w:szCs w:val="26"/>
               </w:rPr>
-              <w:t>{{</w:t>
-            </w:r>
-            <w:proofErr w:type="spellStart"/>
-            <w:r>
-              <w:rPr>
-                <w:rFonts w:ascii="Times New Roman" w:hAnsi="Times New Roman" w:cs="Times New Roman"/>
-                <w:sz w:val="26"/>
-                <w:szCs w:val="26"/>
-              </w:rPr>
-              <w:t>load_weight_kg|default</w:t>
-            </w:r>
-            <w:proofErr w:type="spellEnd"/>
-            <w:r>
-              <w:rPr>
-                <w:rFonts w:ascii="Times New Roman" w:hAnsi="Times New Roman" w:cs="Times New Roman"/>
-                <w:sz w:val="26"/>
-                <w:szCs w:val="26"/>
-              </w:rPr>
-              <w:t>('')}} kg</w:t>
+              <w:t>{{load_weight_kg|default('')}} kg</w:t>
             </w:r>
           </w:p>
         </w:tc>
@@ -3290,25 +2317,7 @@
                 <w:sz w:val="26"/>
                 <w:szCs w:val="26"/>
               </w:rPr>
-              <w:t>Pallets Per Day: {{</w:t>
-            </w:r>
-            <w:proofErr w:type="spellStart"/>
-            <w:r>
-              <w:rPr>
-                <w:rFonts w:ascii="Times New Roman" w:hAnsi="Times New Roman" w:cs="Times New Roman"/>
-                <w:sz w:val="26"/>
-                <w:szCs w:val="26"/>
-              </w:rPr>
-              <w:t>pallets_per_day|default</w:t>
-            </w:r>
-            <w:proofErr w:type="spellEnd"/>
-            <w:r>
-              <w:rPr>
-                <w:rFonts w:ascii="Times New Roman" w:hAnsi="Times New Roman" w:cs="Times New Roman"/>
-                <w:sz w:val="26"/>
-                <w:szCs w:val="26"/>
-              </w:rPr>
-              <w:t>('')}}</w:t>
+              <w:t>Pallets Per Day: {{pallets_per_day|default('')}}</w:t>
             </w:r>
             <w:r>
               <w:rPr>
@@ -3317,25 +2326,7 @@
                 <w:szCs w:val="26"/>
               </w:rPr>
               <w:br/>
-              <w:t>Operational Peak Hours: {{</w:t>
-            </w:r>
-            <w:proofErr w:type="spellStart"/>
-            <w:r>
-              <w:rPr>
-                <w:rFonts w:ascii="Times New Roman" w:hAnsi="Times New Roman" w:cs="Times New Roman"/>
-                <w:sz w:val="26"/>
-                <w:szCs w:val="26"/>
-              </w:rPr>
-              <w:t>peak_hours|default</w:t>
-            </w:r>
-            <w:proofErr w:type="spellEnd"/>
-            <w:r>
-              <w:rPr>
-                <w:rFonts w:ascii="Times New Roman" w:hAnsi="Times New Roman" w:cs="Times New Roman"/>
-                <w:sz w:val="26"/>
-                <w:szCs w:val="26"/>
-              </w:rPr>
-              <w:t>('')}}</w:t>
+              <w:t>Operational Peak Hours: {{peak_hours|default('')}}</w:t>
             </w:r>
             <w:r>
               <w:rPr>
@@ -3344,25 +2335,7 @@
                 <w:szCs w:val="26"/>
               </w:rPr>
               <w:br/>
-              <w:t>Shifts per Day: {{</w:t>
-            </w:r>
-            <w:proofErr w:type="spellStart"/>
-            <w:r>
-              <w:rPr>
-                <w:rFonts w:ascii="Times New Roman" w:hAnsi="Times New Roman" w:cs="Times New Roman"/>
-                <w:sz w:val="26"/>
-                <w:szCs w:val="26"/>
-              </w:rPr>
-              <w:t>shifts_per_day|default</w:t>
-            </w:r>
-            <w:proofErr w:type="spellEnd"/>
-            <w:r>
-              <w:rPr>
-                <w:rFonts w:ascii="Times New Roman" w:hAnsi="Times New Roman" w:cs="Times New Roman"/>
-                <w:sz w:val="26"/>
-                <w:szCs w:val="26"/>
-              </w:rPr>
-              <w:t>('')}}</w:t>
+              <w:t>Shifts per Day: {{shifts_per_day|default('')}}</w:t>
             </w:r>
             <w:r>
               <w:rPr>
@@ -3371,25 +2344,7 @@
                 <w:szCs w:val="26"/>
               </w:rPr>
               <w:br/>
-              <w:t>Pallets per Hour: {{</w:t>
-            </w:r>
-            <w:proofErr w:type="spellStart"/>
-            <w:r>
-              <w:rPr>
-                <w:rFonts w:ascii="Times New Roman" w:hAnsi="Times New Roman" w:cs="Times New Roman"/>
-                <w:sz w:val="26"/>
-                <w:szCs w:val="26"/>
-              </w:rPr>
-              <w:t>pallets_per_hour|default</w:t>
-            </w:r>
-            <w:proofErr w:type="spellEnd"/>
-            <w:r>
-              <w:rPr>
-                <w:rFonts w:ascii="Times New Roman" w:hAnsi="Times New Roman" w:cs="Times New Roman"/>
-                <w:sz w:val="26"/>
-                <w:szCs w:val="26"/>
-              </w:rPr>
-              <w:t>('')}}</w:t>
+              <w:t>Pallets per Hour: {{pallets_per_hour|default('')}}</w:t>
             </w:r>
           </w:p>
         </w:tc>
@@ -3466,26 +2421,19 @@
             <w:vAlign w:val="center"/>
           </w:tcPr>
           <w:p>
-            <w:pPr>
-              <w:spacing w:line="240" w:lineRule="auto"/>
-              <w:jc w:val="left"/>
-              <w:rPr>
-                <w:rFonts w:ascii="Times New Roman" w:eastAsiaTheme="minorEastAsia" w:hAnsi="Times New Roman" w:cs="Times New Roman"/>
-                <w:b/>
-                <w:bCs/>
-                <w:sz w:val="26"/>
-                <w:szCs w:val="26"/>
-              </w:rPr>
-            </w:pPr>
-            <w:r>
-              <w:rPr>
-                <w:rFonts w:ascii="Times New Roman" w:eastAsiaTheme="minorEastAsia" w:hAnsi="Times New Roman" w:cs="Times New Roman"/>
-                <w:kern w:val="0"/>
-                <w:sz w:val="26"/>
-                <w:szCs w:val="26"/>
-                <w:lang w:val="en-BE"/>
-              </w:rPr>
-              <w:t>Transport Distance:</w:t>
+            <w:r>
+              <w:t>{{special_layout}}</w:t>
+            </w:r>
+            <w:r>
+              <w:br/>
+            </w:r>
+            <w:r>
+              <w:br/>
+              <w:t>Application-Specific Details:</w:t>
+            </w:r>
+            <w:r>
+              <w:br/>
+              <w:t>{{application_specific_text}}</w:t>
             </w:r>
           </w:p>
         </w:tc>
@@ -3513,25 +2461,7 @@
                 <w:sz w:val="26"/>
                 <w:szCs w:val="26"/>
               </w:rPr>
-              <w:t>Maximum Transport Distance: {{</w:t>
-            </w:r>
-            <w:proofErr w:type="spellStart"/>
-            <w:r>
-              <w:rPr>
-                <w:rFonts w:ascii="Times New Roman" w:hAnsi="Times New Roman" w:cs="Times New Roman"/>
-                <w:sz w:val="26"/>
-                <w:szCs w:val="26"/>
-              </w:rPr>
-              <w:t>max_transport_m|default</w:t>
-            </w:r>
-            <w:proofErr w:type="spellEnd"/>
-            <w:r>
-              <w:rPr>
-                <w:rFonts w:ascii="Times New Roman" w:hAnsi="Times New Roman" w:cs="Times New Roman"/>
-                <w:sz w:val="26"/>
-                <w:szCs w:val="26"/>
-              </w:rPr>
-              <w:t>('')}} m</w:t>
+              <w:t>Maximum Transport Distance: {{max_transport_m|default('')}} m</w:t>
             </w:r>
             <w:r>
               <w:rPr>
@@ -3540,25 +2470,7 @@
                 <w:szCs w:val="26"/>
               </w:rPr>
               <w:br/>
-              <w:t>Minimum Transport Distance: {{</w:t>
-            </w:r>
-            <w:proofErr w:type="spellStart"/>
-            <w:r>
-              <w:rPr>
-                <w:rFonts w:ascii="Times New Roman" w:hAnsi="Times New Roman" w:cs="Times New Roman"/>
-                <w:sz w:val="26"/>
-                <w:szCs w:val="26"/>
-              </w:rPr>
-              <w:t>min_transport_m|default</w:t>
-            </w:r>
-            <w:proofErr w:type="spellEnd"/>
-            <w:r>
-              <w:rPr>
-                <w:rFonts w:ascii="Times New Roman" w:hAnsi="Times New Roman" w:cs="Times New Roman"/>
-                <w:sz w:val="26"/>
-                <w:szCs w:val="26"/>
-              </w:rPr>
-              <w:t>('')}} m</w:t>
+              <w:t>Minimum Transport Distance: {{min_transport_m|default('')}} m</w:t>
             </w:r>
             <w:r>
               <w:rPr>
@@ -3567,25 +2479,7 @@
                 <w:szCs w:val="26"/>
               </w:rPr>
               <w:br/>
-              <w:t>Average Transport Distance: {{</w:t>
-            </w:r>
-            <w:proofErr w:type="spellStart"/>
-            <w:r>
-              <w:rPr>
-                <w:rFonts w:ascii="Times New Roman" w:hAnsi="Times New Roman" w:cs="Times New Roman"/>
-                <w:sz w:val="26"/>
-                <w:szCs w:val="26"/>
-              </w:rPr>
-              <w:t>avg_transport_m|default</w:t>
-            </w:r>
-            <w:proofErr w:type="spellEnd"/>
-            <w:r>
-              <w:rPr>
-                <w:rFonts w:ascii="Times New Roman" w:hAnsi="Times New Roman" w:cs="Times New Roman"/>
-                <w:sz w:val="26"/>
-                <w:szCs w:val="26"/>
-              </w:rPr>
-              <w:t>('')}} m</w:t>
+              <w:t>Average Transport Distance: {{avg_transport_m|default('')}} m</w:t>
             </w:r>
           </w:p>
         </w:tc>
@@ -3722,48 +2616,32 @@
             <w:vAlign w:val="center"/>
           </w:tcPr>
           <w:p>
-            <w:pPr>
-              <w:jc w:val="left"/>
-              <w:rPr>
-                <w:rFonts w:ascii="Times New Roman" w:hAnsi="Times New Roman" w:cs="Times New Roman"/>
-                <w:sz w:val="26"/>
-                <w:szCs w:val="26"/>
-              </w:rPr>
-            </w:pPr>
-            <w:r>
-              <w:rPr>
-                <w:rFonts w:ascii="Times New Roman" w:hAnsi="Times New Roman" w:cs="Times New Roman"/>
-                <w:sz w:val="26"/>
-                <w:szCs w:val="26"/>
-              </w:rPr>
-              <w:t>Operation process / Efficiency notes:</w:t>
-            </w:r>
-            <w:r>
-              <w:rPr>
-                <w:rFonts w:ascii="Times New Roman" w:hAnsi="Times New Roman" w:cs="Times New Roman"/>
-                <w:sz w:val="26"/>
-                <w:szCs w:val="26"/>
-              </w:rPr>
+            <w:r>
+              <w:t>Pallet type/size: {{pallet_type}}</w:t>
+            </w:r>
+            <w:r>
               <w:br/>
-              <w:t>{{</w:t>
-            </w:r>
-            <w:proofErr w:type="spellStart"/>
-            <w:r>
-              <w:rPr>
-                <w:rFonts w:ascii="Times New Roman" w:hAnsi="Times New Roman" w:cs="Times New Roman"/>
-                <w:sz w:val="26"/>
-                <w:szCs w:val="26"/>
-              </w:rPr>
-              <w:t>route_summary|default</w:t>
-            </w:r>
-            <w:proofErr w:type="spellEnd"/>
-            <w:r>
-              <w:rPr>
-                <w:rFonts w:ascii="Times New Roman" w:hAnsi="Times New Roman" w:cs="Times New Roman"/>
-                <w:sz w:val="26"/>
-                <w:szCs w:val="26"/>
-              </w:rPr>
-              <w:t>('')}}</w:t>
+              <w:t>Insertion Depth: {{pallet_width_mm}} mm</w:t>
+            </w:r>
+            <w:r>
+              <w:br/>
+              <w:t>If Other pallet type: {{other_pallet_type}}</w:t>
+            </w:r>
+            <w:r>
+              <w:br/>
+              <w:t>Load Dimensions (L×W×H): {{load_dimensions}}</w:t>
+            </w:r>
+            <w:r>
+              <w:br/>
+              <w:t>All Pallets Summary:</w:t>
+            </w:r>
+            <w:r>
+              <w:br/>
+              <w:t>{{pallets_summary}}</w:t>
+            </w:r>
+            <w:r>
+              <w:br/>
+              <w:t>Other pallet can be picked by normal pallet truck: {{other_pallet_pickable}}</w:t>
             </w:r>
           </w:p>
         </w:tc>
@@ -3898,25 +2776,7 @@
                 <w:szCs w:val="26"/>
               </w:rPr>
               <w:br/>
-              <w:t>See attached CAD/layout file: {{</w:t>
-            </w:r>
-            <w:proofErr w:type="spellStart"/>
-            <w:r>
-              <w:rPr>
-                <w:rFonts w:ascii="Times New Roman" w:hAnsi="Times New Roman" w:cs="Times New Roman"/>
-                <w:sz w:val="26"/>
-                <w:szCs w:val="26"/>
-              </w:rPr>
-              <w:t>cad_filename|default</w:t>
-            </w:r>
-            <w:proofErr w:type="spellEnd"/>
-            <w:r>
-              <w:rPr>
-                <w:rFonts w:ascii="Times New Roman" w:hAnsi="Times New Roman" w:cs="Times New Roman"/>
-                <w:sz w:val="26"/>
-                <w:szCs w:val="26"/>
-              </w:rPr>
-              <w:t>('')}}</w:t>
+              <w:t>See attached CAD/layout file: {{cad_filename|default('')}}</w:t>
             </w:r>
           </w:p>
         </w:tc>
@@ -4038,25 +2898,7 @@
                 <w:sz w:val="26"/>
                 <w:szCs w:val="26"/>
               </w:rPr>
-              <w:t>Material Flow Sequence: {{</w:t>
-            </w:r>
-            <w:proofErr w:type="spellStart"/>
-            <w:r>
-              <w:rPr>
-                <w:rFonts w:ascii="Times New Roman" w:hAnsi="Times New Roman" w:cs="Times New Roman"/>
-                <w:sz w:val="26"/>
-                <w:szCs w:val="26"/>
-              </w:rPr>
-              <w:t>flow_steps|default</w:t>
-            </w:r>
-            <w:proofErr w:type="spellEnd"/>
-            <w:r>
-              <w:rPr>
-                <w:rFonts w:ascii="Times New Roman" w:hAnsi="Times New Roman" w:cs="Times New Roman"/>
-                <w:sz w:val="26"/>
-                <w:szCs w:val="26"/>
-              </w:rPr>
-              <w:t>('')}}</w:t>
+              <w:t>Material Flow Sequence: {{flow_steps|default('')}}</w:t>
             </w:r>
             <w:r>
               <w:rPr>
@@ -4074,25 +2916,7 @@
                 <w:szCs w:val="26"/>
               </w:rPr>
               <w:br/>
-              <w:t>{{</w:t>
-            </w:r>
-            <w:proofErr w:type="spellStart"/>
-            <w:r>
-              <w:rPr>
-                <w:rFonts w:ascii="Times New Roman" w:hAnsi="Times New Roman" w:cs="Times New Roman"/>
-                <w:sz w:val="26"/>
-                <w:szCs w:val="26"/>
-              </w:rPr>
-              <w:t>route_summary|default</w:t>
-            </w:r>
-            <w:proofErr w:type="spellEnd"/>
-            <w:r>
-              <w:rPr>
-                <w:rFonts w:ascii="Times New Roman" w:hAnsi="Times New Roman" w:cs="Times New Roman"/>
-                <w:sz w:val="26"/>
-                <w:szCs w:val="26"/>
-              </w:rPr>
-              <w:t>('')}}</w:t>
+              <w:t>{{route_summary|default('')}}</w:t>
             </w:r>
             <w:r>
               <w:rPr>
@@ -4101,25 +2925,7 @@
                 <w:szCs w:val="26"/>
               </w:rPr>
               <w:br/>
-              <w:t>Material Flow Details / Summary: {{</w:t>
-            </w:r>
-            <w:proofErr w:type="spellStart"/>
-            <w:r>
-              <w:rPr>
-                <w:rFonts w:ascii="Times New Roman" w:hAnsi="Times New Roman" w:cs="Times New Roman"/>
-                <w:sz w:val="26"/>
-                <w:szCs w:val="26"/>
-              </w:rPr>
-              <w:t>material_flow_text|default</w:t>
-            </w:r>
-            <w:proofErr w:type="spellEnd"/>
-            <w:r>
-              <w:rPr>
-                <w:rFonts w:ascii="Times New Roman" w:hAnsi="Times New Roman" w:cs="Times New Roman"/>
-                <w:sz w:val="26"/>
-                <w:szCs w:val="26"/>
-              </w:rPr>
-              <w:t>('')}}</w:t>
+              <w:t>Material Flow Details / Summary: {{material_flow_text|default('')}}</w:t>
             </w:r>
             <w:r>
               <w:rPr>
@@ -4128,25 +2934,7 @@
                 <w:szCs w:val="26"/>
               </w:rPr>
               <w:br/>
-              <w:t>Special Comments / Direct Flows / Notes: {{</w:t>
-            </w:r>
-            <w:proofErr w:type="spellStart"/>
-            <w:r>
-              <w:rPr>
-                <w:rFonts w:ascii="Times New Roman" w:hAnsi="Times New Roman" w:cs="Times New Roman"/>
-                <w:sz w:val="26"/>
-                <w:szCs w:val="26"/>
-              </w:rPr>
-              <w:t>special_comments|default</w:t>
-            </w:r>
-            <w:proofErr w:type="spellEnd"/>
-            <w:r>
-              <w:rPr>
-                <w:rFonts w:ascii="Times New Roman" w:hAnsi="Times New Roman" w:cs="Times New Roman"/>
-                <w:sz w:val="26"/>
-                <w:szCs w:val="26"/>
-              </w:rPr>
-              <w:t>('')}}</w:t>
+              <w:t>Special Comments / Direct Flows / Notes: {{special_comments|default('')}}</w:t>
             </w:r>
             <w:r>
               <w:rPr>
@@ -4155,25 +2943,7 @@
                 <w:szCs w:val="26"/>
               </w:rPr>
               <w:br/>
-              <w:t>Distances between steps: {{</w:t>
-            </w:r>
-            <w:proofErr w:type="spellStart"/>
-            <w:r>
-              <w:rPr>
-                <w:rFonts w:ascii="Times New Roman" w:hAnsi="Times New Roman" w:cs="Times New Roman"/>
-                <w:sz w:val="26"/>
-                <w:szCs w:val="26"/>
-              </w:rPr>
-              <w:t>distances|default</w:t>
-            </w:r>
-            <w:proofErr w:type="spellEnd"/>
-            <w:r>
-              <w:rPr>
-                <w:rFonts w:ascii="Times New Roman" w:hAnsi="Times New Roman" w:cs="Times New Roman"/>
-                <w:sz w:val="26"/>
-                <w:szCs w:val="26"/>
-              </w:rPr>
-              <w:t>('')}}</w:t>
+              <w:t>Distances between steps: {{distances|default('')}}</w:t>
             </w:r>
           </w:p>
         </w:tc>
@@ -4265,6 +3035,7 @@
                 <w:sz w:val="26"/>
                 <w:szCs w:val="26"/>
               </w:rPr>
+              <w:lastRenderedPageBreak/>
               <w:t>facilities</w:t>
             </w:r>
           </w:p>
@@ -4299,46 +3070,29 @@
             <w:vAlign w:val="center"/>
           </w:tcPr>
           <w:p>
-            <w:pPr>
-              <w:spacing w:line="240" w:lineRule="auto"/>
-              <w:jc w:val="left"/>
-              <w:rPr>
-                <w:rFonts w:ascii="Times New Roman" w:eastAsiaTheme="minorEastAsia" w:hAnsi="Times New Roman" w:cs="Times New Roman"/>
-                <w:sz w:val="26"/>
-                <w:szCs w:val="26"/>
-              </w:rPr>
-            </w:pPr>
-            <w:r>
-              <w:rPr>
-                <w:rFonts w:ascii="Times New Roman" w:hAnsi="Times New Roman" w:cs="Times New Roman"/>
-                <w:sz w:val="26"/>
-                <w:szCs w:val="26"/>
-              </w:rPr>
-              <w:t>Whether there is a charging pile</w:t>
-            </w:r>
-            <w:r>
-              <w:rPr>
-                <w:rFonts w:ascii="Times New Roman" w:eastAsiaTheme="minorEastAsia" w:hAnsi="Times New Roman" w:cs="Times New Roman"/>
-                <w:sz w:val="26"/>
-                <w:szCs w:val="26"/>
-              </w:rPr>
-              <w:t>/</w:t>
-            </w:r>
-            <w:r>
-              <w:rPr>
-                <w:rFonts w:ascii="Times New Roman" w:hAnsi="Times New Roman" w:cs="Times New Roman"/>
-                <w:sz w:val="26"/>
-                <w:szCs w:val="26"/>
-              </w:rPr>
-              <w:t>battery swap station</w:t>
-            </w:r>
-            <w:r>
-              <w:rPr>
-                <w:rFonts w:ascii="Times New Roman" w:hAnsi="Times New Roman" w:cs="Times New Roman"/>
-                <w:sz w:val="26"/>
-                <w:szCs w:val="26"/>
-              </w:rPr>
-              <w:t>：</w:t>
+            <w:r>
+              <w:lastRenderedPageBreak/>
+              <w:t xml:space="preserve">Pallets Per Day: </w:t>
+            </w:r>
+            <w:r>
+              <w:lastRenderedPageBreak/>
+              <w:t>{{pallets_per_day}}</w:t>
+            </w:r>
+            <w:r>
+              <w:br/>
+              <w:t>Hours per Shift: {{peak_hours}}</w:t>
+            </w:r>
+            <w:r>
+              <w:br/>
+              <w:t>Shifts per Day: {{shifts_per_day}}</w:t>
+            </w:r>
+            <w:r>
+              <w:br/>
+              <w:t>Pallets per Hour: {{pallets_per_hour}}</w:t>
+            </w:r>
+            <w:r>
+              <w:br/>
+              <w:t>Temperature Range: {{temperature_range}}</w:t>
             </w:r>
           </w:p>
         </w:tc>
@@ -4366,6 +3120,7 @@
                 <w:sz w:val="26"/>
                 <w:szCs w:val="26"/>
               </w:rPr>
+              <w:lastRenderedPageBreak/>
               <w:t>Charging Status:</w:t>
             </w:r>
             <w:r>
@@ -4374,25 +3129,7 @@
                 <w:sz w:val="26"/>
                 <w:szCs w:val="26"/>
               </w:rPr>
-              <w:t>{{</w:t>
-            </w:r>
-            <w:proofErr w:type="spellStart"/>
-            <w:r>
-              <w:rPr>
-                <w:rFonts w:ascii="Times New Roman" w:hAnsi="Times New Roman" w:cs="Times New Roman"/>
-                <w:sz w:val="26"/>
-                <w:szCs w:val="26"/>
-              </w:rPr>
-              <w:t>charging_status|default</w:t>
-            </w:r>
-            <w:proofErr w:type="spellEnd"/>
-            <w:r>
-              <w:rPr>
-                <w:rFonts w:ascii="Times New Roman" w:hAnsi="Times New Roman" w:cs="Times New Roman"/>
-                <w:sz w:val="26"/>
-                <w:szCs w:val="26"/>
-              </w:rPr>
-              <w:t>('')}}</w:t>
+              <w:t>{{charging_status|default('')}}</w:t>
             </w:r>
             <w:r>
               <w:rPr>
@@ -4408,6 +3145,7 @@
                 <w:sz w:val="26"/>
                 <w:szCs w:val="26"/>
               </w:rPr>
+              <w:lastRenderedPageBreak/>
               <w:t>Parking Area:</w:t>
             </w:r>
             <w:r>
@@ -4416,25 +3154,7 @@
                 <w:sz w:val="26"/>
                 <w:szCs w:val="26"/>
               </w:rPr>
-              <w:t>{{</w:t>
-            </w:r>
-            <w:proofErr w:type="spellStart"/>
-            <w:r>
-              <w:rPr>
-                <w:rFonts w:ascii="Times New Roman" w:hAnsi="Times New Roman" w:cs="Times New Roman"/>
-                <w:sz w:val="26"/>
-                <w:szCs w:val="26"/>
-              </w:rPr>
-              <w:t>parking_area|default</w:t>
-            </w:r>
-            <w:proofErr w:type="spellEnd"/>
-            <w:r>
-              <w:rPr>
-                <w:rFonts w:ascii="Times New Roman" w:hAnsi="Times New Roman" w:cs="Times New Roman"/>
-                <w:sz w:val="26"/>
-                <w:szCs w:val="26"/>
-              </w:rPr>
-              <w:t>('')}}</w:t>
+              <w:t>{{parking_area|default('')}}</w:t>
             </w:r>
             <w:r>
               <w:rPr>
@@ -4458,25 +3178,7 @@
                 <w:sz w:val="26"/>
                 <w:szCs w:val="26"/>
               </w:rPr>
-              <w:t>{{</w:t>
-            </w:r>
-            <w:proofErr w:type="spellStart"/>
-            <w:r>
-              <w:rPr>
-                <w:rFonts w:ascii="Times New Roman" w:hAnsi="Times New Roman" w:cs="Times New Roman"/>
-                <w:sz w:val="26"/>
-                <w:szCs w:val="26"/>
-              </w:rPr>
-              <w:t>charging_stations|default</w:t>
-            </w:r>
-            <w:proofErr w:type="spellEnd"/>
-            <w:r>
-              <w:rPr>
-                <w:rFonts w:ascii="Times New Roman" w:hAnsi="Times New Roman" w:cs="Times New Roman"/>
-                <w:sz w:val="26"/>
-                <w:szCs w:val="26"/>
-              </w:rPr>
-              <w:t>('')}}</w:t>
+              <w:t>{{charging_stations|default('')}}</w:t>
             </w:r>
           </w:p>
         </w:tc>
@@ -4582,103 +3284,8 @@
             <w:vAlign w:val="center"/>
           </w:tcPr>
           <w:p>
-            <w:pPr>
-              <w:jc w:val="left"/>
-              <w:rPr>
-                <w:rFonts w:ascii="Times New Roman" w:hAnsi="Times New Roman" w:cs="Times New Roman"/>
-                <w:sz w:val="26"/>
-                <w:szCs w:val="26"/>
-              </w:rPr>
-            </w:pPr>
-            <w:proofErr w:type="spellStart"/>
-            <w:r>
-              <w:rPr>
-                <w:rFonts w:ascii="Times New Roman" w:hAnsi="Times New Roman" w:cs="Times New Roman"/>
-                <w:sz w:val="26"/>
-                <w:szCs w:val="26"/>
-              </w:rPr>
-              <w:t>WiFi</w:t>
-            </w:r>
-            <w:proofErr w:type="spellEnd"/>
-            <w:r>
-              <w:rPr>
-                <w:rFonts w:ascii="Times New Roman" w:hAnsi="Times New Roman" w:cs="Times New Roman"/>
-                <w:sz w:val="26"/>
-                <w:szCs w:val="26"/>
-              </w:rPr>
-              <w:t xml:space="preserve"> available on site: {{</w:t>
-            </w:r>
-            <w:proofErr w:type="spellStart"/>
-            <w:r>
-              <w:rPr>
-                <w:rFonts w:ascii="Times New Roman" w:hAnsi="Times New Roman" w:cs="Times New Roman"/>
-                <w:sz w:val="26"/>
-                <w:szCs w:val="26"/>
-              </w:rPr>
-              <w:t>site_wifi_available|default</w:t>
-            </w:r>
-            <w:proofErr w:type="spellEnd"/>
-            <w:r>
-              <w:rPr>
-                <w:rFonts w:ascii="Times New Roman" w:hAnsi="Times New Roman" w:cs="Times New Roman"/>
-                <w:sz w:val="26"/>
-                <w:szCs w:val="26"/>
-              </w:rPr>
-              <w:t>('')}}</w:t>
-            </w:r>
-            <w:r>
-              <w:rPr>
-                <w:rFonts w:ascii="Times New Roman" w:hAnsi="Times New Roman" w:cs="Times New Roman"/>
-                <w:sz w:val="26"/>
-                <w:szCs w:val="26"/>
-              </w:rPr>
-              <w:br/>
-              <w:t xml:space="preserve">Site Network Status / </w:t>
-            </w:r>
-            <w:proofErr w:type="spellStart"/>
-            <w:r>
-              <w:rPr>
-                <w:rFonts w:ascii="Times New Roman" w:hAnsi="Times New Roman" w:cs="Times New Roman"/>
-                <w:sz w:val="26"/>
-                <w:szCs w:val="26"/>
-              </w:rPr>
-              <w:t>WiFi</w:t>
-            </w:r>
-            <w:proofErr w:type="spellEnd"/>
-            <w:r>
-              <w:rPr>
-                <w:rFonts w:ascii="Times New Roman" w:hAnsi="Times New Roman" w:cs="Times New Roman"/>
-                <w:sz w:val="26"/>
-                <w:szCs w:val="26"/>
-              </w:rPr>
-              <w:t xml:space="preserve"> Coverage: </w:t>
-            </w:r>
-            <w:r>
-              <w:rPr>
-                <w:rFonts w:ascii="Times New Roman" w:hAnsi="Times New Roman" w:cs="Times New Roman"/>
-                <w:sz w:val="26"/>
-                <w:szCs w:val="26"/>
-              </w:rPr>
-              <w:lastRenderedPageBreak/>
-              <w:t>{{</w:t>
-            </w:r>
-            <w:proofErr w:type="spellStart"/>
-            <w:r>
-              <w:rPr>
-                <w:rFonts w:ascii="Times New Roman" w:hAnsi="Times New Roman" w:cs="Times New Roman"/>
-                <w:sz w:val="26"/>
-                <w:szCs w:val="26"/>
-              </w:rPr>
-              <w:t>network_status|default</w:t>
-            </w:r>
-            <w:proofErr w:type="spellEnd"/>
-            <w:r>
-              <w:rPr>
-                <w:rFonts w:ascii="Times New Roman" w:hAnsi="Times New Roman" w:cs="Times New Roman"/>
-                <w:sz w:val="26"/>
-                <w:szCs w:val="26"/>
-              </w:rPr>
-              <w:t>('')}}</w:t>
+            <w:r>
+              <w:t>{{material_step_details_text}}</w:t>
             </w:r>
           </w:p>
         </w:tc>
@@ -4801,27 +3408,7 @@
                 <w:szCs w:val="26"/>
                 <w:lang w:val="en-BE"/>
               </w:rPr>
-              <w:t>{{</w:t>
-            </w:r>
-            <w:proofErr w:type="spellStart"/>
-            <w:r>
-              <w:rPr>
-                <w:rFonts w:ascii="Times New Roman" w:eastAsiaTheme="minorEastAsia" w:hAnsi="Times New Roman" w:cs="Times New Roman"/>
-                <w:sz w:val="26"/>
-                <w:szCs w:val="26"/>
-                <w:lang w:val="en-BE"/>
-              </w:rPr>
-              <w:t>positioning_req|default</w:t>
-            </w:r>
-            <w:proofErr w:type="spellEnd"/>
-            <w:r>
-              <w:rPr>
-                <w:rFonts w:ascii="Times New Roman" w:eastAsiaTheme="minorEastAsia" w:hAnsi="Times New Roman" w:cs="Times New Roman"/>
-                <w:sz w:val="26"/>
-                <w:szCs w:val="26"/>
-                <w:lang w:val="en-BE"/>
-              </w:rPr>
-              <w:t>(‘‘)}}</w:t>
+              <w:t>{{positioning_req|default(‘‘)}}</w:t>
             </w:r>
           </w:p>
           <w:p>
@@ -4927,7 +3514,16 @@
                 <w:sz w:val="26"/>
                 <w:szCs w:val="26"/>
               </w:rPr>
-              <w:t>Whether there are related equipment that needs to be docked (elevators, robotic arms, roller shutter doors, telescopic doors, vertical warehouses, winding machines, etc.), etc.:</w:t>
+              <w:t xml:space="preserve">Whether there are related equipment that needs to be docked (elevators, robotic arms, roller shutter doors, telescopic doors, vertical warehouses, </w:t>
+            </w:r>
+            <w:r>
+              <w:rPr>
+                <w:rFonts w:ascii="Times New Roman" w:hAnsi="Times New Roman" w:cs="Times New Roman"/>
+                <w:sz w:val="26"/>
+                <w:szCs w:val="26"/>
+              </w:rPr>
+              <w:lastRenderedPageBreak/>
+              <w:t>winding machines, etc.), etc.:</w:t>
             </w:r>
           </w:p>
         </w:tc>
@@ -4958,27 +3554,8 @@
                 <w:szCs w:val="26"/>
                 <w:lang w:val="en-BE"/>
               </w:rPr>
-              <w:t>{{</w:t>
-            </w:r>
-            <w:proofErr w:type="spellStart"/>
-            <w:r>
-              <w:rPr>
-                <w:rFonts w:ascii="Times New Roman" w:eastAsiaTheme="minorEastAsia" w:hAnsi="Times New Roman" w:cs="Times New Roman"/>
-                <w:sz w:val="26"/>
-                <w:szCs w:val="26"/>
-                <w:lang w:val="en-BE"/>
-              </w:rPr>
-              <w:t>docking_equipment|default</w:t>
-            </w:r>
-            <w:proofErr w:type="spellEnd"/>
-            <w:r>
-              <w:rPr>
-                <w:rFonts w:ascii="Times New Roman" w:eastAsiaTheme="minorEastAsia" w:hAnsi="Times New Roman" w:cs="Times New Roman"/>
-                <w:sz w:val="26"/>
-                <w:szCs w:val="26"/>
-                <w:lang w:val="en-BE"/>
-              </w:rPr>
-              <w:t>(‘‘)}}</w:t>
+              <w:lastRenderedPageBreak/>
+              <w:t>{{docking_equipment|default(‘‘)}}</w:t>
             </w:r>
           </w:p>
           <w:p>
@@ -5066,30 +3643,8 @@
             <w:vAlign w:val="center"/>
           </w:tcPr>
           <w:p>
-            <w:pPr>
-              <w:spacing w:line="240" w:lineRule="auto"/>
-              <w:jc w:val="left"/>
-              <w:rPr>
-                <w:rFonts w:ascii="Times New Roman" w:hAnsi="Times New Roman" w:cs="Times New Roman"/>
-                <w:sz w:val="26"/>
-                <w:szCs w:val="26"/>
-              </w:rPr>
-            </w:pPr>
-            <w:r>
-              <w:rPr>
-                <w:rFonts w:ascii="Times New Roman" w:hAnsi="Times New Roman" w:cs="Times New Roman"/>
-                <w:sz w:val="26"/>
-                <w:szCs w:val="26"/>
-              </w:rPr>
-              <w:t>Other</w:t>
-            </w:r>
-            <w:r>
-              <w:rPr>
-                <w:rFonts w:ascii="Times New Roman" w:hAnsi="Times New Roman" w:cs="Times New Roman"/>
-                <w:sz w:val="26"/>
-                <w:szCs w:val="26"/>
-              </w:rPr>
-              <w:t>：</w:t>
+            <w:r>
+              <w:t>See attached CAD/layout file: {{cad_filename}}</w:t>
             </w:r>
           </w:p>
         </w:tc>
@@ -5117,25 +3672,7 @@
                 <w:sz w:val="26"/>
                 <w:szCs w:val="26"/>
               </w:rPr>
-              <w:t>Other AGVs / AMRs: {{</w:t>
-            </w:r>
-            <w:proofErr w:type="spellStart"/>
-            <w:r>
-              <w:rPr>
-                <w:rFonts w:ascii="Times New Roman" w:hAnsi="Times New Roman" w:cs="Times New Roman"/>
-                <w:sz w:val="26"/>
-                <w:szCs w:val="26"/>
-              </w:rPr>
-              <w:t>other_agvs|default</w:t>
-            </w:r>
-            <w:proofErr w:type="spellEnd"/>
-            <w:r>
-              <w:rPr>
-                <w:rFonts w:ascii="Times New Roman" w:hAnsi="Times New Roman" w:cs="Times New Roman"/>
-                <w:sz w:val="26"/>
-                <w:szCs w:val="26"/>
-              </w:rPr>
-              <w:t>('')}}</w:t>
+              <w:t>Other AGVs / AMRs: {{other_agvs|default('')}}</w:t>
             </w:r>
             <w:r>
               <w:rPr>
@@ -5144,25 +3681,7 @@
                 <w:szCs w:val="26"/>
               </w:rPr>
               <w:br/>
-              <w:t>Other Traffic (Trucks/Forklifts/Pedestrians): {{</w:t>
-            </w:r>
-            <w:proofErr w:type="spellStart"/>
-            <w:r>
-              <w:rPr>
-                <w:rFonts w:ascii="Times New Roman" w:hAnsi="Times New Roman" w:cs="Times New Roman"/>
-                <w:sz w:val="26"/>
-                <w:szCs w:val="26"/>
-              </w:rPr>
-              <w:t>other_traffic|default</w:t>
-            </w:r>
-            <w:proofErr w:type="spellEnd"/>
-            <w:r>
-              <w:rPr>
-                <w:rFonts w:ascii="Times New Roman" w:hAnsi="Times New Roman" w:cs="Times New Roman"/>
-                <w:sz w:val="26"/>
-                <w:szCs w:val="26"/>
-              </w:rPr>
-              <w:t>('')}}</w:t>
+              <w:t>Other Traffic (Trucks/Forklifts/Pedestrians): {{other_traffic|default('')}}</w:t>
             </w:r>
             <w:r>
               <w:rPr>
@@ -5171,25 +3690,7 @@
                 <w:szCs w:val="26"/>
               </w:rPr>
               <w:br/>
-              <w:t>Ground Gaps / Depressions: {{</w:t>
-            </w:r>
-            <w:proofErr w:type="spellStart"/>
-            <w:r>
-              <w:rPr>
-                <w:rFonts w:ascii="Times New Roman" w:hAnsi="Times New Roman" w:cs="Times New Roman"/>
-                <w:sz w:val="26"/>
-                <w:szCs w:val="26"/>
-              </w:rPr>
-              <w:t>ground_gaps_mm|default</w:t>
-            </w:r>
-            <w:proofErr w:type="spellEnd"/>
-            <w:r>
-              <w:rPr>
-                <w:rFonts w:ascii="Times New Roman" w:hAnsi="Times New Roman" w:cs="Times New Roman"/>
-                <w:sz w:val="26"/>
-                <w:szCs w:val="26"/>
-              </w:rPr>
-              <w:t>('')}} mm</w:t>
+              <w:t>Ground Gaps / Depressions: {{ground_gaps_mm|default('')}} mm</w:t>
             </w:r>
           </w:p>
         </w:tc>
@@ -5281,27 +3782,8 @@
                 <w:sz w:val="26"/>
                 <w:szCs w:val="26"/>
               </w:rPr>
-              <w:t xml:space="preserve">Explosion-proof level, low/high temperature adaptability, unmanned degree (fully automatic/semi-automatic), remote monitoring </w:t>
-            </w:r>
-            <w:r>
-              <w:rPr>
-                <w:rFonts w:ascii="Times New Roman" w:hAnsi="Times New Roman" w:cs="Times New Roman"/>
-                <w:sz w:val="26"/>
-                <w:szCs w:val="26"/>
-              </w:rPr>
-              <w:lastRenderedPageBreak/>
-              <w:t xml:space="preserve">requirements, customized appearance and logo, </w:t>
-            </w:r>
-            <w:proofErr w:type="spellStart"/>
-            <w:r>
-              <w:rPr>
-                <w:rFonts w:ascii="Times New Roman" w:hAnsi="Times New Roman" w:cs="Times New Roman"/>
-                <w:sz w:val="26"/>
-                <w:szCs w:val="26"/>
-              </w:rPr>
-              <w:t>etc</w:t>
-            </w:r>
-            <w:proofErr w:type="spellEnd"/>
+              <w:t>Explosion-proof level, low/high temperature adaptability, unmanned degree (fully automatic/semi-automatic), remote monitoring requirements, customized appearance and logo, etc</w:t>
+            </w:r>
             <w:r>
               <w:rPr>
                 <w:rFonts w:ascii="Times New Roman" w:hAnsi="Times New Roman" w:cs="Times New Roman"/>
@@ -5322,57 +3804,26 @@
             <w:vAlign w:val="center"/>
           </w:tcPr>
           <w:p>
-            <w:pPr>
-              <w:spacing w:line="240" w:lineRule="auto"/>
-              <w:jc w:val="left"/>
-              <w:rPr>
-                <w:rFonts w:ascii="Times New Roman" w:eastAsiaTheme="minorEastAsia" w:hAnsi="Times New Roman" w:cs="Times New Roman"/>
-                <w:sz w:val="26"/>
-                <w:szCs w:val="26"/>
-                <w:lang w:val="en-BE"/>
-              </w:rPr>
-            </w:pPr>
-            <w:r>
-              <w:rPr>
-                <w:rFonts w:ascii="Times New Roman" w:eastAsiaTheme="minorEastAsia" w:hAnsi="Times New Roman" w:cs="Times New Roman"/>
-                <w:sz w:val="26"/>
-                <w:szCs w:val="26"/>
-                <w:lang w:val="en-BE"/>
-              </w:rPr>
-              <w:lastRenderedPageBreak/>
-              <w:t>{{</w:t>
-            </w:r>
-            <w:proofErr w:type="spellStart"/>
-            <w:r>
-              <w:rPr>
-                <w:rFonts w:ascii="Times New Roman" w:eastAsiaTheme="minorEastAsia" w:hAnsi="Times New Roman" w:cs="Times New Roman"/>
-                <w:sz w:val="26"/>
-                <w:szCs w:val="26"/>
-                <w:lang w:val="en-BE"/>
-              </w:rPr>
-              <w:t>special_demand|default</w:t>
-            </w:r>
-            <w:proofErr w:type="spellEnd"/>
-            <w:r>
-              <w:rPr>
-                <w:rFonts w:ascii="Times New Roman" w:eastAsiaTheme="minorEastAsia" w:hAnsi="Times New Roman" w:cs="Times New Roman"/>
-                <w:sz w:val="26"/>
-                <w:szCs w:val="26"/>
-                <w:lang w:val="en-BE"/>
-              </w:rPr>
-              <w:t>(‘‘)}}</w:t>
-            </w:r>
-          </w:p>
-          <w:p>
-            <w:pPr>
-              <w:spacing w:line="240" w:lineRule="auto"/>
-              <w:jc w:val="left"/>
-              <w:rPr>
-                <w:rFonts w:ascii="Times New Roman" w:eastAsiaTheme="minorEastAsia" w:hAnsi="Times New Roman" w:cs="Times New Roman"/>
-                <w:sz w:val="26"/>
-                <w:szCs w:val="26"/>
-              </w:rPr>
-            </w:pPr>
+            <w:r>
+              <w:t>Step-to-step Transport Distances:</w:t>
+            </w:r>
+            <w:r>
+              <w:br/>
+              <w:t>{{transport_distance_text}}</w:t>
+            </w:r>
+            <w:r>
+              <w:br/>
+            </w:r>
+            <w:r>
+              <w:br/>
+            </w:r>
+            <w:r>
+              <w:t>Special Comments / Notes:</w:t>
+            </w:r>
+            <w:r>
+              <w:br/>
+              <w:t>{{special_comments}}</w:t>
+            </w:r>
           </w:p>
         </w:tc>
         <w:tc>
@@ -5508,67 +3959,7 @@
                 <w:szCs w:val="26"/>
                 <w:lang w:val="en-BE"/>
               </w:rPr>
-              <w:t>{{</w:t>
-            </w:r>
-            <w:proofErr w:type="spellStart"/>
-            <w:r>
-              <w:rPr>
-                <w:rFonts w:ascii="Times New Roman" w:eastAsiaTheme="minorEastAsia" w:hAnsi="Times New Roman" w:cs="Times New Roman"/>
-                <w:sz w:val="26"/>
-                <w:szCs w:val="26"/>
-                <w:lang w:val="en-BE"/>
-              </w:rPr>
-              <w:t>vehicle_type|default</w:t>
-            </w:r>
-            <w:proofErr w:type="spellEnd"/>
-            <w:r>
-              <w:rPr>
-                <w:rFonts w:ascii="Times New Roman" w:eastAsiaTheme="minorEastAsia" w:hAnsi="Times New Roman" w:cs="Times New Roman"/>
-                <w:sz w:val="26"/>
-                <w:szCs w:val="26"/>
-                <w:lang w:val="en-BE"/>
-              </w:rPr>
-              <w:t>(‘‘)}} / {{</w:t>
-            </w:r>
-            <w:proofErr w:type="spellStart"/>
-            <w:r>
-              <w:rPr>
-                <w:rFonts w:ascii="Times New Roman" w:eastAsiaTheme="minorEastAsia" w:hAnsi="Times New Roman" w:cs="Times New Roman"/>
-                <w:sz w:val="26"/>
-                <w:szCs w:val="26"/>
-                <w:lang w:val="en-BE"/>
-              </w:rPr>
-              <w:t>goods_weight_dim|default</w:t>
-            </w:r>
-            <w:proofErr w:type="spellEnd"/>
-            <w:r>
-              <w:rPr>
-                <w:rFonts w:ascii="Times New Roman" w:eastAsiaTheme="minorEastAsia" w:hAnsi="Times New Roman" w:cs="Times New Roman"/>
-                <w:sz w:val="26"/>
-                <w:szCs w:val="26"/>
-                <w:lang w:val="en-BE"/>
-              </w:rPr>
-              <w:t>(‘‘)}} / {{</w:t>
-            </w:r>
-            <w:proofErr w:type="spellStart"/>
-            <w:r>
-              <w:rPr>
-                <w:rFonts w:ascii="Times New Roman" w:eastAsiaTheme="minorEastAsia" w:hAnsi="Times New Roman" w:cs="Times New Roman"/>
-                <w:sz w:val="26"/>
-                <w:szCs w:val="26"/>
-                <w:lang w:val="en-BE"/>
-              </w:rPr>
-              <w:t>efficiency_req|default</w:t>
-            </w:r>
-            <w:proofErr w:type="spellEnd"/>
-            <w:r>
-              <w:rPr>
-                <w:rFonts w:ascii="Times New Roman" w:eastAsiaTheme="minorEastAsia" w:hAnsi="Times New Roman" w:cs="Times New Roman"/>
-                <w:sz w:val="26"/>
-                <w:szCs w:val="26"/>
-                <w:lang w:val="en-BE"/>
-              </w:rPr>
-              <w:t>(‘‘)}}</w:t>
+              <w:t>{{vehicle_type|default(‘‘)}} / {{goods_weight_dim|default(‘‘)}} / {{efficiency_req|default(‘‘)}}</w:t>
             </w:r>
           </w:p>
           <w:p>
@@ -5694,18 +4085,8 @@
                 <w:sz w:val="26"/>
                 <w:szCs w:val="26"/>
               </w:rPr>
-              <w:t>{{</w:t>
-            </w:r>
-            <w:proofErr w:type="spellStart"/>
-            <w:r>
-              <w:rPr>
-                <w:rFonts w:ascii="Times New Roman" w:eastAsiaTheme="minorEastAsia" w:hAnsi="Times New Roman" w:cs="Times New Roman"/>
-                <w:sz w:val="26"/>
-                <w:szCs w:val="26"/>
-              </w:rPr>
-              <w:t>special_demand</w:t>
-            </w:r>
-            <w:proofErr w:type="spellEnd"/>
+              <w:t>{{special_demand</w:t>
+            </w:r>
             <w:r>
               <w:rPr>
                 <w:rFonts w:ascii="Times New Roman" w:eastAsiaTheme="minorEastAsia" w:hAnsi="Times New Roman" w:cs="Times New Roman"/>
@@ -5827,15 +4208,13 @@
             <w:vAlign w:val="center"/>
           </w:tcPr>
           <w:p>
-            <w:pPr>
-              <w:spacing w:line="240" w:lineRule="auto"/>
-              <w:jc w:val="left"/>
-              <w:rPr>
-                <w:rFonts w:ascii="Times New Roman" w:hAnsi="Times New Roman" w:cs="Times New Roman"/>
-                <w:sz w:val="26"/>
-                <w:szCs w:val="26"/>
-              </w:rPr>
-            </w:pPr>
+            <w:r>
+              <w:t>WiFi available on site: {{site_wifi_available}}</w:t>
+            </w:r>
+            <w:r>
+              <w:br/>
+              <w:t>Site Network Status / WiFi Coverage: {{network_status}}</w:t>
+            </w:r>
           </w:p>
         </w:tc>
         <w:tc>
@@ -5931,7 +4310,19 @@
                 <w:szCs w:val="26"/>
                 <w:highlight w:val="yellow"/>
               </w:rPr>
-              <w:t>DATA FLOW</w:t>
+              <w:t xml:space="preserve">DATA </w:t>
+            </w:r>
+            <w:r>
+              <w:rPr>
+                <w:rFonts w:ascii="Times New Roman" w:eastAsiaTheme="minorEastAsia" w:hAnsi="Times New Roman" w:cs="Times New Roman"/>
+                <w:b/>
+                <w:bCs/>
+                <w:sz w:val="26"/>
+                <w:szCs w:val="26"/>
+                <w:highlight w:val="yellow"/>
+              </w:rPr>
+              <w:lastRenderedPageBreak/>
+              <w:t>FLOW</w:t>
             </w:r>
             <w:r>
               <w:rPr>
@@ -5999,25 +4390,8 @@
                 <w:sz w:val="26"/>
                 <w:szCs w:val="26"/>
               </w:rPr>
-              <w:t>System Integration: {{</w:t>
-            </w:r>
-            <w:proofErr w:type="spellStart"/>
-            <w:r>
-              <w:rPr>
-                <w:rFonts w:ascii="Times New Roman" w:hAnsi="Times New Roman" w:cs="Times New Roman"/>
-                <w:sz w:val="26"/>
-                <w:szCs w:val="26"/>
-              </w:rPr>
-              <w:t>system_integration_summary|default</w:t>
-            </w:r>
-            <w:proofErr w:type="spellEnd"/>
-            <w:r>
-              <w:rPr>
-                <w:rFonts w:ascii="Times New Roman" w:hAnsi="Times New Roman" w:cs="Times New Roman"/>
-                <w:sz w:val="26"/>
-                <w:szCs w:val="26"/>
-              </w:rPr>
-              <w:t>('')}}</w:t>
+              <w:lastRenderedPageBreak/>
+              <w:t>System Integration: {{system_integration_summary|default('')}}</w:t>
             </w:r>
             <w:r>
               <w:rPr>
@@ -6026,25 +4400,15 @@
                 <w:szCs w:val="26"/>
               </w:rPr>
               <w:br/>
-              <w:t>Integration to your system required: {{</w:t>
-            </w:r>
-            <w:proofErr w:type="spellStart"/>
-            <w:r>
-              <w:rPr>
-                <w:rFonts w:ascii="Times New Roman" w:hAnsi="Times New Roman" w:cs="Times New Roman"/>
-                <w:sz w:val="26"/>
-                <w:szCs w:val="26"/>
-              </w:rPr>
-              <w:t>integration_to_your_system_required|default</w:t>
-            </w:r>
-            <w:proofErr w:type="spellEnd"/>
-            <w:r>
-              <w:rPr>
-                <w:rFonts w:ascii="Times New Roman" w:hAnsi="Times New Roman" w:cs="Times New Roman"/>
-                <w:sz w:val="26"/>
-                <w:szCs w:val="26"/>
-              </w:rPr>
-              <w:t>('')}}</w:t>
+            </w:r>
+            <w:r>
+              <w:rPr>
+                <w:rFonts w:ascii="Times New Roman" w:hAnsi="Times New Roman" w:cs="Times New Roman"/>
+                <w:sz w:val="26"/>
+                <w:szCs w:val="26"/>
+              </w:rPr>
+              <w:lastRenderedPageBreak/>
+              <w:t>Integration to your system required: {{integration_to_your_system_required|default('')}}</w:t>
             </w:r>
             <w:r>
               <w:rPr>
@@ -6053,25 +4417,7 @@
                 <w:szCs w:val="26"/>
               </w:rPr>
               <w:br/>
-              <w:t>Systems to be integrated: {{</w:t>
-            </w:r>
-            <w:proofErr w:type="spellStart"/>
-            <w:r>
-              <w:rPr>
-                <w:rFonts w:ascii="Times New Roman" w:hAnsi="Times New Roman" w:cs="Times New Roman"/>
-                <w:sz w:val="26"/>
-                <w:szCs w:val="26"/>
-              </w:rPr>
-              <w:t>systems_to_integrate_summary|default</w:t>
-            </w:r>
-            <w:proofErr w:type="spellEnd"/>
-            <w:r>
-              <w:rPr>
-                <w:rFonts w:ascii="Times New Roman" w:hAnsi="Times New Roman" w:cs="Times New Roman"/>
-                <w:sz w:val="26"/>
-                <w:szCs w:val="26"/>
-              </w:rPr>
-              <w:t>('')}}</w:t>
+              <w:t>Systems to be integrated: {{systems_to_integrate_summary|default('')}}</w:t>
             </w:r>
           </w:p>
         </w:tc>
@@ -6171,25 +4517,7 @@
                 <w:sz w:val="26"/>
                 <w:szCs w:val="26"/>
               </w:rPr>
-              <w:t>Other Connections / Interfaces: {{</w:t>
-            </w:r>
-            <w:proofErr w:type="spellStart"/>
-            <w:r>
-              <w:rPr>
-                <w:rFonts w:ascii="Times New Roman" w:hAnsi="Times New Roman" w:cs="Times New Roman"/>
-                <w:sz w:val="26"/>
-                <w:szCs w:val="26"/>
-              </w:rPr>
-              <w:t>connections|default</w:t>
-            </w:r>
-            <w:proofErr w:type="spellEnd"/>
-            <w:r>
-              <w:rPr>
-                <w:rFonts w:ascii="Times New Roman" w:hAnsi="Times New Roman" w:cs="Times New Roman"/>
-                <w:sz w:val="26"/>
-                <w:szCs w:val="26"/>
-              </w:rPr>
-              <w:t>('')}}</w:t>
+              <w:t>Other Connections / Interfaces: {{connections|default('')}}</w:t>
             </w:r>
             <w:r>
               <w:rPr>
@@ -6198,25 +4526,7 @@
                 <w:szCs w:val="26"/>
               </w:rPr>
               <w:br/>
-              <w:t>Data Flow &amp; System Integration: {{</w:t>
-            </w:r>
-            <w:proofErr w:type="spellStart"/>
-            <w:r>
-              <w:rPr>
-                <w:rFonts w:ascii="Times New Roman" w:hAnsi="Times New Roman" w:cs="Times New Roman"/>
-                <w:sz w:val="26"/>
-                <w:szCs w:val="26"/>
-              </w:rPr>
-              <w:t>data_flow_text|default</w:t>
-            </w:r>
-            <w:proofErr w:type="spellEnd"/>
-            <w:r>
-              <w:rPr>
-                <w:rFonts w:ascii="Times New Roman" w:hAnsi="Times New Roman" w:cs="Times New Roman"/>
-                <w:sz w:val="26"/>
-                <w:szCs w:val="26"/>
-              </w:rPr>
-              <w:t>('')}}</w:t>
+              <w:t>Data Flow &amp; System Integration: {{data_flow_text|default('')}}</w:t>
             </w:r>
           </w:p>
         </w:tc>
@@ -6316,25 +4626,7 @@
                 <w:sz w:val="26"/>
                 <w:szCs w:val="26"/>
               </w:rPr>
-              <w:t>{{</w:t>
-            </w:r>
-            <w:proofErr w:type="spellStart"/>
-            <w:r>
-              <w:rPr>
-                <w:rFonts w:ascii="Times New Roman" w:hAnsi="Times New Roman" w:cs="Times New Roman"/>
-                <w:sz w:val="26"/>
-                <w:szCs w:val="26"/>
-              </w:rPr>
-              <w:t>connections_details|default</w:t>
-            </w:r>
-            <w:proofErr w:type="spellEnd"/>
-            <w:r>
-              <w:rPr>
-                <w:rFonts w:ascii="Times New Roman" w:hAnsi="Times New Roman" w:cs="Times New Roman"/>
-                <w:sz w:val="26"/>
-                <w:szCs w:val="26"/>
-              </w:rPr>
-              <w:t>('')}}</w:t>
+              <w:t>{{connections_details|default('')}}</w:t>
             </w:r>
           </w:p>
         </w:tc>
@@ -6513,27 +4805,7 @@
                 <w:szCs w:val="26"/>
                 <w:lang w:val="en-BE"/>
               </w:rPr>
-              <w:t>{{</w:t>
-            </w:r>
-            <w:proofErr w:type="spellStart"/>
-            <w:r>
-              <w:rPr>
-                <w:rFonts w:ascii="Times New Roman" w:eastAsiaTheme="minorEastAsia" w:hAnsi="Times New Roman" w:cs="Times New Roman"/>
-                <w:sz w:val="26"/>
-                <w:szCs w:val="26"/>
-                <w:lang w:val="en-BE"/>
-              </w:rPr>
-              <w:t>product_specs</w:t>
-            </w:r>
-            <w:proofErr w:type="spellEnd"/>
-            <w:r>
-              <w:rPr>
-                <w:rFonts w:ascii="Times New Roman" w:eastAsiaTheme="minorEastAsia" w:hAnsi="Times New Roman" w:cs="Times New Roman"/>
-                <w:sz w:val="26"/>
-                <w:szCs w:val="26"/>
-                <w:lang w:val="en-BE"/>
-              </w:rPr>
-              <w:t>}}</w:t>
+              <w:t>{{product_specs}}</w:t>
             </w:r>
           </w:p>
           <w:p>
@@ -7262,15 +5534,19 @@
             <w:vAlign w:val="center"/>
           </w:tcPr>
           <w:p>
-            <w:pPr>
-              <w:spacing w:line="240" w:lineRule="auto"/>
-              <w:jc w:val="left"/>
-              <w:rPr>
-                <w:rFonts w:ascii="Times New Roman" w:eastAsiaTheme="minorEastAsia" w:hAnsi="Times New Roman" w:cs="Times New Roman"/>
-                <w:sz w:val="26"/>
-                <w:szCs w:val="26"/>
-              </w:rPr>
-            </w:pPr>
+            <w:r>
+              <w:t>System Integration: {{system_integration_summary}}</w:t>
+            </w:r>
+            <w:r>
+              <w:br/>
+            </w:r>
+            <w:r>
+              <w:t>Integration to your system required: {{integration_to_your_system_required}}</w:t>
+            </w:r>
+            <w:r>
+              <w:br/>
+              <w:t>Systems to be integrated: {{systems_to_integrate_summary}}</w:t>
+            </w:r>
           </w:p>
         </w:tc>
       </w:tr>
@@ -7359,36 +5635,14 @@
             <w:vAlign w:val="center"/>
           </w:tcPr>
           <w:p>
-            <w:pPr>
-              <w:spacing w:line="240" w:lineRule="auto"/>
-              <w:jc w:val="left"/>
-              <w:rPr>
-                <w:rFonts w:ascii="Times New Roman" w:eastAsiaTheme="minorEastAsia" w:hAnsi="Times New Roman" w:cs="Times New Roman"/>
-                <w:b/>
-                <w:bCs/>
-                <w:sz w:val="26"/>
-                <w:szCs w:val="26"/>
-              </w:rPr>
-            </w:pPr>
-            <w:r>
-              <w:rPr>
-                <w:rFonts w:ascii="Times New Roman" w:eastAsiaTheme="minorEastAsia" w:hAnsi="Times New Roman" w:cs="Times New Roman"/>
-                <w:b/>
-                <w:bCs/>
-                <w:sz w:val="26"/>
-                <w:szCs w:val="26"/>
-              </w:rPr>
-              <w:t>Key technical points</w:t>
-            </w:r>
-            <w:r>
-              <w:rPr>
-                <w:rFonts w:ascii="Times New Roman" w:eastAsiaTheme="minorEastAsia" w:hAnsi="Times New Roman" w:cs="Times New Roman"/>
-                <w:b/>
-                <w:bCs/>
-                <w:sz w:val="26"/>
-                <w:szCs w:val="26"/>
-              </w:rPr>
-              <w:t>：</w:t>
+            <w:r>
+              <w:t>Other Connections / Interfaces: {{connections}}</w:t>
+            </w:r>
+            <w:r>
+              <w:br/>
+            </w:r>
+            <w:r>
+              <w:t>Data Flow &amp; System Integration: {{data_flow_text}}</w:t>
             </w:r>
           </w:p>
         </w:tc>
@@ -7486,15 +5740,9 @@
             <w:vAlign w:val="center"/>
           </w:tcPr>
           <w:p>
-            <w:pPr>
-              <w:spacing w:line="240" w:lineRule="auto"/>
-              <w:jc w:val="left"/>
-              <w:rPr>
-                <w:rFonts w:ascii="Times New Roman" w:hAnsi="Times New Roman" w:cs="Times New Roman"/>
-                <w:sz w:val="26"/>
-                <w:szCs w:val="26"/>
-              </w:rPr>
-            </w:pPr>
+            <w:r>
+              <w:t>{{connections_details}}</w:t>
+            </w:r>
           </w:p>
         </w:tc>
         <w:tc>
@@ -8175,29 +6423,7 @@
                 <w:sz w:val="26"/>
                 <w:szCs w:val="26"/>
               </w:rPr>
-              <w:t xml:space="preserve">Signature of the </w:t>
-            </w:r>
-            <w:proofErr w:type="spellStart"/>
-            <w:r>
-              <w:rPr>
-                <w:rFonts w:ascii="Times New Roman" w:eastAsiaTheme="minorEastAsia" w:hAnsi="Times New Roman" w:cs="Times New Roman"/>
-                <w:b/>
-                <w:bCs/>
-                <w:sz w:val="26"/>
-                <w:szCs w:val="26"/>
-              </w:rPr>
-              <w:t>assessee</w:t>
-            </w:r>
-            <w:proofErr w:type="spellEnd"/>
-            <w:r>
-              <w:rPr>
-                <w:rFonts w:ascii="Times New Roman" w:eastAsiaTheme="minorEastAsia" w:hAnsi="Times New Roman" w:cs="Times New Roman"/>
-                <w:b/>
-                <w:bCs/>
-                <w:sz w:val="26"/>
-                <w:szCs w:val="26"/>
-              </w:rPr>
-              <w:t>:</w:t>
+              <w:t>Signature of the assessee:</w:t>
             </w:r>
           </w:p>
         </w:tc>
@@ -8394,7 +6620,6 @@
                 <w:sz w:val="26"/>
                 <w:szCs w:val="26"/>
               </w:rPr>
-              <w:lastRenderedPageBreak/>
               <w:t>Review and approval:</w:t>
             </w:r>
           </w:p>
@@ -8514,7 +6739,7 @@
       <mc:AlternateContent>
         <mc:Choice Requires="wps">
           <w:drawing>
-            <wp:anchor distT="0" distB="0" distL="114300" distR="114300" simplePos="0" relativeHeight="251658240" behindDoc="0" locked="0" layoutInCell="1" allowOverlap="1" wp14:anchorId="6324187C" wp14:editId="7ACC4946">
+            <wp:anchor distT="0" distB="0" distL="114300" distR="114300" simplePos="0" relativeHeight="251658240" behindDoc="0" locked="0" layoutInCell="1" allowOverlap="1" wp14:anchorId="121E6CA0" wp14:editId="343A027A">
               <wp:simplePos x="0" y="0"/>
               <wp:positionH relativeFrom="margin">
                 <wp:align>center</wp:align>
@@ -8625,7 +6850,7 @@
         </mc:Choice>
         <mc:Fallback>
           <w:pict>
-            <v:shapetype w14:anchorId="6324187C" id="_x0000_t202" coordsize="21600,21600" o:spt="202" path="m,l,21600r21600,l21600,xe">
+            <v:shapetype w14:anchorId="121E6CA0" id="_x0000_t202" coordsize="21600,21600" o:spt="202" path="m,l,21600r21600,l21600,xe">
               <v:stroke joinstyle="miter"/>
               <v:path gradientshapeok="t" o:connecttype="rect"/>
             </v:shapetype>
@@ -8753,7 +6978,7 @@
         <w:noProof/>
       </w:rPr>
       <w:drawing>
-        <wp:anchor distT="0" distB="0" distL="114300" distR="114300" simplePos="0" relativeHeight="251658241" behindDoc="0" locked="0" layoutInCell="1" allowOverlap="1" wp14:anchorId="245143B7" wp14:editId="5C9F77B4">
+        <wp:anchor distT="0" distB="0" distL="114300" distR="114300" simplePos="0" relativeHeight="251658241" behindDoc="0" locked="0" layoutInCell="1" allowOverlap="1" wp14:anchorId="20713FA8" wp14:editId="33A3E0E1">
           <wp:simplePos x="0" y="0"/>
           <wp:positionH relativeFrom="margin">
             <wp:posOffset>3603748</wp:posOffset>
@@ -8814,7 +7039,7 @@
         <w:noProof/>
       </w:rPr>
       <w:drawing>
-        <wp:anchor distT="0" distB="0" distL="114300" distR="114300" simplePos="0" relativeHeight="251658242" behindDoc="0" locked="0" layoutInCell="1" allowOverlap="1" wp14:anchorId="6CC02561" wp14:editId="2266F725">
+        <wp:anchor distT="0" distB="0" distL="114300" distR="114300" simplePos="0" relativeHeight="251658242" behindDoc="0" locked="0" layoutInCell="1" allowOverlap="1" wp14:anchorId="30F6F134" wp14:editId="0C902D16">
           <wp:simplePos x="0" y="0"/>
           <wp:positionH relativeFrom="column">
             <wp:posOffset>-415044</wp:posOffset>
@@ -10647,6 +8872,7 @@
   <w:style w:type="character" w:default="1" w:styleId="DefaultParagraphFont">
     <w:name w:val="Default Paragraph Font"/>
     <w:uiPriority w:val="1"/>
+    <w:semiHidden/>
     <w:unhideWhenUsed/>
   </w:style>
   <w:style w:type="table" w:default="1" w:styleId="TableNormal">
@@ -10993,12 +9219,12 @@
 </file>
 
 <file path=customXml/item1.xml><?xml version="1.0" encoding="utf-8"?>
-<?mso-contentType ?>
-<FormTemplates xmlns="http://schemas.microsoft.com/sharepoint/v3/contenttype/forms">
-  <Display>DocumentLibraryForm</Display>
-  <Edit>DocumentLibraryForm</Edit>
-  <New>DocumentLibraryForm</New>
-</FormTemplates>
+<s:customData xmlns="http://www.wps.cn/officeDocument/2013/wpsCustomData" xmlns:s="http://www.wps.cn/officeDocument/2013/wpsCustomData">
+  <customSectProps/>
+  <customShpExts>
+    <customShpInfo spid="_x0000_s1026" textRotate="1"/>
+  </customShpExts>
+</s:customData>
 </file>
 
 <file path=customXml/item2.xml><?xml version="1.0" encoding="utf-8"?>
@@ -11215,19 +9441,15 @@
 </file>
 
 <file path=customXml/item3.xml><?xml version="1.0" encoding="utf-8"?>
-<s:customData xmlns="http://www.wps.cn/officeDocument/2013/wpsCustomData" xmlns:s="http://www.wps.cn/officeDocument/2013/wpsCustomData">
-  <customSectProps/>
-  <customShpExts>
-    <customShpInfo spid="_x0000_s1026" textRotate="1"/>
-  </customShpExts>
-</s:customData>
+<?mso-contentType ?>
+<FormTemplates xmlns="http://schemas.microsoft.com/sharepoint/v3/contenttype/forms">
+  <Display>DocumentLibraryForm</Display>
+  <Edit>DocumentLibraryForm</Edit>
+  <New>DocumentLibraryForm</New>
+</FormTemplates>
 </file>
 
 <file path=customXml/item4.xml><?xml version="1.0" encoding="utf-8"?>
-<b:Sources xmlns:b="http://schemas.openxmlformats.org/officeDocument/2006/bibliography" xmlns="http://schemas.openxmlformats.org/officeDocument/2006/bibliography" SelectedStyle="\APASixthEditionOfficeOnline.xsl" StyleName="APA" Version="6"/>
-</file>
-
-<file path=customXml/item5.xml><?xml version="1.0" encoding="utf-8"?>
 <p:properties xmlns:p="http://schemas.microsoft.com/office/2006/metadata/properties" xmlns:xsi="http://www.w3.org/2001/XMLSchema-instance" xmlns:pc="http://schemas.microsoft.com/office/infopath/2007/PartnerControls">
   <documentManagement>
     <lcf76f155ced4ddcb4097134ff3c332f xmlns="bbceff47-94a0-42cc-a34e-bab6fdf630d3">
@@ -11238,10 +9460,14 @@
 </p:properties>
 </file>
 
+<file path=customXml/item5.xml><?xml version="1.0" encoding="utf-8"?>
+<b:Sources xmlns:b="http://schemas.openxmlformats.org/officeDocument/2006/bibliography" xmlns="http://schemas.openxmlformats.org/officeDocument/2006/bibliography" SelectedStyle="\APASixthEditionOfficeOnline.xsl" StyleName="APA" Version="6"/>
+</file>
+
 <file path=customXml/itemProps1.xml><?xml version="1.0" encoding="utf-8"?>
-<ds:datastoreItem xmlns:ds="http://schemas.openxmlformats.org/officeDocument/2006/customXml" ds:itemID="{66E6D9ED-0625-4E0B-A950-FCB28CC096CA}">
+<ds:datastoreItem xmlns:ds="http://schemas.openxmlformats.org/officeDocument/2006/customXml" ds:itemID="{B1977F7D-205B-4081-913C-38D41E755F92}">
   <ds:schemaRefs>
-    <ds:schemaRef ds:uri="http://schemas.microsoft.com/sharepoint/v3/contenttype/forms"/>
+    <ds:schemaRef ds:uri="http://www.wps.cn/officeDocument/2013/wpsCustomData"/>
   </ds:schemaRefs>
 </ds:datastoreItem>
 </file>
@@ -11266,22 +9492,14 @@
 </file>
 
 <file path=customXml/itemProps3.xml><?xml version="1.0" encoding="utf-8"?>
-<ds:datastoreItem xmlns:ds="http://schemas.openxmlformats.org/officeDocument/2006/customXml" ds:itemID="{B1977F7D-205B-4081-913C-38D41E755F92}">
+<ds:datastoreItem xmlns:ds="http://schemas.openxmlformats.org/officeDocument/2006/customXml" ds:itemID="{66E6D9ED-0625-4E0B-A950-FCB28CC096CA}">
   <ds:schemaRefs>
-    <ds:schemaRef ds:uri="http://www.wps.cn/officeDocument/2013/wpsCustomData"/>
+    <ds:schemaRef ds:uri="http://schemas.microsoft.com/sharepoint/v3/contenttype/forms"/>
   </ds:schemaRefs>
 </ds:datastoreItem>
 </file>
 
 <file path=customXml/itemProps4.xml><?xml version="1.0" encoding="utf-8"?>
-<ds:datastoreItem xmlns:ds="http://schemas.openxmlformats.org/officeDocument/2006/customXml" ds:itemID="{1FF82357-F674-4365-859D-EF5EFE0EDCAE}">
-  <ds:schemaRefs>
-    <ds:schemaRef ds:uri="http://schemas.openxmlformats.org/officeDocument/2006/bibliography"/>
-  </ds:schemaRefs>
-</ds:datastoreItem>
-</file>
-
-<file path=customXml/itemProps5.xml><?xml version="1.0" encoding="utf-8"?>
 <ds:datastoreItem xmlns:ds="http://schemas.openxmlformats.org/officeDocument/2006/customXml" ds:itemID="{92B58BC8-A1B8-4740-9413-5A141DF8AFAB}">
   <ds:schemaRefs>
     <ds:schemaRef ds:uri="http://schemas.microsoft.com/office/2006/metadata/properties"/>
@@ -11290,4 +9508,12 @@
     <ds:schemaRef ds:uri="076cc9d1-9a26-4384-96fc-17dbfe6fe8db"/>
   </ds:schemaRefs>
 </ds:datastoreItem>
+</file>
+
+<file path=customXml/itemProps5.xml><?xml version="1.0" encoding="utf-8"?>
+<ds:datastoreItem xmlns:ds="http://schemas.openxmlformats.org/officeDocument/2006/customXml" ds:itemID="{1FF82357-F674-4365-859D-EF5EFE0EDCAE}">
+  <ds:schemaRefs>
+    <ds:schemaRef ds:uri="http://schemas.openxmlformats.org/officeDocument/2006/bibliography"/>
+  </ds:schemaRefs>
+</ds:datastoreItem>
 </file>
</xml_diff>

<commit_message>
Updated more in data_flow_tab
</commit_message>
<xml_diff>
--- a/template.docx
+++ b/template.docx
@@ -165,7 +165,16 @@
                 <w:sz w:val="26"/>
                 <w:szCs w:val="26"/>
               </w:rPr>
-              <w:t>customer_name|default</w:t>
+              <w:t>customer_name|</w:t>
+            </w:r>
+            <w:proofErr w:type="gramStart"/>
+            <w:r>
+              <w:rPr>
+                <w:rFonts w:ascii="Times New Roman" w:hAnsi="Times New Roman" w:cs="Times New Roman"/>
+                <w:sz w:val="26"/>
+                <w:szCs w:val="26"/>
+              </w:rPr>
+              <w:t>default</w:t>
             </w:r>
             <w:proofErr w:type="spellEnd"/>
             <w:r>
@@ -174,7 +183,16 @@
                 <w:sz w:val="26"/>
                 <w:szCs w:val="26"/>
               </w:rPr>
-              <w:t>('')}}</w:t>
+              <w:t>(</w:t>
+            </w:r>
+            <w:proofErr w:type="gramEnd"/>
+            <w:r>
+              <w:rPr>
+                <w:rFonts w:ascii="Times New Roman" w:hAnsi="Times New Roman" w:cs="Times New Roman"/>
+                <w:sz w:val="26"/>
+                <w:szCs w:val="26"/>
+              </w:rPr>
+              <w:t>'')}}</w:t>
             </w:r>
           </w:p>
         </w:tc>
@@ -244,7 +262,16 @@
                 <w:sz w:val="26"/>
                 <w:szCs w:val="26"/>
               </w:rPr>
-              <w:t>project_name|default</w:t>
+              <w:t>project_name|</w:t>
+            </w:r>
+            <w:proofErr w:type="gramStart"/>
+            <w:r>
+              <w:rPr>
+                <w:rFonts w:ascii="Times New Roman" w:hAnsi="Times New Roman" w:cs="Times New Roman"/>
+                <w:sz w:val="26"/>
+                <w:szCs w:val="26"/>
+              </w:rPr>
+              <w:t>default</w:t>
             </w:r>
             <w:proofErr w:type="spellEnd"/>
             <w:r>
@@ -253,7 +280,16 @@
                 <w:sz w:val="26"/>
                 <w:szCs w:val="26"/>
               </w:rPr>
-              <w:t>('')}}</w:t>
+              <w:t>(</w:t>
+            </w:r>
+            <w:proofErr w:type="gramEnd"/>
+            <w:r>
+              <w:rPr>
+                <w:rFonts w:ascii="Times New Roman" w:hAnsi="Times New Roman" w:cs="Times New Roman"/>
+                <w:sz w:val="26"/>
+                <w:szCs w:val="26"/>
+              </w:rPr>
+              <w:t>'')}}</w:t>
             </w:r>
           </w:p>
         </w:tc>
@@ -330,7 +366,16 @@
                 <w:sz w:val="26"/>
                 <w:szCs w:val="26"/>
               </w:rPr>
-              <w:t>project_location|default</w:t>
+              <w:t>project_location|</w:t>
+            </w:r>
+            <w:proofErr w:type="gramStart"/>
+            <w:r>
+              <w:rPr>
+                <w:rFonts w:ascii="Times New Roman" w:hAnsi="Times New Roman" w:cs="Times New Roman"/>
+                <w:sz w:val="26"/>
+                <w:szCs w:val="26"/>
+              </w:rPr>
+              <w:t>default</w:t>
             </w:r>
             <w:proofErr w:type="spellEnd"/>
             <w:r>
@@ -339,7 +384,16 @@
                 <w:sz w:val="26"/>
                 <w:szCs w:val="26"/>
               </w:rPr>
-              <w:t>('')}}</w:t>
+              <w:t>(</w:t>
+            </w:r>
+            <w:proofErr w:type="gramEnd"/>
+            <w:r>
+              <w:rPr>
+                <w:rFonts w:ascii="Times New Roman" w:hAnsi="Times New Roman" w:cs="Times New Roman"/>
+                <w:sz w:val="26"/>
+                <w:szCs w:val="26"/>
+              </w:rPr>
+              <w:t>'')}}</w:t>
             </w:r>
           </w:p>
         </w:tc>
@@ -407,7 +461,16 @@
                 <w:sz w:val="26"/>
                 <w:szCs w:val="26"/>
               </w:rPr>
-              <w:t>survey_date|default</w:t>
+              <w:t>survey_date|</w:t>
+            </w:r>
+            <w:proofErr w:type="gramStart"/>
+            <w:r>
+              <w:rPr>
+                <w:rFonts w:ascii="Times New Roman" w:hAnsi="Times New Roman" w:cs="Times New Roman"/>
+                <w:sz w:val="26"/>
+                <w:szCs w:val="26"/>
+              </w:rPr>
+              <w:t>default</w:t>
             </w:r>
             <w:proofErr w:type="spellEnd"/>
             <w:r>
@@ -416,7 +479,16 @@
                 <w:sz w:val="26"/>
                 <w:szCs w:val="26"/>
               </w:rPr>
-              <w:t>('')}}</w:t>
+              <w:t>(</w:t>
+            </w:r>
+            <w:proofErr w:type="gramEnd"/>
+            <w:r>
+              <w:rPr>
+                <w:rFonts w:ascii="Times New Roman" w:hAnsi="Times New Roman" w:cs="Times New Roman"/>
+                <w:sz w:val="26"/>
+                <w:szCs w:val="26"/>
+              </w:rPr>
+              <w:t>'')}}</w:t>
             </w:r>
           </w:p>
         </w:tc>
@@ -493,7 +565,16 @@
                 <w:sz w:val="26"/>
                 <w:szCs w:val="26"/>
               </w:rPr>
-              <w:t>customer_email|default</w:t>
+              <w:t>customer_email|</w:t>
+            </w:r>
+            <w:proofErr w:type="gramStart"/>
+            <w:r>
+              <w:rPr>
+                <w:rFonts w:ascii="Times New Roman" w:hAnsi="Times New Roman" w:cs="Times New Roman"/>
+                <w:sz w:val="26"/>
+                <w:szCs w:val="26"/>
+              </w:rPr>
+              <w:t>default</w:t>
             </w:r>
             <w:proofErr w:type="spellEnd"/>
             <w:r>
@@ -502,7 +583,16 @@
                 <w:sz w:val="26"/>
                 <w:szCs w:val="26"/>
               </w:rPr>
-              <w:t>('')}}</w:t>
+              <w:t>(</w:t>
+            </w:r>
+            <w:proofErr w:type="gramEnd"/>
+            <w:r>
+              <w:rPr>
+                <w:rFonts w:ascii="Times New Roman" w:hAnsi="Times New Roman" w:cs="Times New Roman"/>
+                <w:sz w:val="26"/>
+                <w:szCs w:val="26"/>
+              </w:rPr>
+              <w:t>'')}}</w:t>
             </w:r>
           </w:p>
         </w:tc>
@@ -587,7 +677,16 @@
                 <w:sz w:val="26"/>
                 <w:szCs w:val="26"/>
               </w:rPr>
-              <w:t>customer_mobile|default</w:t>
+              <w:t>customer_mobile|</w:t>
+            </w:r>
+            <w:proofErr w:type="gramStart"/>
+            <w:r>
+              <w:rPr>
+                <w:rFonts w:ascii="Times New Roman" w:hAnsi="Times New Roman" w:cs="Times New Roman"/>
+                <w:sz w:val="26"/>
+                <w:szCs w:val="26"/>
+              </w:rPr>
+              <w:t>default</w:t>
             </w:r>
             <w:proofErr w:type="spellEnd"/>
             <w:r>
@@ -596,7 +695,16 @@
                 <w:sz w:val="26"/>
                 <w:szCs w:val="26"/>
               </w:rPr>
-              <w:t>('')}}</w:t>
+              <w:t>(</w:t>
+            </w:r>
+            <w:proofErr w:type="gramEnd"/>
+            <w:r>
+              <w:rPr>
+                <w:rFonts w:ascii="Times New Roman" w:hAnsi="Times New Roman" w:cs="Times New Roman"/>
+                <w:sz w:val="26"/>
+                <w:szCs w:val="26"/>
+              </w:rPr>
+              <w:t>'')}}</w:t>
             </w:r>
           </w:p>
         </w:tc>
@@ -1007,7 +1115,16 @@
                 <w:sz w:val="26"/>
                 <w:szCs w:val="26"/>
               </w:rPr>
-              <w:t>warehouse_area|default</w:t>
+              <w:t>warehouse_area|</w:t>
+            </w:r>
+            <w:proofErr w:type="gramStart"/>
+            <w:r>
+              <w:rPr>
+                <w:rFonts w:ascii="Times New Roman" w:hAnsi="Times New Roman" w:cs="Times New Roman"/>
+                <w:sz w:val="26"/>
+                <w:szCs w:val="26"/>
+              </w:rPr>
+              <w:t>default</w:t>
             </w:r>
             <w:proofErr w:type="spellEnd"/>
             <w:r>
@@ -1016,7 +1133,16 @@
                 <w:sz w:val="26"/>
                 <w:szCs w:val="26"/>
               </w:rPr>
-              <w:t>('')}}</w:t>
+              <w:t>(</w:t>
+            </w:r>
+            <w:proofErr w:type="gramEnd"/>
+            <w:r>
+              <w:rPr>
+                <w:rFonts w:ascii="Times New Roman" w:hAnsi="Times New Roman" w:cs="Times New Roman"/>
+                <w:sz w:val="26"/>
+                <w:szCs w:val="26"/>
+              </w:rPr>
+              <w:t>'')}}</w:t>
             </w:r>
           </w:p>
         </w:tc>
@@ -1149,6 +1275,7 @@
                 <w:szCs w:val="26"/>
               </w:rPr>
             </w:pPr>
+            <w:proofErr w:type="gramStart"/>
             <w:r>
               <w:rPr>
                 <w:rFonts w:ascii="Times New Roman" w:hAnsi="Times New Roman" w:cs="Times New Roman"/>
@@ -1164,7 +1291,25 @@
                 <w:sz w:val="26"/>
                 <w:szCs w:val="26"/>
               </w:rPr>
-              <w:t>aisle_width_text|default</w:t>
+              <w:t>aisle</w:t>
+            </w:r>
+            <w:proofErr w:type="gramEnd"/>
+            <w:r>
+              <w:rPr>
+                <w:rFonts w:ascii="Times New Roman" w:hAnsi="Times New Roman" w:cs="Times New Roman"/>
+                <w:sz w:val="26"/>
+                <w:szCs w:val="26"/>
+              </w:rPr>
+              <w:t>_width_text|</w:t>
+            </w:r>
+            <w:proofErr w:type="gramStart"/>
+            <w:r>
+              <w:rPr>
+                <w:rFonts w:ascii="Times New Roman" w:hAnsi="Times New Roman" w:cs="Times New Roman"/>
+                <w:sz w:val="26"/>
+                <w:szCs w:val="26"/>
+              </w:rPr>
+              <w:t>default</w:t>
             </w:r>
             <w:proofErr w:type="spellEnd"/>
             <w:r>
@@ -1173,7 +1318,16 @@
                 <w:sz w:val="26"/>
                 <w:szCs w:val="26"/>
               </w:rPr>
-              <w:t>('') }}</w:t>
+              <w:t>(</w:t>
+            </w:r>
+            <w:proofErr w:type="gramEnd"/>
+            <w:r>
+              <w:rPr>
+                <w:rFonts w:ascii="Times New Roman" w:hAnsi="Times New Roman" w:cs="Times New Roman"/>
+                <w:sz w:val="26"/>
+                <w:szCs w:val="26"/>
+              </w:rPr>
+              <w:t>'') }}</w:t>
             </w:r>
           </w:p>
         </w:tc>
@@ -1290,6 +1444,7 @@
                 <w:szCs w:val="26"/>
               </w:rPr>
             </w:pPr>
+            <w:proofErr w:type="gramStart"/>
             <w:r>
               <w:rPr>
                 <w:rFonts w:ascii="Times New Roman" w:hAnsi="Times New Roman" w:cs="Times New Roman"/>
@@ -1305,7 +1460,25 @@
                 <w:sz w:val="26"/>
                 <w:szCs w:val="26"/>
               </w:rPr>
-              <w:t>stacking_height_text|default</w:t>
+              <w:t>stacking</w:t>
+            </w:r>
+            <w:proofErr w:type="gramEnd"/>
+            <w:r>
+              <w:rPr>
+                <w:rFonts w:ascii="Times New Roman" w:hAnsi="Times New Roman" w:cs="Times New Roman"/>
+                <w:sz w:val="26"/>
+                <w:szCs w:val="26"/>
+              </w:rPr>
+              <w:t>_height_text|</w:t>
+            </w:r>
+            <w:proofErr w:type="gramStart"/>
+            <w:r>
+              <w:rPr>
+                <w:rFonts w:ascii="Times New Roman" w:hAnsi="Times New Roman" w:cs="Times New Roman"/>
+                <w:sz w:val="26"/>
+                <w:szCs w:val="26"/>
+              </w:rPr>
+              <w:t>default</w:t>
             </w:r>
             <w:proofErr w:type="spellEnd"/>
             <w:r>
@@ -1314,7 +1487,16 @@
                 <w:sz w:val="26"/>
                 <w:szCs w:val="26"/>
               </w:rPr>
-              <w:t>('') }}</w:t>
+              <w:t>(</w:t>
+            </w:r>
+            <w:proofErr w:type="gramEnd"/>
+            <w:r>
+              <w:rPr>
+                <w:rFonts w:ascii="Times New Roman" w:hAnsi="Times New Roman" w:cs="Times New Roman"/>
+                <w:sz w:val="26"/>
+                <w:szCs w:val="26"/>
+              </w:rPr>
+              <w:t>'') }}</w:t>
             </w:r>
             <w:r>
               <w:rPr>
@@ -1323,6 +1505,14 @@
                 <w:szCs w:val="26"/>
               </w:rPr>
               <w:br/>
+            </w:r>
+            <w:proofErr w:type="gramStart"/>
+            <w:r>
+              <w:rPr>
+                <w:rFonts w:ascii="Times New Roman" w:hAnsi="Times New Roman" w:cs="Times New Roman"/>
+                <w:sz w:val="26"/>
+                <w:szCs w:val="26"/>
+              </w:rPr>
               <w:t xml:space="preserve">{{ </w:t>
             </w:r>
             <w:proofErr w:type="spellStart"/>
@@ -1332,7 +1522,25 @@
                 <w:sz w:val="26"/>
                 <w:szCs w:val="26"/>
               </w:rPr>
-              <w:t>stacking_level_text|default</w:t>
+              <w:t>stacking</w:t>
+            </w:r>
+            <w:proofErr w:type="gramEnd"/>
+            <w:r>
+              <w:rPr>
+                <w:rFonts w:ascii="Times New Roman" w:hAnsi="Times New Roman" w:cs="Times New Roman"/>
+                <w:sz w:val="26"/>
+                <w:szCs w:val="26"/>
+              </w:rPr>
+              <w:t>_level_text|</w:t>
+            </w:r>
+            <w:proofErr w:type="gramStart"/>
+            <w:r>
+              <w:rPr>
+                <w:rFonts w:ascii="Times New Roman" w:hAnsi="Times New Roman" w:cs="Times New Roman"/>
+                <w:sz w:val="26"/>
+                <w:szCs w:val="26"/>
+              </w:rPr>
+              <w:t>default</w:t>
             </w:r>
             <w:proofErr w:type="spellEnd"/>
             <w:r>
@@ -1341,7 +1549,16 @@
                 <w:sz w:val="26"/>
                 <w:szCs w:val="26"/>
               </w:rPr>
-              <w:t>('') }}</w:t>
+              <w:t>(</w:t>
+            </w:r>
+            <w:proofErr w:type="gramEnd"/>
+            <w:r>
+              <w:rPr>
+                <w:rFonts w:ascii="Times New Roman" w:hAnsi="Times New Roman" w:cs="Times New Roman"/>
+                <w:sz w:val="26"/>
+                <w:szCs w:val="26"/>
+              </w:rPr>
+              <w:t>'') }}</w:t>
             </w:r>
           </w:p>
         </w:tc>
@@ -1448,16 +1665,29 @@
             <w:vAlign w:val="center"/>
           </w:tcPr>
           <w:p>
+            <w:proofErr w:type="gramStart"/>
             <w:r>
               <w:t xml:space="preserve">{{ </w:t>
             </w:r>
             <w:proofErr w:type="spellStart"/>
             <w:r>
-              <w:t>clearance_height_text|default</w:t>
+              <w:t>clearance</w:t>
+            </w:r>
+            <w:proofErr w:type="gramEnd"/>
+            <w:r>
+              <w:t>_height_text|</w:t>
+            </w:r>
+            <w:proofErr w:type="gramStart"/>
+            <w:r>
+              <w:t>default</w:t>
             </w:r>
             <w:proofErr w:type="spellEnd"/>
             <w:r>
-              <w:t>('') }}</w:t>
+              <w:t>(</w:t>
+            </w:r>
+            <w:proofErr w:type="gramEnd"/>
+            <w:r>
+              <w:t>'') }}</w:t>
             </w:r>
           </w:p>
         </w:tc>
@@ -1587,6 +1817,7 @@
                 <w:szCs w:val="26"/>
               </w:rPr>
             </w:pPr>
+            <w:proofErr w:type="gramStart"/>
             <w:r>
               <w:rPr>
                 <w:rFonts w:ascii="Times New Roman" w:hAnsi="Times New Roman" w:cs="Times New Roman"/>
@@ -1602,7 +1833,25 @@
                 <w:sz w:val="26"/>
                 <w:szCs w:val="26"/>
               </w:rPr>
-              <w:t>storage_locations_text|default</w:t>
+              <w:t>storage</w:t>
+            </w:r>
+            <w:proofErr w:type="gramEnd"/>
+            <w:r>
+              <w:rPr>
+                <w:rFonts w:ascii="Times New Roman" w:hAnsi="Times New Roman" w:cs="Times New Roman"/>
+                <w:sz w:val="26"/>
+                <w:szCs w:val="26"/>
+              </w:rPr>
+              <w:t>_locations_text|</w:t>
+            </w:r>
+            <w:proofErr w:type="gramStart"/>
+            <w:r>
+              <w:rPr>
+                <w:rFonts w:ascii="Times New Roman" w:hAnsi="Times New Roman" w:cs="Times New Roman"/>
+                <w:sz w:val="26"/>
+                <w:szCs w:val="26"/>
+              </w:rPr>
+              <w:t>default</w:t>
             </w:r>
             <w:proofErr w:type="spellEnd"/>
             <w:r>
@@ -1611,7 +1860,16 @@
                 <w:sz w:val="26"/>
                 <w:szCs w:val="26"/>
               </w:rPr>
-              <w:t>('') }}</w:t>
+              <w:t>(</w:t>
+            </w:r>
+            <w:proofErr w:type="gramEnd"/>
+            <w:r>
+              <w:rPr>
+                <w:rFonts w:ascii="Times New Roman" w:hAnsi="Times New Roman" w:cs="Times New Roman"/>
+                <w:sz w:val="26"/>
+                <w:szCs w:val="26"/>
+              </w:rPr>
+              <w:t>'') }}</w:t>
             </w:r>
           </w:p>
         </w:tc>
@@ -1733,6 +1991,7 @@
                 <w:szCs w:val="26"/>
               </w:rPr>
             </w:pPr>
+            <w:proofErr w:type="gramStart"/>
             <w:r>
               <w:rPr>
                 <w:rFonts w:ascii="Times New Roman" w:hAnsi="Times New Roman" w:cs="Times New Roman"/>
@@ -1748,7 +2007,25 @@
                 <w:sz w:val="26"/>
                 <w:szCs w:val="26"/>
               </w:rPr>
-              <w:t>ramp_gradient_deg|default</w:t>
+              <w:t>ramp</w:t>
+            </w:r>
+            <w:proofErr w:type="gramEnd"/>
+            <w:r>
+              <w:rPr>
+                <w:rFonts w:ascii="Times New Roman" w:hAnsi="Times New Roman" w:cs="Times New Roman"/>
+                <w:sz w:val="26"/>
+                <w:szCs w:val="26"/>
+              </w:rPr>
+              <w:t>_gradient_deg|</w:t>
+            </w:r>
+            <w:proofErr w:type="gramStart"/>
+            <w:r>
+              <w:rPr>
+                <w:rFonts w:ascii="Times New Roman" w:hAnsi="Times New Roman" w:cs="Times New Roman"/>
+                <w:sz w:val="26"/>
+                <w:szCs w:val="26"/>
+              </w:rPr>
+              <w:t>default</w:t>
             </w:r>
             <w:proofErr w:type="spellEnd"/>
             <w:r>
@@ -1757,7 +2034,16 @@
                 <w:sz w:val="26"/>
                 <w:szCs w:val="26"/>
               </w:rPr>
-              <w:t>('') }}</w:t>
+              <w:t>(</w:t>
+            </w:r>
+            <w:proofErr w:type="gramEnd"/>
+            <w:r>
+              <w:rPr>
+                <w:rFonts w:ascii="Times New Roman" w:hAnsi="Times New Roman" w:cs="Times New Roman"/>
+                <w:sz w:val="26"/>
+                <w:szCs w:val="26"/>
+              </w:rPr>
+              <w:t>'') }}</w:t>
             </w:r>
           </w:p>
         </w:tc>
@@ -1866,6 +2152,7 @@
                 <w:szCs w:val="26"/>
               </w:rPr>
             </w:pPr>
+            <w:proofErr w:type="gramStart"/>
             <w:r>
               <w:rPr>
                 <w:rFonts w:ascii="Times New Roman" w:hAnsi="Times New Roman" w:cs="Times New Roman"/>
@@ -1881,7 +2168,25 @@
                 <w:sz w:val="26"/>
                 <w:szCs w:val="26"/>
               </w:rPr>
-              <w:t>application_specific_text|default</w:t>
+              <w:t>application</w:t>
+            </w:r>
+            <w:proofErr w:type="gramEnd"/>
+            <w:r>
+              <w:rPr>
+                <w:rFonts w:ascii="Times New Roman" w:hAnsi="Times New Roman" w:cs="Times New Roman"/>
+                <w:sz w:val="26"/>
+                <w:szCs w:val="26"/>
+              </w:rPr>
+              <w:t>_specific_text|</w:t>
+            </w:r>
+            <w:proofErr w:type="gramStart"/>
+            <w:r>
+              <w:rPr>
+                <w:rFonts w:ascii="Times New Roman" w:hAnsi="Times New Roman" w:cs="Times New Roman"/>
+                <w:sz w:val="26"/>
+                <w:szCs w:val="26"/>
+              </w:rPr>
+              <w:t>default</w:t>
             </w:r>
             <w:proofErr w:type="spellEnd"/>
             <w:r>
@@ -1890,7 +2195,34 @@
                 <w:sz w:val="26"/>
                 <w:szCs w:val="26"/>
               </w:rPr>
-              <w:t>('') }}</w:t>
+              <w:t>(</w:t>
+            </w:r>
+            <w:proofErr w:type="gramEnd"/>
+            <w:r>
+              <w:rPr>
+                <w:rFonts w:ascii="Times New Roman" w:hAnsi="Times New Roman" w:cs="Times New Roman"/>
+                <w:sz w:val="26"/>
+                <w:szCs w:val="26"/>
+              </w:rPr>
+              <w:t>''</w:t>
+            </w:r>
+            <w:proofErr w:type="gramStart"/>
+            <w:r>
+              <w:rPr>
+                <w:rFonts w:ascii="Times New Roman" w:hAnsi="Times New Roman" w:cs="Times New Roman"/>
+                <w:sz w:val="26"/>
+                <w:szCs w:val="26"/>
+              </w:rPr>
+              <w:t>) }</w:t>
+            </w:r>
+            <w:proofErr w:type="gramEnd"/>
+            <w:r>
+              <w:rPr>
+                <w:rFonts w:ascii="Times New Roman" w:hAnsi="Times New Roman" w:cs="Times New Roman"/>
+                <w:sz w:val="26"/>
+                <w:szCs w:val="26"/>
+              </w:rPr>
+              <w:t>}</w:t>
             </w:r>
           </w:p>
           <w:p>
@@ -2015,6 +2347,7 @@
                 <w:szCs w:val="26"/>
               </w:rPr>
             </w:pPr>
+            <w:proofErr w:type="gramStart"/>
             <w:r>
               <w:rPr>
                 <w:rFonts w:ascii="Times New Roman" w:hAnsi="Times New Roman" w:cs="Times New Roman"/>
@@ -2030,7 +2363,25 @@
                 <w:sz w:val="26"/>
                 <w:szCs w:val="26"/>
               </w:rPr>
-              <w:t>special_layout|default</w:t>
+              <w:t>special</w:t>
+            </w:r>
+            <w:proofErr w:type="gramEnd"/>
+            <w:r>
+              <w:rPr>
+                <w:rFonts w:ascii="Times New Roman" w:hAnsi="Times New Roman" w:cs="Times New Roman"/>
+                <w:sz w:val="26"/>
+                <w:szCs w:val="26"/>
+              </w:rPr>
+              <w:t>_layout|</w:t>
+            </w:r>
+            <w:proofErr w:type="gramStart"/>
+            <w:r>
+              <w:rPr>
+                <w:rFonts w:ascii="Times New Roman" w:hAnsi="Times New Roman" w:cs="Times New Roman"/>
+                <w:sz w:val="26"/>
+                <w:szCs w:val="26"/>
+              </w:rPr>
+              <w:t>default</w:t>
             </w:r>
             <w:proofErr w:type="spellEnd"/>
             <w:r>
@@ -2039,18 +2390,46 @@
                 <w:sz w:val="26"/>
                 <w:szCs w:val="26"/>
               </w:rPr>
-              <w:t>('') }}</w:t>
-            </w:r>
-          </w:p>
-          <w:p>
-            <w:pPr>
-              <w:jc w:val="left"/>
-              <w:rPr>
-                <w:rFonts w:ascii="Times New Roman" w:hAnsi="Times New Roman" w:cs="Times New Roman"/>
-                <w:sz w:val="26"/>
-                <w:szCs w:val="26"/>
-              </w:rPr>
-            </w:pPr>
+              <w:t>(</w:t>
+            </w:r>
+            <w:proofErr w:type="gramEnd"/>
+            <w:r>
+              <w:rPr>
+                <w:rFonts w:ascii="Times New Roman" w:hAnsi="Times New Roman" w:cs="Times New Roman"/>
+                <w:sz w:val="26"/>
+                <w:szCs w:val="26"/>
+              </w:rPr>
+              <w:t>''</w:t>
+            </w:r>
+            <w:proofErr w:type="gramStart"/>
+            <w:r>
+              <w:rPr>
+                <w:rFonts w:ascii="Times New Roman" w:hAnsi="Times New Roman" w:cs="Times New Roman"/>
+                <w:sz w:val="26"/>
+                <w:szCs w:val="26"/>
+              </w:rPr>
+              <w:t>) }</w:t>
+            </w:r>
+            <w:proofErr w:type="gramEnd"/>
+            <w:r>
+              <w:rPr>
+                <w:rFonts w:ascii="Times New Roman" w:hAnsi="Times New Roman" w:cs="Times New Roman"/>
+                <w:sz w:val="26"/>
+                <w:szCs w:val="26"/>
+              </w:rPr>
+              <w:t>}</w:t>
+            </w:r>
+          </w:p>
+          <w:p>
+            <w:pPr>
+              <w:jc w:val="left"/>
+              <w:rPr>
+                <w:rFonts w:ascii="Times New Roman" w:hAnsi="Times New Roman" w:cs="Times New Roman"/>
+                <w:sz w:val="26"/>
+                <w:szCs w:val="26"/>
+              </w:rPr>
+            </w:pPr>
+            <w:proofErr w:type="gramStart"/>
             <w:r>
               <w:rPr>
                 <w:rFonts w:ascii="Times New Roman" w:hAnsi="Times New Roman" w:cs="Times New Roman"/>
@@ -2066,7 +2445,25 @@
                 <w:sz w:val="26"/>
                 <w:szCs w:val="26"/>
               </w:rPr>
-              <w:t>conveyor_picture_name|default</w:t>
+              <w:t>conveyor</w:t>
+            </w:r>
+            <w:proofErr w:type="gramEnd"/>
+            <w:r>
+              <w:rPr>
+                <w:rFonts w:ascii="Times New Roman" w:hAnsi="Times New Roman" w:cs="Times New Roman"/>
+                <w:sz w:val="26"/>
+                <w:szCs w:val="26"/>
+              </w:rPr>
+              <w:t>_picture_name|</w:t>
+            </w:r>
+            <w:proofErr w:type="gramStart"/>
+            <w:r>
+              <w:rPr>
+                <w:rFonts w:ascii="Times New Roman" w:hAnsi="Times New Roman" w:cs="Times New Roman"/>
+                <w:sz w:val="26"/>
+                <w:szCs w:val="26"/>
+              </w:rPr>
+              <w:t>default</w:t>
             </w:r>
             <w:proofErr w:type="spellEnd"/>
             <w:r>
@@ -2075,7 +2472,34 @@
                 <w:sz w:val="26"/>
                 <w:szCs w:val="26"/>
               </w:rPr>
-              <w:t>('') }}</w:t>
+              <w:t>(</w:t>
+            </w:r>
+            <w:proofErr w:type="gramEnd"/>
+            <w:r>
+              <w:rPr>
+                <w:rFonts w:ascii="Times New Roman" w:hAnsi="Times New Roman" w:cs="Times New Roman"/>
+                <w:sz w:val="26"/>
+                <w:szCs w:val="26"/>
+              </w:rPr>
+              <w:t>''</w:t>
+            </w:r>
+            <w:proofErr w:type="gramStart"/>
+            <w:r>
+              <w:rPr>
+                <w:rFonts w:ascii="Times New Roman" w:hAnsi="Times New Roman" w:cs="Times New Roman"/>
+                <w:sz w:val="26"/>
+                <w:szCs w:val="26"/>
+              </w:rPr>
+              <w:t>) }</w:t>
+            </w:r>
+            <w:proofErr w:type="gramEnd"/>
+            <w:r>
+              <w:rPr>
+                <w:rFonts w:ascii="Times New Roman" w:hAnsi="Times New Roman" w:cs="Times New Roman"/>
+                <w:sz w:val="26"/>
+                <w:szCs w:val="26"/>
+              </w:rPr>
+              <w:t>}</w:t>
             </w:r>
           </w:p>
           <w:p>
@@ -2110,7 +2534,16 @@
                 <w:sz w:val="26"/>
                 <w:szCs w:val="26"/>
               </w:rPr>
-              <w:t>xpl_xna_summary_text|default</w:t>
+              <w:t>xpl_xna_summary_text|</w:t>
+            </w:r>
+            <w:proofErr w:type="gramStart"/>
+            <w:r>
+              <w:rPr>
+                <w:rFonts w:ascii="Times New Roman" w:hAnsi="Times New Roman" w:cs="Times New Roman"/>
+                <w:sz w:val="26"/>
+                <w:szCs w:val="26"/>
+              </w:rPr>
+              <w:t>default</w:t>
             </w:r>
             <w:proofErr w:type="spellEnd"/>
             <w:r>
@@ -2119,7 +2552,16 @@
                 <w:sz w:val="26"/>
                 <w:szCs w:val="26"/>
               </w:rPr>
-              <w:t>('') }}</w:t>
+              <w:t>(</w:t>
+            </w:r>
+            <w:proofErr w:type="gramEnd"/>
+            <w:r>
+              <w:rPr>
+                <w:rFonts w:ascii="Times New Roman" w:hAnsi="Times New Roman" w:cs="Times New Roman"/>
+                <w:sz w:val="26"/>
+                <w:szCs w:val="26"/>
+              </w:rPr>
+              <w:t>'') }}</w:t>
             </w:r>
           </w:p>
         </w:tc>
@@ -2187,6 +2629,7 @@
                 <w:szCs w:val="26"/>
               </w:rPr>
             </w:pPr>
+            <w:proofErr w:type="gramStart"/>
             <w:r>
               <w:rPr>
                 <w:rFonts w:ascii="Times New Roman" w:hAnsi="Times New Roman" w:cs="Times New Roman"/>
@@ -2195,6 +2638,7 @@
               </w:rPr>
               <w:t>Load</w:t>
             </w:r>
+            <w:proofErr w:type="gramEnd"/>
           </w:p>
           <w:p>
             <w:pPr>
@@ -2600,6 +3044,7 @@
                 <w:szCs w:val="26"/>
               </w:rPr>
             </w:pPr>
+            <w:proofErr w:type="gramStart"/>
             <w:r>
               <w:rPr>
                 <w:rFonts w:ascii="Times New Roman" w:hAnsi="Times New Roman" w:cs="Times New Roman"/>
@@ -2615,7 +3060,25 @@
                 <w:sz w:val="26"/>
                 <w:szCs w:val="26"/>
               </w:rPr>
-              <w:t>load_weight_text|default</w:t>
+              <w:t>load</w:t>
+            </w:r>
+            <w:proofErr w:type="gramEnd"/>
+            <w:r>
+              <w:rPr>
+                <w:rFonts w:ascii="Times New Roman" w:hAnsi="Times New Roman" w:cs="Times New Roman"/>
+                <w:sz w:val="26"/>
+                <w:szCs w:val="26"/>
+              </w:rPr>
+              <w:t>_weight_text|</w:t>
+            </w:r>
+            <w:proofErr w:type="gramStart"/>
+            <w:r>
+              <w:rPr>
+                <w:rFonts w:ascii="Times New Roman" w:hAnsi="Times New Roman" w:cs="Times New Roman"/>
+                <w:sz w:val="26"/>
+                <w:szCs w:val="26"/>
+              </w:rPr>
+              <w:t>default</w:t>
             </w:r>
             <w:proofErr w:type="spellEnd"/>
             <w:r>
@@ -2624,7 +3087,16 @@
                 <w:sz w:val="26"/>
                 <w:szCs w:val="26"/>
               </w:rPr>
-              <w:t>('') }}</w:t>
+              <w:t>(</w:t>
+            </w:r>
+            <w:proofErr w:type="gramEnd"/>
+            <w:r>
+              <w:rPr>
+                <w:rFonts w:ascii="Times New Roman" w:hAnsi="Times New Roman" w:cs="Times New Roman"/>
+                <w:sz w:val="26"/>
+                <w:szCs w:val="26"/>
+              </w:rPr>
+              <w:t>'') }}</w:t>
             </w:r>
           </w:p>
         </w:tc>
@@ -2744,7 +3216,16 @@
                 <w:sz w:val="26"/>
                 <w:szCs w:val="26"/>
               </w:rPr>
-              <w:t xml:space="preserve">Pallets per day: {{ </w:t>
+              <w:t xml:space="preserve">Pallets per day: </w:t>
+            </w:r>
+            <w:proofErr w:type="gramStart"/>
+            <w:r>
+              <w:rPr>
+                <w:rFonts w:ascii="Times New Roman" w:hAnsi="Times New Roman" w:cs="Times New Roman"/>
+                <w:sz w:val="26"/>
+                <w:szCs w:val="26"/>
+              </w:rPr>
+              <w:t xml:space="preserve">{{ </w:t>
             </w:r>
             <w:proofErr w:type="spellStart"/>
             <w:r>
@@ -2753,7 +3234,25 @@
                 <w:sz w:val="26"/>
                 <w:szCs w:val="26"/>
               </w:rPr>
-              <w:t>pallets_per_day|default</w:t>
+              <w:t>pallets</w:t>
+            </w:r>
+            <w:proofErr w:type="gramEnd"/>
+            <w:r>
+              <w:rPr>
+                <w:rFonts w:ascii="Times New Roman" w:hAnsi="Times New Roman" w:cs="Times New Roman"/>
+                <w:sz w:val="26"/>
+                <w:szCs w:val="26"/>
+              </w:rPr>
+              <w:t>_per_day|</w:t>
+            </w:r>
+            <w:proofErr w:type="gramStart"/>
+            <w:r>
+              <w:rPr>
+                <w:rFonts w:ascii="Times New Roman" w:hAnsi="Times New Roman" w:cs="Times New Roman"/>
+                <w:sz w:val="26"/>
+                <w:szCs w:val="26"/>
+              </w:rPr>
+              <w:t>default</w:t>
             </w:r>
             <w:proofErr w:type="spellEnd"/>
             <w:r>
@@ -2762,7 +3261,16 @@
                 <w:sz w:val="26"/>
                 <w:szCs w:val="26"/>
               </w:rPr>
-              <w:t>('') }}</w:t>
+              <w:t>(</w:t>
+            </w:r>
+            <w:proofErr w:type="gramEnd"/>
+            <w:r>
+              <w:rPr>
+                <w:rFonts w:ascii="Times New Roman" w:hAnsi="Times New Roman" w:cs="Times New Roman"/>
+                <w:sz w:val="26"/>
+                <w:szCs w:val="26"/>
+              </w:rPr>
+              <w:t>'') }}</w:t>
             </w:r>
             <w:r>
               <w:rPr>
@@ -2771,7 +3279,16 @@
                 <w:szCs w:val="26"/>
               </w:rPr>
               <w:br/>
-              <w:t xml:space="preserve">Operational peak hours: {{ </w:t>
+              <w:t xml:space="preserve">Operational peak hours: </w:t>
+            </w:r>
+            <w:proofErr w:type="gramStart"/>
+            <w:r>
+              <w:rPr>
+                <w:rFonts w:ascii="Times New Roman" w:hAnsi="Times New Roman" w:cs="Times New Roman"/>
+                <w:sz w:val="26"/>
+                <w:szCs w:val="26"/>
+              </w:rPr>
+              <w:t xml:space="preserve">{{ </w:t>
             </w:r>
             <w:proofErr w:type="spellStart"/>
             <w:r>
@@ -2780,7 +3297,25 @@
                 <w:sz w:val="26"/>
                 <w:szCs w:val="26"/>
               </w:rPr>
-              <w:t>peak_hours|default</w:t>
+              <w:t>peak</w:t>
+            </w:r>
+            <w:proofErr w:type="gramEnd"/>
+            <w:r>
+              <w:rPr>
+                <w:rFonts w:ascii="Times New Roman" w:hAnsi="Times New Roman" w:cs="Times New Roman"/>
+                <w:sz w:val="26"/>
+                <w:szCs w:val="26"/>
+              </w:rPr>
+              <w:t>_hours|</w:t>
+            </w:r>
+            <w:proofErr w:type="gramStart"/>
+            <w:r>
+              <w:rPr>
+                <w:rFonts w:ascii="Times New Roman" w:hAnsi="Times New Roman" w:cs="Times New Roman"/>
+                <w:sz w:val="26"/>
+                <w:szCs w:val="26"/>
+              </w:rPr>
+              <w:t>default</w:t>
             </w:r>
             <w:proofErr w:type="spellEnd"/>
             <w:r>
@@ -2789,7 +3324,16 @@
                 <w:sz w:val="26"/>
                 <w:szCs w:val="26"/>
               </w:rPr>
-              <w:t>('') }}</w:t>
+              <w:t>(</w:t>
+            </w:r>
+            <w:proofErr w:type="gramEnd"/>
+            <w:r>
+              <w:rPr>
+                <w:rFonts w:ascii="Times New Roman" w:hAnsi="Times New Roman" w:cs="Times New Roman"/>
+                <w:sz w:val="26"/>
+                <w:szCs w:val="26"/>
+              </w:rPr>
+              <w:t>'') }}</w:t>
             </w:r>
             <w:r>
               <w:rPr>
@@ -2798,7 +3342,16 @@
                 <w:szCs w:val="26"/>
               </w:rPr>
               <w:br/>
-              <w:t xml:space="preserve">Shifts per day: {{ </w:t>
+              <w:t xml:space="preserve">Shifts per day: </w:t>
+            </w:r>
+            <w:proofErr w:type="gramStart"/>
+            <w:r>
+              <w:rPr>
+                <w:rFonts w:ascii="Times New Roman" w:hAnsi="Times New Roman" w:cs="Times New Roman"/>
+                <w:sz w:val="26"/>
+                <w:szCs w:val="26"/>
+              </w:rPr>
+              <w:t xml:space="preserve">{{ </w:t>
             </w:r>
             <w:proofErr w:type="spellStart"/>
             <w:r>
@@ -2807,7 +3360,25 @@
                 <w:sz w:val="26"/>
                 <w:szCs w:val="26"/>
               </w:rPr>
-              <w:t>shifts_per_day|default</w:t>
+              <w:t>shifts</w:t>
+            </w:r>
+            <w:proofErr w:type="gramEnd"/>
+            <w:r>
+              <w:rPr>
+                <w:rFonts w:ascii="Times New Roman" w:hAnsi="Times New Roman" w:cs="Times New Roman"/>
+                <w:sz w:val="26"/>
+                <w:szCs w:val="26"/>
+              </w:rPr>
+              <w:t>_per_day|</w:t>
+            </w:r>
+            <w:proofErr w:type="gramStart"/>
+            <w:r>
+              <w:rPr>
+                <w:rFonts w:ascii="Times New Roman" w:hAnsi="Times New Roman" w:cs="Times New Roman"/>
+                <w:sz w:val="26"/>
+                <w:szCs w:val="26"/>
+              </w:rPr>
+              <w:t>default</w:t>
             </w:r>
             <w:proofErr w:type="spellEnd"/>
             <w:r>
@@ -2816,7 +3387,16 @@
                 <w:sz w:val="26"/>
                 <w:szCs w:val="26"/>
               </w:rPr>
-              <w:t>('') }}</w:t>
+              <w:t>(</w:t>
+            </w:r>
+            <w:proofErr w:type="gramEnd"/>
+            <w:r>
+              <w:rPr>
+                <w:rFonts w:ascii="Times New Roman" w:hAnsi="Times New Roman" w:cs="Times New Roman"/>
+                <w:sz w:val="26"/>
+                <w:szCs w:val="26"/>
+              </w:rPr>
+              <w:t>'') }}</w:t>
             </w:r>
             <w:r>
               <w:rPr>
@@ -2825,7 +3405,16 @@
                 <w:szCs w:val="26"/>
               </w:rPr>
               <w:br/>
-              <w:t xml:space="preserve">Pallets per hour: {{ </w:t>
+              <w:t xml:space="preserve">Pallets per hour: </w:t>
+            </w:r>
+            <w:proofErr w:type="gramStart"/>
+            <w:r>
+              <w:rPr>
+                <w:rFonts w:ascii="Times New Roman" w:hAnsi="Times New Roman" w:cs="Times New Roman"/>
+                <w:sz w:val="26"/>
+                <w:szCs w:val="26"/>
+              </w:rPr>
+              <w:t xml:space="preserve">{{ </w:t>
             </w:r>
             <w:proofErr w:type="spellStart"/>
             <w:r>
@@ -2834,7 +3423,25 @@
                 <w:sz w:val="26"/>
                 <w:szCs w:val="26"/>
               </w:rPr>
-              <w:t>pallets_per_hour|default</w:t>
+              <w:t>pallets</w:t>
+            </w:r>
+            <w:proofErr w:type="gramEnd"/>
+            <w:r>
+              <w:rPr>
+                <w:rFonts w:ascii="Times New Roman" w:hAnsi="Times New Roman" w:cs="Times New Roman"/>
+                <w:sz w:val="26"/>
+                <w:szCs w:val="26"/>
+              </w:rPr>
+              <w:t>_per_hour|</w:t>
+            </w:r>
+            <w:proofErr w:type="gramStart"/>
+            <w:r>
+              <w:rPr>
+                <w:rFonts w:ascii="Times New Roman" w:hAnsi="Times New Roman" w:cs="Times New Roman"/>
+                <w:sz w:val="26"/>
+                <w:szCs w:val="26"/>
+              </w:rPr>
+              <w:t>default</w:t>
             </w:r>
             <w:proofErr w:type="spellEnd"/>
             <w:r>
@@ -2843,7 +3450,16 @@
                 <w:sz w:val="26"/>
                 <w:szCs w:val="26"/>
               </w:rPr>
-              <w:t>('') }}</w:t>
+              <w:t>(</w:t>
+            </w:r>
+            <w:proofErr w:type="gramEnd"/>
+            <w:r>
+              <w:rPr>
+                <w:rFonts w:ascii="Times New Roman" w:hAnsi="Times New Roman" w:cs="Times New Roman"/>
+                <w:sz w:val="26"/>
+                <w:szCs w:val="26"/>
+              </w:rPr>
+              <w:t>'') }}</w:t>
             </w:r>
           </w:p>
         </w:tc>
@@ -3132,6 +3748,7 @@
               <w:t xml:space="preserve"> flow </w:t>
             </w:r>
             <w:proofErr w:type="spellStart"/>
+            <w:proofErr w:type="gramStart"/>
             <w:r>
               <w:rPr>
                 <w:rFonts w:ascii="Times New Roman" w:hAnsi="Times New Roman" w:cs="Times New Roman"/>
@@ -3149,7 +3766,27 @@
                 <w:szCs w:val="26"/>
                 <w:lang w:val="fr-BE"/>
               </w:rPr>
-              <w:t xml:space="preserve">: {{ </w:t>
+              <w:t>:</w:t>
+            </w:r>
+            <w:proofErr w:type="gramEnd"/>
+            <w:r>
+              <w:rPr>
+                <w:rFonts w:ascii="Times New Roman" w:hAnsi="Times New Roman" w:cs="Times New Roman"/>
+                <w:sz w:val="26"/>
+                <w:szCs w:val="26"/>
+                <w:lang w:val="fr-BE"/>
+              </w:rPr>
+              <w:t xml:space="preserve"> </w:t>
+            </w:r>
+            <w:proofErr w:type="gramStart"/>
+            <w:r>
+              <w:rPr>
+                <w:rFonts w:ascii="Times New Roman" w:hAnsi="Times New Roman" w:cs="Times New Roman"/>
+                <w:sz w:val="26"/>
+                <w:szCs w:val="26"/>
+                <w:lang w:val="fr-BE"/>
+              </w:rPr>
+              <w:t xml:space="preserve">{{ </w:t>
             </w:r>
             <w:proofErr w:type="spellStart"/>
             <w:r>
@@ -3159,7 +3796,27 @@
                 <w:szCs w:val="26"/>
                 <w:lang w:val="fr-BE"/>
               </w:rPr>
-              <w:t>flow_steps|default</w:t>
+              <w:t>flow</w:t>
+            </w:r>
+            <w:proofErr w:type="gramEnd"/>
+            <w:r>
+              <w:rPr>
+                <w:rFonts w:ascii="Times New Roman" w:hAnsi="Times New Roman" w:cs="Times New Roman"/>
+                <w:sz w:val="26"/>
+                <w:szCs w:val="26"/>
+                <w:lang w:val="fr-BE"/>
+              </w:rPr>
+              <w:t>_steps|</w:t>
+            </w:r>
+            <w:proofErr w:type="gramStart"/>
+            <w:r>
+              <w:rPr>
+                <w:rFonts w:ascii="Times New Roman" w:hAnsi="Times New Roman" w:cs="Times New Roman"/>
+                <w:sz w:val="26"/>
+                <w:szCs w:val="26"/>
+                <w:lang w:val="fr-BE"/>
+              </w:rPr>
+              <w:t>default</w:t>
             </w:r>
             <w:proofErr w:type="spellEnd"/>
             <w:r>
@@ -3169,7 +3826,17 @@
                 <w:szCs w:val="26"/>
                 <w:lang w:val="fr-BE"/>
               </w:rPr>
-              <w:t>('') }}</w:t>
+              <w:t>(</w:t>
+            </w:r>
+            <w:proofErr w:type="gramEnd"/>
+            <w:r>
+              <w:rPr>
+                <w:rFonts w:ascii="Times New Roman" w:hAnsi="Times New Roman" w:cs="Times New Roman"/>
+                <w:sz w:val="26"/>
+                <w:szCs w:val="26"/>
+                <w:lang w:val="fr-BE"/>
+              </w:rPr>
+              <w:t>'') }}</w:t>
             </w:r>
             <w:r>
               <w:rPr>
@@ -3182,6 +3849,7 @@
               <w:t xml:space="preserve">Route </w:t>
             </w:r>
             <w:proofErr w:type="spellStart"/>
+            <w:proofErr w:type="gramStart"/>
             <w:r>
               <w:rPr>
                 <w:rFonts w:ascii="Times New Roman" w:hAnsi="Times New Roman" w:cs="Times New Roman"/>
@@ -3201,6 +3869,7 @@
               </w:rPr>
               <w:t>:</w:t>
             </w:r>
+            <w:proofErr w:type="gramEnd"/>
             <w:r>
               <w:rPr>
                 <w:rFonts w:ascii="Times New Roman" w:hAnsi="Times New Roman" w:cs="Times New Roman"/>
@@ -3209,6 +3878,15 @@
                 <w:lang w:val="fr-BE"/>
               </w:rPr>
               <w:br/>
+            </w:r>
+            <w:proofErr w:type="gramStart"/>
+            <w:r>
+              <w:rPr>
+                <w:rFonts w:ascii="Times New Roman" w:hAnsi="Times New Roman" w:cs="Times New Roman"/>
+                <w:sz w:val="26"/>
+                <w:szCs w:val="26"/>
+                <w:lang w:val="fr-BE"/>
+              </w:rPr>
               <w:t xml:space="preserve">{{ </w:t>
             </w:r>
             <w:proofErr w:type="spellStart"/>
@@ -3219,7 +3897,27 @@
                 <w:szCs w:val="26"/>
                 <w:lang w:val="fr-BE"/>
               </w:rPr>
-              <w:t>route_summary|default</w:t>
+              <w:t>route</w:t>
+            </w:r>
+            <w:proofErr w:type="gramEnd"/>
+            <w:r>
+              <w:rPr>
+                <w:rFonts w:ascii="Times New Roman" w:hAnsi="Times New Roman" w:cs="Times New Roman"/>
+                <w:sz w:val="26"/>
+                <w:szCs w:val="26"/>
+                <w:lang w:val="fr-BE"/>
+              </w:rPr>
+              <w:t>_summary|</w:t>
+            </w:r>
+            <w:proofErr w:type="gramStart"/>
+            <w:r>
+              <w:rPr>
+                <w:rFonts w:ascii="Times New Roman" w:hAnsi="Times New Roman" w:cs="Times New Roman"/>
+                <w:sz w:val="26"/>
+                <w:szCs w:val="26"/>
+                <w:lang w:val="fr-BE"/>
+              </w:rPr>
+              <w:t>default</w:t>
             </w:r>
             <w:proofErr w:type="spellEnd"/>
             <w:r>
@@ -3229,8 +3927,9 @@
                 <w:szCs w:val="26"/>
                 <w:lang w:val="fr-BE"/>
               </w:rPr>
-              <w:t>('') }}</w:t>
-            </w:r>
+              <w:t>(</w:t>
+            </w:r>
+            <w:proofErr w:type="gramEnd"/>
             <w:r>
               <w:rPr>
                 <w:rFonts w:ascii="Times New Roman" w:hAnsi="Times New Roman" w:cs="Times New Roman"/>
@@ -3238,6 +3937,15 @@
                 <w:szCs w:val="26"/>
                 <w:lang w:val="fr-BE"/>
               </w:rPr>
+              <w:t>'') }}</w:t>
+            </w:r>
+            <w:r>
+              <w:rPr>
+                <w:rFonts w:ascii="Times New Roman" w:hAnsi="Times New Roman" w:cs="Times New Roman"/>
+                <w:sz w:val="26"/>
+                <w:szCs w:val="26"/>
+                <w:lang w:val="fr-BE"/>
+              </w:rPr>
               <w:br/>
             </w:r>
             <w:proofErr w:type="spellStart"/>
@@ -3281,6 +3989,7 @@
               <w:t xml:space="preserve"> / </w:t>
             </w:r>
             <w:proofErr w:type="spellStart"/>
+            <w:proofErr w:type="gramStart"/>
             <w:r>
               <w:rPr>
                 <w:rFonts w:ascii="Times New Roman" w:hAnsi="Times New Roman" w:cs="Times New Roman"/>
@@ -3298,7 +4007,27 @@
                 <w:szCs w:val="26"/>
                 <w:lang w:val="fr-BE"/>
               </w:rPr>
-              <w:t xml:space="preserve">: {{ </w:t>
+              <w:t>:</w:t>
+            </w:r>
+            <w:proofErr w:type="gramEnd"/>
+            <w:r>
+              <w:rPr>
+                <w:rFonts w:ascii="Times New Roman" w:hAnsi="Times New Roman" w:cs="Times New Roman"/>
+                <w:sz w:val="26"/>
+                <w:szCs w:val="26"/>
+                <w:lang w:val="fr-BE"/>
+              </w:rPr>
+              <w:t xml:space="preserve"> </w:t>
+            </w:r>
+            <w:proofErr w:type="gramStart"/>
+            <w:r>
+              <w:rPr>
+                <w:rFonts w:ascii="Times New Roman" w:hAnsi="Times New Roman" w:cs="Times New Roman"/>
+                <w:sz w:val="26"/>
+                <w:szCs w:val="26"/>
+                <w:lang w:val="fr-BE"/>
+              </w:rPr>
+              <w:t xml:space="preserve">{{ </w:t>
             </w:r>
             <w:proofErr w:type="spellStart"/>
             <w:r>
@@ -3308,7 +4037,27 @@
                 <w:szCs w:val="26"/>
                 <w:lang w:val="fr-BE"/>
               </w:rPr>
-              <w:t>material_flow_text|default</w:t>
+              <w:t>material</w:t>
+            </w:r>
+            <w:proofErr w:type="gramEnd"/>
+            <w:r>
+              <w:rPr>
+                <w:rFonts w:ascii="Times New Roman" w:hAnsi="Times New Roman" w:cs="Times New Roman"/>
+                <w:sz w:val="26"/>
+                <w:szCs w:val="26"/>
+                <w:lang w:val="fr-BE"/>
+              </w:rPr>
+              <w:t>_flow_text|</w:t>
+            </w:r>
+            <w:proofErr w:type="gramStart"/>
+            <w:r>
+              <w:rPr>
+                <w:rFonts w:ascii="Times New Roman" w:hAnsi="Times New Roman" w:cs="Times New Roman"/>
+                <w:sz w:val="26"/>
+                <w:szCs w:val="26"/>
+                <w:lang w:val="fr-BE"/>
+              </w:rPr>
+              <w:t>default</w:t>
             </w:r>
             <w:proofErr w:type="spellEnd"/>
             <w:r>
@@ -3318,8 +4067,9 @@
                 <w:szCs w:val="26"/>
                 <w:lang w:val="fr-BE"/>
               </w:rPr>
-              <w:t>('') }}</w:t>
-            </w:r>
+              <w:t>(</w:t>
+            </w:r>
+            <w:proofErr w:type="gramEnd"/>
             <w:r>
               <w:rPr>
                 <w:rFonts w:ascii="Times New Roman" w:hAnsi="Times New Roman" w:cs="Times New Roman"/>
@@ -3327,6 +4077,15 @@
                 <w:szCs w:val="26"/>
                 <w:lang w:val="fr-BE"/>
               </w:rPr>
+              <w:t>'') }}</w:t>
+            </w:r>
+            <w:r>
+              <w:rPr>
+                <w:rFonts w:ascii="Times New Roman" w:hAnsi="Times New Roman" w:cs="Times New Roman"/>
+                <w:sz w:val="26"/>
+                <w:szCs w:val="26"/>
+                <w:lang w:val="fr-BE"/>
+              </w:rPr>
               <w:br/>
             </w:r>
             <w:proofErr w:type="spellStart"/>
@@ -3367,8 +4126,9 @@
                 <w:szCs w:val="26"/>
                 <w:lang w:val="fr-BE"/>
               </w:rPr>
-              <w:t xml:space="preserve"> notes:</w:t>
-            </w:r>
+              <w:t xml:space="preserve"> </w:t>
+            </w:r>
+            <w:proofErr w:type="gramStart"/>
             <w:r>
               <w:rPr>
                 <w:rFonts w:ascii="Times New Roman" w:hAnsi="Times New Roman" w:cs="Times New Roman"/>
@@ -3376,7 +4136,26 @@
                 <w:szCs w:val="26"/>
                 <w:lang w:val="fr-BE"/>
               </w:rPr>
+              <w:t>notes:</w:t>
+            </w:r>
+            <w:proofErr w:type="gramEnd"/>
+            <w:r>
+              <w:rPr>
+                <w:rFonts w:ascii="Times New Roman" w:hAnsi="Times New Roman" w:cs="Times New Roman"/>
+                <w:sz w:val="26"/>
+                <w:szCs w:val="26"/>
+                <w:lang w:val="fr-BE"/>
+              </w:rPr>
               <w:br/>
+            </w:r>
+            <w:proofErr w:type="gramStart"/>
+            <w:r>
+              <w:rPr>
+                <w:rFonts w:ascii="Times New Roman" w:hAnsi="Times New Roman" w:cs="Times New Roman"/>
+                <w:sz w:val="26"/>
+                <w:szCs w:val="26"/>
+                <w:lang w:val="fr-BE"/>
+              </w:rPr>
               <w:t xml:space="preserve">{{ </w:t>
             </w:r>
             <w:proofErr w:type="spellStart"/>
@@ -3387,7 +4166,27 @@
                 <w:szCs w:val="26"/>
                 <w:lang w:val="fr-BE"/>
               </w:rPr>
-              <w:t>material_step_details_text|default</w:t>
+              <w:t>material</w:t>
+            </w:r>
+            <w:proofErr w:type="gramEnd"/>
+            <w:r>
+              <w:rPr>
+                <w:rFonts w:ascii="Times New Roman" w:hAnsi="Times New Roman" w:cs="Times New Roman"/>
+                <w:sz w:val="26"/>
+                <w:szCs w:val="26"/>
+                <w:lang w:val="fr-BE"/>
+              </w:rPr>
+              <w:t>_step_details_text|</w:t>
+            </w:r>
+            <w:proofErr w:type="gramStart"/>
+            <w:r>
+              <w:rPr>
+                <w:rFonts w:ascii="Times New Roman" w:hAnsi="Times New Roman" w:cs="Times New Roman"/>
+                <w:sz w:val="26"/>
+                <w:szCs w:val="26"/>
+                <w:lang w:val="fr-BE"/>
+              </w:rPr>
+              <w:t>default</w:t>
             </w:r>
             <w:proofErr w:type="spellEnd"/>
             <w:r>
@@ -3397,7 +4196,17 @@
                 <w:szCs w:val="26"/>
                 <w:lang w:val="fr-BE"/>
               </w:rPr>
-              <w:t>('') }}</w:t>
+              <w:t>(</w:t>
+            </w:r>
+            <w:proofErr w:type="gramEnd"/>
+            <w:r>
+              <w:rPr>
+                <w:rFonts w:ascii="Times New Roman" w:hAnsi="Times New Roman" w:cs="Times New Roman"/>
+                <w:sz w:val="26"/>
+                <w:szCs w:val="26"/>
+                <w:lang w:val="fr-BE"/>
+              </w:rPr>
+              <w:t>'') }}</w:t>
             </w:r>
             <w:r>
               <w:rPr>
@@ -3427,8 +4236,9 @@
                 <w:szCs w:val="26"/>
                 <w:lang w:val="fr-BE"/>
               </w:rPr>
-              <w:t xml:space="preserve"> / direct flows / notes:</w:t>
-            </w:r>
+              <w:t xml:space="preserve"> / direct flows / </w:t>
+            </w:r>
+            <w:proofErr w:type="gramStart"/>
             <w:r>
               <w:rPr>
                 <w:rFonts w:ascii="Times New Roman" w:hAnsi="Times New Roman" w:cs="Times New Roman"/>
@@ -3436,7 +4246,26 @@
                 <w:szCs w:val="26"/>
                 <w:lang w:val="fr-BE"/>
               </w:rPr>
+              <w:t>notes:</w:t>
+            </w:r>
+            <w:proofErr w:type="gramEnd"/>
+            <w:r>
+              <w:rPr>
+                <w:rFonts w:ascii="Times New Roman" w:hAnsi="Times New Roman" w:cs="Times New Roman"/>
+                <w:sz w:val="26"/>
+                <w:szCs w:val="26"/>
+                <w:lang w:val="fr-BE"/>
+              </w:rPr>
               <w:br/>
+            </w:r>
+            <w:proofErr w:type="gramStart"/>
+            <w:r>
+              <w:rPr>
+                <w:rFonts w:ascii="Times New Roman" w:hAnsi="Times New Roman" w:cs="Times New Roman"/>
+                <w:sz w:val="26"/>
+                <w:szCs w:val="26"/>
+                <w:lang w:val="fr-BE"/>
+              </w:rPr>
               <w:t xml:space="preserve">{{ </w:t>
             </w:r>
             <w:proofErr w:type="spellStart"/>
@@ -3447,7 +4276,27 @@
                 <w:szCs w:val="26"/>
                 <w:lang w:val="fr-BE"/>
               </w:rPr>
-              <w:t>special_comments|default</w:t>
+              <w:t>special</w:t>
+            </w:r>
+            <w:proofErr w:type="gramEnd"/>
+            <w:r>
+              <w:rPr>
+                <w:rFonts w:ascii="Times New Roman" w:hAnsi="Times New Roman" w:cs="Times New Roman"/>
+                <w:sz w:val="26"/>
+                <w:szCs w:val="26"/>
+                <w:lang w:val="fr-BE"/>
+              </w:rPr>
+              <w:t>_comments|</w:t>
+            </w:r>
+            <w:proofErr w:type="gramStart"/>
+            <w:r>
+              <w:rPr>
+                <w:rFonts w:ascii="Times New Roman" w:hAnsi="Times New Roman" w:cs="Times New Roman"/>
+                <w:sz w:val="26"/>
+                <w:szCs w:val="26"/>
+                <w:lang w:val="fr-BE"/>
+              </w:rPr>
+              <w:t>default</w:t>
             </w:r>
             <w:proofErr w:type="spellEnd"/>
             <w:r>
@@ -3457,7 +4306,17 @@
                 <w:szCs w:val="26"/>
                 <w:lang w:val="fr-BE"/>
               </w:rPr>
-              <w:t>('') }}</w:t>
+              <w:t>(</w:t>
+            </w:r>
+            <w:proofErr w:type="gramEnd"/>
+            <w:r>
+              <w:rPr>
+                <w:rFonts w:ascii="Times New Roman" w:hAnsi="Times New Roman" w:cs="Times New Roman"/>
+                <w:sz w:val="26"/>
+                <w:szCs w:val="26"/>
+                <w:lang w:val="fr-BE"/>
+              </w:rPr>
+              <w:t>'') }}</w:t>
             </w:r>
           </w:p>
         </w:tc>
@@ -3592,7 +4451,16 @@
                 <w:szCs w:val="26"/>
               </w:rPr>
               <w:br/>
-              <w:t xml:space="preserve">See attached CAD / layout file: {{ </w:t>
+              <w:t xml:space="preserve">See attached CAD / layout file: </w:t>
+            </w:r>
+            <w:proofErr w:type="gramStart"/>
+            <w:r>
+              <w:rPr>
+                <w:rFonts w:ascii="Times New Roman" w:hAnsi="Times New Roman" w:cs="Times New Roman"/>
+                <w:sz w:val="26"/>
+                <w:szCs w:val="26"/>
+              </w:rPr>
+              <w:t xml:space="preserve">{{ </w:t>
             </w:r>
             <w:proofErr w:type="spellStart"/>
             <w:r>
@@ -3601,7 +4469,25 @@
                 <w:sz w:val="26"/>
                 <w:szCs w:val="26"/>
               </w:rPr>
-              <w:t>cad_filename|default</w:t>
+              <w:t>cad</w:t>
+            </w:r>
+            <w:proofErr w:type="gramEnd"/>
+            <w:r>
+              <w:rPr>
+                <w:rFonts w:ascii="Times New Roman" w:hAnsi="Times New Roman" w:cs="Times New Roman"/>
+                <w:sz w:val="26"/>
+                <w:szCs w:val="26"/>
+              </w:rPr>
+              <w:t>_filename|</w:t>
+            </w:r>
+            <w:proofErr w:type="gramStart"/>
+            <w:r>
+              <w:rPr>
+                <w:rFonts w:ascii="Times New Roman" w:hAnsi="Times New Roman" w:cs="Times New Roman"/>
+                <w:sz w:val="26"/>
+                <w:szCs w:val="26"/>
+              </w:rPr>
+              <w:t>default</w:t>
             </w:r>
             <w:proofErr w:type="spellEnd"/>
             <w:r>
@@ -3610,7 +4496,16 @@
                 <w:sz w:val="26"/>
                 <w:szCs w:val="26"/>
               </w:rPr>
-              <w:t>('') }}</w:t>
+              <w:t>(</w:t>
+            </w:r>
+            <w:proofErr w:type="gramEnd"/>
+            <w:r>
+              <w:rPr>
+                <w:rFonts w:ascii="Times New Roman" w:hAnsi="Times New Roman" w:cs="Times New Roman"/>
+                <w:sz w:val="26"/>
+                <w:szCs w:val="26"/>
+              </w:rPr>
+              <w:t>'') }}</w:t>
             </w:r>
           </w:p>
         </w:tc>
@@ -3888,63 +4783,147 @@
               <w:rPr>
                 <w:lang w:val="en-BE"/>
               </w:rPr>
-              <w:t xml:space="preserve">Site Wi-Fi available: {{ </w:t>
+              <w:t xml:space="preserve">Site Wi-Fi available: </w:t>
+            </w:r>
+            <w:proofErr w:type="gramStart"/>
+            <w:r>
+              <w:rPr>
+                <w:lang w:val="en-BE"/>
+              </w:rPr>
+              <w:t xml:space="preserve">{{ </w:t>
             </w:r>
             <w:proofErr w:type="spellStart"/>
             <w:r>
               <w:rPr>
                 <w:lang w:val="en-BE"/>
               </w:rPr>
-              <w:t>site_wifi_available|default</w:t>
+              <w:t>site</w:t>
+            </w:r>
+            <w:proofErr w:type="gramEnd"/>
+            <w:r>
+              <w:rPr>
+                <w:lang w:val="en-BE"/>
+              </w:rPr>
+              <w:t>_wifi_available|</w:t>
+            </w:r>
+            <w:proofErr w:type="gramStart"/>
+            <w:r>
+              <w:rPr>
+                <w:lang w:val="en-BE"/>
+              </w:rPr>
+              <w:t>default</w:t>
             </w:r>
             <w:proofErr w:type="spellEnd"/>
             <w:r>
               <w:rPr>
                 <w:lang w:val="en-BE"/>
               </w:rPr>
-              <w:t>('') }}</w:t>
-            </w:r>
+              <w:t>(</w:t>
+            </w:r>
+            <w:proofErr w:type="gramEnd"/>
             <w:r>
               <w:rPr>
                 <w:lang w:val="en-BE"/>
               </w:rPr>
+              <w:t>'') }}</w:t>
+            </w:r>
+            <w:r>
+              <w:rPr>
+                <w:lang w:val="en-BE"/>
+              </w:rPr>
               <w:br/>
-              <w:t xml:space="preserve">Network status: {{ </w:t>
+              <w:t xml:space="preserve">Network status: </w:t>
+            </w:r>
+            <w:proofErr w:type="gramStart"/>
+            <w:r>
+              <w:rPr>
+                <w:lang w:val="en-BE"/>
+              </w:rPr>
+              <w:t xml:space="preserve">{{ </w:t>
             </w:r>
             <w:proofErr w:type="spellStart"/>
             <w:r>
               <w:rPr>
                 <w:lang w:val="en-BE"/>
               </w:rPr>
-              <w:t>network_status|default</w:t>
+              <w:t>network</w:t>
+            </w:r>
+            <w:proofErr w:type="gramEnd"/>
+            <w:r>
+              <w:rPr>
+                <w:lang w:val="en-BE"/>
+              </w:rPr>
+              <w:t>_status|</w:t>
+            </w:r>
+            <w:proofErr w:type="gramStart"/>
+            <w:r>
+              <w:rPr>
+                <w:lang w:val="en-BE"/>
+              </w:rPr>
+              <w:t>default</w:t>
             </w:r>
             <w:proofErr w:type="spellEnd"/>
             <w:r>
               <w:rPr>
                 <w:lang w:val="en-BE"/>
               </w:rPr>
-              <w:t>('') }}</w:t>
-            </w:r>
+              <w:t>(</w:t>
+            </w:r>
+            <w:proofErr w:type="gramEnd"/>
             <w:r>
               <w:rPr>
                 <w:lang w:val="en-BE"/>
               </w:rPr>
+              <w:t>'') }}</w:t>
+            </w:r>
+            <w:r>
+              <w:rPr>
+                <w:lang w:val="en-BE"/>
+              </w:rPr>
               <w:br/>
-              <w:t xml:space="preserve">Coverage details: {{ </w:t>
+              <w:t xml:space="preserve">Coverage details: </w:t>
+            </w:r>
+            <w:proofErr w:type="gramStart"/>
+            <w:r>
+              <w:rPr>
+                <w:lang w:val="en-BE"/>
+              </w:rPr>
+              <w:t xml:space="preserve">{{ </w:t>
             </w:r>
             <w:proofErr w:type="spellStart"/>
             <w:r>
               <w:rPr>
                 <w:lang w:val="en-BE"/>
               </w:rPr>
-              <w:t>network_coverage|default</w:t>
+              <w:t>network</w:t>
+            </w:r>
+            <w:proofErr w:type="gramEnd"/>
+            <w:r>
+              <w:rPr>
+                <w:lang w:val="en-BE"/>
+              </w:rPr>
+              <w:t>_coverage|</w:t>
+            </w:r>
+            <w:proofErr w:type="gramStart"/>
+            <w:r>
+              <w:rPr>
+                <w:lang w:val="en-BE"/>
+              </w:rPr>
+              <w:t>default</w:t>
             </w:r>
             <w:proofErr w:type="spellEnd"/>
             <w:r>
               <w:rPr>
                 <w:lang w:val="en-BE"/>
               </w:rPr>
-              <w:t>('') }}</w:t>
+              <w:t>(</w:t>
+            </w:r>
+            <w:proofErr w:type="gramEnd"/>
+            <w:r>
+              <w:rPr>
+                <w:lang w:val="en-BE"/>
+              </w:rPr>
+              <w:t>'') }}</w:t>
             </w:r>
           </w:p>
         </w:tc>
@@ -4062,6 +5041,7 @@
             <w:vAlign w:val="center"/>
           </w:tcPr>
           <w:p>
+            <w:proofErr w:type="gramStart"/>
             <w:r>
               <w:rPr>
                 <w:rFonts w:ascii="Times New Roman" w:eastAsiaTheme="minorEastAsia" w:hAnsi="Times New Roman" w:cs="Times New Roman"/>
@@ -4078,7 +5058,25 @@
                 <w:sz w:val="26"/>
                 <w:szCs w:val="26"/>
               </w:rPr>
-              <w:t>integration_support_text|default</w:t>
+              <w:t>integration</w:t>
+            </w:r>
+            <w:proofErr w:type="gramEnd"/>
+            <w:r>
+              <w:rPr>
+                <w:rFonts w:ascii="Times New Roman" w:eastAsiaTheme="minorEastAsia" w:hAnsi="Times New Roman" w:cs="Times New Roman"/>
+                <w:sz w:val="26"/>
+                <w:szCs w:val="26"/>
+              </w:rPr>
+              <w:t>_support_text|</w:t>
+            </w:r>
+            <w:proofErr w:type="gramStart"/>
+            <w:r>
+              <w:rPr>
+                <w:rFonts w:ascii="Times New Roman" w:eastAsiaTheme="minorEastAsia" w:hAnsi="Times New Roman" w:cs="Times New Roman"/>
+                <w:sz w:val="26"/>
+                <w:szCs w:val="26"/>
+              </w:rPr>
+              <w:t>default</w:t>
             </w:r>
             <w:proofErr w:type="spellEnd"/>
             <w:r>
@@ -4087,7 +5085,34 @@
                 <w:sz w:val="26"/>
                 <w:szCs w:val="26"/>
               </w:rPr>
-              <w:t>('') }}</w:t>
+              <w:t>(</w:t>
+            </w:r>
+            <w:proofErr w:type="gramEnd"/>
+            <w:r>
+              <w:rPr>
+                <w:rFonts w:ascii="Times New Roman" w:eastAsiaTheme="minorEastAsia" w:hAnsi="Times New Roman" w:cs="Times New Roman"/>
+                <w:sz w:val="26"/>
+                <w:szCs w:val="26"/>
+              </w:rPr>
+              <w:t>''</w:t>
+            </w:r>
+            <w:proofErr w:type="gramStart"/>
+            <w:r>
+              <w:rPr>
+                <w:rFonts w:ascii="Times New Roman" w:eastAsiaTheme="minorEastAsia" w:hAnsi="Times New Roman" w:cs="Times New Roman"/>
+                <w:sz w:val="26"/>
+                <w:szCs w:val="26"/>
+              </w:rPr>
+              <w:t>) }</w:t>
+            </w:r>
+            <w:proofErr w:type="gramEnd"/>
+            <w:r>
+              <w:rPr>
+                <w:rFonts w:ascii="Times New Roman" w:eastAsiaTheme="minorEastAsia" w:hAnsi="Times New Roman" w:cs="Times New Roman"/>
+                <w:sz w:val="26"/>
+                <w:szCs w:val="26"/>
+              </w:rPr>
+              <w:t>}</w:t>
             </w:r>
           </w:p>
           <w:p/>
@@ -4180,7 +5205,25 @@
                 <w:sz w:val="26"/>
                 <w:szCs w:val="26"/>
               </w:rPr>
-              <w:t>Whether there are related equipment that needs to be docked (elevators, robotic arms, roller shutter doors, telescopic doors, vertical warehouses, winding machines, etc.), etc.:</w:t>
+              <w:t xml:space="preserve">Whether there </w:t>
+            </w:r>
+            <w:proofErr w:type="gramStart"/>
+            <w:r>
+              <w:rPr>
+                <w:rFonts w:ascii="Times New Roman" w:hAnsi="Times New Roman" w:cs="Times New Roman"/>
+                <w:sz w:val="26"/>
+                <w:szCs w:val="26"/>
+              </w:rPr>
+              <w:t>are</w:t>
+            </w:r>
+            <w:proofErr w:type="gramEnd"/>
+            <w:r>
+              <w:rPr>
+                <w:rFonts w:ascii="Times New Roman" w:hAnsi="Times New Roman" w:cs="Times New Roman"/>
+                <w:sz w:val="26"/>
+                <w:szCs w:val="26"/>
+              </w:rPr>
+              <w:t xml:space="preserve"> related equipment that needs to be docked (elevators, robotic arms, roller shutter doors, telescopic doors, vertical warehouses, winding machines, etc.), etc.:</w:t>
             </w:r>
           </w:p>
         </w:tc>
@@ -4204,6 +5247,7 @@
                 <w:lang w:val="en-BE"/>
               </w:rPr>
             </w:pPr>
+            <w:proofErr w:type="gramStart"/>
             <w:r>
               <w:rPr>
                 <w:rFonts w:ascii="Times New Roman" w:eastAsiaTheme="minorEastAsia" w:hAnsi="Times New Roman" w:cs="Times New Roman"/>
@@ -4219,7 +5263,25 @@
                 <w:sz w:val="26"/>
                 <w:szCs w:val="26"/>
               </w:rPr>
-              <w:t>integration_req|default</w:t>
+              <w:t>integration</w:t>
+            </w:r>
+            <w:proofErr w:type="gramEnd"/>
+            <w:r>
+              <w:rPr>
+                <w:rFonts w:ascii="Times New Roman" w:eastAsiaTheme="minorEastAsia" w:hAnsi="Times New Roman" w:cs="Times New Roman"/>
+                <w:sz w:val="26"/>
+                <w:szCs w:val="26"/>
+              </w:rPr>
+              <w:t>_req|</w:t>
+            </w:r>
+            <w:proofErr w:type="gramStart"/>
+            <w:r>
+              <w:rPr>
+                <w:rFonts w:ascii="Times New Roman" w:eastAsiaTheme="minorEastAsia" w:hAnsi="Times New Roman" w:cs="Times New Roman"/>
+                <w:sz w:val="26"/>
+                <w:szCs w:val="26"/>
+              </w:rPr>
+              <w:t>default</w:t>
             </w:r>
             <w:proofErr w:type="spellEnd"/>
             <w:r>
@@ -4228,19 +5290,47 @@
                 <w:sz w:val="26"/>
                 <w:szCs w:val="26"/>
               </w:rPr>
-              <w:t>('') }}</w:t>
-            </w:r>
-          </w:p>
-          <w:p>
-            <w:pPr>
-              <w:spacing w:line="240" w:lineRule="auto"/>
-              <w:jc w:val="left"/>
-              <w:rPr>
-                <w:rFonts w:ascii="Times New Roman" w:eastAsiaTheme="minorEastAsia" w:hAnsi="Times New Roman" w:cs="Times New Roman"/>
-                <w:sz w:val="26"/>
-                <w:szCs w:val="26"/>
-              </w:rPr>
-            </w:pPr>
+              <w:t>(</w:t>
+            </w:r>
+            <w:proofErr w:type="gramEnd"/>
+            <w:r>
+              <w:rPr>
+                <w:rFonts w:ascii="Times New Roman" w:eastAsiaTheme="minorEastAsia" w:hAnsi="Times New Roman" w:cs="Times New Roman"/>
+                <w:sz w:val="26"/>
+                <w:szCs w:val="26"/>
+              </w:rPr>
+              <w:t>''</w:t>
+            </w:r>
+            <w:proofErr w:type="gramStart"/>
+            <w:r>
+              <w:rPr>
+                <w:rFonts w:ascii="Times New Roman" w:eastAsiaTheme="minorEastAsia" w:hAnsi="Times New Roman" w:cs="Times New Roman"/>
+                <w:sz w:val="26"/>
+                <w:szCs w:val="26"/>
+              </w:rPr>
+              <w:t>) }</w:t>
+            </w:r>
+            <w:proofErr w:type="gramEnd"/>
+            <w:r>
+              <w:rPr>
+                <w:rFonts w:ascii="Times New Roman" w:eastAsiaTheme="minorEastAsia" w:hAnsi="Times New Roman" w:cs="Times New Roman"/>
+                <w:sz w:val="26"/>
+                <w:szCs w:val="26"/>
+              </w:rPr>
+              <w:t>}</w:t>
+            </w:r>
+          </w:p>
+          <w:p>
+            <w:pPr>
+              <w:spacing w:line="240" w:lineRule="auto"/>
+              <w:jc w:val="left"/>
+              <w:rPr>
+                <w:rFonts w:ascii="Times New Roman" w:eastAsiaTheme="minorEastAsia" w:hAnsi="Times New Roman" w:cs="Times New Roman"/>
+                <w:sz w:val="26"/>
+                <w:szCs w:val="26"/>
+              </w:rPr>
+            </w:pPr>
+            <w:proofErr w:type="gramStart"/>
             <w:r>
               <w:rPr>
                 <w:rFonts w:ascii="Times New Roman" w:eastAsiaTheme="minorEastAsia" w:hAnsi="Times New Roman" w:cs="Times New Roman"/>
@@ -4256,7 +5346,25 @@
                 <w:sz w:val="26"/>
                 <w:szCs w:val="26"/>
               </w:rPr>
-              <w:t>connections_details|default</w:t>
+              <w:t>connections</w:t>
+            </w:r>
+            <w:proofErr w:type="gramEnd"/>
+            <w:r>
+              <w:rPr>
+                <w:rFonts w:ascii="Times New Roman" w:eastAsiaTheme="minorEastAsia" w:hAnsi="Times New Roman" w:cs="Times New Roman"/>
+                <w:sz w:val="26"/>
+                <w:szCs w:val="26"/>
+              </w:rPr>
+              <w:t>_details|</w:t>
+            </w:r>
+            <w:proofErr w:type="gramStart"/>
+            <w:r>
+              <w:rPr>
+                <w:rFonts w:ascii="Times New Roman" w:eastAsiaTheme="minorEastAsia" w:hAnsi="Times New Roman" w:cs="Times New Roman"/>
+                <w:sz w:val="26"/>
+                <w:szCs w:val="26"/>
+              </w:rPr>
+              <w:t>default</w:t>
             </w:r>
             <w:proofErr w:type="spellEnd"/>
             <w:r>
@@ -4265,7 +5373,34 @@
                 <w:sz w:val="26"/>
                 <w:szCs w:val="26"/>
               </w:rPr>
-              <w:t>('') }}</w:t>
+              <w:t>(</w:t>
+            </w:r>
+            <w:proofErr w:type="gramEnd"/>
+            <w:r>
+              <w:rPr>
+                <w:rFonts w:ascii="Times New Roman" w:eastAsiaTheme="minorEastAsia" w:hAnsi="Times New Roman" w:cs="Times New Roman"/>
+                <w:sz w:val="26"/>
+                <w:szCs w:val="26"/>
+              </w:rPr>
+              <w:t>''</w:t>
+            </w:r>
+            <w:proofErr w:type="gramStart"/>
+            <w:r>
+              <w:rPr>
+                <w:rFonts w:ascii="Times New Roman" w:eastAsiaTheme="minorEastAsia" w:hAnsi="Times New Roman" w:cs="Times New Roman"/>
+                <w:sz w:val="26"/>
+                <w:szCs w:val="26"/>
+              </w:rPr>
+              <w:t>) }</w:t>
+            </w:r>
+            <w:proofErr w:type="gramEnd"/>
+            <w:r>
+              <w:rPr>
+                <w:rFonts w:ascii="Times New Roman" w:eastAsiaTheme="minorEastAsia" w:hAnsi="Times New Roman" w:cs="Times New Roman"/>
+                <w:sz w:val="26"/>
+                <w:szCs w:val="26"/>
+              </w:rPr>
+              <w:t>}</w:t>
             </w:r>
           </w:p>
           <w:p>
@@ -4279,6 +5414,7 @@
                 <w:lang w:val="en-BE"/>
               </w:rPr>
             </w:pPr>
+            <w:proofErr w:type="gramStart"/>
             <w:r>
               <w:rPr>
                 <w:rFonts w:ascii="Times New Roman" w:eastAsiaTheme="minorEastAsia" w:hAnsi="Times New Roman" w:cs="Times New Roman"/>
@@ -4294,7 +5430,25 @@
                 <w:sz w:val="26"/>
                 <w:szCs w:val="26"/>
               </w:rPr>
-              <w:t>connections|default</w:t>
+              <w:t>connections</w:t>
+            </w:r>
+            <w:proofErr w:type="gramEnd"/>
+            <w:r>
+              <w:rPr>
+                <w:rFonts w:ascii="Times New Roman" w:eastAsiaTheme="minorEastAsia" w:hAnsi="Times New Roman" w:cs="Times New Roman"/>
+                <w:sz w:val="26"/>
+                <w:szCs w:val="26"/>
+              </w:rPr>
+              <w:t>|</w:t>
+            </w:r>
+            <w:proofErr w:type="gramStart"/>
+            <w:r>
+              <w:rPr>
+                <w:rFonts w:ascii="Times New Roman" w:eastAsiaTheme="minorEastAsia" w:hAnsi="Times New Roman" w:cs="Times New Roman"/>
+                <w:sz w:val="26"/>
+                <w:szCs w:val="26"/>
+              </w:rPr>
+              <w:t>default</w:t>
             </w:r>
             <w:proofErr w:type="spellEnd"/>
             <w:r>
@@ -4303,7 +5457,34 @@
                 <w:sz w:val="26"/>
                 <w:szCs w:val="26"/>
               </w:rPr>
-              <w:t>('') }}</w:t>
+              <w:t>(</w:t>
+            </w:r>
+            <w:proofErr w:type="gramEnd"/>
+            <w:r>
+              <w:rPr>
+                <w:rFonts w:ascii="Times New Roman" w:eastAsiaTheme="minorEastAsia" w:hAnsi="Times New Roman" w:cs="Times New Roman"/>
+                <w:sz w:val="26"/>
+                <w:szCs w:val="26"/>
+              </w:rPr>
+              <w:t>''</w:t>
+            </w:r>
+            <w:proofErr w:type="gramStart"/>
+            <w:r>
+              <w:rPr>
+                <w:rFonts w:ascii="Times New Roman" w:eastAsiaTheme="minorEastAsia" w:hAnsi="Times New Roman" w:cs="Times New Roman"/>
+                <w:sz w:val="26"/>
+                <w:szCs w:val="26"/>
+              </w:rPr>
+              <w:t>) }</w:t>
+            </w:r>
+            <w:proofErr w:type="gramEnd"/>
+            <w:r>
+              <w:rPr>
+                <w:rFonts w:ascii="Times New Roman" w:eastAsiaTheme="minorEastAsia" w:hAnsi="Times New Roman" w:cs="Times New Roman"/>
+                <w:sz w:val="26"/>
+                <w:szCs w:val="26"/>
+              </w:rPr>
+              <w:t>}</w:t>
             </w:r>
           </w:p>
           <w:p>
@@ -4611,7 +5792,16 @@
                 <w:szCs w:val="26"/>
               </w:rPr>
               <w:lastRenderedPageBreak/>
-              <w:t xml:space="preserve">Charging status: {{ </w:t>
+              <w:t xml:space="preserve">Charging status: </w:t>
+            </w:r>
+            <w:proofErr w:type="gramStart"/>
+            <w:r>
+              <w:rPr>
+                <w:rFonts w:ascii="Times New Roman" w:hAnsi="Times New Roman" w:cs="Times New Roman"/>
+                <w:sz w:val="26"/>
+                <w:szCs w:val="26"/>
+              </w:rPr>
+              <w:t xml:space="preserve">{{ </w:t>
             </w:r>
             <w:proofErr w:type="spellStart"/>
             <w:r>
@@ -4620,7 +5810,25 @@
                 <w:sz w:val="26"/>
                 <w:szCs w:val="26"/>
               </w:rPr>
-              <w:t>charging_status|default</w:t>
+              <w:t>charging</w:t>
+            </w:r>
+            <w:proofErr w:type="gramEnd"/>
+            <w:r>
+              <w:rPr>
+                <w:rFonts w:ascii="Times New Roman" w:hAnsi="Times New Roman" w:cs="Times New Roman"/>
+                <w:sz w:val="26"/>
+                <w:szCs w:val="26"/>
+              </w:rPr>
+              <w:t>_status|</w:t>
+            </w:r>
+            <w:proofErr w:type="gramStart"/>
+            <w:r>
+              <w:rPr>
+                <w:rFonts w:ascii="Times New Roman" w:hAnsi="Times New Roman" w:cs="Times New Roman"/>
+                <w:sz w:val="26"/>
+                <w:szCs w:val="26"/>
+              </w:rPr>
+              <w:t>default</w:t>
             </w:r>
             <w:proofErr w:type="spellEnd"/>
             <w:r>
@@ -4629,7 +5837,16 @@
                 <w:sz w:val="26"/>
                 <w:szCs w:val="26"/>
               </w:rPr>
-              <w:t>('') }}</w:t>
+              <w:t>(</w:t>
+            </w:r>
+            <w:proofErr w:type="gramEnd"/>
+            <w:r>
+              <w:rPr>
+                <w:rFonts w:ascii="Times New Roman" w:hAnsi="Times New Roman" w:cs="Times New Roman"/>
+                <w:sz w:val="26"/>
+                <w:szCs w:val="26"/>
+              </w:rPr>
+              <w:t>'') }}</w:t>
             </w:r>
             <w:r>
               <w:rPr>
@@ -4638,7 +5855,16 @@
                 <w:szCs w:val="26"/>
               </w:rPr>
               <w:br/>
-              <w:t xml:space="preserve">Parking area: {{ </w:t>
+              <w:t xml:space="preserve">Parking area: </w:t>
+            </w:r>
+            <w:proofErr w:type="gramStart"/>
+            <w:r>
+              <w:rPr>
+                <w:rFonts w:ascii="Times New Roman" w:hAnsi="Times New Roman" w:cs="Times New Roman"/>
+                <w:sz w:val="26"/>
+                <w:szCs w:val="26"/>
+              </w:rPr>
+              <w:t xml:space="preserve">{{ </w:t>
             </w:r>
             <w:proofErr w:type="spellStart"/>
             <w:r>
@@ -4647,7 +5873,25 @@
                 <w:sz w:val="26"/>
                 <w:szCs w:val="26"/>
               </w:rPr>
-              <w:t>parking_area|default</w:t>
+              <w:t>parking</w:t>
+            </w:r>
+            <w:proofErr w:type="gramEnd"/>
+            <w:r>
+              <w:rPr>
+                <w:rFonts w:ascii="Times New Roman" w:hAnsi="Times New Roman" w:cs="Times New Roman"/>
+                <w:sz w:val="26"/>
+                <w:szCs w:val="26"/>
+              </w:rPr>
+              <w:t>_area|</w:t>
+            </w:r>
+            <w:proofErr w:type="gramStart"/>
+            <w:r>
+              <w:rPr>
+                <w:rFonts w:ascii="Times New Roman" w:hAnsi="Times New Roman" w:cs="Times New Roman"/>
+                <w:sz w:val="26"/>
+                <w:szCs w:val="26"/>
+              </w:rPr>
+              <w:t>default</w:t>
             </w:r>
             <w:proofErr w:type="spellEnd"/>
             <w:r>
@@ -4656,15 +5900,42 @@
                 <w:sz w:val="26"/>
                 <w:szCs w:val="26"/>
               </w:rPr>
-              <w:t>('') }}</w:t>
-            </w:r>
-            <w:r>
-              <w:rPr>
-                <w:rFonts w:ascii="Times New Roman" w:hAnsi="Times New Roman" w:cs="Times New Roman"/>
-                <w:sz w:val="26"/>
-                <w:szCs w:val="26"/>
-              </w:rPr>
-              <w:t xml:space="preserve">Charging </w:t>
+              <w:t>(</w:t>
+            </w:r>
+            <w:proofErr w:type="gramEnd"/>
+            <w:r>
+              <w:rPr>
+                <w:rFonts w:ascii="Times New Roman" w:hAnsi="Times New Roman" w:cs="Times New Roman"/>
+                <w:sz w:val="26"/>
+                <w:szCs w:val="26"/>
+              </w:rPr>
+              <w:t>''</w:t>
+            </w:r>
+            <w:proofErr w:type="gramStart"/>
+            <w:r>
+              <w:rPr>
+                <w:rFonts w:ascii="Times New Roman" w:hAnsi="Times New Roman" w:cs="Times New Roman"/>
+                <w:sz w:val="26"/>
+                <w:szCs w:val="26"/>
+              </w:rPr>
+              <w:t>) }}</w:t>
+            </w:r>
+            <w:r>
+              <w:rPr>
+                <w:rFonts w:ascii="Times New Roman" w:hAnsi="Times New Roman" w:cs="Times New Roman"/>
+                <w:sz w:val="26"/>
+                <w:szCs w:val="26"/>
+              </w:rPr>
+              <w:t>Charging</w:t>
+            </w:r>
+            <w:proofErr w:type="gramEnd"/>
+            <w:r>
+              <w:rPr>
+                <w:rFonts w:ascii="Times New Roman" w:hAnsi="Times New Roman" w:cs="Times New Roman"/>
+                <w:sz w:val="26"/>
+                <w:szCs w:val="26"/>
+              </w:rPr>
+              <w:t xml:space="preserve"> </w:t>
             </w:r>
           </w:p>
         </w:tc>
@@ -4836,7 +6107,27 @@
                 <w:szCs w:val="26"/>
                 <w:lang w:val="en-BE"/>
               </w:rPr>
-              <w:t>|default(‘‘)</w:t>
+              <w:t>|</w:t>
+            </w:r>
+            <w:proofErr w:type="gramStart"/>
+            <w:r>
+              <w:rPr>
+                <w:rFonts w:ascii="Times New Roman" w:eastAsiaTheme="minorEastAsia" w:hAnsi="Times New Roman" w:cs="Times New Roman"/>
+                <w:sz w:val="26"/>
+                <w:szCs w:val="26"/>
+                <w:lang w:val="en-BE"/>
+              </w:rPr>
+              <w:t>default(</w:t>
+            </w:r>
+            <w:proofErr w:type="gramEnd"/>
+            <w:r>
+              <w:rPr>
+                <w:rFonts w:ascii="Times New Roman" w:eastAsiaTheme="minorEastAsia" w:hAnsi="Times New Roman" w:cs="Times New Roman"/>
+                <w:sz w:val="26"/>
+                <w:szCs w:val="26"/>
+                <w:lang w:val="en-BE"/>
+              </w:rPr>
+              <w:t>‘‘)</w:t>
             </w:r>
             <w:r>
               <w:rPr>
@@ -4980,6 +6271,15 @@
                 <w:sz w:val="26"/>
                 <w:szCs w:val="26"/>
               </w:rPr>
+              <w:t>System architecture:</w:t>
+            </w:r>
+            <w:r>
+              <w:rPr>
+                <w:rFonts w:ascii="Times New Roman" w:hAnsi="Times New Roman" w:cs="Times New Roman"/>
+                <w:sz w:val="26"/>
+                <w:szCs w:val="26"/>
+              </w:rPr>
+              <w:br/>
               <w:t xml:space="preserve">{{ </w:t>
             </w:r>
             <w:proofErr w:type="spellStart"/>
@@ -4989,7 +6289,7 @@
                 <w:sz w:val="26"/>
                 <w:szCs w:val="26"/>
               </w:rPr>
-              <w:t>data_flow_text|default</w:t>
+              <w:t>system_architecture_text|default</w:t>
             </w:r>
             <w:proofErr w:type="spellEnd"/>
             <w:r>
@@ -5000,22 +6300,338 @@
               </w:rPr>
               <w:t>('') }}</w:t>
             </w:r>
-          </w:p>
-          <w:p>
-            <w:pPr>
-              <w:jc w:val="left"/>
-              <w:rPr>
-                <w:rFonts w:ascii="Times New Roman" w:hAnsi="Times New Roman" w:cs="Times New Roman"/>
-                <w:sz w:val="26"/>
-                <w:szCs w:val="26"/>
-              </w:rPr>
-            </w:pPr>
-            <w:r>
-              <w:rPr>
-                <w:rFonts w:ascii="Times New Roman" w:hAnsi="Times New Roman" w:cs="Times New Roman"/>
-                <w:sz w:val="26"/>
-                <w:szCs w:val="26"/>
-              </w:rPr>
+            <w:r>
+              <w:rPr>
+                <w:rFonts w:ascii="Times New Roman" w:hAnsi="Times New Roman" w:cs="Times New Roman"/>
+                <w:sz w:val="26"/>
+                <w:szCs w:val="26"/>
+              </w:rPr>
+              <w:br/>
+            </w:r>
+            <w:r>
+              <w:rPr>
+                <w:rFonts w:ascii="Times New Roman" w:hAnsi="Times New Roman" w:cs="Times New Roman"/>
+                <w:sz w:val="26"/>
+                <w:szCs w:val="26"/>
+              </w:rPr>
+              <w:br/>
+              <w:t>Overall integration route:</w:t>
+            </w:r>
+            <w:r>
+              <w:rPr>
+                <w:rFonts w:ascii="Times New Roman" w:hAnsi="Times New Roman" w:cs="Times New Roman"/>
+                <w:sz w:val="26"/>
+                <w:szCs w:val="26"/>
+              </w:rPr>
+              <w:br/>
+              <w:t xml:space="preserve">{{ </w:t>
+            </w:r>
+            <w:proofErr w:type="spellStart"/>
+            <w:r>
+              <w:rPr>
+                <w:rFonts w:ascii="Times New Roman" w:hAnsi="Times New Roman" w:cs="Times New Roman"/>
+                <w:sz w:val="26"/>
+                <w:szCs w:val="26"/>
+              </w:rPr>
+              <w:t>integration_route_text|default</w:t>
+            </w:r>
+            <w:proofErr w:type="spellEnd"/>
+            <w:r>
+              <w:rPr>
+                <w:rFonts w:ascii="Times New Roman" w:hAnsi="Times New Roman" w:cs="Times New Roman"/>
+                <w:sz w:val="26"/>
+                <w:szCs w:val="26"/>
+              </w:rPr>
+              <w:t>('') }}</w:t>
+            </w:r>
+            <w:r>
+              <w:rPr>
+                <w:rFonts w:ascii="Times New Roman" w:hAnsi="Times New Roman" w:cs="Times New Roman"/>
+                <w:sz w:val="26"/>
+                <w:szCs w:val="26"/>
+              </w:rPr>
+              <w:br/>
+            </w:r>
+            <w:r>
+              <w:rPr>
+                <w:rFonts w:ascii="Times New Roman" w:hAnsi="Times New Roman" w:cs="Times New Roman"/>
+                <w:sz w:val="26"/>
+                <w:szCs w:val="26"/>
+              </w:rPr>
+              <w:br/>
+              <w:t>System flow diagram / path:</w:t>
+            </w:r>
+            <w:r>
+              <w:rPr>
+                <w:rFonts w:ascii="Times New Roman" w:hAnsi="Times New Roman" w:cs="Times New Roman"/>
+                <w:sz w:val="26"/>
+                <w:szCs w:val="26"/>
+              </w:rPr>
+              <w:br/>
+              <w:t xml:space="preserve">{{ </w:t>
+            </w:r>
+            <w:proofErr w:type="spellStart"/>
+            <w:r>
+              <w:rPr>
+                <w:rFonts w:ascii="Times New Roman" w:hAnsi="Times New Roman" w:cs="Times New Roman"/>
+                <w:sz w:val="26"/>
+                <w:szCs w:val="26"/>
+              </w:rPr>
+              <w:t>data_flow_diagram_text|default</w:t>
+            </w:r>
+            <w:proofErr w:type="spellEnd"/>
+            <w:r>
+              <w:rPr>
+                <w:rFonts w:ascii="Times New Roman" w:hAnsi="Times New Roman" w:cs="Times New Roman"/>
+                <w:sz w:val="26"/>
+                <w:szCs w:val="26"/>
+              </w:rPr>
+              <w:t>('') }}</w:t>
+            </w:r>
+            <w:r>
+              <w:rPr>
+                <w:rFonts w:ascii="Times New Roman" w:hAnsi="Times New Roman" w:cs="Times New Roman"/>
+                <w:sz w:val="26"/>
+                <w:szCs w:val="26"/>
+              </w:rPr>
+              <w:br/>
+            </w:r>
+            <w:r>
+              <w:rPr>
+                <w:rFonts w:ascii="Times New Roman" w:hAnsi="Times New Roman" w:cs="Times New Roman"/>
+                <w:sz w:val="26"/>
+                <w:szCs w:val="26"/>
+              </w:rPr>
+              <w:br/>
+              <w:t>Task flow by process:</w:t>
+            </w:r>
+            <w:r>
+              <w:rPr>
+                <w:rFonts w:ascii="Times New Roman" w:hAnsi="Times New Roman" w:cs="Times New Roman"/>
+                <w:sz w:val="26"/>
+                <w:szCs w:val="26"/>
+              </w:rPr>
+              <w:br/>
+              <w:t xml:space="preserve">{{ </w:t>
+            </w:r>
+            <w:proofErr w:type="spellStart"/>
+            <w:r>
+              <w:rPr>
+                <w:rFonts w:ascii="Times New Roman" w:hAnsi="Times New Roman" w:cs="Times New Roman"/>
+                <w:sz w:val="26"/>
+                <w:szCs w:val="26"/>
+              </w:rPr>
+              <w:t>task_flow_text|default</w:t>
+            </w:r>
+            <w:proofErr w:type="spellEnd"/>
+            <w:r>
+              <w:rPr>
+                <w:rFonts w:ascii="Times New Roman" w:hAnsi="Times New Roman" w:cs="Times New Roman"/>
+                <w:sz w:val="26"/>
+                <w:szCs w:val="26"/>
+              </w:rPr>
+              <w:t>('') }}</w:t>
+            </w:r>
+            <w:r>
+              <w:rPr>
+                <w:rFonts w:ascii="Times New Roman" w:hAnsi="Times New Roman" w:cs="Times New Roman"/>
+                <w:sz w:val="26"/>
+                <w:szCs w:val="26"/>
+              </w:rPr>
+              <w:br/>
+            </w:r>
+            <w:r>
+              <w:rPr>
+                <w:rFonts w:ascii="Times New Roman" w:hAnsi="Times New Roman" w:cs="Times New Roman"/>
+                <w:sz w:val="26"/>
+                <w:szCs w:val="26"/>
+              </w:rPr>
+              <w:br/>
+              <w:t>Connected systems:</w:t>
+            </w:r>
+            <w:r>
+              <w:rPr>
+                <w:rFonts w:ascii="Times New Roman" w:hAnsi="Times New Roman" w:cs="Times New Roman"/>
+                <w:sz w:val="26"/>
+                <w:szCs w:val="26"/>
+              </w:rPr>
+              <w:br/>
+              <w:t xml:space="preserve">{{ </w:t>
+            </w:r>
+            <w:proofErr w:type="spellStart"/>
+            <w:r>
+              <w:rPr>
+                <w:rFonts w:ascii="Times New Roman" w:hAnsi="Times New Roman" w:cs="Times New Roman"/>
+                <w:sz w:val="26"/>
+                <w:szCs w:val="26"/>
+              </w:rPr>
+              <w:t>connected_systems_text|default</w:t>
+            </w:r>
+            <w:proofErr w:type="spellEnd"/>
+            <w:r>
+              <w:rPr>
+                <w:rFonts w:ascii="Times New Roman" w:hAnsi="Times New Roman" w:cs="Times New Roman"/>
+                <w:sz w:val="26"/>
+                <w:szCs w:val="26"/>
+              </w:rPr>
+              <w:t>('') }}</w:t>
+            </w:r>
+            <w:r>
+              <w:rPr>
+                <w:rFonts w:ascii="Times New Roman" w:hAnsi="Times New Roman" w:cs="Times New Roman"/>
+                <w:sz w:val="26"/>
+                <w:szCs w:val="26"/>
+              </w:rPr>
+              <w:br/>
+            </w:r>
+            <w:r>
+              <w:rPr>
+                <w:rFonts w:ascii="Times New Roman" w:hAnsi="Times New Roman" w:cs="Times New Roman"/>
+                <w:sz w:val="26"/>
+                <w:szCs w:val="26"/>
+              </w:rPr>
+              <w:br/>
+              <w:t>Status feedback returned by EP:</w:t>
+            </w:r>
+            <w:r>
+              <w:rPr>
+                <w:rFonts w:ascii="Times New Roman" w:hAnsi="Times New Roman" w:cs="Times New Roman"/>
+                <w:sz w:val="26"/>
+                <w:szCs w:val="26"/>
+              </w:rPr>
+              <w:br/>
+              <w:t xml:space="preserve">{{ </w:t>
+            </w:r>
+            <w:proofErr w:type="spellStart"/>
+            <w:r>
+              <w:rPr>
+                <w:rFonts w:ascii="Times New Roman" w:hAnsi="Times New Roman" w:cs="Times New Roman"/>
+                <w:sz w:val="26"/>
+                <w:szCs w:val="26"/>
+              </w:rPr>
+              <w:t>status_feedback_text|default</w:t>
+            </w:r>
+            <w:proofErr w:type="spellEnd"/>
+            <w:r>
+              <w:rPr>
+                <w:rFonts w:ascii="Times New Roman" w:hAnsi="Times New Roman" w:cs="Times New Roman"/>
+                <w:sz w:val="26"/>
+                <w:szCs w:val="26"/>
+              </w:rPr>
+              <w:t>('') }}</w:t>
+            </w:r>
+            <w:r>
+              <w:rPr>
+                <w:rFonts w:ascii="Times New Roman" w:hAnsi="Times New Roman" w:cs="Times New Roman"/>
+                <w:sz w:val="26"/>
+                <w:szCs w:val="26"/>
+              </w:rPr>
+              <w:br/>
+            </w:r>
+            <w:r>
+              <w:rPr>
+                <w:rFonts w:ascii="Times New Roman" w:hAnsi="Times New Roman" w:cs="Times New Roman"/>
+                <w:sz w:val="26"/>
+                <w:szCs w:val="26"/>
+              </w:rPr>
+              <w:br/>
+              <w:t>Key data exchanged:</w:t>
+            </w:r>
+            <w:r>
+              <w:rPr>
+                <w:rFonts w:ascii="Times New Roman" w:hAnsi="Times New Roman" w:cs="Times New Roman"/>
+                <w:sz w:val="26"/>
+                <w:szCs w:val="26"/>
+              </w:rPr>
+              <w:br/>
+              <w:t xml:space="preserve">{{ </w:t>
+            </w:r>
+            <w:proofErr w:type="spellStart"/>
+            <w:r>
+              <w:rPr>
+                <w:rFonts w:ascii="Times New Roman" w:hAnsi="Times New Roman" w:cs="Times New Roman"/>
+                <w:sz w:val="26"/>
+                <w:szCs w:val="26"/>
+              </w:rPr>
+              <w:t>key_data_exchange_text|default</w:t>
+            </w:r>
+            <w:proofErr w:type="spellEnd"/>
+            <w:r>
+              <w:rPr>
+                <w:rFonts w:ascii="Times New Roman" w:hAnsi="Times New Roman" w:cs="Times New Roman"/>
+                <w:sz w:val="26"/>
+                <w:szCs w:val="26"/>
+              </w:rPr>
+              <w:t>('') }}</w:t>
+            </w:r>
+            <w:r>
+              <w:rPr>
+                <w:rFonts w:ascii="Times New Roman" w:hAnsi="Times New Roman" w:cs="Times New Roman"/>
+                <w:sz w:val="26"/>
+                <w:szCs w:val="26"/>
+              </w:rPr>
+              <w:br/>
+            </w:r>
+            <w:r>
+              <w:rPr>
+                <w:rFonts w:ascii="Times New Roman" w:hAnsi="Times New Roman" w:cs="Times New Roman"/>
+                <w:sz w:val="26"/>
+                <w:szCs w:val="26"/>
+              </w:rPr>
+              <w:br/>
+              <w:t>Connection / interface details:</w:t>
+            </w:r>
+            <w:r>
+              <w:rPr>
+                <w:rFonts w:ascii="Times New Roman" w:hAnsi="Times New Roman" w:cs="Times New Roman"/>
+                <w:sz w:val="26"/>
+                <w:szCs w:val="26"/>
+              </w:rPr>
+              <w:br/>
+              <w:t xml:space="preserve">{{ </w:t>
+            </w:r>
+            <w:proofErr w:type="spellStart"/>
+            <w:r>
+              <w:rPr>
+                <w:rFonts w:ascii="Times New Roman" w:hAnsi="Times New Roman" w:cs="Times New Roman"/>
+                <w:sz w:val="26"/>
+                <w:szCs w:val="26"/>
+              </w:rPr>
+              <w:t>connections_details|default</w:t>
+            </w:r>
+            <w:proofErr w:type="spellEnd"/>
+            <w:r>
+              <w:rPr>
+                <w:rFonts w:ascii="Times New Roman" w:hAnsi="Times New Roman" w:cs="Times New Roman"/>
+                <w:sz w:val="26"/>
+                <w:szCs w:val="26"/>
+              </w:rPr>
+              <w:t>('') }}</w:t>
+            </w:r>
+            <w:r>
+              <w:rPr>
+                <w:rFonts w:ascii="Times New Roman" w:hAnsi="Times New Roman" w:cs="Times New Roman"/>
+                <w:sz w:val="26"/>
+                <w:szCs w:val="26"/>
+              </w:rPr>
+              <w:br/>
+            </w:r>
+            <w:r>
+              <w:rPr>
+                <w:rFonts w:ascii="Times New Roman" w:hAnsi="Times New Roman" w:cs="Times New Roman"/>
+                <w:sz w:val="26"/>
+                <w:szCs w:val="26"/>
+              </w:rPr>
+              <w:br/>
+              <w:t>Additional notes:</w:t>
+            </w:r>
+            <w:r>
+              <w:rPr>
+                <w:rFonts w:ascii="Times New Roman" w:hAnsi="Times New Roman" w:cs="Times New Roman"/>
+                <w:sz w:val="26"/>
+                <w:szCs w:val="26"/>
+              </w:rPr>
+              <w:br/>
               <w:t xml:space="preserve">{{ </w:t>
             </w:r>
             <w:proofErr w:type="spellStart"/>
@@ -5171,6 +6787,7 @@
                 <w:szCs w:val="26"/>
               </w:rPr>
             </w:pPr>
+            <w:proofErr w:type="gramStart"/>
             <w:r>
               <w:rPr>
                 <w:rFonts w:ascii="Times New Roman" w:hAnsi="Times New Roman" w:cs="Times New Roman"/>
@@ -5186,7 +6803,25 @@
                 <w:sz w:val="26"/>
                 <w:szCs w:val="26"/>
               </w:rPr>
-              <w:t>other_agvs|default</w:t>
+              <w:t>other</w:t>
+            </w:r>
+            <w:proofErr w:type="gramEnd"/>
+            <w:r>
+              <w:rPr>
+                <w:rFonts w:ascii="Times New Roman" w:hAnsi="Times New Roman" w:cs="Times New Roman"/>
+                <w:sz w:val="26"/>
+                <w:szCs w:val="26"/>
+              </w:rPr>
+              <w:t>_agvs|</w:t>
+            </w:r>
+            <w:proofErr w:type="gramStart"/>
+            <w:r>
+              <w:rPr>
+                <w:rFonts w:ascii="Times New Roman" w:hAnsi="Times New Roman" w:cs="Times New Roman"/>
+                <w:sz w:val="26"/>
+                <w:szCs w:val="26"/>
+              </w:rPr>
+              <w:t>default</w:t>
             </w:r>
             <w:proofErr w:type="spellEnd"/>
             <w:r>
@@ -5195,7 +6830,16 @@
                 <w:sz w:val="26"/>
                 <w:szCs w:val="26"/>
               </w:rPr>
-              <w:t>('') }}</w:t>
+              <w:t>(</w:t>
+            </w:r>
+            <w:proofErr w:type="gramEnd"/>
+            <w:r>
+              <w:rPr>
+                <w:rFonts w:ascii="Times New Roman" w:hAnsi="Times New Roman" w:cs="Times New Roman"/>
+                <w:sz w:val="26"/>
+                <w:szCs w:val="26"/>
+              </w:rPr>
+              <w:t>'') }}</w:t>
             </w:r>
             <w:r>
               <w:rPr>
@@ -5205,6 +6849,7 @@
               </w:rPr>
               <w:br/>
             </w:r>
+            <w:proofErr w:type="gramStart"/>
             <w:r>
               <w:rPr>
                 <w:rFonts w:ascii="Times New Roman" w:hAnsi="Times New Roman" w:cs="Times New Roman"/>
@@ -5220,7 +6865,25 @@
                 <w:sz w:val="26"/>
                 <w:szCs w:val="26"/>
               </w:rPr>
-              <w:t>other_traffic|default</w:t>
+              <w:t>other</w:t>
+            </w:r>
+            <w:proofErr w:type="gramEnd"/>
+            <w:r>
+              <w:rPr>
+                <w:rFonts w:ascii="Times New Roman" w:hAnsi="Times New Roman" w:cs="Times New Roman"/>
+                <w:sz w:val="26"/>
+                <w:szCs w:val="26"/>
+              </w:rPr>
+              <w:t>_traffic|</w:t>
+            </w:r>
+            <w:proofErr w:type="gramStart"/>
+            <w:r>
+              <w:rPr>
+                <w:rFonts w:ascii="Times New Roman" w:hAnsi="Times New Roman" w:cs="Times New Roman"/>
+                <w:sz w:val="26"/>
+                <w:szCs w:val="26"/>
+              </w:rPr>
+              <w:t>default</w:t>
             </w:r>
             <w:proofErr w:type="spellEnd"/>
             <w:r>
@@ -5229,19 +6892,47 @@
                 <w:sz w:val="26"/>
                 <w:szCs w:val="26"/>
               </w:rPr>
-              <w:t>('') }}</w:t>
-            </w:r>
-          </w:p>
-          <w:p>
-            <w:pPr>
-              <w:spacing w:line="240" w:lineRule="auto"/>
-              <w:jc w:val="left"/>
-              <w:rPr>
-                <w:rFonts w:ascii="Times New Roman" w:hAnsi="Times New Roman" w:cs="Times New Roman"/>
-                <w:sz w:val="26"/>
-                <w:szCs w:val="26"/>
-              </w:rPr>
-            </w:pPr>
+              <w:t>(</w:t>
+            </w:r>
+            <w:proofErr w:type="gramEnd"/>
+            <w:r>
+              <w:rPr>
+                <w:rFonts w:ascii="Times New Roman" w:hAnsi="Times New Roman" w:cs="Times New Roman"/>
+                <w:sz w:val="26"/>
+                <w:szCs w:val="26"/>
+              </w:rPr>
+              <w:t>''</w:t>
+            </w:r>
+            <w:proofErr w:type="gramStart"/>
+            <w:r>
+              <w:rPr>
+                <w:rFonts w:ascii="Times New Roman" w:hAnsi="Times New Roman" w:cs="Times New Roman"/>
+                <w:sz w:val="26"/>
+                <w:szCs w:val="26"/>
+              </w:rPr>
+              <w:t>) }</w:t>
+            </w:r>
+            <w:proofErr w:type="gramEnd"/>
+            <w:r>
+              <w:rPr>
+                <w:rFonts w:ascii="Times New Roman" w:hAnsi="Times New Roman" w:cs="Times New Roman"/>
+                <w:sz w:val="26"/>
+                <w:szCs w:val="26"/>
+              </w:rPr>
+              <w:t>}</w:t>
+            </w:r>
+          </w:p>
+          <w:p>
+            <w:pPr>
+              <w:spacing w:line="240" w:lineRule="auto"/>
+              <w:jc w:val="left"/>
+              <w:rPr>
+                <w:rFonts w:ascii="Times New Roman" w:hAnsi="Times New Roman" w:cs="Times New Roman"/>
+                <w:sz w:val="26"/>
+                <w:szCs w:val="26"/>
+              </w:rPr>
+            </w:pPr>
+            <w:proofErr w:type="gramStart"/>
             <w:r>
               <w:rPr>
                 <w:rFonts w:ascii="Times New Roman" w:hAnsi="Times New Roman" w:cs="Times New Roman"/>
@@ -5257,7 +6948,25 @@
                 <w:sz w:val="26"/>
                 <w:szCs w:val="26"/>
               </w:rPr>
-              <w:t>ground_gaps_text|default</w:t>
+              <w:t>ground</w:t>
+            </w:r>
+            <w:proofErr w:type="gramEnd"/>
+            <w:r>
+              <w:rPr>
+                <w:rFonts w:ascii="Times New Roman" w:hAnsi="Times New Roman" w:cs="Times New Roman"/>
+                <w:sz w:val="26"/>
+                <w:szCs w:val="26"/>
+              </w:rPr>
+              <w:t>_gaps_text|</w:t>
+            </w:r>
+            <w:proofErr w:type="gramStart"/>
+            <w:r>
+              <w:rPr>
+                <w:rFonts w:ascii="Times New Roman" w:hAnsi="Times New Roman" w:cs="Times New Roman"/>
+                <w:sz w:val="26"/>
+                <w:szCs w:val="26"/>
+              </w:rPr>
+              <w:t>default</w:t>
             </w:r>
             <w:proofErr w:type="spellEnd"/>
             <w:r>
@@ -5266,7 +6975,16 @@
                 <w:sz w:val="26"/>
                 <w:szCs w:val="26"/>
               </w:rPr>
-              <w:t>('') }}</w:t>
+              <w:t>(</w:t>
+            </w:r>
+            <w:proofErr w:type="gramEnd"/>
+            <w:r>
+              <w:rPr>
+                <w:rFonts w:ascii="Times New Roman" w:hAnsi="Times New Roman" w:cs="Times New Roman"/>
+                <w:sz w:val="26"/>
+                <w:szCs w:val="26"/>
+              </w:rPr>
+              <w:t>'') }}</w:t>
             </w:r>
           </w:p>
         </w:tc>
@@ -5304,7 +7022,7 @@
                 <w:sz w:val="22"/>
                 <w:szCs w:val="22"/>
               </w:rPr>
-              <w:t>Specifications and quantities of products to be used</w:t>
+              <w:t xml:space="preserve">Specifications </w:t>
             </w:r>
             <w:r>
               <w:rPr>
@@ -5314,6 +7032,17 @@
                 <w:sz w:val="22"/>
                 <w:szCs w:val="22"/>
               </w:rPr>
+              <w:lastRenderedPageBreak/>
+              <w:t>and quantities of products to be used</w:t>
+            </w:r>
+            <w:r>
+              <w:rPr>
+                <w:rFonts w:ascii="Times New Roman" w:eastAsiaTheme="minorEastAsia" w:hAnsi="Times New Roman" w:cs="Times New Roman"/>
+                <w:b/>
+                <w:bCs/>
+                <w:sz w:val="22"/>
+                <w:szCs w:val="22"/>
+              </w:rPr>
               <w:t>：</w:t>
             </w:r>
           </w:p>
@@ -5341,6 +7070,7 @@
                 <w:sz w:val="22"/>
                 <w:szCs w:val="22"/>
               </w:rPr>
+              <w:lastRenderedPageBreak/>
               <w:t>Specifications</w:t>
             </w:r>
             <w:r>
@@ -6517,16 +8247,7 @@
                 <w:sz w:val="22"/>
                 <w:szCs w:val="22"/>
               </w:rPr>
-              <w:t>Sales representati</w:t>
-            </w:r>
-            <w:r>
-              <w:rPr>
-                <w:rFonts w:ascii="Times New Roman" w:eastAsiaTheme="minorEastAsia" w:hAnsi="Times New Roman" w:cs="Times New Roman"/>
-                <w:sz w:val="22"/>
-                <w:szCs w:val="22"/>
-              </w:rPr>
-              <w:lastRenderedPageBreak/>
-              <w:t>ves</w:t>
+              <w:t>Sales representatives</w:t>
             </w:r>
           </w:p>
         </w:tc>
@@ -9680,15 +11401,30 @@
 </file>
 
 <file path=customXml/item1.xml><?xml version="1.0" encoding="utf-8"?>
-<s:customData xmlns="http://www.wps.cn/officeDocument/2013/wpsCustomData" xmlns:s="http://www.wps.cn/officeDocument/2013/wpsCustomData">
-  <customSectProps/>
-  <customShpExts>
-    <customShpInfo spid="_x0000_s1026" textRotate="1"/>
-  </customShpExts>
-</s:customData>
+<b:Sources xmlns:b="http://schemas.openxmlformats.org/officeDocument/2006/bibliography" xmlns="http://schemas.openxmlformats.org/officeDocument/2006/bibliography" SelectedStyle="\APASixthEditionOfficeOnline.xsl" StyleName="APA" Version="6"/>
 </file>
 
 <file path=customXml/item2.xml><?xml version="1.0" encoding="utf-8"?>
+<p:properties xmlns:p="http://schemas.microsoft.com/office/2006/metadata/properties" xmlns:xsi="http://www.w3.org/2001/XMLSchema-instance" xmlns:pc="http://schemas.microsoft.com/office/infopath/2007/PartnerControls">
+  <documentManagement>
+    <lcf76f155ced4ddcb4097134ff3c332f xmlns="bbceff47-94a0-42cc-a34e-bab6fdf630d3">
+      <Terms xmlns="http://schemas.microsoft.com/office/infopath/2007/PartnerControls"/>
+    </lcf76f155ced4ddcb4097134ff3c332f>
+    <TaxCatchAll xmlns="076cc9d1-9a26-4384-96fc-17dbfe6fe8db" xsi:nil="true"/>
+  </documentManagement>
+</p:properties>
+</file>
+
+<file path=customXml/item3.xml><?xml version="1.0" encoding="utf-8"?>
+<?mso-contentType ?>
+<FormTemplates xmlns="http://schemas.microsoft.com/sharepoint/v3/contenttype/forms">
+  <Display>DocumentLibraryForm</Display>
+  <Edit>DocumentLibraryForm</Edit>
+  <New>DocumentLibraryForm</New>
+</FormTemplates>
+</file>
+
+<file path=customXml/item4.xml><?xml version="1.0" encoding="utf-8"?>
 <ct:contentTypeSchema xmlns:ct="http://schemas.microsoft.com/office/2006/metadata/contentType" xmlns:ma="http://schemas.microsoft.com/office/2006/metadata/properties/metaAttributes" ct:_="" ma:_="" ma:contentTypeName="Document" ma:contentTypeID="0x0101000ED1937193E6644B9910A1F8F337BE3A" ma:contentTypeVersion="15" ma:contentTypeDescription="Create a new document." ma:contentTypeScope="" ma:versionID="33d0915d951d370b6a1e09b978e628b3">
   <xsd:schema xmlns:xsd="http://www.w3.org/2001/XMLSchema" xmlns:xs="http://www.w3.org/2001/XMLSchema" xmlns:p="http://schemas.microsoft.com/office/2006/metadata/properties" xmlns:ns2="bbceff47-94a0-42cc-a34e-bab6fdf630d3" xmlns:ns3="076cc9d1-9a26-4384-96fc-17dbfe6fe8db" targetNamespace="http://schemas.microsoft.com/office/2006/metadata/properties" ma:root="true" ma:fieldsID="ca8e0581b507d7ca9a3160f88f47f0fe" ns2:_="" ns3:_="">
     <xsd:import namespace="bbceff47-94a0-42cc-a34e-bab6fdf630d3"/>
@@ -9901,39 +11637,43 @@
 </ct:contentTypeSchema>
 </file>
 
-<file path=customXml/item3.xml><?xml version="1.0" encoding="utf-8"?>
-<?mso-contentType ?>
-<FormTemplates xmlns="http://schemas.microsoft.com/sharepoint/v3/contenttype/forms">
-  <Display>DocumentLibraryForm</Display>
-  <Edit>DocumentLibraryForm</Edit>
-  <New>DocumentLibraryForm</New>
-</FormTemplates>
-</file>
-
-<file path=customXml/item4.xml><?xml version="1.0" encoding="utf-8"?>
-<p:properties xmlns:p="http://schemas.microsoft.com/office/2006/metadata/properties" xmlns:xsi="http://www.w3.org/2001/XMLSchema-instance" xmlns:pc="http://schemas.microsoft.com/office/infopath/2007/PartnerControls">
-  <documentManagement>
-    <lcf76f155ced4ddcb4097134ff3c332f xmlns="bbceff47-94a0-42cc-a34e-bab6fdf630d3">
-      <Terms xmlns="http://schemas.microsoft.com/office/infopath/2007/PartnerControls"/>
-    </lcf76f155ced4ddcb4097134ff3c332f>
-    <TaxCatchAll xmlns="076cc9d1-9a26-4384-96fc-17dbfe6fe8db" xsi:nil="true"/>
-  </documentManagement>
-</p:properties>
-</file>
-
 <file path=customXml/item5.xml><?xml version="1.0" encoding="utf-8"?>
-<b:Sources xmlns:b="http://schemas.openxmlformats.org/officeDocument/2006/bibliography" xmlns="http://schemas.openxmlformats.org/officeDocument/2006/bibliography" SelectedStyle="\APASixthEditionOfficeOnline.xsl" StyleName="APA" Version="6"/>
+<s:customData xmlns="http://www.wps.cn/officeDocument/2013/wpsCustomData" xmlns:s="http://www.wps.cn/officeDocument/2013/wpsCustomData">
+  <customSectProps/>
+  <customShpExts>
+    <customShpInfo spid="_x0000_s1026" textRotate="1"/>
+  </customShpExts>
+</s:customData>
 </file>
 
 <file path=customXml/itemProps1.xml><?xml version="1.0" encoding="utf-8"?>
-<ds:datastoreItem xmlns:ds="http://schemas.openxmlformats.org/officeDocument/2006/customXml" ds:itemID="{B1977F7D-205B-4081-913C-38D41E755F92}">
+<ds:datastoreItem xmlns:ds="http://schemas.openxmlformats.org/officeDocument/2006/customXml" ds:itemID="{1FF82357-F674-4365-859D-EF5EFE0EDCAE}">
   <ds:schemaRefs>
-    <ds:schemaRef ds:uri="http://www.wps.cn/officeDocument/2013/wpsCustomData"/>
+    <ds:schemaRef ds:uri="http://schemas.openxmlformats.org/officeDocument/2006/bibliography"/>
   </ds:schemaRefs>
 </ds:datastoreItem>
 </file>
 
 <file path=customXml/itemProps2.xml><?xml version="1.0" encoding="utf-8"?>
+<ds:datastoreItem xmlns:ds="http://schemas.openxmlformats.org/officeDocument/2006/customXml" ds:itemID="{92B58BC8-A1B8-4740-9413-5A141DF8AFAB}">
+  <ds:schemaRefs>
+    <ds:schemaRef ds:uri="http://schemas.microsoft.com/office/2006/metadata/properties"/>
+    <ds:schemaRef ds:uri="http://schemas.microsoft.com/office/infopath/2007/PartnerControls"/>
+    <ds:schemaRef ds:uri="bbceff47-94a0-42cc-a34e-bab6fdf630d3"/>
+    <ds:schemaRef ds:uri="076cc9d1-9a26-4384-96fc-17dbfe6fe8db"/>
+  </ds:schemaRefs>
+</ds:datastoreItem>
+</file>
+
+<file path=customXml/itemProps3.xml><?xml version="1.0" encoding="utf-8"?>
+<ds:datastoreItem xmlns:ds="http://schemas.openxmlformats.org/officeDocument/2006/customXml" ds:itemID="{66E6D9ED-0625-4E0B-A950-FCB28CC096CA}">
+  <ds:schemaRefs>
+    <ds:schemaRef ds:uri="http://schemas.microsoft.com/sharepoint/v3/contenttype/forms"/>
+  </ds:schemaRefs>
+</ds:datastoreItem>
+</file>
+
+<file path=customXml/itemProps4.xml><?xml version="1.0" encoding="utf-8"?>
 <ds:datastoreItem xmlns:ds="http://schemas.openxmlformats.org/officeDocument/2006/customXml" ds:itemID="{117EB414-D13B-4D74-9FFC-4E3D989A8CA2}">
   <ds:schemaRefs>
     <ds:schemaRef ds:uri="http://schemas.microsoft.com/office/2006/metadata/contentType"/>
@@ -9952,29 +11692,10 @@
 </ds:datastoreItem>
 </file>
 
-<file path=customXml/itemProps3.xml><?xml version="1.0" encoding="utf-8"?>
-<ds:datastoreItem xmlns:ds="http://schemas.openxmlformats.org/officeDocument/2006/customXml" ds:itemID="{66E6D9ED-0625-4E0B-A950-FCB28CC096CA}">
+<file path=customXml/itemProps5.xml><?xml version="1.0" encoding="utf-8"?>
+<ds:datastoreItem xmlns:ds="http://schemas.openxmlformats.org/officeDocument/2006/customXml" ds:itemID="{B1977F7D-205B-4081-913C-38D41E755F92}">
   <ds:schemaRefs>
-    <ds:schemaRef ds:uri="http://schemas.microsoft.com/sharepoint/v3/contenttype/forms"/>
-  </ds:schemaRefs>
-</ds:datastoreItem>
-</file>
-
-<file path=customXml/itemProps4.xml><?xml version="1.0" encoding="utf-8"?>
-<ds:datastoreItem xmlns:ds="http://schemas.openxmlformats.org/officeDocument/2006/customXml" ds:itemID="{92B58BC8-A1B8-4740-9413-5A141DF8AFAB}">
-  <ds:schemaRefs>
-    <ds:schemaRef ds:uri="http://schemas.microsoft.com/office/2006/metadata/properties"/>
-    <ds:schemaRef ds:uri="http://schemas.microsoft.com/office/infopath/2007/PartnerControls"/>
-    <ds:schemaRef ds:uri="bbceff47-94a0-42cc-a34e-bab6fdf630d3"/>
-    <ds:schemaRef ds:uri="076cc9d1-9a26-4384-96fc-17dbfe6fe8db"/>
-  </ds:schemaRefs>
-</ds:datastoreItem>
-</file>
-
-<file path=customXml/itemProps5.xml><?xml version="1.0" encoding="utf-8"?>
-<ds:datastoreItem xmlns:ds="http://schemas.openxmlformats.org/officeDocument/2006/customXml" ds:itemID="{1FF82357-F674-4365-859D-EF5EFE0EDCAE}">
-  <ds:schemaRefs>
-    <ds:schemaRef ds:uri="http://schemas.openxmlformats.org/officeDocument/2006/bibliography"/>
+    <ds:schemaRef ds:uri="http://www.wps.cn/officeDocument/2013/wpsCustomData"/>
   </ds:schemaRefs>
 </ds:datastoreItem>
 </file>
</xml_diff>

<commit_message>
updated the XQE &XPL layout files
</commit_message>
<xml_diff>
--- a/template.docx
+++ b/template.docx
@@ -3202,264 +3202,16 @@
             <w:vAlign w:val="center"/>
           </w:tcPr>
           <w:p>
-            <w:pPr>
-              <w:jc w:val="left"/>
-              <w:rPr>
-                <w:rFonts w:ascii="Times New Roman" w:hAnsi="Times New Roman" w:cs="Times New Roman"/>
-                <w:sz w:val="26"/>
-                <w:szCs w:val="26"/>
-              </w:rPr>
-            </w:pPr>
-            <w:r>
-              <w:rPr>
-                <w:rFonts w:ascii="Times New Roman" w:hAnsi="Times New Roman" w:cs="Times New Roman"/>
-                <w:sz w:val="26"/>
-                <w:szCs w:val="26"/>
-              </w:rPr>
-              <w:t xml:space="preserve">Pallets per day: </w:t>
-            </w:r>
-            <w:proofErr w:type="gramStart"/>
-            <w:r>
-              <w:rPr>
-                <w:rFonts w:ascii="Times New Roman" w:hAnsi="Times New Roman" w:cs="Times New Roman"/>
-                <w:sz w:val="26"/>
-                <w:szCs w:val="26"/>
-              </w:rPr>
-              <w:t xml:space="preserve">{{ </w:t>
-            </w:r>
-            <w:proofErr w:type="spellStart"/>
-            <w:r>
-              <w:rPr>
-                <w:rFonts w:ascii="Times New Roman" w:hAnsi="Times New Roman" w:cs="Times New Roman"/>
-                <w:sz w:val="26"/>
-                <w:szCs w:val="26"/>
-              </w:rPr>
-              <w:t>pallets</w:t>
-            </w:r>
-            <w:proofErr w:type="gramEnd"/>
-            <w:r>
-              <w:rPr>
-                <w:rFonts w:ascii="Times New Roman" w:hAnsi="Times New Roman" w:cs="Times New Roman"/>
-                <w:sz w:val="26"/>
-                <w:szCs w:val="26"/>
-              </w:rPr>
-              <w:t>_per_day|</w:t>
-            </w:r>
-            <w:proofErr w:type="gramStart"/>
-            <w:r>
-              <w:rPr>
-                <w:rFonts w:ascii="Times New Roman" w:hAnsi="Times New Roman" w:cs="Times New Roman"/>
-                <w:sz w:val="26"/>
-                <w:szCs w:val="26"/>
-              </w:rPr>
-              <w:t>default</w:t>
-            </w:r>
-            <w:proofErr w:type="spellEnd"/>
-            <w:r>
-              <w:rPr>
-                <w:rFonts w:ascii="Times New Roman" w:hAnsi="Times New Roman" w:cs="Times New Roman"/>
-                <w:sz w:val="26"/>
-                <w:szCs w:val="26"/>
-              </w:rPr>
-              <w:t>(</w:t>
-            </w:r>
-            <w:proofErr w:type="gramEnd"/>
-            <w:r>
-              <w:rPr>
-                <w:rFonts w:ascii="Times New Roman" w:hAnsi="Times New Roman" w:cs="Times New Roman"/>
-                <w:sz w:val="26"/>
-                <w:szCs w:val="26"/>
-              </w:rPr>
-              <w:t>'') }}</w:t>
-            </w:r>
-            <w:r>
-              <w:rPr>
-                <w:rFonts w:ascii="Times New Roman" w:hAnsi="Times New Roman" w:cs="Times New Roman"/>
-                <w:sz w:val="26"/>
-                <w:szCs w:val="26"/>
-              </w:rPr>
+            <w:r>
+              <w:t>Operational peak hours: {{ peak_hours|default('') }}</w:t>
+            </w:r>
+            <w:r>
               <w:br/>
-              <w:t xml:space="preserve">Operational peak hours: </w:t>
-            </w:r>
-            <w:proofErr w:type="gramStart"/>
-            <w:r>
-              <w:rPr>
-                <w:rFonts w:ascii="Times New Roman" w:hAnsi="Times New Roman" w:cs="Times New Roman"/>
-                <w:sz w:val="26"/>
-                <w:szCs w:val="26"/>
-              </w:rPr>
-              <w:t xml:space="preserve">{{ </w:t>
-            </w:r>
-            <w:proofErr w:type="spellStart"/>
-            <w:r>
-              <w:rPr>
-                <w:rFonts w:ascii="Times New Roman" w:hAnsi="Times New Roman" w:cs="Times New Roman"/>
-                <w:sz w:val="26"/>
-                <w:szCs w:val="26"/>
-              </w:rPr>
-              <w:t>peak</w:t>
-            </w:r>
-            <w:proofErr w:type="gramEnd"/>
-            <w:r>
-              <w:rPr>
-                <w:rFonts w:ascii="Times New Roman" w:hAnsi="Times New Roman" w:cs="Times New Roman"/>
-                <w:sz w:val="26"/>
-                <w:szCs w:val="26"/>
-              </w:rPr>
-              <w:t>_hours|</w:t>
-            </w:r>
-            <w:proofErr w:type="gramStart"/>
-            <w:r>
-              <w:rPr>
-                <w:rFonts w:ascii="Times New Roman" w:hAnsi="Times New Roman" w:cs="Times New Roman"/>
-                <w:sz w:val="26"/>
-                <w:szCs w:val="26"/>
-              </w:rPr>
-              <w:t>default</w:t>
-            </w:r>
-            <w:proofErr w:type="spellEnd"/>
-            <w:r>
-              <w:rPr>
-                <w:rFonts w:ascii="Times New Roman" w:hAnsi="Times New Roman" w:cs="Times New Roman"/>
-                <w:sz w:val="26"/>
-                <w:szCs w:val="26"/>
-              </w:rPr>
-              <w:t>(</w:t>
-            </w:r>
-            <w:proofErr w:type="gramEnd"/>
-            <w:r>
-              <w:rPr>
-                <w:rFonts w:ascii="Times New Roman" w:hAnsi="Times New Roman" w:cs="Times New Roman"/>
-                <w:sz w:val="26"/>
-                <w:szCs w:val="26"/>
-              </w:rPr>
-              <w:t>'') }}</w:t>
-            </w:r>
-            <w:r>
-              <w:rPr>
-                <w:rFonts w:ascii="Times New Roman" w:hAnsi="Times New Roman" w:cs="Times New Roman"/>
-                <w:sz w:val="26"/>
-                <w:szCs w:val="26"/>
-              </w:rPr>
+              <w:t>Shifts per day: {{ shifts_per_day|default('') }}</w:t>
+            </w:r>
+            <w:r>
               <w:br/>
-              <w:t xml:space="preserve">Shifts per day: </w:t>
-            </w:r>
-            <w:proofErr w:type="gramStart"/>
-            <w:r>
-              <w:rPr>
-                <w:rFonts w:ascii="Times New Roman" w:hAnsi="Times New Roman" w:cs="Times New Roman"/>
-                <w:sz w:val="26"/>
-                <w:szCs w:val="26"/>
-              </w:rPr>
-              <w:t xml:space="preserve">{{ </w:t>
-            </w:r>
-            <w:proofErr w:type="spellStart"/>
-            <w:r>
-              <w:rPr>
-                <w:rFonts w:ascii="Times New Roman" w:hAnsi="Times New Roman" w:cs="Times New Roman"/>
-                <w:sz w:val="26"/>
-                <w:szCs w:val="26"/>
-              </w:rPr>
-              <w:t>shifts</w:t>
-            </w:r>
-            <w:proofErr w:type="gramEnd"/>
-            <w:r>
-              <w:rPr>
-                <w:rFonts w:ascii="Times New Roman" w:hAnsi="Times New Roman" w:cs="Times New Roman"/>
-                <w:sz w:val="26"/>
-                <w:szCs w:val="26"/>
-              </w:rPr>
-              <w:t>_per_day|</w:t>
-            </w:r>
-            <w:proofErr w:type="gramStart"/>
-            <w:r>
-              <w:rPr>
-                <w:rFonts w:ascii="Times New Roman" w:hAnsi="Times New Roman" w:cs="Times New Roman"/>
-                <w:sz w:val="26"/>
-                <w:szCs w:val="26"/>
-              </w:rPr>
-              <w:t>default</w:t>
-            </w:r>
-            <w:proofErr w:type="spellEnd"/>
-            <w:r>
-              <w:rPr>
-                <w:rFonts w:ascii="Times New Roman" w:hAnsi="Times New Roman" w:cs="Times New Roman"/>
-                <w:sz w:val="26"/>
-                <w:szCs w:val="26"/>
-              </w:rPr>
-              <w:t>(</w:t>
-            </w:r>
-            <w:proofErr w:type="gramEnd"/>
-            <w:r>
-              <w:rPr>
-                <w:rFonts w:ascii="Times New Roman" w:hAnsi="Times New Roman" w:cs="Times New Roman"/>
-                <w:sz w:val="26"/>
-                <w:szCs w:val="26"/>
-              </w:rPr>
-              <w:t>'') }}</w:t>
-            </w:r>
-            <w:r>
-              <w:rPr>
-                <w:rFonts w:ascii="Times New Roman" w:hAnsi="Times New Roman" w:cs="Times New Roman"/>
-                <w:sz w:val="26"/>
-                <w:szCs w:val="26"/>
-              </w:rPr>
-              <w:br/>
-              <w:t xml:space="preserve">Pallets per hour: </w:t>
-            </w:r>
-            <w:proofErr w:type="gramStart"/>
-            <w:r>
-              <w:rPr>
-                <w:rFonts w:ascii="Times New Roman" w:hAnsi="Times New Roman" w:cs="Times New Roman"/>
-                <w:sz w:val="26"/>
-                <w:szCs w:val="26"/>
-              </w:rPr>
-              <w:t xml:space="preserve">{{ </w:t>
-            </w:r>
-            <w:proofErr w:type="spellStart"/>
-            <w:r>
-              <w:rPr>
-                <w:rFonts w:ascii="Times New Roman" w:hAnsi="Times New Roman" w:cs="Times New Roman"/>
-                <w:sz w:val="26"/>
-                <w:szCs w:val="26"/>
-              </w:rPr>
-              <w:t>pallets</w:t>
-            </w:r>
-            <w:proofErr w:type="gramEnd"/>
-            <w:r>
-              <w:rPr>
-                <w:rFonts w:ascii="Times New Roman" w:hAnsi="Times New Roman" w:cs="Times New Roman"/>
-                <w:sz w:val="26"/>
-                <w:szCs w:val="26"/>
-              </w:rPr>
-              <w:t>_per_hour|</w:t>
-            </w:r>
-            <w:proofErr w:type="gramStart"/>
-            <w:r>
-              <w:rPr>
-                <w:rFonts w:ascii="Times New Roman" w:hAnsi="Times New Roman" w:cs="Times New Roman"/>
-                <w:sz w:val="26"/>
-                <w:szCs w:val="26"/>
-              </w:rPr>
-              <w:t>default</w:t>
-            </w:r>
-            <w:proofErr w:type="spellEnd"/>
-            <w:r>
-              <w:rPr>
-                <w:rFonts w:ascii="Times New Roman" w:hAnsi="Times New Roman" w:cs="Times New Roman"/>
-                <w:sz w:val="26"/>
-                <w:szCs w:val="26"/>
-              </w:rPr>
-              <w:t>(</w:t>
-            </w:r>
-            <w:proofErr w:type="gramEnd"/>
-            <w:r>
-              <w:rPr>
-                <w:rFonts w:ascii="Times New Roman" w:hAnsi="Times New Roman" w:cs="Times New Roman"/>
-                <w:sz w:val="26"/>
-                <w:szCs w:val="26"/>
-              </w:rPr>
-              <w:t>'') }}</w:t>
+              <w:t>Pallets per hour: {{ pallets_per_hour|default('') }}</w:t>
             </w:r>
           </w:p>
         </w:tc>
@@ -5018,7 +4770,7 @@
                 <w:sz w:val="26"/>
                 <w:szCs w:val="26"/>
               </w:rPr>
-              <w:t xml:space="preserve">Positioning </w:t>
+              <w:t xml:space="preserve">Positioning accuracy </w:t>
             </w:r>
             <w:r>
               <w:rPr>
@@ -5027,7 +4779,7 @@
                 <w:szCs w:val="26"/>
               </w:rPr>
               <w:lastRenderedPageBreak/>
-              <w:t>accuracy docking requirements, whether it is necessary to dock equipment or assembly lines, etc.:</w:t>
+              <w:t>docking requirements, whether it is necessary to dock equipment or assembly lines, etc.:</w:t>
             </w:r>
           </w:p>
         </w:tc>
@@ -5751,7 +5503,7 @@
                 <w:sz w:val="26"/>
                 <w:szCs w:val="26"/>
               </w:rPr>
-              <w:t xml:space="preserve">Whether there is a charging </w:t>
+              <w:t xml:space="preserve">Whether there is a charging pile/battery </w:t>
             </w:r>
             <w:r>
               <w:rPr>
@@ -5760,7 +5512,7 @@
                 <w:szCs w:val="26"/>
               </w:rPr>
               <w:lastRenderedPageBreak/>
-              <w:t>pile/battery swap station</w:t>
+              <w:t>swap station</w:t>
             </w:r>
             <w:r>
               <w:t xml:space="preserve"> </w:t>
@@ -7022,7 +6774,7 @@
                 <w:sz w:val="22"/>
                 <w:szCs w:val="22"/>
               </w:rPr>
-              <w:t xml:space="preserve">Specifications </w:t>
+              <w:t xml:space="preserve">Specifications and quantities of products to </w:t>
             </w:r>
             <w:r>
               <w:rPr>
@@ -7033,7 +6785,7 @@
                 <w:szCs w:val="22"/>
               </w:rPr>
               <w:lastRenderedPageBreak/>
-              <w:t>and quantities of products to be used</w:t>
+              <w:t>be used</w:t>
             </w:r>
             <w:r>
               <w:rPr>
@@ -7202,7 +6954,16 @@
                 <w:sz w:val="22"/>
                 <w:szCs w:val="22"/>
               </w:rPr>
-              <w:t xml:space="preserve">22 / XSC </w:t>
+              <w:t xml:space="preserve">22 / </w:t>
+            </w:r>
+            <w:r>
+              <w:rPr>
+                <w:rFonts w:ascii="Times New Roman" w:eastAsiaTheme="minorEastAsia" w:hAnsi="Times New Roman" w:cs="Times New Roman"/>
+                <w:sz w:val="22"/>
+                <w:szCs w:val="22"/>
+              </w:rPr>
+              <w:lastRenderedPageBreak/>
+              <w:t xml:space="preserve">XSC </w:t>
             </w:r>
           </w:p>
         </w:tc>
@@ -7245,7 +7006,16 @@
                 <w:sz w:val="22"/>
                 <w:szCs w:val="22"/>
               </w:rPr>
-              <w:t>Truck type depending on delivery time and EP technical preference</w:t>
+              <w:t xml:space="preserve">Truck type </w:t>
+            </w:r>
+            <w:r>
+              <w:rPr>
+                <w:rFonts w:ascii="Times New Roman" w:eastAsiaTheme="minorEastAsia" w:hAnsi="Times New Roman" w:cs="Times New Roman"/>
+                <w:sz w:val="22"/>
+                <w:szCs w:val="22"/>
+              </w:rPr>
+              <w:lastRenderedPageBreak/>
+              <w:t>depending on delivery time and EP technical preference</w:t>
             </w:r>
           </w:p>
         </w:tc>
@@ -11055,6 +10825,7 @@
   <w:style w:type="character" w:default="1" w:styleId="DefaultParagraphFont">
     <w:name w:val="Default Paragraph Font"/>
     <w:uiPriority w:val="1"/>
+    <w:semiHidden/>
     <w:unhideWhenUsed/>
   </w:style>
   <w:style w:type="table" w:default="1" w:styleId="TableNormal">
@@ -11401,7 +11172,12 @@
 </file>
 
 <file path=customXml/item1.xml><?xml version="1.0" encoding="utf-8"?>
-<b:Sources xmlns:b="http://schemas.openxmlformats.org/officeDocument/2006/bibliography" xmlns="http://schemas.openxmlformats.org/officeDocument/2006/bibliography" SelectedStyle="\APASixthEditionOfficeOnline.xsl" StyleName="APA" Version="6"/>
+<?mso-contentType ?>
+<FormTemplates xmlns="http://schemas.microsoft.com/sharepoint/v3/contenttype/forms">
+  <Display>DocumentLibraryForm</Display>
+  <Edit>DocumentLibraryForm</Edit>
+  <New>DocumentLibraryForm</New>
+</FormTemplates>
 </file>
 
 <file path=customXml/item2.xml><?xml version="1.0" encoding="utf-8"?>
@@ -11416,15 +11192,19 @@
 </file>
 
 <file path=customXml/item3.xml><?xml version="1.0" encoding="utf-8"?>
-<?mso-contentType ?>
-<FormTemplates xmlns="http://schemas.microsoft.com/sharepoint/v3/contenttype/forms">
-  <Display>DocumentLibraryForm</Display>
-  <Edit>DocumentLibraryForm</Edit>
-  <New>DocumentLibraryForm</New>
-</FormTemplates>
+<b:Sources xmlns:b="http://schemas.openxmlformats.org/officeDocument/2006/bibliography" xmlns="http://schemas.openxmlformats.org/officeDocument/2006/bibliography" SelectedStyle="\APASixthEditionOfficeOnline.xsl" StyleName="APA" Version="6"/>
 </file>
 
 <file path=customXml/item4.xml><?xml version="1.0" encoding="utf-8"?>
+<s:customData xmlns="http://www.wps.cn/officeDocument/2013/wpsCustomData" xmlns:s="http://www.wps.cn/officeDocument/2013/wpsCustomData">
+  <customSectProps/>
+  <customShpExts>
+    <customShpInfo spid="_x0000_s1026" textRotate="1"/>
+  </customShpExts>
+</s:customData>
+</file>
+
+<file path=customXml/item5.xml><?xml version="1.0" encoding="utf-8"?>
 <ct:contentTypeSchema xmlns:ct="http://schemas.microsoft.com/office/2006/metadata/contentType" xmlns:ma="http://schemas.microsoft.com/office/2006/metadata/properties/metaAttributes" ct:_="" ma:_="" ma:contentTypeName="Document" ma:contentTypeID="0x0101000ED1937193E6644B9910A1F8F337BE3A" ma:contentTypeVersion="15" ma:contentTypeDescription="Create a new document." ma:contentTypeScope="" ma:versionID="33d0915d951d370b6a1e09b978e628b3">
   <xsd:schema xmlns:xsd="http://www.w3.org/2001/XMLSchema" xmlns:xs="http://www.w3.org/2001/XMLSchema" xmlns:p="http://schemas.microsoft.com/office/2006/metadata/properties" xmlns:ns2="bbceff47-94a0-42cc-a34e-bab6fdf630d3" xmlns:ns3="076cc9d1-9a26-4384-96fc-17dbfe6fe8db" targetNamespace="http://schemas.microsoft.com/office/2006/metadata/properties" ma:root="true" ma:fieldsID="ca8e0581b507d7ca9a3160f88f47f0fe" ns2:_="" ns3:_="">
     <xsd:import namespace="bbceff47-94a0-42cc-a34e-bab6fdf630d3"/>
@@ -11637,19 +11417,10 @@
 </ct:contentTypeSchema>
 </file>
 
-<file path=customXml/item5.xml><?xml version="1.0" encoding="utf-8"?>
-<s:customData xmlns="http://www.wps.cn/officeDocument/2013/wpsCustomData" xmlns:s="http://www.wps.cn/officeDocument/2013/wpsCustomData">
-  <customSectProps/>
-  <customShpExts>
-    <customShpInfo spid="_x0000_s1026" textRotate="1"/>
-  </customShpExts>
-</s:customData>
-</file>
-
 <file path=customXml/itemProps1.xml><?xml version="1.0" encoding="utf-8"?>
-<ds:datastoreItem xmlns:ds="http://schemas.openxmlformats.org/officeDocument/2006/customXml" ds:itemID="{1FF82357-F674-4365-859D-EF5EFE0EDCAE}">
+<ds:datastoreItem xmlns:ds="http://schemas.openxmlformats.org/officeDocument/2006/customXml" ds:itemID="{66E6D9ED-0625-4E0B-A950-FCB28CC096CA}">
   <ds:schemaRefs>
-    <ds:schemaRef ds:uri="http://schemas.openxmlformats.org/officeDocument/2006/bibliography"/>
+    <ds:schemaRef ds:uri="http://schemas.microsoft.com/sharepoint/v3/contenttype/forms"/>
   </ds:schemaRefs>
 </ds:datastoreItem>
 </file>
@@ -11666,14 +11437,22 @@
 </file>
 
 <file path=customXml/itemProps3.xml><?xml version="1.0" encoding="utf-8"?>
-<ds:datastoreItem xmlns:ds="http://schemas.openxmlformats.org/officeDocument/2006/customXml" ds:itemID="{66E6D9ED-0625-4E0B-A950-FCB28CC096CA}">
+<ds:datastoreItem xmlns:ds="http://schemas.openxmlformats.org/officeDocument/2006/customXml" ds:itemID="{1FF82357-F674-4365-859D-EF5EFE0EDCAE}">
   <ds:schemaRefs>
-    <ds:schemaRef ds:uri="http://schemas.microsoft.com/sharepoint/v3/contenttype/forms"/>
+    <ds:schemaRef ds:uri="http://schemas.openxmlformats.org/officeDocument/2006/bibliography"/>
   </ds:schemaRefs>
 </ds:datastoreItem>
 </file>
 
 <file path=customXml/itemProps4.xml><?xml version="1.0" encoding="utf-8"?>
+<ds:datastoreItem xmlns:ds="http://schemas.openxmlformats.org/officeDocument/2006/customXml" ds:itemID="{B1977F7D-205B-4081-913C-38D41E755F92}">
+  <ds:schemaRefs>
+    <ds:schemaRef ds:uri="http://www.wps.cn/officeDocument/2013/wpsCustomData"/>
+  </ds:schemaRefs>
+</ds:datastoreItem>
+</file>
+
+<file path=customXml/itemProps5.xml><?xml version="1.0" encoding="utf-8"?>
 <ds:datastoreItem xmlns:ds="http://schemas.openxmlformats.org/officeDocument/2006/customXml" ds:itemID="{117EB414-D13B-4D74-9FFC-4E3D989A8CA2}">
   <ds:schemaRefs>
     <ds:schemaRef ds:uri="http://schemas.microsoft.com/office/2006/metadata/contentType"/>
@@ -11690,12 +11469,4 @@
     <ds:schemaRef ds:uri="http://schemas.microsoft.com/internal/obd"/>
   </ds:schemaRefs>
 </ds:datastoreItem>
-</file>
-
-<file path=customXml/itemProps5.xml><?xml version="1.0" encoding="utf-8"?>
-<ds:datastoreItem xmlns:ds="http://schemas.openxmlformats.org/officeDocument/2006/customXml" ds:itemID="{B1977F7D-205B-4081-913C-38D41E755F92}">
-  <ds:schemaRefs>
-    <ds:schemaRef ds:uri="http://www.wps.cn/officeDocument/2013/wpsCustomData"/>
-  </ds:schemaRefs>
-</ds:datastoreItem>
 </file>
</xml_diff>

<commit_message>
update in the tempelate
</commit_message>
<xml_diff>
--- a/template.docx
+++ b/template.docx
@@ -156,43 +156,7 @@
                 <w:sz w:val="26"/>
                 <w:szCs w:val="26"/>
               </w:rPr>
-              <w:t>{{</w:t>
-            </w:r>
-            <w:proofErr w:type="spellStart"/>
-            <w:r>
-              <w:rPr>
-                <w:rFonts w:ascii="Times New Roman" w:hAnsi="Times New Roman" w:cs="Times New Roman"/>
-                <w:sz w:val="26"/>
-                <w:szCs w:val="26"/>
-              </w:rPr>
-              <w:t>customer_name|</w:t>
-            </w:r>
-            <w:proofErr w:type="gramStart"/>
-            <w:r>
-              <w:rPr>
-                <w:rFonts w:ascii="Times New Roman" w:hAnsi="Times New Roman" w:cs="Times New Roman"/>
-                <w:sz w:val="26"/>
-                <w:szCs w:val="26"/>
-              </w:rPr>
-              <w:t>default</w:t>
-            </w:r>
-            <w:proofErr w:type="spellEnd"/>
-            <w:r>
-              <w:rPr>
-                <w:rFonts w:ascii="Times New Roman" w:hAnsi="Times New Roman" w:cs="Times New Roman"/>
-                <w:sz w:val="26"/>
-                <w:szCs w:val="26"/>
-              </w:rPr>
-              <w:t>(</w:t>
-            </w:r>
-            <w:proofErr w:type="gramEnd"/>
-            <w:r>
-              <w:rPr>
-                <w:rFonts w:ascii="Times New Roman" w:hAnsi="Times New Roman" w:cs="Times New Roman"/>
-                <w:sz w:val="26"/>
-                <w:szCs w:val="26"/>
-              </w:rPr>
-              <w:t>'')}}</w:t>
+              <w:t>{{customer_name|default('')}}</w:t>
             </w:r>
           </w:p>
         </w:tc>
@@ -262,16 +226,7 @@
                 <w:sz w:val="26"/>
                 <w:szCs w:val="26"/>
               </w:rPr>
-              <w:t>project_name|</w:t>
-            </w:r>
-            <w:proofErr w:type="gramStart"/>
-            <w:r>
-              <w:rPr>
-                <w:rFonts w:ascii="Times New Roman" w:hAnsi="Times New Roman" w:cs="Times New Roman"/>
-                <w:sz w:val="26"/>
-                <w:szCs w:val="26"/>
-              </w:rPr>
-              <w:t>default</w:t>
+              <w:t>project_name|default</w:t>
             </w:r>
             <w:proofErr w:type="spellEnd"/>
             <w:r>
@@ -280,16 +235,7 @@
                 <w:sz w:val="26"/>
                 <w:szCs w:val="26"/>
               </w:rPr>
-              <w:t>(</w:t>
-            </w:r>
-            <w:proofErr w:type="gramEnd"/>
-            <w:r>
-              <w:rPr>
-                <w:rFonts w:ascii="Times New Roman" w:hAnsi="Times New Roman" w:cs="Times New Roman"/>
-                <w:sz w:val="26"/>
-                <w:szCs w:val="26"/>
-              </w:rPr>
-              <w:t>'')}}</w:t>
+              <w:t>('')}}</w:t>
             </w:r>
           </w:p>
         </w:tc>
@@ -366,16 +312,7 @@
                 <w:sz w:val="26"/>
                 <w:szCs w:val="26"/>
               </w:rPr>
-              <w:t>project_location|</w:t>
-            </w:r>
-            <w:proofErr w:type="gramStart"/>
-            <w:r>
-              <w:rPr>
-                <w:rFonts w:ascii="Times New Roman" w:hAnsi="Times New Roman" w:cs="Times New Roman"/>
-                <w:sz w:val="26"/>
-                <w:szCs w:val="26"/>
-              </w:rPr>
-              <w:t>default</w:t>
+              <w:t>project_location|default</w:t>
             </w:r>
             <w:proofErr w:type="spellEnd"/>
             <w:r>
@@ -384,16 +321,7 @@
                 <w:sz w:val="26"/>
                 <w:szCs w:val="26"/>
               </w:rPr>
-              <w:t>(</w:t>
-            </w:r>
-            <w:proofErr w:type="gramEnd"/>
-            <w:r>
-              <w:rPr>
-                <w:rFonts w:ascii="Times New Roman" w:hAnsi="Times New Roman" w:cs="Times New Roman"/>
-                <w:sz w:val="26"/>
-                <w:szCs w:val="26"/>
-              </w:rPr>
-              <w:t>'')}}</w:t>
+              <w:t>('')}}</w:t>
             </w:r>
           </w:p>
         </w:tc>
@@ -461,16 +389,7 @@
                 <w:sz w:val="26"/>
                 <w:szCs w:val="26"/>
               </w:rPr>
-              <w:t>survey_date|</w:t>
-            </w:r>
-            <w:proofErr w:type="gramStart"/>
-            <w:r>
-              <w:rPr>
-                <w:rFonts w:ascii="Times New Roman" w:hAnsi="Times New Roman" w:cs="Times New Roman"/>
-                <w:sz w:val="26"/>
-                <w:szCs w:val="26"/>
-              </w:rPr>
-              <w:t>default</w:t>
+              <w:t>survey_date|default</w:t>
             </w:r>
             <w:proofErr w:type="spellEnd"/>
             <w:r>
@@ -479,16 +398,7 @@
                 <w:sz w:val="26"/>
                 <w:szCs w:val="26"/>
               </w:rPr>
-              <w:t>(</w:t>
-            </w:r>
-            <w:proofErr w:type="gramEnd"/>
-            <w:r>
-              <w:rPr>
-                <w:rFonts w:ascii="Times New Roman" w:hAnsi="Times New Roman" w:cs="Times New Roman"/>
-                <w:sz w:val="26"/>
-                <w:szCs w:val="26"/>
-              </w:rPr>
-              <w:t>'')}}</w:t>
+              <w:t>('')}}</w:t>
             </w:r>
           </w:p>
         </w:tc>
@@ -565,16 +475,7 @@
                 <w:sz w:val="26"/>
                 <w:szCs w:val="26"/>
               </w:rPr>
-              <w:t>customer_email|</w:t>
-            </w:r>
-            <w:proofErr w:type="gramStart"/>
-            <w:r>
-              <w:rPr>
-                <w:rFonts w:ascii="Times New Roman" w:hAnsi="Times New Roman" w:cs="Times New Roman"/>
-                <w:sz w:val="26"/>
-                <w:szCs w:val="26"/>
-              </w:rPr>
-              <w:t>default</w:t>
+              <w:t>customer_email|default</w:t>
             </w:r>
             <w:proofErr w:type="spellEnd"/>
             <w:r>
@@ -583,16 +484,7 @@
                 <w:sz w:val="26"/>
                 <w:szCs w:val="26"/>
               </w:rPr>
-              <w:t>(</w:t>
-            </w:r>
-            <w:proofErr w:type="gramEnd"/>
-            <w:r>
-              <w:rPr>
-                <w:rFonts w:ascii="Times New Roman" w:hAnsi="Times New Roman" w:cs="Times New Roman"/>
-                <w:sz w:val="26"/>
-                <w:szCs w:val="26"/>
-              </w:rPr>
-              <w:t>'')}}</w:t>
+              <w:t>('')}}</w:t>
             </w:r>
           </w:p>
         </w:tc>
@@ -677,16 +569,7 @@
                 <w:sz w:val="26"/>
                 <w:szCs w:val="26"/>
               </w:rPr>
-              <w:t>customer_mobile|</w:t>
-            </w:r>
-            <w:proofErr w:type="gramStart"/>
-            <w:r>
-              <w:rPr>
-                <w:rFonts w:ascii="Times New Roman" w:hAnsi="Times New Roman" w:cs="Times New Roman"/>
-                <w:sz w:val="26"/>
-                <w:szCs w:val="26"/>
-              </w:rPr>
-              <w:t>default</w:t>
+              <w:t>customer_mobile|default</w:t>
             </w:r>
             <w:proofErr w:type="spellEnd"/>
             <w:r>
@@ -695,16 +578,7 @@
                 <w:sz w:val="26"/>
                 <w:szCs w:val="26"/>
               </w:rPr>
-              <w:t>(</w:t>
-            </w:r>
-            <w:proofErr w:type="gramEnd"/>
-            <w:r>
-              <w:rPr>
-                <w:rFonts w:ascii="Times New Roman" w:hAnsi="Times New Roman" w:cs="Times New Roman"/>
-                <w:sz w:val="26"/>
-                <w:szCs w:val="26"/>
-              </w:rPr>
-              <w:t>'')}}</w:t>
+              <w:t>('')}}</w:t>
             </w:r>
           </w:p>
         </w:tc>
@@ -1115,16 +989,7 @@
                 <w:sz w:val="26"/>
                 <w:szCs w:val="26"/>
               </w:rPr>
-              <w:t>warehouse_area|</w:t>
-            </w:r>
-            <w:proofErr w:type="gramStart"/>
-            <w:r>
-              <w:rPr>
-                <w:rFonts w:ascii="Times New Roman" w:hAnsi="Times New Roman" w:cs="Times New Roman"/>
-                <w:sz w:val="26"/>
-                <w:szCs w:val="26"/>
-              </w:rPr>
-              <w:t>default</w:t>
+              <w:t>warehouse_area|default</w:t>
             </w:r>
             <w:proofErr w:type="spellEnd"/>
             <w:r>
@@ -1133,16 +998,7 @@
                 <w:sz w:val="26"/>
                 <w:szCs w:val="26"/>
               </w:rPr>
-              <w:t>(</w:t>
-            </w:r>
-            <w:proofErr w:type="gramEnd"/>
-            <w:r>
-              <w:rPr>
-                <w:rFonts w:ascii="Times New Roman" w:hAnsi="Times New Roman" w:cs="Times New Roman"/>
-                <w:sz w:val="26"/>
-                <w:szCs w:val="26"/>
-              </w:rPr>
-              <w:t>'')}}</w:t>
+              <w:t>('')}}</w:t>
             </w:r>
           </w:p>
         </w:tc>
@@ -1275,7 +1131,6 @@
                 <w:szCs w:val="26"/>
               </w:rPr>
             </w:pPr>
-            <w:proofErr w:type="gramStart"/>
             <w:r>
               <w:rPr>
                 <w:rFonts w:ascii="Times New Roman" w:hAnsi="Times New Roman" w:cs="Times New Roman"/>
@@ -1291,25 +1146,7 @@
                 <w:sz w:val="26"/>
                 <w:szCs w:val="26"/>
               </w:rPr>
-              <w:t>aisle</w:t>
-            </w:r>
-            <w:proofErr w:type="gramEnd"/>
-            <w:r>
-              <w:rPr>
-                <w:rFonts w:ascii="Times New Roman" w:hAnsi="Times New Roman" w:cs="Times New Roman"/>
-                <w:sz w:val="26"/>
-                <w:szCs w:val="26"/>
-              </w:rPr>
-              <w:t>_width_text|</w:t>
-            </w:r>
-            <w:proofErr w:type="gramStart"/>
-            <w:r>
-              <w:rPr>
-                <w:rFonts w:ascii="Times New Roman" w:hAnsi="Times New Roman" w:cs="Times New Roman"/>
-                <w:sz w:val="26"/>
-                <w:szCs w:val="26"/>
-              </w:rPr>
-              <w:t>default</w:t>
+              <w:t>aisle_width_text|default</w:t>
             </w:r>
             <w:proofErr w:type="spellEnd"/>
             <w:r>
@@ -1318,16 +1155,7 @@
                 <w:sz w:val="26"/>
                 <w:szCs w:val="26"/>
               </w:rPr>
-              <w:t>(</w:t>
-            </w:r>
-            <w:proofErr w:type="gramEnd"/>
-            <w:r>
-              <w:rPr>
-                <w:rFonts w:ascii="Times New Roman" w:hAnsi="Times New Roman" w:cs="Times New Roman"/>
-                <w:sz w:val="26"/>
-                <w:szCs w:val="26"/>
-              </w:rPr>
-              <w:t>'') }}</w:t>
+              <w:t>('') }}</w:t>
             </w:r>
           </w:p>
         </w:tc>
@@ -1444,7 +1272,6 @@
                 <w:szCs w:val="26"/>
               </w:rPr>
             </w:pPr>
-            <w:proofErr w:type="gramStart"/>
             <w:r>
               <w:rPr>
                 <w:rFonts w:ascii="Times New Roman" w:hAnsi="Times New Roman" w:cs="Times New Roman"/>
@@ -1460,25 +1287,7 @@
                 <w:sz w:val="26"/>
                 <w:szCs w:val="26"/>
               </w:rPr>
-              <w:t>stacking</w:t>
-            </w:r>
-            <w:proofErr w:type="gramEnd"/>
-            <w:r>
-              <w:rPr>
-                <w:rFonts w:ascii="Times New Roman" w:hAnsi="Times New Roman" w:cs="Times New Roman"/>
-                <w:sz w:val="26"/>
-                <w:szCs w:val="26"/>
-              </w:rPr>
-              <w:t>_height_text|</w:t>
-            </w:r>
-            <w:proofErr w:type="gramStart"/>
-            <w:r>
-              <w:rPr>
-                <w:rFonts w:ascii="Times New Roman" w:hAnsi="Times New Roman" w:cs="Times New Roman"/>
-                <w:sz w:val="26"/>
-                <w:szCs w:val="26"/>
-              </w:rPr>
-              <w:t>default</w:t>
+              <w:t>stacking_height_text|default</w:t>
             </w:r>
             <w:proofErr w:type="spellEnd"/>
             <w:r>
@@ -1487,16 +1296,7 @@
                 <w:sz w:val="26"/>
                 <w:szCs w:val="26"/>
               </w:rPr>
-              <w:t>(</w:t>
-            </w:r>
-            <w:proofErr w:type="gramEnd"/>
-            <w:r>
-              <w:rPr>
-                <w:rFonts w:ascii="Times New Roman" w:hAnsi="Times New Roman" w:cs="Times New Roman"/>
-                <w:sz w:val="26"/>
-                <w:szCs w:val="26"/>
-              </w:rPr>
-              <w:t>'') }}</w:t>
+              <w:t>('') }}</w:t>
             </w:r>
             <w:r>
               <w:rPr>
@@ -1505,14 +1305,6 @@
                 <w:szCs w:val="26"/>
               </w:rPr>
               <w:br/>
-            </w:r>
-            <w:proofErr w:type="gramStart"/>
-            <w:r>
-              <w:rPr>
-                <w:rFonts w:ascii="Times New Roman" w:hAnsi="Times New Roman" w:cs="Times New Roman"/>
-                <w:sz w:val="26"/>
-                <w:szCs w:val="26"/>
-              </w:rPr>
               <w:t xml:space="preserve">{{ </w:t>
             </w:r>
             <w:proofErr w:type="spellStart"/>
@@ -1522,25 +1314,7 @@
                 <w:sz w:val="26"/>
                 <w:szCs w:val="26"/>
               </w:rPr>
-              <w:t>stacking</w:t>
-            </w:r>
-            <w:proofErr w:type="gramEnd"/>
-            <w:r>
-              <w:rPr>
-                <w:rFonts w:ascii="Times New Roman" w:hAnsi="Times New Roman" w:cs="Times New Roman"/>
-                <w:sz w:val="26"/>
-                <w:szCs w:val="26"/>
-              </w:rPr>
-              <w:t>_level_text|</w:t>
-            </w:r>
-            <w:proofErr w:type="gramStart"/>
-            <w:r>
-              <w:rPr>
-                <w:rFonts w:ascii="Times New Roman" w:hAnsi="Times New Roman" w:cs="Times New Roman"/>
-                <w:sz w:val="26"/>
-                <w:szCs w:val="26"/>
-              </w:rPr>
-              <w:t>default</w:t>
+              <w:t>stacking_level_text|default</w:t>
             </w:r>
             <w:proofErr w:type="spellEnd"/>
             <w:r>
@@ -1549,16 +1323,7 @@
                 <w:sz w:val="26"/>
                 <w:szCs w:val="26"/>
               </w:rPr>
-              <w:t>(</w:t>
-            </w:r>
-            <w:proofErr w:type="gramEnd"/>
-            <w:r>
-              <w:rPr>
-                <w:rFonts w:ascii="Times New Roman" w:hAnsi="Times New Roman" w:cs="Times New Roman"/>
-                <w:sz w:val="26"/>
-                <w:szCs w:val="26"/>
-              </w:rPr>
-              <w:t>'') }}</w:t>
+              <w:t>('') }}</w:t>
             </w:r>
           </w:p>
         </w:tc>
@@ -1665,29 +1430,16 @@
             <w:vAlign w:val="center"/>
           </w:tcPr>
           <w:p>
-            <w:proofErr w:type="gramStart"/>
             <w:r>
               <w:t xml:space="preserve">{{ </w:t>
             </w:r>
             <w:proofErr w:type="spellStart"/>
             <w:r>
-              <w:t>clearance</w:t>
-            </w:r>
-            <w:proofErr w:type="gramEnd"/>
-            <w:r>
-              <w:t>_height_text|</w:t>
-            </w:r>
-            <w:proofErr w:type="gramStart"/>
-            <w:r>
-              <w:t>default</w:t>
+              <w:t>clearance_height_text|default</w:t>
             </w:r>
             <w:proofErr w:type="spellEnd"/>
             <w:r>
-              <w:t>(</w:t>
-            </w:r>
-            <w:proofErr w:type="gramEnd"/>
-            <w:r>
-              <w:t>'') }}</w:t>
+              <w:t>('') }}</w:t>
             </w:r>
           </w:p>
         </w:tc>
@@ -1817,7 +1569,6 @@
                 <w:szCs w:val="26"/>
               </w:rPr>
             </w:pPr>
-            <w:proofErr w:type="gramStart"/>
             <w:r>
               <w:rPr>
                 <w:rFonts w:ascii="Times New Roman" w:hAnsi="Times New Roman" w:cs="Times New Roman"/>
@@ -1833,25 +1584,7 @@
                 <w:sz w:val="26"/>
                 <w:szCs w:val="26"/>
               </w:rPr>
-              <w:t>storage</w:t>
-            </w:r>
-            <w:proofErr w:type="gramEnd"/>
-            <w:r>
-              <w:rPr>
-                <w:rFonts w:ascii="Times New Roman" w:hAnsi="Times New Roman" w:cs="Times New Roman"/>
-                <w:sz w:val="26"/>
-                <w:szCs w:val="26"/>
-              </w:rPr>
-              <w:t>_locations_text|</w:t>
-            </w:r>
-            <w:proofErr w:type="gramStart"/>
-            <w:r>
-              <w:rPr>
-                <w:rFonts w:ascii="Times New Roman" w:hAnsi="Times New Roman" w:cs="Times New Roman"/>
-                <w:sz w:val="26"/>
-                <w:szCs w:val="26"/>
-              </w:rPr>
-              <w:t>default</w:t>
+              <w:t>storage_locations_text|default</w:t>
             </w:r>
             <w:proofErr w:type="spellEnd"/>
             <w:r>
@@ -1860,16 +1593,7 @@
                 <w:sz w:val="26"/>
                 <w:szCs w:val="26"/>
               </w:rPr>
-              <w:t>(</w:t>
-            </w:r>
-            <w:proofErr w:type="gramEnd"/>
-            <w:r>
-              <w:rPr>
-                <w:rFonts w:ascii="Times New Roman" w:hAnsi="Times New Roman" w:cs="Times New Roman"/>
-                <w:sz w:val="26"/>
-                <w:szCs w:val="26"/>
-              </w:rPr>
-              <w:t>'') }}</w:t>
+              <w:t>('') }}</w:t>
             </w:r>
           </w:p>
         </w:tc>
@@ -1991,7 +1715,6 @@
                 <w:szCs w:val="26"/>
               </w:rPr>
             </w:pPr>
-            <w:proofErr w:type="gramStart"/>
             <w:r>
               <w:rPr>
                 <w:rFonts w:ascii="Times New Roman" w:hAnsi="Times New Roman" w:cs="Times New Roman"/>
@@ -2007,25 +1730,7 @@
                 <w:sz w:val="26"/>
                 <w:szCs w:val="26"/>
               </w:rPr>
-              <w:t>ramp</w:t>
-            </w:r>
-            <w:proofErr w:type="gramEnd"/>
-            <w:r>
-              <w:rPr>
-                <w:rFonts w:ascii="Times New Roman" w:hAnsi="Times New Roman" w:cs="Times New Roman"/>
-                <w:sz w:val="26"/>
-                <w:szCs w:val="26"/>
-              </w:rPr>
-              <w:t>_gradient_deg|</w:t>
-            </w:r>
-            <w:proofErr w:type="gramStart"/>
-            <w:r>
-              <w:rPr>
-                <w:rFonts w:ascii="Times New Roman" w:hAnsi="Times New Roman" w:cs="Times New Roman"/>
-                <w:sz w:val="26"/>
-                <w:szCs w:val="26"/>
-              </w:rPr>
-              <w:t>default</w:t>
+              <w:t>ramp_gradient_deg|default</w:t>
             </w:r>
             <w:proofErr w:type="spellEnd"/>
             <w:r>
@@ -2034,16 +1739,7 @@
                 <w:sz w:val="26"/>
                 <w:szCs w:val="26"/>
               </w:rPr>
-              <w:t>(</w:t>
-            </w:r>
-            <w:proofErr w:type="gramEnd"/>
-            <w:r>
-              <w:rPr>
-                <w:rFonts w:ascii="Times New Roman" w:hAnsi="Times New Roman" w:cs="Times New Roman"/>
-                <w:sz w:val="26"/>
-                <w:szCs w:val="26"/>
-              </w:rPr>
-              <w:t>'') }}</w:t>
+              <w:t>('') }}</w:t>
             </w:r>
           </w:p>
         </w:tc>
@@ -2152,7 +1848,6 @@
                 <w:szCs w:val="26"/>
               </w:rPr>
             </w:pPr>
-            <w:proofErr w:type="gramStart"/>
             <w:r>
               <w:rPr>
                 <w:rFonts w:ascii="Times New Roman" w:hAnsi="Times New Roman" w:cs="Times New Roman"/>
@@ -2168,25 +1863,7 @@
                 <w:sz w:val="26"/>
                 <w:szCs w:val="26"/>
               </w:rPr>
-              <w:t>application</w:t>
-            </w:r>
-            <w:proofErr w:type="gramEnd"/>
-            <w:r>
-              <w:rPr>
-                <w:rFonts w:ascii="Times New Roman" w:hAnsi="Times New Roman" w:cs="Times New Roman"/>
-                <w:sz w:val="26"/>
-                <w:szCs w:val="26"/>
-              </w:rPr>
-              <w:t>_specific_text|</w:t>
-            </w:r>
-            <w:proofErr w:type="gramStart"/>
-            <w:r>
-              <w:rPr>
-                <w:rFonts w:ascii="Times New Roman" w:hAnsi="Times New Roman" w:cs="Times New Roman"/>
-                <w:sz w:val="26"/>
-                <w:szCs w:val="26"/>
-              </w:rPr>
-              <w:t>default</w:t>
+              <w:t>application_specific_text|default</w:t>
             </w:r>
             <w:proofErr w:type="spellEnd"/>
             <w:r>
@@ -2195,34 +1872,7 @@
                 <w:sz w:val="26"/>
                 <w:szCs w:val="26"/>
               </w:rPr>
-              <w:t>(</w:t>
-            </w:r>
-            <w:proofErr w:type="gramEnd"/>
-            <w:r>
-              <w:rPr>
-                <w:rFonts w:ascii="Times New Roman" w:hAnsi="Times New Roman" w:cs="Times New Roman"/>
-                <w:sz w:val="26"/>
-                <w:szCs w:val="26"/>
-              </w:rPr>
-              <w:t>''</w:t>
-            </w:r>
-            <w:proofErr w:type="gramStart"/>
-            <w:r>
-              <w:rPr>
-                <w:rFonts w:ascii="Times New Roman" w:hAnsi="Times New Roman" w:cs="Times New Roman"/>
-                <w:sz w:val="26"/>
-                <w:szCs w:val="26"/>
-              </w:rPr>
-              <w:t>) }</w:t>
-            </w:r>
-            <w:proofErr w:type="gramEnd"/>
-            <w:r>
-              <w:rPr>
-                <w:rFonts w:ascii="Times New Roman" w:hAnsi="Times New Roman" w:cs="Times New Roman"/>
-                <w:sz w:val="26"/>
-                <w:szCs w:val="26"/>
-              </w:rPr>
-              <w:t>}</w:t>
+              <w:t>('') }}</w:t>
             </w:r>
           </w:p>
           <w:p>
@@ -2347,7 +1997,6 @@
                 <w:szCs w:val="26"/>
               </w:rPr>
             </w:pPr>
-            <w:proofErr w:type="gramStart"/>
             <w:r>
               <w:rPr>
                 <w:rFonts w:ascii="Times New Roman" w:hAnsi="Times New Roman" w:cs="Times New Roman"/>
@@ -2363,25 +2012,7 @@
                 <w:sz w:val="26"/>
                 <w:szCs w:val="26"/>
               </w:rPr>
-              <w:t>special</w:t>
-            </w:r>
-            <w:proofErr w:type="gramEnd"/>
-            <w:r>
-              <w:rPr>
-                <w:rFonts w:ascii="Times New Roman" w:hAnsi="Times New Roman" w:cs="Times New Roman"/>
-                <w:sz w:val="26"/>
-                <w:szCs w:val="26"/>
-              </w:rPr>
-              <w:t>_layout|</w:t>
-            </w:r>
-            <w:proofErr w:type="gramStart"/>
-            <w:r>
-              <w:rPr>
-                <w:rFonts w:ascii="Times New Roman" w:hAnsi="Times New Roman" w:cs="Times New Roman"/>
-                <w:sz w:val="26"/>
-                <w:szCs w:val="26"/>
-              </w:rPr>
-              <w:t>default</w:t>
+              <w:t>special_layout|default</w:t>
             </w:r>
             <w:proofErr w:type="spellEnd"/>
             <w:r>
@@ -2390,46 +2021,18 @@
                 <w:sz w:val="26"/>
                 <w:szCs w:val="26"/>
               </w:rPr>
-              <w:t>(</w:t>
-            </w:r>
-            <w:proofErr w:type="gramEnd"/>
-            <w:r>
-              <w:rPr>
-                <w:rFonts w:ascii="Times New Roman" w:hAnsi="Times New Roman" w:cs="Times New Roman"/>
-                <w:sz w:val="26"/>
-                <w:szCs w:val="26"/>
-              </w:rPr>
-              <w:t>''</w:t>
-            </w:r>
-            <w:proofErr w:type="gramStart"/>
-            <w:r>
-              <w:rPr>
-                <w:rFonts w:ascii="Times New Roman" w:hAnsi="Times New Roman" w:cs="Times New Roman"/>
-                <w:sz w:val="26"/>
-                <w:szCs w:val="26"/>
-              </w:rPr>
-              <w:t>) }</w:t>
-            </w:r>
-            <w:proofErr w:type="gramEnd"/>
-            <w:r>
-              <w:rPr>
-                <w:rFonts w:ascii="Times New Roman" w:hAnsi="Times New Roman" w:cs="Times New Roman"/>
-                <w:sz w:val="26"/>
-                <w:szCs w:val="26"/>
-              </w:rPr>
-              <w:t>}</w:t>
-            </w:r>
-          </w:p>
-          <w:p>
-            <w:pPr>
-              <w:jc w:val="left"/>
-              <w:rPr>
-                <w:rFonts w:ascii="Times New Roman" w:hAnsi="Times New Roman" w:cs="Times New Roman"/>
-                <w:sz w:val="26"/>
-                <w:szCs w:val="26"/>
-              </w:rPr>
-            </w:pPr>
-            <w:proofErr w:type="gramStart"/>
+              <w:t>('') }}</w:t>
+            </w:r>
+          </w:p>
+          <w:p>
+            <w:pPr>
+              <w:jc w:val="left"/>
+              <w:rPr>
+                <w:rFonts w:ascii="Times New Roman" w:hAnsi="Times New Roman" w:cs="Times New Roman"/>
+                <w:sz w:val="26"/>
+                <w:szCs w:val="26"/>
+              </w:rPr>
+            </w:pPr>
             <w:r>
               <w:rPr>
                 <w:rFonts w:ascii="Times New Roman" w:hAnsi="Times New Roman" w:cs="Times New Roman"/>
@@ -2445,25 +2048,7 @@
                 <w:sz w:val="26"/>
                 <w:szCs w:val="26"/>
               </w:rPr>
-              <w:t>conveyor</w:t>
-            </w:r>
-            <w:proofErr w:type="gramEnd"/>
-            <w:r>
-              <w:rPr>
-                <w:rFonts w:ascii="Times New Roman" w:hAnsi="Times New Roman" w:cs="Times New Roman"/>
-                <w:sz w:val="26"/>
-                <w:szCs w:val="26"/>
-              </w:rPr>
-              <w:t>_picture_name|</w:t>
-            </w:r>
-            <w:proofErr w:type="gramStart"/>
-            <w:r>
-              <w:rPr>
-                <w:rFonts w:ascii="Times New Roman" w:hAnsi="Times New Roman" w:cs="Times New Roman"/>
-                <w:sz w:val="26"/>
-                <w:szCs w:val="26"/>
-              </w:rPr>
-              <w:t>default</w:t>
+              <w:t>conveyor_picture_name|default</w:t>
             </w:r>
             <w:proofErr w:type="spellEnd"/>
             <w:r>
@@ -2472,34 +2057,7 @@
                 <w:sz w:val="26"/>
                 <w:szCs w:val="26"/>
               </w:rPr>
-              <w:t>(</w:t>
-            </w:r>
-            <w:proofErr w:type="gramEnd"/>
-            <w:r>
-              <w:rPr>
-                <w:rFonts w:ascii="Times New Roman" w:hAnsi="Times New Roman" w:cs="Times New Roman"/>
-                <w:sz w:val="26"/>
-                <w:szCs w:val="26"/>
-              </w:rPr>
-              <w:t>''</w:t>
-            </w:r>
-            <w:proofErr w:type="gramStart"/>
-            <w:r>
-              <w:rPr>
-                <w:rFonts w:ascii="Times New Roman" w:hAnsi="Times New Roman" w:cs="Times New Roman"/>
-                <w:sz w:val="26"/>
-                <w:szCs w:val="26"/>
-              </w:rPr>
-              <w:t>) }</w:t>
-            </w:r>
-            <w:proofErr w:type="gramEnd"/>
-            <w:r>
-              <w:rPr>
-                <w:rFonts w:ascii="Times New Roman" w:hAnsi="Times New Roman" w:cs="Times New Roman"/>
-                <w:sz w:val="26"/>
-                <w:szCs w:val="26"/>
-              </w:rPr>
-              <w:t>}</w:t>
+              <w:t>('') }}</w:t>
             </w:r>
           </w:p>
           <w:p>
@@ -2534,16 +2092,7 @@
                 <w:sz w:val="26"/>
                 <w:szCs w:val="26"/>
               </w:rPr>
-              <w:t>xpl_xna_summary_text|</w:t>
-            </w:r>
-            <w:proofErr w:type="gramStart"/>
-            <w:r>
-              <w:rPr>
-                <w:rFonts w:ascii="Times New Roman" w:hAnsi="Times New Roman" w:cs="Times New Roman"/>
-                <w:sz w:val="26"/>
-                <w:szCs w:val="26"/>
-              </w:rPr>
-              <w:t>default</w:t>
+              <w:t>xpl_xna_summary_text|default</w:t>
             </w:r>
             <w:proofErr w:type="spellEnd"/>
             <w:r>
@@ -2552,16 +2101,7 @@
                 <w:sz w:val="26"/>
                 <w:szCs w:val="26"/>
               </w:rPr>
-              <w:t>(</w:t>
-            </w:r>
-            <w:proofErr w:type="gramEnd"/>
-            <w:r>
-              <w:rPr>
-                <w:rFonts w:ascii="Times New Roman" w:hAnsi="Times New Roman" w:cs="Times New Roman"/>
-                <w:sz w:val="26"/>
-                <w:szCs w:val="26"/>
-              </w:rPr>
-              <w:t>'') }}</w:t>
+              <w:t>('') }}</w:t>
             </w:r>
           </w:p>
         </w:tc>
@@ -2629,7 +2169,6 @@
                 <w:szCs w:val="26"/>
               </w:rPr>
             </w:pPr>
-            <w:proofErr w:type="gramStart"/>
             <w:r>
               <w:rPr>
                 <w:rFonts w:ascii="Times New Roman" w:hAnsi="Times New Roman" w:cs="Times New Roman"/>
@@ -2638,7 +2177,6 @@
               </w:rPr>
               <w:t>Load</w:t>
             </w:r>
-            <w:proofErr w:type="gramEnd"/>
           </w:p>
           <w:p>
             <w:pPr>
@@ -3044,7 +2582,6 @@
                 <w:szCs w:val="26"/>
               </w:rPr>
             </w:pPr>
-            <w:proofErr w:type="gramStart"/>
             <w:r>
               <w:rPr>
                 <w:rFonts w:ascii="Times New Roman" w:hAnsi="Times New Roman" w:cs="Times New Roman"/>
@@ -3060,25 +2597,7 @@
                 <w:sz w:val="26"/>
                 <w:szCs w:val="26"/>
               </w:rPr>
-              <w:t>load</w:t>
-            </w:r>
-            <w:proofErr w:type="gramEnd"/>
-            <w:r>
-              <w:rPr>
-                <w:rFonts w:ascii="Times New Roman" w:hAnsi="Times New Roman" w:cs="Times New Roman"/>
-                <w:sz w:val="26"/>
-                <w:szCs w:val="26"/>
-              </w:rPr>
-              <w:t>_weight_text|</w:t>
-            </w:r>
-            <w:proofErr w:type="gramStart"/>
-            <w:r>
-              <w:rPr>
-                <w:rFonts w:ascii="Times New Roman" w:hAnsi="Times New Roman" w:cs="Times New Roman"/>
-                <w:sz w:val="26"/>
-                <w:szCs w:val="26"/>
-              </w:rPr>
-              <w:t>default</w:t>
+              <w:t>load_weight_text|default</w:t>
             </w:r>
             <w:proofErr w:type="spellEnd"/>
             <w:r>
@@ -3087,16 +2606,7 @@
                 <w:sz w:val="26"/>
                 <w:szCs w:val="26"/>
               </w:rPr>
-              <w:t>(</w:t>
-            </w:r>
-            <w:proofErr w:type="gramEnd"/>
-            <w:r>
-              <w:rPr>
-                <w:rFonts w:ascii="Times New Roman" w:hAnsi="Times New Roman" w:cs="Times New Roman"/>
-                <w:sz w:val="26"/>
-                <w:szCs w:val="26"/>
-              </w:rPr>
-              <w:t>'') }}</w:t>
+              <w:t>('') }}</w:t>
             </w:r>
           </w:p>
         </w:tc>
@@ -3500,7 +3010,6 @@
               <w:t xml:space="preserve"> flow </w:t>
             </w:r>
             <w:proofErr w:type="spellStart"/>
-            <w:proofErr w:type="gramStart"/>
             <w:r>
               <w:rPr>
                 <w:rFonts w:ascii="Times New Roman" w:hAnsi="Times New Roman" w:cs="Times New Roman"/>
@@ -3518,9 +3027,9 @@
                 <w:szCs w:val="26"/>
                 <w:lang w:val="fr-BE"/>
               </w:rPr>
-              <w:t>:</w:t>
-            </w:r>
-            <w:proofErr w:type="gramEnd"/>
+              <w:t xml:space="preserve">: {{ </w:t>
+            </w:r>
+            <w:proofErr w:type="spellStart"/>
             <w:r>
               <w:rPr>
                 <w:rFonts w:ascii="Times New Roman" w:hAnsi="Times New Roman" w:cs="Times New Roman"/>
@@ -3528,9 +3037,9 @@
                 <w:szCs w:val="26"/>
                 <w:lang w:val="fr-BE"/>
               </w:rPr>
-              <w:t xml:space="preserve"> </w:t>
-            </w:r>
-            <w:proofErr w:type="gramStart"/>
+              <w:t>flow_steps|default</w:t>
+            </w:r>
+            <w:proofErr w:type="spellEnd"/>
             <w:r>
               <w:rPr>
                 <w:rFonts w:ascii="Times New Roman" w:hAnsi="Times New Roman" w:cs="Times New Roman"/>
@@ -3538,57 +3047,7 @@
                 <w:szCs w:val="26"/>
                 <w:lang w:val="fr-BE"/>
               </w:rPr>
-              <w:t xml:space="preserve">{{ </w:t>
-            </w:r>
-            <w:proofErr w:type="spellStart"/>
-            <w:r>
-              <w:rPr>
-                <w:rFonts w:ascii="Times New Roman" w:hAnsi="Times New Roman" w:cs="Times New Roman"/>
-                <w:sz w:val="26"/>
-                <w:szCs w:val="26"/>
-                <w:lang w:val="fr-BE"/>
-              </w:rPr>
-              <w:t>flow</w:t>
-            </w:r>
-            <w:proofErr w:type="gramEnd"/>
-            <w:r>
-              <w:rPr>
-                <w:rFonts w:ascii="Times New Roman" w:hAnsi="Times New Roman" w:cs="Times New Roman"/>
-                <w:sz w:val="26"/>
-                <w:szCs w:val="26"/>
-                <w:lang w:val="fr-BE"/>
-              </w:rPr>
-              <w:t>_steps|</w:t>
-            </w:r>
-            <w:proofErr w:type="gramStart"/>
-            <w:r>
-              <w:rPr>
-                <w:rFonts w:ascii="Times New Roman" w:hAnsi="Times New Roman" w:cs="Times New Roman"/>
-                <w:sz w:val="26"/>
-                <w:szCs w:val="26"/>
-                <w:lang w:val="fr-BE"/>
-              </w:rPr>
-              <w:t>default</w:t>
-            </w:r>
-            <w:proofErr w:type="spellEnd"/>
-            <w:r>
-              <w:rPr>
-                <w:rFonts w:ascii="Times New Roman" w:hAnsi="Times New Roman" w:cs="Times New Roman"/>
-                <w:sz w:val="26"/>
-                <w:szCs w:val="26"/>
-                <w:lang w:val="fr-BE"/>
-              </w:rPr>
-              <w:t>(</w:t>
-            </w:r>
-            <w:proofErr w:type="gramEnd"/>
-            <w:r>
-              <w:rPr>
-                <w:rFonts w:ascii="Times New Roman" w:hAnsi="Times New Roman" w:cs="Times New Roman"/>
-                <w:sz w:val="26"/>
-                <w:szCs w:val="26"/>
-                <w:lang w:val="fr-BE"/>
-              </w:rPr>
-              <w:t>'') }}</w:t>
+              <w:t>('') }}</w:t>
             </w:r>
             <w:r>
               <w:rPr>
@@ -3601,7 +3060,6 @@
               <w:t xml:space="preserve">Route </w:t>
             </w:r>
             <w:proofErr w:type="spellStart"/>
-            <w:proofErr w:type="gramStart"/>
             <w:r>
               <w:rPr>
                 <w:rFonts w:ascii="Times New Roman" w:hAnsi="Times New Roman" w:cs="Times New Roman"/>
@@ -3621,7 +3079,6 @@
               </w:rPr>
               <w:t>:</w:t>
             </w:r>
-            <w:proofErr w:type="gramEnd"/>
             <w:r>
               <w:rPr>
                 <w:rFonts w:ascii="Times New Roman" w:hAnsi="Times New Roman" w:cs="Times New Roman"/>
@@ -3630,8 +3087,9 @@
                 <w:lang w:val="fr-BE"/>
               </w:rPr>
               <w:br/>
-            </w:r>
-            <w:proofErr w:type="gramStart"/>
+              <w:t xml:space="preserve">{{ </w:t>
+            </w:r>
+            <w:proofErr w:type="spellStart"/>
             <w:r>
               <w:rPr>
                 <w:rFonts w:ascii="Times New Roman" w:hAnsi="Times New Roman" w:cs="Times New Roman"/>
@@ -3639,6 +3097,164 @@
                 <w:szCs w:val="26"/>
                 <w:lang w:val="fr-BE"/>
               </w:rPr>
+              <w:t>route_summary|default</w:t>
+            </w:r>
+            <w:proofErr w:type="spellEnd"/>
+            <w:r>
+              <w:rPr>
+                <w:rFonts w:ascii="Times New Roman" w:hAnsi="Times New Roman" w:cs="Times New Roman"/>
+                <w:sz w:val="26"/>
+                <w:szCs w:val="26"/>
+                <w:lang w:val="fr-BE"/>
+              </w:rPr>
+              <w:t>('') }}</w:t>
+            </w:r>
+            <w:r>
+              <w:rPr>
+                <w:rFonts w:ascii="Times New Roman" w:hAnsi="Times New Roman" w:cs="Times New Roman"/>
+                <w:sz w:val="26"/>
+                <w:szCs w:val="26"/>
+                <w:lang w:val="fr-BE"/>
+              </w:rPr>
+              <w:br/>
+            </w:r>
+            <w:proofErr w:type="spellStart"/>
+            <w:r>
+              <w:rPr>
+                <w:rFonts w:ascii="Times New Roman" w:hAnsi="Times New Roman" w:cs="Times New Roman"/>
+                <w:sz w:val="26"/>
+                <w:szCs w:val="26"/>
+                <w:lang w:val="fr-BE"/>
+              </w:rPr>
+              <w:t>Material</w:t>
+            </w:r>
+            <w:proofErr w:type="spellEnd"/>
+            <w:r>
+              <w:rPr>
+                <w:rFonts w:ascii="Times New Roman" w:hAnsi="Times New Roman" w:cs="Times New Roman"/>
+                <w:sz w:val="26"/>
+                <w:szCs w:val="26"/>
+                <w:lang w:val="fr-BE"/>
+              </w:rPr>
+              <w:t xml:space="preserve"> flow </w:t>
+            </w:r>
+            <w:proofErr w:type="spellStart"/>
+            <w:r>
+              <w:rPr>
+                <w:rFonts w:ascii="Times New Roman" w:hAnsi="Times New Roman" w:cs="Times New Roman"/>
+                <w:sz w:val="26"/>
+                <w:szCs w:val="26"/>
+                <w:lang w:val="fr-BE"/>
+              </w:rPr>
+              <w:t>details</w:t>
+            </w:r>
+            <w:proofErr w:type="spellEnd"/>
+            <w:r>
+              <w:rPr>
+                <w:rFonts w:ascii="Times New Roman" w:hAnsi="Times New Roman" w:cs="Times New Roman"/>
+                <w:sz w:val="26"/>
+                <w:szCs w:val="26"/>
+                <w:lang w:val="fr-BE"/>
+              </w:rPr>
+              <w:t xml:space="preserve"> / </w:t>
+            </w:r>
+            <w:proofErr w:type="spellStart"/>
+            <w:r>
+              <w:rPr>
+                <w:rFonts w:ascii="Times New Roman" w:hAnsi="Times New Roman" w:cs="Times New Roman"/>
+                <w:sz w:val="26"/>
+                <w:szCs w:val="26"/>
+                <w:lang w:val="fr-BE"/>
+              </w:rPr>
+              <w:t>summary</w:t>
+            </w:r>
+            <w:proofErr w:type="spellEnd"/>
+            <w:r>
+              <w:rPr>
+                <w:rFonts w:ascii="Times New Roman" w:hAnsi="Times New Roman" w:cs="Times New Roman"/>
+                <w:sz w:val="26"/>
+                <w:szCs w:val="26"/>
+                <w:lang w:val="fr-BE"/>
+              </w:rPr>
+              <w:t xml:space="preserve">: {{ </w:t>
+            </w:r>
+            <w:proofErr w:type="spellStart"/>
+            <w:r>
+              <w:rPr>
+                <w:rFonts w:ascii="Times New Roman" w:hAnsi="Times New Roman" w:cs="Times New Roman"/>
+                <w:sz w:val="26"/>
+                <w:szCs w:val="26"/>
+                <w:lang w:val="fr-BE"/>
+              </w:rPr>
+              <w:t>material_flow_text|default</w:t>
+            </w:r>
+            <w:proofErr w:type="spellEnd"/>
+            <w:r>
+              <w:rPr>
+                <w:rFonts w:ascii="Times New Roman" w:hAnsi="Times New Roman" w:cs="Times New Roman"/>
+                <w:sz w:val="26"/>
+                <w:szCs w:val="26"/>
+                <w:lang w:val="fr-BE"/>
+              </w:rPr>
+              <w:t>('') }}</w:t>
+            </w:r>
+            <w:r>
+              <w:rPr>
+                <w:rFonts w:ascii="Times New Roman" w:hAnsi="Times New Roman" w:cs="Times New Roman"/>
+                <w:sz w:val="26"/>
+                <w:szCs w:val="26"/>
+                <w:lang w:val="fr-BE"/>
+              </w:rPr>
+              <w:br/>
+            </w:r>
+            <w:proofErr w:type="spellStart"/>
+            <w:r>
+              <w:rPr>
+                <w:rFonts w:ascii="Times New Roman" w:hAnsi="Times New Roman" w:cs="Times New Roman"/>
+                <w:sz w:val="26"/>
+                <w:szCs w:val="26"/>
+                <w:lang w:val="fr-BE"/>
+              </w:rPr>
+              <w:t>Detailed</w:t>
+            </w:r>
+            <w:proofErr w:type="spellEnd"/>
+            <w:r>
+              <w:rPr>
+                <w:rFonts w:ascii="Times New Roman" w:hAnsi="Times New Roman" w:cs="Times New Roman"/>
+                <w:sz w:val="26"/>
+                <w:szCs w:val="26"/>
+                <w:lang w:val="fr-BE"/>
+              </w:rPr>
+              <w:t xml:space="preserve"> </w:t>
+            </w:r>
+            <w:proofErr w:type="spellStart"/>
+            <w:r>
+              <w:rPr>
+                <w:rFonts w:ascii="Times New Roman" w:hAnsi="Times New Roman" w:cs="Times New Roman"/>
+                <w:sz w:val="26"/>
+                <w:szCs w:val="26"/>
+                <w:lang w:val="fr-BE"/>
+              </w:rPr>
+              <w:t>step</w:t>
+            </w:r>
+            <w:proofErr w:type="spellEnd"/>
+            <w:r>
+              <w:rPr>
+                <w:rFonts w:ascii="Times New Roman" w:hAnsi="Times New Roman" w:cs="Times New Roman"/>
+                <w:sz w:val="26"/>
+                <w:szCs w:val="26"/>
+                <w:lang w:val="fr-BE"/>
+              </w:rPr>
+              <w:t xml:space="preserve"> notes:</w:t>
+            </w:r>
+            <w:r>
+              <w:rPr>
+                <w:rFonts w:ascii="Times New Roman" w:hAnsi="Times New Roman" w:cs="Times New Roman"/>
+                <w:sz w:val="26"/>
+                <w:szCs w:val="26"/>
+                <w:lang w:val="fr-BE"/>
+              </w:rPr>
+              <w:br/>
               <w:t xml:space="preserve">{{ </w:t>
             </w:r>
             <w:proofErr w:type="spellStart"/>
@@ -3649,9 +3265,9 @@
                 <w:szCs w:val="26"/>
                 <w:lang w:val="fr-BE"/>
               </w:rPr>
-              <w:t>route</w:t>
-            </w:r>
-            <w:proofErr w:type="gramEnd"/>
+              <w:t>material_step_details_text|default</w:t>
+            </w:r>
+            <w:proofErr w:type="spellEnd"/>
             <w:r>
               <w:rPr>
                 <w:rFonts w:ascii="Times New Roman" w:hAnsi="Times New Roman" w:cs="Times New Roman"/>
@@ -3659,306 +3275,7 @@
                 <w:szCs w:val="26"/>
                 <w:lang w:val="fr-BE"/>
               </w:rPr>
-              <w:t>_summary|</w:t>
-            </w:r>
-            <w:proofErr w:type="gramStart"/>
-            <w:r>
-              <w:rPr>
-                <w:rFonts w:ascii="Times New Roman" w:hAnsi="Times New Roman" w:cs="Times New Roman"/>
-                <w:sz w:val="26"/>
-                <w:szCs w:val="26"/>
-                <w:lang w:val="fr-BE"/>
-              </w:rPr>
-              <w:t>default</w:t>
-            </w:r>
-            <w:proofErr w:type="spellEnd"/>
-            <w:r>
-              <w:rPr>
-                <w:rFonts w:ascii="Times New Roman" w:hAnsi="Times New Roman" w:cs="Times New Roman"/>
-                <w:sz w:val="26"/>
-                <w:szCs w:val="26"/>
-                <w:lang w:val="fr-BE"/>
-              </w:rPr>
-              <w:t>(</w:t>
-            </w:r>
-            <w:proofErr w:type="gramEnd"/>
-            <w:r>
-              <w:rPr>
-                <w:rFonts w:ascii="Times New Roman" w:hAnsi="Times New Roman" w:cs="Times New Roman"/>
-                <w:sz w:val="26"/>
-                <w:szCs w:val="26"/>
-                <w:lang w:val="fr-BE"/>
-              </w:rPr>
-              <w:t>'') }}</w:t>
-            </w:r>
-            <w:r>
-              <w:rPr>
-                <w:rFonts w:ascii="Times New Roman" w:hAnsi="Times New Roman" w:cs="Times New Roman"/>
-                <w:sz w:val="26"/>
-                <w:szCs w:val="26"/>
-                <w:lang w:val="fr-BE"/>
-              </w:rPr>
-              <w:br/>
-            </w:r>
-            <w:proofErr w:type="spellStart"/>
-            <w:r>
-              <w:rPr>
-                <w:rFonts w:ascii="Times New Roman" w:hAnsi="Times New Roman" w:cs="Times New Roman"/>
-                <w:sz w:val="26"/>
-                <w:szCs w:val="26"/>
-                <w:lang w:val="fr-BE"/>
-              </w:rPr>
-              <w:t>Material</w:t>
-            </w:r>
-            <w:proofErr w:type="spellEnd"/>
-            <w:r>
-              <w:rPr>
-                <w:rFonts w:ascii="Times New Roman" w:hAnsi="Times New Roman" w:cs="Times New Roman"/>
-                <w:sz w:val="26"/>
-                <w:szCs w:val="26"/>
-                <w:lang w:val="fr-BE"/>
-              </w:rPr>
-              <w:t xml:space="preserve"> flow </w:t>
-            </w:r>
-            <w:proofErr w:type="spellStart"/>
-            <w:r>
-              <w:rPr>
-                <w:rFonts w:ascii="Times New Roman" w:hAnsi="Times New Roman" w:cs="Times New Roman"/>
-                <w:sz w:val="26"/>
-                <w:szCs w:val="26"/>
-                <w:lang w:val="fr-BE"/>
-              </w:rPr>
-              <w:t>details</w:t>
-            </w:r>
-            <w:proofErr w:type="spellEnd"/>
-            <w:r>
-              <w:rPr>
-                <w:rFonts w:ascii="Times New Roman" w:hAnsi="Times New Roman" w:cs="Times New Roman"/>
-                <w:sz w:val="26"/>
-                <w:szCs w:val="26"/>
-                <w:lang w:val="fr-BE"/>
-              </w:rPr>
-              <w:t xml:space="preserve"> / </w:t>
-            </w:r>
-            <w:proofErr w:type="spellStart"/>
-            <w:proofErr w:type="gramStart"/>
-            <w:r>
-              <w:rPr>
-                <w:rFonts w:ascii="Times New Roman" w:hAnsi="Times New Roman" w:cs="Times New Roman"/>
-                <w:sz w:val="26"/>
-                <w:szCs w:val="26"/>
-                <w:lang w:val="fr-BE"/>
-              </w:rPr>
-              <w:t>summary</w:t>
-            </w:r>
-            <w:proofErr w:type="spellEnd"/>
-            <w:r>
-              <w:rPr>
-                <w:rFonts w:ascii="Times New Roman" w:hAnsi="Times New Roman" w:cs="Times New Roman"/>
-                <w:sz w:val="26"/>
-                <w:szCs w:val="26"/>
-                <w:lang w:val="fr-BE"/>
-              </w:rPr>
-              <w:t>:</w:t>
-            </w:r>
-            <w:proofErr w:type="gramEnd"/>
-            <w:r>
-              <w:rPr>
-                <w:rFonts w:ascii="Times New Roman" w:hAnsi="Times New Roman" w:cs="Times New Roman"/>
-                <w:sz w:val="26"/>
-                <w:szCs w:val="26"/>
-                <w:lang w:val="fr-BE"/>
-              </w:rPr>
-              <w:t xml:space="preserve"> </w:t>
-            </w:r>
-            <w:proofErr w:type="gramStart"/>
-            <w:r>
-              <w:rPr>
-                <w:rFonts w:ascii="Times New Roman" w:hAnsi="Times New Roman" w:cs="Times New Roman"/>
-                <w:sz w:val="26"/>
-                <w:szCs w:val="26"/>
-                <w:lang w:val="fr-BE"/>
-              </w:rPr>
-              <w:t xml:space="preserve">{{ </w:t>
-            </w:r>
-            <w:proofErr w:type="spellStart"/>
-            <w:r>
-              <w:rPr>
-                <w:rFonts w:ascii="Times New Roman" w:hAnsi="Times New Roman" w:cs="Times New Roman"/>
-                <w:sz w:val="26"/>
-                <w:szCs w:val="26"/>
-                <w:lang w:val="fr-BE"/>
-              </w:rPr>
-              <w:t>material</w:t>
-            </w:r>
-            <w:proofErr w:type="gramEnd"/>
-            <w:r>
-              <w:rPr>
-                <w:rFonts w:ascii="Times New Roman" w:hAnsi="Times New Roman" w:cs="Times New Roman"/>
-                <w:sz w:val="26"/>
-                <w:szCs w:val="26"/>
-                <w:lang w:val="fr-BE"/>
-              </w:rPr>
-              <w:t>_flow_text|</w:t>
-            </w:r>
-            <w:proofErr w:type="gramStart"/>
-            <w:r>
-              <w:rPr>
-                <w:rFonts w:ascii="Times New Roman" w:hAnsi="Times New Roman" w:cs="Times New Roman"/>
-                <w:sz w:val="26"/>
-                <w:szCs w:val="26"/>
-                <w:lang w:val="fr-BE"/>
-              </w:rPr>
-              <w:t>default</w:t>
-            </w:r>
-            <w:proofErr w:type="spellEnd"/>
-            <w:r>
-              <w:rPr>
-                <w:rFonts w:ascii="Times New Roman" w:hAnsi="Times New Roman" w:cs="Times New Roman"/>
-                <w:sz w:val="26"/>
-                <w:szCs w:val="26"/>
-                <w:lang w:val="fr-BE"/>
-              </w:rPr>
-              <w:t>(</w:t>
-            </w:r>
-            <w:proofErr w:type="gramEnd"/>
-            <w:r>
-              <w:rPr>
-                <w:rFonts w:ascii="Times New Roman" w:hAnsi="Times New Roman" w:cs="Times New Roman"/>
-                <w:sz w:val="26"/>
-                <w:szCs w:val="26"/>
-                <w:lang w:val="fr-BE"/>
-              </w:rPr>
-              <w:t>'') }}</w:t>
-            </w:r>
-            <w:r>
-              <w:rPr>
-                <w:rFonts w:ascii="Times New Roman" w:hAnsi="Times New Roman" w:cs="Times New Roman"/>
-                <w:sz w:val="26"/>
-                <w:szCs w:val="26"/>
-                <w:lang w:val="fr-BE"/>
-              </w:rPr>
-              <w:br/>
-            </w:r>
-            <w:proofErr w:type="spellStart"/>
-            <w:r>
-              <w:rPr>
-                <w:rFonts w:ascii="Times New Roman" w:hAnsi="Times New Roman" w:cs="Times New Roman"/>
-                <w:sz w:val="26"/>
-                <w:szCs w:val="26"/>
-                <w:lang w:val="fr-BE"/>
-              </w:rPr>
-              <w:t>Detailed</w:t>
-            </w:r>
-            <w:proofErr w:type="spellEnd"/>
-            <w:r>
-              <w:rPr>
-                <w:rFonts w:ascii="Times New Roman" w:hAnsi="Times New Roman" w:cs="Times New Roman"/>
-                <w:sz w:val="26"/>
-                <w:szCs w:val="26"/>
-                <w:lang w:val="fr-BE"/>
-              </w:rPr>
-              <w:t xml:space="preserve"> </w:t>
-            </w:r>
-            <w:proofErr w:type="spellStart"/>
-            <w:r>
-              <w:rPr>
-                <w:rFonts w:ascii="Times New Roman" w:hAnsi="Times New Roman" w:cs="Times New Roman"/>
-                <w:sz w:val="26"/>
-                <w:szCs w:val="26"/>
-                <w:lang w:val="fr-BE"/>
-              </w:rPr>
-              <w:t>step</w:t>
-            </w:r>
-            <w:proofErr w:type="spellEnd"/>
-            <w:r>
-              <w:rPr>
-                <w:rFonts w:ascii="Times New Roman" w:hAnsi="Times New Roman" w:cs="Times New Roman"/>
-                <w:sz w:val="26"/>
-                <w:szCs w:val="26"/>
-                <w:lang w:val="fr-BE"/>
-              </w:rPr>
-              <w:t xml:space="preserve"> </w:t>
-            </w:r>
-            <w:proofErr w:type="gramStart"/>
-            <w:r>
-              <w:rPr>
-                <w:rFonts w:ascii="Times New Roman" w:hAnsi="Times New Roman" w:cs="Times New Roman"/>
-                <w:sz w:val="26"/>
-                <w:szCs w:val="26"/>
-                <w:lang w:val="fr-BE"/>
-              </w:rPr>
-              <w:t>notes:</w:t>
-            </w:r>
-            <w:proofErr w:type="gramEnd"/>
-            <w:r>
-              <w:rPr>
-                <w:rFonts w:ascii="Times New Roman" w:hAnsi="Times New Roman" w:cs="Times New Roman"/>
-                <w:sz w:val="26"/>
-                <w:szCs w:val="26"/>
-                <w:lang w:val="fr-BE"/>
-              </w:rPr>
-              <w:br/>
-            </w:r>
-            <w:proofErr w:type="gramStart"/>
-            <w:r>
-              <w:rPr>
-                <w:rFonts w:ascii="Times New Roman" w:hAnsi="Times New Roman" w:cs="Times New Roman"/>
-                <w:sz w:val="26"/>
-                <w:szCs w:val="26"/>
-                <w:lang w:val="fr-BE"/>
-              </w:rPr>
-              <w:t xml:space="preserve">{{ </w:t>
-            </w:r>
-            <w:proofErr w:type="spellStart"/>
-            <w:r>
-              <w:rPr>
-                <w:rFonts w:ascii="Times New Roman" w:hAnsi="Times New Roman" w:cs="Times New Roman"/>
-                <w:sz w:val="26"/>
-                <w:szCs w:val="26"/>
-                <w:lang w:val="fr-BE"/>
-              </w:rPr>
-              <w:t>material</w:t>
-            </w:r>
-            <w:proofErr w:type="gramEnd"/>
-            <w:r>
-              <w:rPr>
-                <w:rFonts w:ascii="Times New Roman" w:hAnsi="Times New Roman" w:cs="Times New Roman"/>
-                <w:sz w:val="26"/>
-                <w:szCs w:val="26"/>
-                <w:lang w:val="fr-BE"/>
-              </w:rPr>
-              <w:t>_step_details_text|</w:t>
-            </w:r>
-            <w:proofErr w:type="gramStart"/>
-            <w:r>
-              <w:rPr>
-                <w:rFonts w:ascii="Times New Roman" w:hAnsi="Times New Roman" w:cs="Times New Roman"/>
-                <w:sz w:val="26"/>
-                <w:szCs w:val="26"/>
-                <w:lang w:val="fr-BE"/>
-              </w:rPr>
-              <w:t>default</w:t>
-            </w:r>
-            <w:proofErr w:type="spellEnd"/>
-            <w:r>
-              <w:rPr>
-                <w:rFonts w:ascii="Times New Roman" w:hAnsi="Times New Roman" w:cs="Times New Roman"/>
-                <w:sz w:val="26"/>
-                <w:szCs w:val="26"/>
-                <w:lang w:val="fr-BE"/>
-              </w:rPr>
-              <w:t>(</w:t>
-            </w:r>
-            <w:proofErr w:type="gramEnd"/>
-            <w:r>
-              <w:rPr>
-                <w:rFonts w:ascii="Times New Roman" w:hAnsi="Times New Roman" w:cs="Times New Roman"/>
-                <w:sz w:val="26"/>
-                <w:szCs w:val="26"/>
-                <w:lang w:val="fr-BE"/>
-              </w:rPr>
-              <w:t>'') }}</w:t>
+              <w:t>('') }}</w:t>
             </w:r>
             <w:r>
               <w:rPr>
@@ -3988,9 +3305,8 @@
                 <w:szCs w:val="26"/>
                 <w:lang w:val="fr-BE"/>
               </w:rPr>
-              <w:t xml:space="preserve"> / direct flows / </w:t>
-            </w:r>
-            <w:proofErr w:type="gramStart"/>
+              <w:t xml:space="preserve"> / direct flows / notes:</w:t>
+            </w:r>
             <w:r>
               <w:rPr>
                 <w:rFonts w:ascii="Times New Roman" w:hAnsi="Times New Roman" w:cs="Times New Roman"/>
@@ -3998,9 +3314,10 @@
                 <w:szCs w:val="26"/>
                 <w:lang w:val="fr-BE"/>
               </w:rPr>
-              <w:t>notes:</w:t>
-            </w:r>
-            <w:proofErr w:type="gramEnd"/>
+              <w:br/>
+              <w:t xml:space="preserve">{{ </w:t>
+            </w:r>
+            <w:proofErr w:type="spellStart"/>
             <w:r>
               <w:rPr>
                 <w:rFonts w:ascii="Times New Roman" w:hAnsi="Times New Roman" w:cs="Times New Roman"/>
@@ -4008,9 +3325,9 @@
                 <w:szCs w:val="26"/>
                 <w:lang w:val="fr-BE"/>
               </w:rPr>
-              <w:br/>
-            </w:r>
-            <w:proofErr w:type="gramStart"/>
+              <w:t>special_comments|default</w:t>
+            </w:r>
+            <w:proofErr w:type="spellEnd"/>
             <w:r>
               <w:rPr>
                 <w:rFonts w:ascii="Times New Roman" w:hAnsi="Times New Roman" w:cs="Times New Roman"/>
@@ -4018,57 +3335,7 @@
                 <w:szCs w:val="26"/>
                 <w:lang w:val="fr-BE"/>
               </w:rPr>
-              <w:t xml:space="preserve">{{ </w:t>
-            </w:r>
-            <w:proofErr w:type="spellStart"/>
-            <w:r>
-              <w:rPr>
-                <w:rFonts w:ascii="Times New Roman" w:hAnsi="Times New Roman" w:cs="Times New Roman"/>
-                <w:sz w:val="26"/>
-                <w:szCs w:val="26"/>
-                <w:lang w:val="fr-BE"/>
-              </w:rPr>
-              <w:t>special</w:t>
-            </w:r>
-            <w:proofErr w:type="gramEnd"/>
-            <w:r>
-              <w:rPr>
-                <w:rFonts w:ascii="Times New Roman" w:hAnsi="Times New Roman" w:cs="Times New Roman"/>
-                <w:sz w:val="26"/>
-                <w:szCs w:val="26"/>
-                <w:lang w:val="fr-BE"/>
-              </w:rPr>
-              <w:t>_comments|</w:t>
-            </w:r>
-            <w:proofErr w:type="gramStart"/>
-            <w:r>
-              <w:rPr>
-                <w:rFonts w:ascii="Times New Roman" w:hAnsi="Times New Roman" w:cs="Times New Roman"/>
-                <w:sz w:val="26"/>
-                <w:szCs w:val="26"/>
-                <w:lang w:val="fr-BE"/>
-              </w:rPr>
-              <w:t>default</w:t>
-            </w:r>
-            <w:proofErr w:type="spellEnd"/>
-            <w:r>
-              <w:rPr>
-                <w:rFonts w:ascii="Times New Roman" w:hAnsi="Times New Roman" w:cs="Times New Roman"/>
-                <w:sz w:val="26"/>
-                <w:szCs w:val="26"/>
-                <w:lang w:val="fr-BE"/>
-              </w:rPr>
-              <w:t>(</w:t>
-            </w:r>
-            <w:proofErr w:type="gramEnd"/>
-            <w:r>
-              <w:rPr>
-                <w:rFonts w:ascii="Times New Roman" w:hAnsi="Times New Roman" w:cs="Times New Roman"/>
-                <w:sz w:val="26"/>
-                <w:szCs w:val="26"/>
-                <w:lang w:val="fr-BE"/>
-              </w:rPr>
-              <w:t>'') }}</w:t>
+              <w:t>('') }}</w:t>
             </w:r>
           </w:p>
         </w:tc>
@@ -4203,16 +3470,7 @@
                 <w:szCs w:val="26"/>
               </w:rPr>
               <w:br/>
-              <w:t xml:space="preserve">See attached CAD / layout file: </w:t>
-            </w:r>
-            <w:proofErr w:type="gramStart"/>
-            <w:r>
-              <w:rPr>
-                <w:rFonts w:ascii="Times New Roman" w:hAnsi="Times New Roman" w:cs="Times New Roman"/>
-                <w:sz w:val="26"/>
-                <w:szCs w:val="26"/>
-              </w:rPr>
-              <w:t xml:space="preserve">{{ </w:t>
+              <w:t xml:space="preserve">See attached CAD / layout file: {{ </w:t>
             </w:r>
             <w:proofErr w:type="spellStart"/>
             <w:r>
@@ -4221,25 +3479,7 @@
                 <w:sz w:val="26"/>
                 <w:szCs w:val="26"/>
               </w:rPr>
-              <w:t>cad</w:t>
-            </w:r>
-            <w:proofErr w:type="gramEnd"/>
-            <w:r>
-              <w:rPr>
-                <w:rFonts w:ascii="Times New Roman" w:hAnsi="Times New Roman" w:cs="Times New Roman"/>
-                <w:sz w:val="26"/>
-                <w:szCs w:val="26"/>
-              </w:rPr>
-              <w:t>_filename|</w:t>
-            </w:r>
-            <w:proofErr w:type="gramStart"/>
-            <w:r>
-              <w:rPr>
-                <w:rFonts w:ascii="Times New Roman" w:hAnsi="Times New Roman" w:cs="Times New Roman"/>
-                <w:sz w:val="26"/>
-                <w:szCs w:val="26"/>
-              </w:rPr>
-              <w:t>default</w:t>
+              <w:t>cad_filename|default</w:t>
             </w:r>
             <w:proofErr w:type="spellEnd"/>
             <w:r>
@@ -4248,16 +3488,7 @@
                 <w:sz w:val="26"/>
                 <w:szCs w:val="26"/>
               </w:rPr>
-              <w:t>(</w:t>
-            </w:r>
-            <w:proofErr w:type="gramEnd"/>
-            <w:r>
-              <w:rPr>
-                <w:rFonts w:ascii="Times New Roman" w:hAnsi="Times New Roman" w:cs="Times New Roman"/>
-                <w:sz w:val="26"/>
-                <w:szCs w:val="26"/>
-              </w:rPr>
-              <w:t>'') }}</w:t>
+              <w:t>('') }}</w:t>
             </w:r>
           </w:p>
         </w:tc>
@@ -4535,147 +3766,63 @@
               <w:rPr>
                 <w:lang w:val="en-BE"/>
               </w:rPr>
-              <w:t xml:space="preserve">Site Wi-Fi available: </w:t>
-            </w:r>
-            <w:proofErr w:type="gramStart"/>
+              <w:t xml:space="preserve">Site Wi-Fi available: {{ </w:t>
+            </w:r>
+            <w:proofErr w:type="spellStart"/>
             <w:r>
               <w:rPr>
                 <w:lang w:val="en-BE"/>
               </w:rPr>
-              <w:t xml:space="preserve">{{ </w:t>
+              <w:t>site_wifi_available|default</w:t>
+            </w:r>
+            <w:proofErr w:type="spellEnd"/>
+            <w:r>
+              <w:rPr>
+                <w:lang w:val="en-BE"/>
+              </w:rPr>
+              <w:t>('') }}</w:t>
+            </w:r>
+            <w:r>
+              <w:rPr>
+                <w:lang w:val="en-BE"/>
+              </w:rPr>
+              <w:br/>
+              <w:t xml:space="preserve">Network status: {{ </w:t>
             </w:r>
             <w:proofErr w:type="spellStart"/>
             <w:r>
               <w:rPr>
                 <w:lang w:val="en-BE"/>
               </w:rPr>
-              <w:t>site</w:t>
-            </w:r>
-            <w:proofErr w:type="gramEnd"/>
+              <w:t>network_status|default</w:t>
+            </w:r>
+            <w:proofErr w:type="spellEnd"/>
             <w:r>
               <w:rPr>
                 <w:lang w:val="en-BE"/>
               </w:rPr>
-              <w:t>_wifi_available|</w:t>
-            </w:r>
-            <w:proofErr w:type="gramStart"/>
+              <w:t>('') }}</w:t>
+            </w:r>
             <w:r>
               <w:rPr>
                 <w:lang w:val="en-BE"/>
               </w:rPr>
-              <w:t>default</w:t>
+              <w:br/>
+              <w:t xml:space="preserve">Coverage details: {{ </w:t>
+            </w:r>
+            <w:proofErr w:type="spellStart"/>
+            <w:r>
+              <w:rPr>
+                <w:lang w:val="en-BE"/>
+              </w:rPr>
+              <w:t>network_coverage|default</w:t>
             </w:r>
             <w:proofErr w:type="spellEnd"/>
             <w:r>
               <w:rPr>
                 <w:lang w:val="en-BE"/>
               </w:rPr>
-              <w:t>(</w:t>
-            </w:r>
-            <w:proofErr w:type="gramEnd"/>
-            <w:r>
-              <w:rPr>
-                <w:lang w:val="en-BE"/>
-              </w:rPr>
-              <w:t>'') }}</w:t>
-            </w:r>
-            <w:r>
-              <w:rPr>
-                <w:lang w:val="en-BE"/>
-              </w:rPr>
-              <w:br/>
-              <w:t xml:space="preserve">Network status: </w:t>
-            </w:r>
-            <w:proofErr w:type="gramStart"/>
-            <w:r>
-              <w:rPr>
-                <w:lang w:val="en-BE"/>
-              </w:rPr>
-              <w:t xml:space="preserve">{{ </w:t>
-            </w:r>
-            <w:proofErr w:type="spellStart"/>
-            <w:r>
-              <w:rPr>
-                <w:lang w:val="en-BE"/>
-              </w:rPr>
-              <w:t>network</w:t>
-            </w:r>
-            <w:proofErr w:type="gramEnd"/>
-            <w:r>
-              <w:rPr>
-                <w:lang w:val="en-BE"/>
-              </w:rPr>
-              <w:t>_status|</w:t>
-            </w:r>
-            <w:proofErr w:type="gramStart"/>
-            <w:r>
-              <w:rPr>
-                <w:lang w:val="en-BE"/>
-              </w:rPr>
-              <w:t>default</w:t>
-            </w:r>
-            <w:proofErr w:type="spellEnd"/>
-            <w:r>
-              <w:rPr>
-                <w:lang w:val="en-BE"/>
-              </w:rPr>
-              <w:t>(</w:t>
-            </w:r>
-            <w:proofErr w:type="gramEnd"/>
-            <w:r>
-              <w:rPr>
-                <w:lang w:val="en-BE"/>
-              </w:rPr>
-              <w:t>'') }}</w:t>
-            </w:r>
-            <w:r>
-              <w:rPr>
-                <w:lang w:val="en-BE"/>
-              </w:rPr>
-              <w:br/>
-              <w:t xml:space="preserve">Coverage details: </w:t>
-            </w:r>
-            <w:proofErr w:type="gramStart"/>
-            <w:r>
-              <w:rPr>
-                <w:lang w:val="en-BE"/>
-              </w:rPr>
-              <w:t xml:space="preserve">{{ </w:t>
-            </w:r>
-            <w:proofErr w:type="spellStart"/>
-            <w:r>
-              <w:rPr>
-                <w:lang w:val="en-BE"/>
-              </w:rPr>
-              <w:t>network</w:t>
-            </w:r>
-            <w:proofErr w:type="gramEnd"/>
-            <w:r>
-              <w:rPr>
-                <w:lang w:val="en-BE"/>
-              </w:rPr>
-              <w:t>_coverage|</w:t>
-            </w:r>
-            <w:proofErr w:type="gramStart"/>
-            <w:r>
-              <w:rPr>
-                <w:lang w:val="en-BE"/>
-              </w:rPr>
-              <w:t>default</w:t>
-            </w:r>
-            <w:proofErr w:type="spellEnd"/>
-            <w:r>
-              <w:rPr>
-                <w:lang w:val="en-BE"/>
-              </w:rPr>
-              <w:t>(</w:t>
-            </w:r>
-            <w:proofErr w:type="gramEnd"/>
-            <w:r>
-              <w:rPr>
-                <w:lang w:val="en-BE"/>
-              </w:rPr>
-              <w:t>'') }}</w:t>
+              <w:t>('') }}</w:t>
             </w:r>
           </w:p>
         </w:tc>
@@ -4793,7 +3940,6 @@
             <w:vAlign w:val="center"/>
           </w:tcPr>
           <w:p>
-            <w:proofErr w:type="gramStart"/>
             <w:r>
               <w:rPr>
                 <w:rFonts w:ascii="Times New Roman" w:eastAsiaTheme="minorEastAsia" w:hAnsi="Times New Roman" w:cs="Times New Roman"/>
@@ -4810,25 +3956,7 @@
                 <w:sz w:val="26"/>
                 <w:szCs w:val="26"/>
               </w:rPr>
-              <w:t>integration</w:t>
-            </w:r>
-            <w:proofErr w:type="gramEnd"/>
-            <w:r>
-              <w:rPr>
-                <w:rFonts w:ascii="Times New Roman" w:eastAsiaTheme="minorEastAsia" w:hAnsi="Times New Roman" w:cs="Times New Roman"/>
-                <w:sz w:val="26"/>
-                <w:szCs w:val="26"/>
-              </w:rPr>
-              <w:t>_support_text|</w:t>
-            </w:r>
-            <w:proofErr w:type="gramStart"/>
-            <w:r>
-              <w:rPr>
-                <w:rFonts w:ascii="Times New Roman" w:eastAsiaTheme="minorEastAsia" w:hAnsi="Times New Roman" w:cs="Times New Roman"/>
-                <w:sz w:val="26"/>
-                <w:szCs w:val="26"/>
-              </w:rPr>
-              <w:t>default</w:t>
+              <w:t>integration_support_text|default</w:t>
             </w:r>
             <w:proofErr w:type="spellEnd"/>
             <w:r>
@@ -4837,34 +3965,7 @@
                 <w:sz w:val="26"/>
                 <w:szCs w:val="26"/>
               </w:rPr>
-              <w:t>(</w:t>
-            </w:r>
-            <w:proofErr w:type="gramEnd"/>
-            <w:r>
-              <w:rPr>
-                <w:rFonts w:ascii="Times New Roman" w:eastAsiaTheme="minorEastAsia" w:hAnsi="Times New Roman" w:cs="Times New Roman"/>
-                <w:sz w:val="26"/>
-                <w:szCs w:val="26"/>
-              </w:rPr>
-              <w:t>''</w:t>
-            </w:r>
-            <w:proofErr w:type="gramStart"/>
-            <w:r>
-              <w:rPr>
-                <w:rFonts w:ascii="Times New Roman" w:eastAsiaTheme="minorEastAsia" w:hAnsi="Times New Roman" w:cs="Times New Roman"/>
-                <w:sz w:val="26"/>
-                <w:szCs w:val="26"/>
-              </w:rPr>
-              <w:t>) }</w:t>
-            </w:r>
-            <w:proofErr w:type="gramEnd"/>
-            <w:r>
-              <w:rPr>
-                <w:rFonts w:ascii="Times New Roman" w:eastAsiaTheme="minorEastAsia" w:hAnsi="Times New Roman" w:cs="Times New Roman"/>
-                <w:sz w:val="26"/>
-                <w:szCs w:val="26"/>
-              </w:rPr>
-              <w:t>}</w:t>
+              <w:t>('') }}</w:t>
             </w:r>
           </w:p>
           <w:p/>
@@ -4957,25 +4058,7 @@
                 <w:sz w:val="26"/>
                 <w:szCs w:val="26"/>
               </w:rPr>
-              <w:t xml:space="preserve">Whether there </w:t>
-            </w:r>
-            <w:proofErr w:type="gramStart"/>
-            <w:r>
-              <w:rPr>
-                <w:rFonts w:ascii="Times New Roman" w:hAnsi="Times New Roman" w:cs="Times New Roman"/>
-                <w:sz w:val="26"/>
-                <w:szCs w:val="26"/>
-              </w:rPr>
-              <w:t>are</w:t>
-            </w:r>
-            <w:proofErr w:type="gramEnd"/>
-            <w:r>
-              <w:rPr>
-                <w:rFonts w:ascii="Times New Roman" w:hAnsi="Times New Roman" w:cs="Times New Roman"/>
-                <w:sz w:val="26"/>
-                <w:szCs w:val="26"/>
-              </w:rPr>
-              <w:t xml:space="preserve"> related equipment that needs to be docked (elevators, robotic arms, roller shutter doors, telescopic doors, vertical warehouses, winding machines, etc.), etc.:</w:t>
+              <w:t>Whether there are related equipment that needs to be docked (elevators, robotic arms, roller shutter doors, telescopic doors, vertical warehouses, winding machines, etc.), etc.:</w:t>
             </w:r>
           </w:p>
         </w:tc>
@@ -4999,7 +4082,6 @@
                 <w:lang w:val="en-BE"/>
               </w:rPr>
             </w:pPr>
-            <w:proofErr w:type="gramStart"/>
             <w:r>
               <w:rPr>
                 <w:rFonts w:ascii="Times New Roman" w:eastAsiaTheme="minorEastAsia" w:hAnsi="Times New Roman" w:cs="Times New Roman"/>
@@ -5015,25 +4097,7 @@
                 <w:sz w:val="26"/>
                 <w:szCs w:val="26"/>
               </w:rPr>
-              <w:t>integration</w:t>
-            </w:r>
-            <w:proofErr w:type="gramEnd"/>
-            <w:r>
-              <w:rPr>
-                <w:rFonts w:ascii="Times New Roman" w:eastAsiaTheme="minorEastAsia" w:hAnsi="Times New Roman" w:cs="Times New Roman"/>
-                <w:sz w:val="26"/>
-                <w:szCs w:val="26"/>
-              </w:rPr>
-              <w:t>_req|</w:t>
-            </w:r>
-            <w:proofErr w:type="gramStart"/>
-            <w:r>
-              <w:rPr>
-                <w:rFonts w:ascii="Times New Roman" w:eastAsiaTheme="minorEastAsia" w:hAnsi="Times New Roman" w:cs="Times New Roman"/>
-                <w:sz w:val="26"/>
-                <w:szCs w:val="26"/>
-              </w:rPr>
-              <w:t>default</w:t>
+              <w:t>integration_req|default</w:t>
             </w:r>
             <w:proofErr w:type="spellEnd"/>
             <w:r>
@@ -5042,201 +4106,7 @@
                 <w:sz w:val="26"/>
                 <w:szCs w:val="26"/>
               </w:rPr>
-              <w:t>(</w:t>
-            </w:r>
-            <w:proofErr w:type="gramEnd"/>
-            <w:r>
-              <w:rPr>
-                <w:rFonts w:ascii="Times New Roman" w:eastAsiaTheme="minorEastAsia" w:hAnsi="Times New Roman" w:cs="Times New Roman"/>
-                <w:sz w:val="26"/>
-                <w:szCs w:val="26"/>
-              </w:rPr>
-              <w:t>''</w:t>
-            </w:r>
-            <w:proofErr w:type="gramStart"/>
-            <w:r>
-              <w:rPr>
-                <w:rFonts w:ascii="Times New Roman" w:eastAsiaTheme="minorEastAsia" w:hAnsi="Times New Roman" w:cs="Times New Roman"/>
-                <w:sz w:val="26"/>
-                <w:szCs w:val="26"/>
-              </w:rPr>
-              <w:t>) }</w:t>
-            </w:r>
-            <w:proofErr w:type="gramEnd"/>
-            <w:r>
-              <w:rPr>
-                <w:rFonts w:ascii="Times New Roman" w:eastAsiaTheme="minorEastAsia" w:hAnsi="Times New Roman" w:cs="Times New Roman"/>
-                <w:sz w:val="26"/>
-                <w:szCs w:val="26"/>
-              </w:rPr>
-              <w:t>}</w:t>
-            </w:r>
-          </w:p>
-          <w:p>
-            <w:pPr>
-              <w:spacing w:line="240" w:lineRule="auto"/>
-              <w:jc w:val="left"/>
-              <w:rPr>
-                <w:rFonts w:ascii="Times New Roman" w:eastAsiaTheme="minorEastAsia" w:hAnsi="Times New Roman" w:cs="Times New Roman"/>
-                <w:sz w:val="26"/>
-                <w:szCs w:val="26"/>
-              </w:rPr>
-            </w:pPr>
-            <w:proofErr w:type="gramStart"/>
-            <w:r>
-              <w:rPr>
-                <w:rFonts w:ascii="Times New Roman" w:eastAsiaTheme="minorEastAsia" w:hAnsi="Times New Roman" w:cs="Times New Roman"/>
-                <w:sz w:val="26"/>
-                <w:szCs w:val="26"/>
-              </w:rPr>
-              <w:t xml:space="preserve">{{ </w:t>
-            </w:r>
-            <w:proofErr w:type="spellStart"/>
-            <w:r>
-              <w:rPr>
-                <w:rFonts w:ascii="Times New Roman" w:eastAsiaTheme="minorEastAsia" w:hAnsi="Times New Roman" w:cs="Times New Roman"/>
-                <w:sz w:val="26"/>
-                <w:szCs w:val="26"/>
-              </w:rPr>
-              <w:t>connections</w:t>
-            </w:r>
-            <w:proofErr w:type="gramEnd"/>
-            <w:r>
-              <w:rPr>
-                <w:rFonts w:ascii="Times New Roman" w:eastAsiaTheme="minorEastAsia" w:hAnsi="Times New Roman" w:cs="Times New Roman"/>
-                <w:sz w:val="26"/>
-                <w:szCs w:val="26"/>
-              </w:rPr>
-              <w:t>_details|</w:t>
-            </w:r>
-            <w:proofErr w:type="gramStart"/>
-            <w:r>
-              <w:rPr>
-                <w:rFonts w:ascii="Times New Roman" w:eastAsiaTheme="minorEastAsia" w:hAnsi="Times New Roman" w:cs="Times New Roman"/>
-                <w:sz w:val="26"/>
-                <w:szCs w:val="26"/>
-              </w:rPr>
-              <w:t>default</w:t>
-            </w:r>
-            <w:proofErr w:type="spellEnd"/>
-            <w:r>
-              <w:rPr>
-                <w:rFonts w:ascii="Times New Roman" w:eastAsiaTheme="minorEastAsia" w:hAnsi="Times New Roman" w:cs="Times New Roman"/>
-                <w:sz w:val="26"/>
-                <w:szCs w:val="26"/>
-              </w:rPr>
-              <w:t>(</w:t>
-            </w:r>
-            <w:proofErr w:type="gramEnd"/>
-            <w:r>
-              <w:rPr>
-                <w:rFonts w:ascii="Times New Roman" w:eastAsiaTheme="minorEastAsia" w:hAnsi="Times New Roman" w:cs="Times New Roman"/>
-                <w:sz w:val="26"/>
-                <w:szCs w:val="26"/>
-              </w:rPr>
-              <w:t>''</w:t>
-            </w:r>
-            <w:proofErr w:type="gramStart"/>
-            <w:r>
-              <w:rPr>
-                <w:rFonts w:ascii="Times New Roman" w:eastAsiaTheme="minorEastAsia" w:hAnsi="Times New Roman" w:cs="Times New Roman"/>
-                <w:sz w:val="26"/>
-                <w:szCs w:val="26"/>
-              </w:rPr>
-              <w:t>) }</w:t>
-            </w:r>
-            <w:proofErr w:type="gramEnd"/>
-            <w:r>
-              <w:rPr>
-                <w:rFonts w:ascii="Times New Roman" w:eastAsiaTheme="minorEastAsia" w:hAnsi="Times New Roman" w:cs="Times New Roman"/>
-                <w:sz w:val="26"/>
-                <w:szCs w:val="26"/>
-              </w:rPr>
-              <w:t>}</w:t>
-            </w:r>
-          </w:p>
-          <w:p>
-            <w:pPr>
-              <w:spacing w:line="240" w:lineRule="auto"/>
-              <w:jc w:val="left"/>
-              <w:rPr>
-                <w:rFonts w:ascii="Times New Roman" w:eastAsiaTheme="minorEastAsia" w:hAnsi="Times New Roman" w:cs="Times New Roman"/>
-                <w:sz w:val="26"/>
-                <w:szCs w:val="26"/>
-                <w:lang w:val="en-BE"/>
-              </w:rPr>
-            </w:pPr>
-            <w:proofErr w:type="gramStart"/>
-            <w:r>
-              <w:rPr>
-                <w:rFonts w:ascii="Times New Roman" w:eastAsiaTheme="minorEastAsia" w:hAnsi="Times New Roman" w:cs="Times New Roman"/>
-                <w:sz w:val="26"/>
-                <w:szCs w:val="26"/>
-              </w:rPr>
-              <w:t xml:space="preserve">{{ </w:t>
-            </w:r>
-            <w:proofErr w:type="spellStart"/>
-            <w:r>
-              <w:rPr>
-                <w:rFonts w:ascii="Times New Roman" w:eastAsiaTheme="minorEastAsia" w:hAnsi="Times New Roman" w:cs="Times New Roman"/>
-                <w:sz w:val="26"/>
-                <w:szCs w:val="26"/>
-              </w:rPr>
-              <w:t>connections</w:t>
-            </w:r>
-            <w:proofErr w:type="gramEnd"/>
-            <w:r>
-              <w:rPr>
-                <w:rFonts w:ascii="Times New Roman" w:eastAsiaTheme="minorEastAsia" w:hAnsi="Times New Roman" w:cs="Times New Roman"/>
-                <w:sz w:val="26"/>
-                <w:szCs w:val="26"/>
-              </w:rPr>
-              <w:t>|</w:t>
-            </w:r>
-            <w:proofErr w:type="gramStart"/>
-            <w:r>
-              <w:rPr>
-                <w:rFonts w:ascii="Times New Roman" w:eastAsiaTheme="minorEastAsia" w:hAnsi="Times New Roman" w:cs="Times New Roman"/>
-                <w:sz w:val="26"/>
-                <w:szCs w:val="26"/>
-              </w:rPr>
-              <w:t>default</w:t>
-            </w:r>
-            <w:proofErr w:type="spellEnd"/>
-            <w:r>
-              <w:rPr>
-                <w:rFonts w:ascii="Times New Roman" w:eastAsiaTheme="minorEastAsia" w:hAnsi="Times New Roman" w:cs="Times New Roman"/>
-                <w:sz w:val="26"/>
-                <w:szCs w:val="26"/>
-              </w:rPr>
-              <w:t>(</w:t>
-            </w:r>
-            <w:proofErr w:type="gramEnd"/>
-            <w:r>
-              <w:rPr>
-                <w:rFonts w:ascii="Times New Roman" w:eastAsiaTheme="minorEastAsia" w:hAnsi="Times New Roman" w:cs="Times New Roman"/>
-                <w:sz w:val="26"/>
-                <w:szCs w:val="26"/>
-              </w:rPr>
-              <w:t>''</w:t>
-            </w:r>
-            <w:proofErr w:type="gramStart"/>
-            <w:r>
-              <w:rPr>
-                <w:rFonts w:ascii="Times New Roman" w:eastAsiaTheme="minorEastAsia" w:hAnsi="Times New Roman" w:cs="Times New Roman"/>
-                <w:sz w:val="26"/>
-                <w:szCs w:val="26"/>
-              </w:rPr>
-              <w:t>) }</w:t>
-            </w:r>
-            <w:proofErr w:type="gramEnd"/>
-            <w:r>
-              <w:rPr>
-                <w:rFonts w:ascii="Times New Roman" w:eastAsiaTheme="minorEastAsia" w:hAnsi="Times New Roman" w:cs="Times New Roman"/>
-                <w:sz w:val="26"/>
-                <w:szCs w:val="26"/>
-              </w:rPr>
-              <w:t>}</w:t>
+              <w:t>('') }}</w:t>
             </w:r>
           </w:p>
           <w:p>
@@ -5544,16 +4414,7 @@
                 <w:szCs w:val="26"/>
               </w:rPr>
               <w:lastRenderedPageBreak/>
-              <w:t xml:space="preserve">Charging status: </w:t>
-            </w:r>
-            <w:proofErr w:type="gramStart"/>
-            <w:r>
-              <w:rPr>
-                <w:rFonts w:ascii="Times New Roman" w:hAnsi="Times New Roman" w:cs="Times New Roman"/>
-                <w:sz w:val="26"/>
-                <w:szCs w:val="26"/>
-              </w:rPr>
-              <w:t xml:space="preserve">{{ </w:t>
+              <w:t xml:space="preserve">Charging status: {{ </w:t>
             </w:r>
             <w:proofErr w:type="spellStart"/>
             <w:r>
@@ -5562,25 +4423,7 @@
                 <w:sz w:val="26"/>
                 <w:szCs w:val="26"/>
               </w:rPr>
-              <w:t>charging</w:t>
-            </w:r>
-            <w:proofErr w:type="gramEnd"/>
-            <w:r>
-              <w:rPr>
-                <w:rFonts w:ascii="Times New Roman" w:hAnsi="Times New Roman" w:cs="Times New Roman"/>
-                <w:sz w:val="26"/>
-                <w:szCs w:val="26"/>
-              </w:rPr>
-              <w:t>_status|</w:t>
-            </w:r>
-            <w:proofErr w:type="gramStart"/>
-            <w:r>
-              <w:rPr>
-                <w:rFonts w:ascii="Times New Roman" w:hAnsi="Times New Roman" w:cs="Times New Roman"/>
-                <w:sz w:val="26"/>
-                <w:szCs w:val="26"/>
-              </w:rPr>
-              <w:t>default</w:t>
+              <w:t>charging_status|default</w:t>
             </w:r>
             <w:proofErr w:type="spellEnd"/>
             <w:r>
@@ -5589,16 +4432,7 @@
                 <w:sz w:val="26"/>
                 <w:szCs w:val="26"/>
               </w:rPr>
-              <w:t>(</w:t>
-            </w:r>
-            <w:proofErr w:type="gramEnd"/>
-            <w:r>
-              <w:rPr>
-                <w:rFonts w:ascii="Times New Roman" w:hAnsi="Times New Roman" w:cs="Times New Roman"/>
-                <w:sz w:val="26"/>
-                <w:szCs w:val="26"/>
-              </w:rPr>
-              <w:t>'') }}</w:t>
+              <w:t>('') }}</w:t>
             </w:r>
             <w:r>
               <w:rPr>
@@ -5607,16 +4441,7 @@
                 <w:szCs w:val="26"/>
               </w:rPr>
               <w:br/>
-              <w:t xml:space="preserve">Parking area: </w:t>
-            </w:r>
-            <w:proofErr w:type="gramStart"/>
-            <w:r>
-              <w:rPr>
-                <w:rFonts w:ascii="Times New Roman" w:hAnsi="Times New Roman" w:cs="Times New Roman"/>
-                <w:sz w:val="26"/>
-                <w:szCs w:val="26"/>
-              </w:rPr>
-              <w:t xml:space="preserve">{{ </w:t>
+              <w:t xml:space="preserve">Parking area: {{ </w:t>
             </w:r>
             <w:proofErr w:type="spellStart"/>
             <w:r>
@@ -5625,25 +4450,7 @@
                 <w:sz w:val="26"/>
                 <w:szCs w:val="26"/>
               </w:rPr>
-              <w:t>parking</w:t>
-            </w:r>
-            <w:proofErr w:type="gramEnd"/>
-            <w:r>
-              <w:rPr>
-                <w:rFonts w:ascii="Times New Roman" w:hAnsi="Times New Roman" w:cs="Times New Roman"/>
-                <w:sz w:val="26"/>
-                <w:szCs w:val="26"/>
-              </w:rPr>
-              <w:t>_area|</w:t>
-            </w:r>
-            <w:proofErr w:type="gramStart"/>
-            <w:r>
-              <w:rPr>
-                <w:rFonts w:ascii="Times New Roman" w:hAnsi="Times New Roman" w:cs="Times New Roman"/>
-                <w:sz w:val="26"/>
-                <w:szCs w:val="26"/>
-              </w:rPr>
-              <w:t>default</w:t>
+              <w:t>parking_area|default</w:t>
             </w:r>
             <w:proofErr w:type="spellEnd"/>
             <w:r>
@@ -5652,42 +4459,15 @@
                 <w:sz w:val="26"/>
                 <w:szCs w:val="26"/>
               </w:rPr>
-              <w:t>(</w:t>
-            </w:r>
-            <w:proofErr w:type="gramEnd"/>
-            <w:r>
-              <w:rPr>
-                <w:rFonts w:ascii="Times New Roman" w:hAnsi="Times New Roman" w:cs="Times New Roman"/>
-                <w:sz w:val="26"/>
-                <w:szCs w:val="26"/>
-              </w:rPr>
-              <w:t>''</w:t>
-            </w:r>
-            <w:proofErr w:type="gramStart"/>
-            <w:r>
-              <w:rPr>
-                <w:rFonts w:ascii="Times New Roman" w:hAnsi="Times New Roman" w:cs="Times New Roman"/>
-                <w:sz w:val="26"/>
-                <w:szCs w:val="26"/>
-              </w:rPr>
-              <w:t>) }}</w:t>
-            </w:r>
-            <w:r>
-              <w:rPr>
-                <w:rFonts w:ascii="Times New Roman" w:hAnsi="Times New Roman" w:cs="Times New Roman"/>
-                <w:sz w:val="26"/>
-                <w:szCs w:val="26"/>
-              </w:rPr>
-              <w:t>Charging</w:t>
-            </w:r>
-            <w:proofErr w:type="gramEnd"/>
-            <w:r>
-              <w:rPr>
-                <w:rFonts w:ascii="Times New Roman" w:hAnsi="Times New Roman" w:cs="Times New Roman"/>
-                <w:sz w:val="26"/>
-                <w:szCs w:val="26"/>
-              </w:rPr>
-              <w:t xml:space="preserve"> </w:t>
+              <w:t>('') }}</w:t>
+            </w:r>
+            <w:r>
+              <w:rPr>
+                <w:rFonts w:ascii="Times New Roman" w:hAnsi="Times New Roman" w:cs="Times New Roman"/>
+                <w:sz w:val="26"/>
+                <w:szCs w:val="26"/>
+              </w:rPr>
+              <w:t xml:space="preserve">Charging </w:t>
             </w:r>
           </w:p>
         </w:tc>
@@ -5840,7 +4620,7 @@
                 <w:sz w:val="26"/>
                 <w:szCs w:val="26"/>
               </w:rPr>
-              <w:t>{{</w:t>
+              <w:t xml:space="preserve">{{ </w:t>
             </w:r>
             <w:proofErr w:type="spellStart"/>
             <w:r>
@@ -5849,7 +4629,7 @@
                 <w:sz w:val="26"/>
                 <w:szCs w:val="26"/>
               </w:rPr>
-              <w:t>special_demand</w:t>
+              <w:t>special_demand|default</w:t>
             </w:r>
             <w:proofErr w:type="spellEnd"/>
             <w:r>
@@ -5857,37 +4637,8 @@
                 <w:rFonts w:ascii="Times New Roman" w:eastAsiaTheme="minorEastAsia" w:hAnsi="Times New Roman" w:cs="Times New Roman"/>
                 <w:sz w:val="26"/>
                 <w:szCs w:val="26"/>
-                <w:lang w:val="en-BE"/>
-              </w:rPr>
-              <w:t>|</w:t>
-            </w:r>
-            <w:proofErr w:type="gramStart"/>
-            <w:r>
-              <w:rPr>
-                <w:rFonts w:ascii="Times New Roman" w:eastAsiaTheme="minorEastAsia" w:hAnsi="Times New Roman" w:cs="Times New Roman"/>
-                <w:sz w:val="26"/>
-                <w:szCs w:val="26"/>
-                <w:lang w:val="en-BE"/>
-              </w:rPr>
-              <w:t>default(</w:t>
-            </w:r>
-            <w:proofErr w:type="gramEnd"/>
-            <w:r>
-              <w:rPr>
-                <w:rFonts w:ascii="Times New Roman" w:eastAsiaTheme="minorEastAsia" w:hAnsi="Times New Roman" w:cs="Times New Roman"/>
-                <w:sz w:val="26"/>
-                <w:szCs w:val="26"/>
-                <w:lang w:val="en-BE"/>
-              </w:rPr>
-              <w:t>‘‘)</w:t>
-            </w:r>
-            <w:r>
-              <w:rPr>
-                <w:rFonts w:ascii="Times New Roman" w:eastAsiaTheme="minorEastAsia" w:hAnsi="Times New Roman" w:cs="Times New Roman"/>
-                <w:sz w:val="26"/>
-                <w:szCs w:val="26"/>
-              </w:rPr>
-              <w:t>}}</w:t>
+              </w:rPr>
+              <w:t>('') }}</w:t>
             </w:r>
           </w:p>
         </w:tc>
@@ -6539,7 +5290,6 @@
                 <w:szCs w:val="26"/>
               </w:rPr>
             </w:pPr>
-            <w:proofErr w:type="gramStart"/>
             <w:r>
               <w:rPr>
                 <w:rFonts w:ascii="Times New Roman" w:hAnsi="Times New Roman" w:cs="Times New Roman"/>
@@ -6555,25 +5305,7 @@
                 <w:sz w:val="26"/>
                 <w:szCs w:val="26"/>
               </w:rPr>
-              <w:t>other</w:t>
-            </w:r>
-            <w:proofErr w:type="gramEnd"/>
-            <w:r>
-              <w:rPr>
-                <w:rFonts w:ascii="Times New Roman" w:hAnsi="Times New Roman" w:cs="Times New Roman"/>
-                <w:sz w:val="26"/>
-                <w:szCs w:val="26"/>
-              </w:rPr>
-              <w:t>_agvs|</w:t>
-            </w:r>
-            <w:proofErr w:type="gramStart"/>
-            <w:r>
-              <w:rPr>
-                <w:rFonts w:ascii="Times New Roman" w:hAnsi="Times New Roman" w:cs="Times New Roman"/>
-                <w:sz w:val="26"/>
-                <w:szCs w:val="26"/>
-              </w:rPr>
-              <w:t>default</w:t>
+              <w:t>other_agvs|default</w:t>
             </w:r>
             <w:proofErr w:type="spellEnd"/>
             <w:r>
@@ -6582,16 +5314,7 @@
                 <w:sz w:val="26"/>
                 <w:szCs w:val="26"/>
               </w:rPr>
-              <w:t>(</w:t>
-            </w:r>
-            <w:proofErr w:type="gramEnd"/>
-            <w:r>
-              <w:rPr>
-                <w:rFonts w:ascii="Times New Roman" w:hAnsi="Times New Roman" w:cs="Times New Roman"/>
-                <w:sz w:val="26"/>
-                <w:szCs w:val="26"/>
-              </w:rPr>
-              <w:t>'') }}</w:t>
+              <w:t>('') }}</w:t>
             </w:r>
             <w:r>
               <w:rPr>
@@ -6601,7 +5324,6 @@
               </w:rPr>
               <w:br/>
             </w:r>
-            <w:proofErr w:type="gramStart"/>
             <w:r>
               <w:rPr>
                 <w:rFonts w:ascii="Times New Roman" w:hAnsi="Times New Roman" w:cs="Times New Roman"/>
@@ -6617,25 +5339,7 @@
                 <w:sz w:val="26"/>
                 <w:szCs w:val="26"/>
               </w:rPr>
-              <w:t>other</w:t>
-            </w:r>
-            <w:proofErr w:type="gramEnd"/>
-            <w:r>
-              <w:rPr>
-                <w:rFonts w:ascii="Times New Roman" w:hAnsi="Times New Roman" w:cs="Times New Roman"/>
-                <w:sz w:val="26"/>
-                <w:szCs w:val="26"/>
-              </w:rPr>
-              <w:t>_traffic|</w:t>
-            </w:r>
-            <w:proofErr w:type="gramStart"/>
-            <w:r>
-              <w:rPr>
-                <w:rFonts w:ascii="Times New Roman" w:hAnsi="Times New Roman" w:cs="Times New Roman"/>
-                <w:sz w:val="26"/>
-                <w:szCs w:val="26"/>
-              </w:rPr>
-              <w:t>default</w:t>
+              <w:t>other_traffic|default</w:t>
             </w:r>
             <w:proofErr w:type="spellEnd"/>
             <w:r>
@@ -6644,47 +5348,19 @@
                 <w:sz w:val="26"/>
                 <w:szCs w:val="26"/>
               </w:rPr>
-              <w:t>(</w:t>
-            </w:r>
-            <w:proofErr w:type="gramEnd"/>
-            <w:r>
-              <w:rPr>
-                <w:rFonts w:ascii="Times New Roman" w:hAnsi="Times New Roman" w:cs="Times New Roman"/>
-                <w:sz w:val="26"/>
-                <w:szCs w:val="26"/>
-              </w:rPr>
-              <w:t>''</w:t>
-            </w:r>
-            <w:proofErr w:type="gramStart"/>
-            <w:r>
-              <w:rPr>
-                <w:rFonts w:ascii="Times New Roman" w:hAnsi="Times New Roman" w:cs="Times New Roman"/>
-                <w:sz w:val="26"/>
-                <w:szCs w:val="26"/>
-              </w:rPr>
-              <w:t>) }</w:t>
-            </w:r>
-            <w:proofErr w:type="gramEnd"/>
-            <w:r>
-              <w:rPr>
-                <w:rFonts w:ascii="Times New Roman" w:hAnsi="Times New Roman" w:cs="Times New Roman"/>
-                <w:sz w:val="26"/>
-                <w:szCs w:val="26"/>
-              </w:rPr>
-              <w:t>}</w:t>
-            </w:r>
-          </w:p>
-          <w:p>
-            <w:pPr>
-              <w:spacing w:line="240" w:lineRule="auto"/>
-              <w:jc w:val="left"/>
-              <w:rPr>
-                <w:rFonts w:ascii="Times New Roman" w:hAnsi="Times New Roman" w:cs="Times New Roman"/>
-                <w:sz w:val="26"/>
-                <w:szCs w:val="26"/>
-              </w:rPr>
-            </w:pPr>
-            <w:proofErr w:type="gramStart"/>
+              <w:t>('') }}</w:t>
+            </w:r>
+          </w:p>
+          <w:p>
+            <w:pPr>
+              <w:spacing w:line="240" w:lineRule="auto"/>
+              <w:jc w:val="left"/>
+              <w:rPr>
+                <w:rFonts w:ascii="Times New Roman" w:hAnsi="Times New Roman" w:cs="Times New Roman"/>
+                <w:sz w:val="26"/>
+                <w:szCs w:val="26"/>
+              </w:rPr>
+            </w:pPr>
             <w:r>
               <w:rPr>
                 <w:rFonts w:ascii="Times New Roman" w:hAnsi="Times New Roman" w:cs="Times New Roman"/>
@@ -6700,25 +5376,7 @@
                 <w:sz w:val="26"/>
                 <w:szCs w:val="26"/>
               </w:rPr>
-              <w:t>ground</w:t>
-            </w:r>
-            <w:proofErr w:type="gramEnd"/>
-            <w:r>
-              <w:rPr>
-                <w:rFonts w:ascii="Times New Roman" w:hAnsi="Times New Roman" w:cs="Times New Roman"/>
-                <w:sz w:val="26"/>
-                <w:szCs w:val="26"/>
-              </w:rPr>
-              <w:t>_gaps_text|</w:t>
-            </w:r>
-            <w:proofErr w:type="gramStart"/>
-            <w:r>
-              <w:rPr>
-                <w:rFonts w:ascii="Times New Roman" w:hAnsi="Times New Roman" w:cs="Times New Roman"/>
-                <w:sz w:val="26"/>
-                <w:szCs w:val="26"/>
-              </w:rPr>
-              <w:t>default</w:t>
+              <w:t>ground_gaps_text|default</w:t>
             </w:r>
             <w:proofErr w:type="spellEnd"/>
             <w:r>
@@ -6727,16 +5385,7 @@
                 <w:sz w:val="26"/>
                 <w:szCs w:val="26"/>
               </w:rPr>
-              <w:t>(</w:t>
-            </w:r>
-            <w:proofErr w:type="gramEnd"/>
-            <w:r>
-              <w:rPr>
-                <w:rFonts w:ascii="Times New Roman" w:hAnsi="Times New Roman" w:cs="Times New Roman"/>
-                <w:sz w:val="26"/>
-                <w:szCs w:val="26"/>
-              </w:rPr>
-              <w:t>'') }}</w:t>
+              <w:t>('') }}</w:t>
             </w:r>
           </w:p>
         </w:tc>
@@ -11172,12 +9821,7 @@
 </file>
 
 <file path=customXml/item1.xml><?xml version="1.0" encoding="utf-8"?>
-<?mso-contentType ?>
-<FormTemplates xmlns="http://schemas.microsoft.com/sharepoint/v3/contenttype/forms">
-  <Display>DocumentLibraryForm</Display>
-  <Edit>DocumentLibraryForm</Edit>
-  <New>DocumentLibraryForm</New>
-</FormTemplates>
+<b:Sources xmlns:b="http://schemas.openxmlformats.org/officeDocument/2006/bibliography" xmlns="http://schemas.openxmlformats.org/officeDocument/2006/bibliography" SelectedStyle="\APASixthEditionOfficeOnline.xsl" StyleName="APA" Version="6"/>
 </file>
 
 <file path=customXml/item2.xml><?xml version="1.0" encoding="utf-8"?>
@@ -11192,19 +9836,15 @@
 </file>
 
 <file path=customXml/item3.xml><?xml version="1.0" encoding="utf-8"?>
-<b:Sources xmlns:b="http://schemas.openxmlformats.org/officeDocument/2006/bibliography" xmlns="http://schemas.openxmlformats.org/officeDocument/2006/bibliography" SelectedStyle="\APASixthEditionOfficeOnline.xsl" StyleName="APA" Version="6"/>
+<?mso-contentType ?>
+<FormTemplates xmlns="http://schemas.microsoft.com/sharepoint/v3/contenttype/forms">
+  <Display>DocumentLibraryForm</Display>
+  <Edit>DocumentLibraryForm</Edit>
+  <New>DocumentLibraryForm</New>
+</FormTemplates>
 </file>
 
 <file path=customXml/item4.xml><?xml version="1.0" encoding="utf-8"?>
-<s:customData xmlns="http://www.wps.cn/officeDocument/2013/wpsCustomData" xmlns:s="http://www.wps.cn/officeDocument/2013/wpsCustomData">
-  <customSectProps/>
-  <customShpExts>
-    <customShpInfo spid="_x0000_s1026" textRotate="1"/>
-  </customShpExts>
-</s:customData>
-</file>
-
-<file path=customXml/item5.xml><?xml version="1.0" encoding="utf-8"?>
 <ct:contentTypeSchema xmlns:ct="http://schemas.microsoft.com/office/2006/metadata/contentType" xmlns:ma="http://schemas.microsoft.com/office/2006/metadata/properties/metaAttributes" ct:_="" ma:_="" ma:contentTypeName="Document" ma:contentTypeID="0x0101000ED1937193E6644B9910A1F8F337BE3A" ma:contentTypeVersion="15" ma:contentTypeDescription="Create a new document." ma:contentTypeScope="" ma:versionID="33d0915d951d370b6a1e09b978e628b3">
   <xsd:schema xmlns:xsd="http://www.w3.org/2001/XMLSchema" xmlns:xs="http://www.w3.org/2001/XMLSchema" xmlns:p="http://schemas.microsoft.com/office/2006/metadata/properties" xmlns:ns2="bbceff47-94a0-42cc-a34e-bab6fdf630d3" xmlns:ns3="076cc9d1-9a26-4384-96fc-17dbfe6fe8db" targetNamespace="http://schemas.microsoft.com/office/2006/metadata/properties" ma:root="true" ma:fieldsID="ca8e0581b507d7ca9a3160f88f47f0fe" ns2:_="" ns3:_="">
     <xsd:import namespace="bbceff47-94a0-42cc-a34e-bab6fdf630d3"/>
@@ -11417,10 +10057,19 @@
 </ct:contentTypeSchema>
 </file>
 
+<file path=customXml/item5.xml><?xml version="1.0" encoding="utf-8"?>
+<s:customData xmlns="http://www.wps.cn/officeDocument/2013/wpsCustomData" xmlns:s="http://www.wps.cn/officeDocument/2013/wpsCustomData">
+  <customSectProps/>
+  <customShpExts>
+    <customShpInfo spid="_x0000_s1026" textRotate="1"/>
+  </customShpExts>
+</s:customData>
+</file>
+
 <file path=customXml/itemProps1.xml><?xml version="1.0" encoding="utf-8"?>
-<ds:datastoreItem xmlns:ds="http://schemas.openxmlformats.org/officeDocument/2006/customXml" ds:itemID="{66E6D9ED-0625-4E0B-A950-FCB28CC096CA}">
+<ds:datastoreItem xmlns:ds="http://schemas.openxmlformats.org/officeDocument/2006/customXml" ds:itemID="{1FF82357-F674-4365-859D-EF5EFE0EDCAE}">
   <ds:schemaRefs>
-    <ds:schemaRef ds:uri="http://schemas.microsoft.com/sharepoint/v3/contenttype/forms"/>
+    <ds:schemaRef ds:uri="http://schemas.openxmlformats.org/officeDocument/2006/bibliography"/>
   </ds:schemaRefs>
 </ds:datastoreItem>
 </file>
@@ -11437,22 +10086,14 @@
 </file>
 
 <file path=customXml/itemProps3.xml><?xml version="1.0" encoding="utf-8"?>
-<ds:datastoreItem xmlns:ds="http://schemas.openxmlformats.org/officeDocument/2006/customXml" ds:itemID="{1FF82357-F674-4365-859D-EF5EFE0EDCAE}">
+<ds:datastoreItem xmlns:ds="http://schemas.openxmlformats.org/officeDocument/2006/customXml" ds:itemID="{66E6D9ED-0625-4E0B-A950-FCB28CC096CA}">
   <ds:schemaRefs>
-    <ds:schemaRef ds:uri="http://schemas.openxmlformats.org/officeDocument/2006/bibliography"/>
+    <ds:schemaRef ds:uri="http://schemas.microsoft.com/sharepoint/v3/contenttype/forms"/>
   </ds:schemaRefs>
 </ds:datastoreItem>
 </file>
 
 <file path=customXml/itemProps4.xml><?xml version="1.0" encoding="utf-8"?>
-<ds:datastoreItem xmlns:ds="http://schemas.openxmlformats.org/officeDocument/2006/customXml" ds:itemID="{B1977F7D-205B-4081-913C-38D41E755F92}">
-  <ds:schemaRefs>
-    <ds:schemaRef ds:uri="http://www.wps.cn/officeDocument/2013/wpsCustomData"/>
-  </ds:schemaRefs>
-</ds:datastoreItem>
-</file>
-
-<file path=customXml/itemProps5.xml><?xml version="1.0" encoding="utf-8"?>
 <ds:datastoreItem xmlns:ds="http://schemas.openxmlformats.org/officeDocument/2006/customXml" ds:itemID="{117EB414-D13B-4D74-9FFC-4E3D989A8CA2}">
   <ds:schemaRefs>
     <ds:schemaRef ds:uri="http://schemas.microsoft.com/office/2006/metadata/contentType"/>
@@ -11469,4 +10110,12 @@
     <ds:schemaRef ds:uri="http://schemas.microsoft.com/internal/obd"/>
   </ds:schemaRefs>
 </ds:datastoreItem>
+</file>
+
+<file path=customXml/itemProps5.xml><?xml version="1.0" encoding="utf-8"?>
+<ds:datastoreItem xmlns:ds="http://schemas.openxmlformats.org/officeDocument/2006/customXml" ds:itemID="{B1977F7D-205B-4081-913C-38D41E755F92}">
+  <ds:schemaRefs>
+    <ds:schemaRef ds:uri="http://www.wps.cn/officeDocument/2013/wpsCustomData"/>
+  </ds:schemaRefs>
+</ds:datastoreItem>
 </file>
</xml_diff>

<commit_message>
fix: no-extra-data Word report, smart combined fields, cleaned requirements
- app.py: added 13 smart context fields (pallet_display_text, operational_text,
  avg_transport_text, material_flow_display_text, cad_info_text, wifi_info_text,
  charging_parking_text, special_info_text, job_to_do_text, data_flow_display_text,
  recommendation_text, xpl_recommendation, dasp_info) — labels appear only when
  the corresponding field has a value, enforcing the no-extra-data rule
- app.py: fixed pallet_width_mm=0 stored as "" to suppress "mm" suffix on blank
- app.py: added recommendation_text / xpl_recommendation / dasp_info context so
  product recommendations appear in the Word report (previously UI-only)
- template.docx: replaced 14 mixed-label cells with single smart {{ field }} refs,
  reducing Jinja2 variables from 59 to 36
- requirements.txt: removed unused packages (nicegui, plotly, PyPDF2, pandas,
  Pillow, streamlit-authenticator) and fixed malformed line with embedded \n chars
</commit_message>
<xml_diff>
--- a/template.docx
+++ b/template.docx
@@ -796,20 +796,10 @@
             <w:vAlign w:val="center"/>
           </w:tcPr>
           <w:p>
-            <w:r>
-              <w:t>Application(s): {{application}}</w:t>
-            </w:r>
-            <w:r>
-              <w:br/>
-              <w:t>Job-To-Do: {{</w:t>
-            </w:r>
             <w:proofErr w:type="spellStart"/>
-            <w:r>
-              <w:t>job_to_do</w:t>
-            </w:r>
             <w:proofErr w:type="spellEnd"/>
             <w:r>
-              <w:t>}}</w:t>
+              <w:t xml:space="preserve">{{ job_to_do_text|default('') }}</w:t>
             </w:r>
           </w:p>
         </w:tc>
@@ -2240,12 +2230,7 @@
               </w:rPr>
             </w:pPr>
             <w:r>
-              <w:rPr>
-                <w:rFonts w:ascii="Times New Roman" w:eastAsiaTheme="minorEastAsia" w:hAnsi="Times New Roman" w:cs="Times New Roman"/>
-                <w:sz w:val="26"/>
-                <w:szCs w:val="26"/>
-              </w:rPr>
-              <w:t>Pallet type/size: (with picture)</w:t>
+              <w:t xml:space="preserve">{{ pallet_display_text|default('') }}</w:t>
             </w:r>
           </w:p>
         </w:tc>
@@ -2267,193 +2252,22 @@
                 <w:szCs w:val="26"/>
               </w:rPr>
             </w:pPr>
-            <w:r>
-              <w:rPr>
-                <w:rFonts w:ascii="Times New Roman" w:hAnsi="Times New Roman" w:cs="Times New Roman"/>
-                <w:sz w:val="26"/>
-                <w:szCs w:val="26"/>
-              </w:rPr>
-              <w:t xml:space="preserve">Pallet type/size: {{ </w:t>
-            </w:r>
             <w:proofErr w:type="spellStart"/>
-            <w:r>
-              <w:rPr>
-                <w:rFonts w:ascii="Times New Roman" w:hAnsi="Times New Roman" w:cs="Times New Roman"/>
-                <w:sz w:val="26"/>
-                <w:szCs w:val="26"/>
-              </w:rPr>
-              <w:t>pallet_type|default</w:t>
-            </w:r>
             <w:proofErr w:type="spellEnd"/>
-            <w:r>
-              <w:rPr>
-                <w:rFonts w:ascii="Times New Roman" w:hAnsi="Times New Roman" w:cs="Times New Roman"/>
-                <w:sz w:val="26"/>
-                <w:szCs w:val="26"/>
-              </w:rPr>
-              <w:t>('') }}</w:t>
-            </w:r>
-            <w:r>
-              <w:rPr>
-                <w:rFonts w:ascii="Times New Roman" w:hAnsi="Times New Roman" w:cs="Times New Roman"/>
-                <w:sz w:val="26"/>
-                <w:szCs w:val="26"/>
-              </w:rPr>
-              <w:br/>
-              <w:t xml:space="preserve">Pallet width (fork entry): {{ </w:t>
-            </w:r>
             <w:proofErr w:type="spellStart"/>
-            <w:r>
-              <w:rPr>
-                <w:rFonts w:ascii="Times New Roman" w:hAnsi="Times New Roman" w:cs="Times New Roman"/>
-                <w:sz w:val="26"/>
-                <w:szCs w:val="26"/>
-              </w:rPr>
-              <w:t>pallet_width_mm|default</w:t>
-            </w:r>
             <w:proofErr w:type="spellEnd"/>
-            <w:r>
-              <w:rPr>
-                <w:rFonts w:ascii="Times New Roman" w:hAnsi="Times New Roman" w:cs="Times New Roman"/>
-                <w:sz w:val="26"/>
-                <w:szCs w:val="26"/>
-              </w:rPr>
-              <w:t>('') }} mm</w:t>
-            </w:r>
-            <w:r>
-              <w:rPr>
-                <w:rFonts w:ascii="Times New Roman" w:hAnsi="Times New Roman" w:cs="Times New Roman"/>
-                <w:sz w:val="26"/>
-                <w:szCs w:val="26"/>
-              </w:rPr>
-              <w:br/>
-              <w:t xml:space="preserve">If other pallet type: {{ </w:t>
-            </w:r>
             <w:proofErr w:type="spellStart"/>
-            <w:r>
-              <w:rPr>
-                <w:rFonts w:ascii="Times New Roman" w:hAnsi="Times New Roman" w:cs="Times New Roman"/>
-                <w:sz w:val="26"/>
-                <w:szCs w:val="26"/>
-              </w:rPr>
-              <w:t>other_pallet_type|default</w:t>
-            </w:r>
             <w:proofErr w:type="spellEnd"/>
-            <w:r>
-              <w:rPr>
-                <w:rFonts w:ascii="Times New Roman" w:hAnsi="Times New Roman" w:cs="Times New Roman"/>
-                <w:sz w:val="26"/>
-                <w:szCs w:val="26"/>
-              </w:rPr>
-              <w:t>('') }}</w:t>
-            </w:r>
-            <w:r>
-              <w:rPr>
-                <w:rFonts w:ascii="Times New Roman" w:hAnsi="Times New Roman" w:cs="Times New Roman"/>
-                <w:sz w:val="26"/>
-                <w:szCs w:val="26"/>
-              </w:rPr>
-              <w:br/>
-              <w:t>Load dimensions (</w:t>
-            </w:r>
             <w:proofErr w:type="spellStart"/>
-            <w:r>
-              <w:rPr>
-                <w:rFonts w:ascii="Times New Roman" w:hAnsi="Times New Roman" w:cs="Times New Roman"/>
-                <w:sz w:val="26"/>
-                <w:szCs w:val="26"/>
-              </w:rPr>
-              <w:t>LxWxH</w:t>
-            </w:r>
             <w:proofErr w:type="spellEnd"/>
-            <w:r>
-              <w:rPr>
-                <w:rFonts w:ascii="Times New Roman" w:hAnsi="Times New Roman" w:cs="Times New Roman"/>
-                <w:sz w:val="26"/>
-                <w:szCs w:val="26"/>
-              </w:rPr>
-              <w:t xml:space="preserve">): {{ </w:t>
-            </w:r>
             <w:proofErr w:type="spellStart"/>
-            <w:r>
-              <w:rPr>
-                <w:rFonts w:ascii="Times New Roman" w:hAnsi="Times New Roman" w:cs="Times New Roman"/>
-                <w:sz w:val="26"/>
-                <w:szCs w:val="26"/>
-              </w:rPr>
-              <w:t>load_dimensions|default</w:t>
-            </w:r>
             <w:proofErr w:type="spellEnd"/>
-            <w:r>
-              <w:rPr>
-                <w:rFonts w:ascii="Times New Roman" w:hAnsi="Times New Roman" w:cs="Times New Roman"/>
-                <w:sz w:val="26"/>
-                <w:szCs w:val="26"/>
-              </w:rPr>
-              <w:t>('') }}</w:t>
-            </w:r>
-            <w:r>
-              <w:rPr>
-                <w:rFonts w:ascii="Times New Roman" w:hAnsi="Times New Roman" w:cs="Times New Roman"/>
-                <w:sz w:val="26"/>
-                <w:szCs w:val="26"/>
-              </w:rPr>
-              <w:br/>
-              <w:t>All pallets summary:</w:t>
-            </w:r>
-            <w:r>
-              <w:rPr>
-                <w:rFonts w:ascii="Times New Roman" w:hAnsi="Times New Roman" w:cs="Times New Roman"/>
-                <w:sz w:val="26"/>
-                <w:szCs w:val="26"/>
-              </w:rPr>
-              <w:br/>
-              <w:t xml:space="preserve">{{ </w:t>
-            </w:r>
             <w:proofErr w:type="spellStart"/>
-            <w:r>
-              <w:rPr>
-                <w:rFonts w:ascii="Times New Roman" w:hAnsi="Times New Roman" w:cs="Times New Roman"/>
-                <w:sz w:val="26"/>
-                <w:szCs w:val="26"/>
-              </w:rPr>
-              <w:t>pallets_summary|default</w:t>
-            </w:r>
             <w:proofErr w:type="spellEnd"/>
-            <w:r>
-              <w:rPr>
-                <w:rFonts w:ascii="Times New Roman" w:hAnsi="Times New Roman" w:cs="Times New Roman"/>
-                <w:sz w:val="26"/>
-                <w:szCs w:val="26"/>
-              </w:rPr>
-              <w:t>('') }}</w:t>
-            </w:r>
-            <w:r>
-              <w:rPr>
-                <w:rFonts w:ascii="Times New Roman" w:hAnsi="Times New Roman" w:cs="Times New Roman"/>
-                <w:sz w:val="26"/>
-                <w:szCs w:val="26"/>
-              </w:rPr>
-              <w:br/>
-              <w:t xml:space="preserve">Other pallet can be picked by normal pallet truck: {{ </w:t>
-            </w:r>
             <w:proofErr w:type="spellStart"/>
-            <w:r>
-              <w:rPr>
-                <w:rFonts w:ascii="Times New Roman" w:hAnsi="Times New Roman" w:cs="Times New Roman"/>
-                <w:sz w:val="26"/>
-                <w:szCs w:val="26"/>
-              </w:rPr>
-              <w:t>other_pallet_pickable|default</w:t>
-            </w:r>
             <w:proofErr w:type="spellEnd"/>
             <w:r>
-              <w:rPr>
-                <w:rFonts w:ascii="Times New Roman" w:hAnsi="Times New Roman" w:cs="Times New Roman"/>
-                <w:sz w:val="26"/>
-                <w:szCs w:val="26"/>
-              </w:rPr>
-              <w:t>('') }}</w:t>
+              <w:t xml:space="preserve">{{ pallet_display_text|default('') }}</w:t>
             </w:r>
           </w:p>
         </w:tc>
@@ -2713,15 +2527,7 @@
           </w:tcPr>
           <w:p>
             <w:r>
-              <w:t>Operational peak hours: {{ peak_hours|default('') }}</w:t>
-            </w:r>
-            <w:r>
-              <w:br/>
-              <w:t>Shifts per day: {{ shifts_per_day|default('') }}</w:t>
-            </w:r>
-            <w:r>
-              <w:br/>
-              <w:t>Pallets per hour: {{ pallets_per_hour|default('') }}</w:t>
+              <w:t xml:space="preserve">{{ operational_text|default('') }}</w:t>
             </w:r>
           </w:p>
         </w:tc>
@@ -2828,22 +2634,7 @@
               </w:rPr>
             </w:pPr>
             <w:r>
-              <w:rPr>
-                <w:rFonts w:ascii="Times New Roman" w:hAnsi="Times New Roman" w:cs="Times New Roman"/>
-                <w:sz w:val="26"/>
-                <w:szCs w:val="26"/>
-                <w:lang w:val="nb-NO"/>
-              </w:rPr>
-              <w:br/>
-            </w:r>
-            <w:r>
-              <w:rPr>
-                <w:rFonts w:ascii="Times New Roman" w:hAnsi="Times New Roman" w:cs="Times New Roman"/>
-                <w:sz w:val="26"/>
-                <w:szCs w:val="26"/>
-                <w:lang w:val="nb-NO"/>
-              </w:rPr>
-              <w:t>{{ avg_transport_m|default('') }} m</w:t>
+              <w:t xml:space="preserve">{{ avg_transport_text|default('') }}</w:t>
             </w:r>
           </w:p>
         </w:tc>
@@ -2990,352 +2781,35 @@
               </w:rPr>
             </w:pPr>
             <w:proofErr w:type="spellStart"/>
-            <w:r>
-              <w:rPr>
-                <w:rFonts w:ascii="Times New Roman" w:hAnsi="Times New Roman" w:cs="Times New Roman"/>
-                <w:sz w:val="26"/>
-                <w:szCs w:val="26"/>
-                <w:lang w:val="fr-BE"/>
-              </w:rPr>
-              <w:t>Material</w:t>
-            </w:r>
             <w:proofErr w:type="spellEnd"/>
-            <w:r>
-              <w:rPr>
-                <w:rFonts w:ascii="Times New Roman" w:hAnsi="Times New Roman" w:cs="Times New Roman"/>
-                <w:sz w:val="26"/>
-                <w:szCs w:val="26"/>
-                <w:lang w:val="fr-BE"/>
-              </w:rPr>
-              <w:t xml:space="preserve"> flow </w:t>
-            </w:r>
             <w:proofErr w:type="spellStart"/>
-            <w:r>
-              <w:rPr>
-                <w:rFonts w:ascii="Times New Roman" w:hAnsi="Times New Roman" w:cs="Times New Roman"/>
-                <w:sz w:val="26"/>
-                <w:szCs w:val="26"/>
-                <w:lang w:val="fr-BE"/>
-              </w:rPr>
-              <w:t>sequence</w:t>
-            </w:r>
             <w:proofErr w:type="spellEnd"/>
-            <w:r>
-              <w:rPr>
-                <w:rFonts w:ascii="Times New Roman" w:hAnsi="Times New Roman" w:cs="Times New Roman"/>
-                <w:sz w:val="26"/>
-                <w:szCs w:val="26"/>
-                <w:lang w:val="fr-BE"/>
-              </w:rPr>
-              <w:t xml:space="preserve">: {{ </w:t>
-            </w:r>
             <w:proofErr w:type="spellStart"/>
-            <w:r>
-              <w:rPr>
-                <w:rFonts w:ascii="Times New Roman" w:hAnsi="Times New Roman" w:cs="Times New Roman"/>
-                <w:sz w:val="26"/>
-                <w:szCs w:val="26"/>
-                <w:lang w:val="fr-BE"/>
-              </w:rPr>
-              <w:t>flow_steps|default</w:t>
-            </w:r>
             <w:proofErr w:type="spellEnd"/>
-            <w:r>
-              <w:rPr>
-                <w:rFonts w:ascii="Times New Roman" w:hAnsi="Times New Roman" w:cs="Times New Roman"/>
-                <w:sz w:val="26"/>
-                <w:szCs w:val="26"/>
-                <w:lang w:val="fr-BE"/>
-              </w:rPr>
-              <w:t>('') }}</w:t>
-            </w:r>
-            <w:r>
-              <w:rPr>
-                <w:rFonts w:ascii="Times New Roman" w:hAnsi="Times New Roman" w:cs="Times New Roman"/>
-                <w:sz w:val="26"/>
-                <w:szCs w:val="26"/>
-                <w:lang w:val="fr-BE"/>
-              </w:rPr>
-              <w:br/>
-              <w:t xml:space="preserve">Route </w:t>
-            </w:r>
             <w:proofErr w:type="spellStart"/>
-            <w:r>
-              <w:rPr>
-                <w:rFonts w:ascii="Times New Roman" w:hAnsi="Times New Roman" w:cs="Times New Roman"/>
-                <w:sz w:val="26"/>
-                <w:szCs w:val="26"/>
-                <w:lang w:val="fr-BE"/>
-              </w:rPr>
-              <w:t>summary</w:t>
-            </w:r>
             <w:proofErr w:type="spellEnd"/>
-            <w:r>
-              <w:rPr>
-                <w:rFonts w:ascii="Times New Roman" w:hAnsi="Times New Roman" w:cs="Times New Roman"/>
-                <w:sz w:val="26"/>
-                <w:szCs w:val="26"/>
-                <w:lang w:val="fr-BE"/>
-              </w:rPr>
-              <w:t>:</w:t>
-            </w:r>
-            <w:r>
-              <w:rPr>
-                <w:rFonts w:ascii="Times New Roman" w:hAnsi="Times New Roman" w:cs="Times New Roman"/>
-                <w:sz w:val="26"/>
-                <w:szCs w:val="26"/>
-                <w:lang w:val="fr-BE"/>
-              </w:rPr>
-              <w:br/>
-              <w:t xml:space="preserve">{{ </w:t>
-            </w:r>
             <w:proofErr w:type="spellStart"/>
-            <w:r>
-              <w:rPr>
-                <w:rFonts w:ascii="Times New Roman" w:hAnsi="Times New Roman" w:cs="Times New Roman"/>
-                <w:sz w:val="26"/>
-                <w:szCs w:val="26"/>
-                <w:lang w:val="fr-BE"/>
-              </w:rPr>
-              <w:t>route_summary|default</w:t>
-            </w:r>
             <w:proofErr w:type="spellEnd"/>
-            <w:r>
-              <w:rPr>
-                <w:rFonts w:ascii="Times New Roman" w:hAnsi="Times New Roman" w:cs="Times New Roman"/>
-                <w:sz w:val="26"/>
-                <w:szCs w:val="26"/>
-                <w:lang w:val="fr-BE"/>
-              </w:rPr>
-              <w:t>('') }}</w:t>
-            </w:r>
-            <w:r>
-              <w:rPr>
-                <w:rFonts w:ascii="Times New Roman" w:hAnsi="Times New Roman" w:cs="Times New Roman"/>
-                <w:sz w:val="26"/>
-                <w:szCs w:val="26"/>
-                <w:lang w:val="fr-BE"/>
-              </w:rPr>
-              <w:br/>
-            </w:r>
             <w:proofErr w:type="spellStart"/>
-            <w:r>
-              <w:rPr>
-                <w:rFonts w:ascii="Times New Roman" w:hAnsi="Times New Roman" w:cs="Times New Roman"/>
-                <w:sz w:val="26"/>
-                <w:szCs w:val="26"/>
-                <w:lang w:val="fr-BE"/>
-              </w:rPr>
-              <w:t>Material</w:t>
-            </w:r>
             <w:proofErr w:type="spellEnd"/>
-            <w:r>
-              <w:rPr>
-                <w:rFonts w:ascii="Times New Roman" w:hAnsi="Times New Roman" w:cs="Times New Roman"/>
-                <w:sz w:val="26"/>
-                <w:szCs w:val="26"/>
-                <w:lang w:val="fr-BE"/>
-              </w:rPr>
-              <w:t xml:space="preserve"> flow </w:t>
-            </w:r>
             <w:proofErr w:type="spellStart"/>
-            <w:r>
-              <w:rPr>
-                <w:rFonts w:ascii="Times New Roman" w:hAnsi="Times New Roman" w:cs="Times New Roman"/>
-                <w:sz w:val="26"/>
-                <w:szCs w:val="26"/>
-                <w:lang w:val="fr-BE"/>
-              </w:rPr>
-              <w:t>details</w:t>
-            </w:r>
             <w:proofErr w:type="spellEnd"/>
-            <w:r>
-              <w:rPr>
-                <w:rFonts w:ascii="Times New Roman" w:hAnsi="Times New Roman" w:cs="Times New Roman"/>
-                <w:sz w:val="26"/>
-                <w:szCs w:val="26"/>
-                <w:lang w:val="fr-BE"/>
-              </w:rPr>
-              <w:t xml:space="preserve"> / </w:t>
-            </w:r>
             <w:proofErr w:type="spellStart"/>
-            <w:r>
-              <w:rPr>
-                <w:rFonts w:ascii="Times New Roman" w:hAnsi="Times New Roman" w:cs="Times New Roman"/>
-                <w:sz w:val="26"/>
-                <w:szCs w:val="26"/>
-                <w:lang w:val="fr-BE"/>
-              </w:rPr>
-              <w:t>summary</w:t>
-            </w:r>
             <w:proofErr w:type="spellEnd"/>
-            <w:r>
-              <w:rPr>
-                <w:rFonts w:ascii="Times New Roman" w:hAnsi="Times New Roman" w:cs="Times New Roman"/>
-                <w:sz w:val="26"/>
-                <w:szCs w:val="26"/>
-                <w:lang w:val="fr-BE"/>
-              </w:rPr>
-              <w:t xml:space="preserve">: {{ </w:t>
-            </w:r>
             <w:proofErr w:type="spellStart"/>
-            <w:r>
-              <w:rPr>
-                <w:rFonts w:ascii="Times New Roman" w:hAnsi="Times New Roman" w:cs="Times New Roman"/>
-                <w:sz w:val="26"/>
-                <w:szCs w:val="26"/>
-                <w:lang w:val="fr-BE"/>
-              </w:rPr>
-              <w:t>material_flow_text|default</w:t>
-            </w:r>
             <w:proofErr w:type="spellEnd"/>
-            <w:r>
-              <w:rPr>
-                <w:rFonts w:ascii="Times New Roman" w:hAnsi="Times New Roman" w:cs="Times New Roman"/>
-                <w:sz w:val="26"/>
-                <w:szCs w:val="26"/>
-                <w:lang w:val="fr-BE"/>
-              </w:rPr>
-              <w:t>('') }}</w:t>
-            </w:r>
-            <w:r>
-              <w:rPr>
-                <w:rFonts w:ascii="Times New Roman" w:hAnsi="Times New Roman" w:cs="Times New Roman"/>
-                <w:sz w:val="26"/>
-                <w:szCs w:val="26"/>
-                <w:lang w:val="fr-BE"/>
-              </w:rPr>
-              <w:br/>
-            </w:r>
             <w:proofErr w:type="spellStart"/>
-            <w:r>
-              <w:rPr>
-                <w:rFonts w:ascii="Times New Roman" w:hAnsi="Times New Roman" w:cs="Times New Roman"/>
-                <w:sz w:val="26"/>
-                <w:szCs w:val="26"/>
-                <w:lang w:val="fr-BE"/>
-              </w:rPr>
-              <w:t>Detailed</w:t>
-            </w:r>
             <w:proofErr w:type="spellEnd"/>
-            <w:r>
-              <w:rPr>
-                <w:rFonts w:ascii="Times New Roman" w:hAnsi="Times New Roman" w:cs="Times New Roman"/>
-                <w:sz w:val="26"/>
-                <w:szCs w:val="26"/>
-                <w:lang w:val="fr-BE"/>
-              </w:rPr>
-              <w:t xml:space="preserve"> </w:t>
-            </w:r>
             <w:proofErr w:type="spellStart"/>
-            <w:r>
-              <w:rPr>
-                <w:rFonts w:ascii="Times New Roman" w:hAnsi="Times New Roman" w:cs="Times New Roman"/>
-                <w:sz w:val="26"/>
-                <w:szCs w:val="26"/>
-                <w:lang w:val="fr-BE"/>
-              </w:rPr>
-              <w:t>step</w:t>
-            </w:r>
             <w:proofErr w:type="spellEnd"/>
-            <w:r>
-              <w:rPr>
-                <w:rFonts w:ascii="Times New Roman" w:hAnsi="Times New Roman" w:cs="Times New Roman"/>
-                <w:sz w:val="26"/>
-                <w:szCs w:val="26"/>
-                <w:lang w:val="fr-BE"/>
-              </w:rPr>
-              <w:t xml:space="preserve"> notes:</w:t>
-            </w:r>
-            <w:r>
-              <w:rPr>
-                <w:rFonts w:ascii="Times New Roman" w:hAnsi="Times New Roman" w:cs="Times New Roman"/>
-                <w:sz w:val="26"/>
-                <w:szCs w:val="26"/>
-                <w:lang w:val="fr-BE"/>
-              </w:rPr>
-              <w:br/>
-              <w:t xml:space="preserve">{{ </w:t>
-            </w:r>
             <w:proofErr w:type="spellStart"/>
-            <w:r>
-              <w:rPr>
-                <w:rFonts w:ascii="Times New Roman" w:hAnsi="Times New Roman" w:cs="Times New Roman"/>
-                <w:sz w:val="26"/>
-                <w:szCs w:val="26"/>
-                <w:lang w:val="fr-BE"/>
-              </w:rPr>
-              <w:t>material_step_details_text|default</w:t>
-            </w:r>
             <w:proofErr w:type="spellEnd"/>
-            <w:r>
-              <w:rPr>
-                <w:rFonts w:ascii="Times New Roman" w:hAnsi="Times New Roman" w:cs="Times New Roman"/>
-                <w:sz w:val="26"/>
-                <w:szCs w:val="26"/>
-                <w:lang w:val="fr-BE"/>
-              </w:rPr>
-              <w:t>('') }}</w:t>
-            </w:r>
-            <w:r>
-              <w:rPr>
-                <w:rFonts w:ascii="Times New Roman" w:hAnsi="Times New Roman" w:cs="Times New Roman"/>
-                <w:sz w:val="26"/>
-                <w:szCs w:val="26"/>
-                <w:lang w:val="fr-BE"/>
-              </w:rPr>
-              <w:br/>
-              <w:t xml:space="preserve">Special </w:t>
-            </w:r>
             <w:proofErr w:type="spellStart"/>
-            <w:r>
-              <w:rPr>
-                <w:rFonts w:ascii="Times New Roman" w:hAnsi="Times New Roman" w:cs="Times New Roman"/>
-                <w:sz w:val="26"/>
-                <w:szCs w:val="26"/>
-                <w:lang w:val="fr-BE"/>
-              </w:rPr>
-              <w:t>comments</w:t>
-            </w:r>
             <w:proofErr w:type="spellEnd"/>
-            <w:r>
-              <w:rPr>
-                <w:rFonts w:ascii="Times New Roman" w:hAnsi="Times New Roman" w:cs="Times New Roman"/>
-                <w:sz w:val="26"/>
-                <w:szCs w:val="26"/>
-                <w:lang w:val="fr-BE"/>
-              </w:rPr>
-              <w:t xml:space="preserve"> / direct flows / notes:</w:t>
-            </w:r>
-            <w:r>
-              <w:rPr>
-                <w:rFonts w:ascii="Times New Roman" w:hAnsi="Times New Roman" w:cs="Times New Roman"/>
-                <w:sz w:val="26"/>
-                <w:szCs w:val="26"/>
-                <w:lang w:val="fr-BE"/>
-              </w:rPr>
-              <w:br/>
-              <w:t xml:space="preserve">{{ </w:t>
-            </w:r>
             <w:proofErr w:type="spellStart"/>
-            <w:r>
-              <w:rPr>
-                <w:rFonts w:ascii="Times New Roman" w:hAnsi="Times New Roman" w:cs="Times New Roman"/>
-                <w:sz w:val="26"/>
-                <w:szCs w:val="26"/>
-                <w:lang w:val="fr-BE"/>
-              </w:rPr>
-              <w:t>special_comments|default</w:t>
-            </w:r>
             <w:proofErr w:type="spellEnd"/>
             <w:r>
-              <w:rPr>
-                <w:rFonts w:ascii="Times New Roman" w:hAnsi="Times New Roman" w:cs="Times New Roman"/>
-                <w:sz w:val="26"/>
-                <w:szCs w:val="26"/>
-                <w:lang w:val="fr-BE"/>
-              </w:rPr>
-              <w:t>('') }}</w:t>
+              <w:t xml:space="preserve">{{ material_flow_display_text|default('') }}</w:t>
             </w:r>
           </w:p>
         </w:tc>
@@ -3455,40 +2929,10 @@
                 <w:szCs w:val="26"/>
               </w:rPr>
             </w:pPr>
-            <w:r>
-              <w:rPr>
-                <w:rFonts w:ascii="Times New Roman" w:hAnsi="Times New Roman" w:cs="Times New Roman"/>
-                <w:sz w:val="26"/>
-                <w:szCs w:val="26"/>
-              </w:rPr>
-              <w:t>[Insert logistics roadmap / material flow diagram(s) here]</w:t>
-            </w:r>
-            <w:r>
-              <w:rPr>
-                <w:rFonts w:ascii="Times New Roman" w:hAnsi="Times New Roman" w:cs="Times New Roman"/>
-                <w:sz w:val="26"/>
-                <w:szCs w:val="26"/>
-              </w:rPr>
-              <w:br/>
-              <w:t xml:space="preserve">See attached CAD / layout file: {{ </w:t>
-            </w:r>
             <w:proofErr w:type="spellStart"/>
-            <w:r>
-              <w:rPr>
-                <w:rFonts w:ascii="Times New Roman" w:hAnsi="Times New Roman" w:cs="Times New Roman"/>
-                <w:sz w:val="26"/>
-                <w:szCs w:val="26"/>
-              </w:rPr>
-              <w:t>cad_filename|default</w:t>
-            </w:r>
             <w:proofErr w:type="spellEnd"/>
             <w:r>
-              <w:rPr>
-                <w:rFonts w:ascii="Times New Roman" w:hAnsi="Times New Roman" w:cs="Times New Roman"/>
-                <w:sz w:val="26"/>
-                <w:szCs w:val="26"/>
-              </w:rPr>
-              <w:t>('') }}</w:t>
+              <w:t xml:space="preserve">{{ cad_info_text|default('') }}</w:t>
             </w:r>
           </w:p>
         </w:tc>
@@ -3762,67 +3206,14 @@
                 <w:lang w:val="en-BE"/>
               </w:rPr>
             </w:pPr>
-            <w:r>
-              <w:rPr>
-                <w:lang w:val="en-BE"/>
-              </w:rPr>
-              <w:t xml:space="preserve">Site Wi-Fi available: {{ </w:t>
-            </w:r>
             <w:proofErr w:type="spellStart"/>
-            <w:r>
-              <w:rPr>
-                <w:lang w:val="en-BE"/>
-              </w:rPr>
-              <w:t>site_wifi_available|default</w:t>
-            </w:r>
             <w:proofErr w:type="spellEnd"/>
-            <w:r>
-              <w:rPr>
-                <w:lang w:val="en-BE"/>
-              </w:rPr>
-              <w:t>('') }}</w:t>
-            </w:r>
-            <w:r>
-              <w:rPr>
-                <w:lang w:val="en-BE"/>
-              </w:rPr>
-              <w:br/>
-              <w:t xml:space="preserve">Network status: {{ </w:t>
-            </w:r>
             <w:proofErr w:type="spellStart"/>
-            <w:r>
-              <w:rPr>
-                <w:lang w:val="en-BE"/>
-              </w:rPr>
-              <w:t>network_status|default</w:t>
-            </w:r>
             <w:proofErr w:type="spellEnd"/>
-            <w:r>
-              <w:rPr>
-                <w:lang w:val="en-BE"/>
-              </w:rPr>
-              <w:t>('') }}</w:t>
-            </w:r>
-            <w:r>
-              <w:rPr>
-                <w:lang w:val="en-BE"/>
-              </w:rPr>
-              <w:br/>
-              <w:t xml:space="preserve">Coverage details: {{ </w:t>
-            </w:r>
             <w:proofErr w:type="spellStart"/>
-            <w:r>
-              <w:rPr>
-                <w:lang w:val="en-BE"/>
-              </w:rPr>
-              <w:t>network_coverage|default</w:t>
-            </w:r>
             <w:proofErr w:type="spellEnd"/>
             <w:r>
-              <w:rPr>
-                <w:lang w:val="en-BE"/>
-              </w:rPr>
-              <w:t>('') }}</w:t>
+              <w:t xml:space="preserve">{{ wifi_info_text|default('') }}</w:t>
             </w:r>
           </w:p>
         </w:tc>
@@ -4407,67 +3798,12 @@
                 <w:szCs w:val="26"/>
               </w:rPr>
             </w:pPr>
-            <w:r>
-              <w:rPr>
-                <w:rFonts w:ascii="Times New Roman" w:hAnsi="Times New Roman" w:cs="Times New Roman"/>
-                <w:sz w:val="26"/>
-                <w:szCs w:val="26"/>
-              </w:rPr>
-              <w:lastRenderedPageBreak/>
-              <w:t xml:space="preserve">Charging status: {{ </w:t>
-            </w:r>
             <w:proofErr w:type="spellStart"/>
-            <w:r>
-              <w:rPr>
-                <w:rFonts w:ascii="Times New Roman" w:hAnsi="Times New Roman" w:cs="Times New Roman"/>
-                <w:sz w:val="26"/>
-                <w:szCs w:val="26"/>
-              </w:rPr>
-              <w:t>charging_status|default</w:t>
-            </w:r>
             <w:proofErr w:type="spellEnd"/>
-            <w:r>
-              <w:rPr>
-                <w:rFonts w:ascii="Times New Roman" w:hAnsi="Times New Roman" w:cs="Times New Roman"/>
-                <w:sz w:val="26"/>
-                <w:szCs w:val="26"/>
-              </w:rPr>
-              <w:t>('') }}</w:t>
-            </w:r>
-            <w:r>
-              <w:rPr>
-                <w:rFonts w:ascii="Times New Roman" w:hAnsi="Times New Roman" w:cs="Times New Roman"/>
-                <w:sz w:val="26"/>
-                <w:szCs w:val="26"/>
-              </w:rPr>
-              <w:br/>
-              <w:t xml:space="preserve">Parking area: {{ </w:t>
-            </w:r>
             <w:proofErr w:type="spellStart"/>
-            <w:r>
-              <w:rPr>
-                <w:rFonts w:ascii="Times New Roman" w:hAnsi="Times New Roman" w:cs="Times New Roman"/>
-                <w:sz w:val="26"/>
-                <w:szCs w:val="26"/>
-              </w:rPr>
-              <w:t>parking_area|default</w:t>
-            </w:r>
             <w:proofErr w:type="spellEnd"/>
             <w:r>
-              <w:rPr>
-                <w:rFonts w:ascii="Times New Roman" w:hAnsi="Times New Roman" w:cs="Times New Roman"/>
-                <w:sz w:val="26"/>
-                <w:szCs w:val="26"/>
-              </w:rPr>
-              <w:t>('') }}</w:t>
-            </w:r>
-            <w:r>
-              <w:rPr>
-                <w:rFonts w:ascii="Times New Roman" w:hAnsi="Times New Roman" w:cs="Times New Roman"/>
-                <w:sz w:val="26"/>
-                <w:szCs w:val="26"/>
-              </w:rPr>
-              <w:t xml:space="preserve">Charging </w:t>
+              <w:t xml:space="preserve">{{ charging_parking_text|default('') }}</w:t>
             </w:r>
           </w:p>
         </w:tc>
@@ -4588,57 +3924,10 @@
               <w:spacing w:line="240" w:lineRule="auto"/>
               <w:jc w:val="left"/>
             </w:pPr>
-            <w:r>
-              <w:t>Special Comments / Notes:</w:t>
-            </w:r>
-            <w:r>
-              <w:br/>
-              <w:t>{{</w:t>
-            </w:r>
             <w:proofErr w:type="spellStart"/>
-            <w:r>
-              <w:t>special_comments</w:t>
-            </w:r>
             <w:proofErr w:type="spellEnd"/>
             <w:r>
-              <w:t>}}</w:t>
-            </w:r>
-          </w:p>
-          <w:p>
-            <w:pPr>
-              <w:spacing w:line="240" w:lineRule="auto"/>
-              <w:jc w:val="left"/>
-              <w:rPr>
-                <w:rFonts w:ascii="Times New Roman" w:eastAsiaTheme="minorEastAsia" w:hAnsi="Times New Roman" w:cs="Times New Roman"/>
-                <w:sz w:val="26"/>
-                <w:szCs w:val="26"/>
-              </w:rPr>
-            </w:pPr>
-            <w:r>
-              <w:rPr>
-                <w:rFonts w:ascii="Times New Roman" w:eastAsiaTheme="minorEastAsia" w:hAnsi="Times New Roman" w:cs="Times New Roman"/>
-                <w:sz w:val="26"/>
-                <w:szCs w:val="26"/>
-              </w:rPr>
-              <w:t xml:space="preserve">{{ </w:t>
-            </w:r>
-            <w:proofErr w:type="spellStart"/>
-            <w:r>
-              <w:rPr>
-                <w:rFonts w:ascii="Times New Roman" w:eastAsiaTheme="minorEastAsia" w:hAnsi="Times New Roman" w:cs="Times New Roman"/>
-                <w:sz w:val="26"/>
-                <w:szCs w:val="26"/>
-              </w:rPr>
-              <w:t>special_demand|default</w:t>
-            </w:r>
-            <w:proofErr w:type="spellEnd"/>
-            <w:r>
-              <w:rPr>
-                <w:rFonts w:ascii="Times New Roman" w:eastAsiaTheme="minorEastAsia" w:hAnsi="Times New Roman" w:cs="Times New Roman"/>
-                <w:sz w:val="26"/>
-                <w:szCs w:val="26"/>
-              </w:rPr>
-              <w:t>('') }}</w:t>
+              <w:t xml:space="preserve">{{ special_info_text|default('') }}</w:t>
             </w:r>
           </w:p>
         </w:tc>
@@ -4768,392 +4057,26 @@
                 <w:szCs w:val="26"/>
               </w:rPr>
             </w:pPr>
-            <w:r>
-              <w:rPr>
-                <w:rFonts w:ascii="Times New Roman" w:hAnsi="Times New Roman" w:cs="Times New Roman"/>
-                <w:sz w:val="26"/>
-                <w:szCs w:val="26"/>
-              </w:rPr>
-              <w:t>System architecture:</w:t>
-            </w:r>
-            <w:r>
-              <w:rPr>
-                <w:rFonts w:ascii="Times New Roman" w:hAnsi="Times New Roman" w:cs="Times New Roman"/>
-                <w:sz w:val="26"/>
-                <w:szCs w:val="26"/>
-              </w:rPr>
-              <w:br/>
-              <w:t xml:space="preserve">{{ </w:t>
-            </w:r>
             <w:proofErr w:type="spellStart"/>
-            <w:r>
-              <w:rPr>
-                <w:rFonts w:ascii="Times New Roman" w:hAnsi="Times New Roman" w:cs="Times New Roman"/>
-                <w:sz w:val="26"/>
-                <w:szCs w:val="26"/>
-              </w:rPr>
-              <w:t>system_architecture_text|default</w:t>
-            </w:r>
             <w:proofErr w:type="spellEnd"/>
-            <w:r>
-              <w:rPr>
-                <w:rFonts w:ascii="Times New Roman" w:hAnsi="Times New Roman" w:cs="Times New Roman"/>
-                <w:sz w:val="26"/>
-                <w:szCs w:val="26"/>
-              </w:rPr>
-              <w:t>('') }}</w:t>
-            </w:r>
-            <w:r>
-              <w:rPr>
-                <w:rFonts w:ascii="Times New Roman" w:hAnsi="Times New Roman" w:cs="Times New Roman"/>
-                <w:sz w:val="26"/>
-                <w:szCs w:val="26"/>
-              </w:rPr>
-              <w:br/>
-            </w:r>
-            <w:r>
-              <w:rPr>
-                <w:rFonts w:ascii="Times New Roman" w:hAnsi="Times New Roman" w:cs="Times New Roman"/>
-                <w:sz w:val="26"/>
-                <w:szCs w:val="26"/>
-              </w:rPr>
-              <w:br/>
-              <w:t>Overall integration route:</w:t>
-            </w:r>
-            <w:r>
-              <w:rPr>
-                <w:rFonts w:ascii="Times New Roman" w:hAnsi="Times New Roman" w:cs="Times New Roman"/>
-                <w:sz w:val="26"/>
-                <w:szCs w:val="26"/>
-              </w:rPr>
-              <w:br/>
-              <w:t xml:space="preserve">{{ </w:t>
-            </w:r>
             <w:proofErr w:type="spellStart"/>
-            <w:r>
-              <w:rPr>
-                <w:rFonts w:ascii="Times New Roman" w:hAnsi="Times New Roman" w:cs="Times New Roman"/>
-                <w:sz w:val="26"/>
-                <w:szCs w:val="26"/>
-              </w:rPr>
-              <w:t>integration_route_text|default</w:t>
-            </w:r>
             <w:proofErr w:type="spellEnd"/>
-            <w:r>
-              <w:rPr>
-                <w:rFonts w:ascii="Times New Roman" w:hAnsi="Times New Roman" w:cs="Times New Roman"/>
-                <w:sz w:val="26"/>
-                <w:szCs w:val="26"/>
-              </w:rPr>
-              <w:t>('') }}</w:t>
-            </w:r>
-            <w:r>
-              <w:rPr>
-                <w:rFonts w:ascii="Times New Roman" w:hAnsi="Times New Roman" w:cs="Times New Roman"/>
-                <w:sz w:val="26"/>
-                <w:szCs w:val="26"/>
-              </w:rPr>
-              <w:br/>
-            </w:r>
-            <w:r>
-              <w:rPr>
-                <w:rFonts w:ascii="Times New Roman" w:hAnsi="Times New Roman" w:cs="Times New Roman"/>
-                <w:sz w:val="26"/>
-                <w:szCs w:val="26"/>
-              </w:rPr>
-              <w:br/>
-              <w:t>System flow diagram / path:</w:t>
-            </w:r>
-            <w:r>
-              <w:rPr>
-                <w:rFonts w:ascii="Times New Roman" w:hAnsi="Times New Roman" w:cs="Times New Roman"/>
-                <w:sz w:val="26"/>
-                <w:szCs w:val="26"/>
-              </w:rPr>
-              <w:br/>
-              <w:t xml:space="preserve">{{ </w:t>
-            </w:r>
             <w:proofErr w:type="spellStart"/>
-            <w:r>
-              <w:rPr>
-                <w:rFonts w:ascii="Times New Roman" w:hAnsi="Times New Roman" w:cs="Times New Roman"/>
-                <w:sz w:val="26"/>
-                <w:szCs w:val="26"/>
-              </w:rPr>
-              <w:t>data_flow_diagram_text|default</w:t>
-            </w:r>
             <w:proofErr w:type="spellEnd"/>
-            <w:r>
-              <w:rPr>
-                <w:rFonts w:ascii="Times New Roman" w:hAnsi="Times New Roman" w:cs="Times New Roman"/>
-                <w:sz w:val="26"/>
-                <w:szCs w:val="26"/>
-              </w:rPr>
-              <w:t>('') }}</w:t>
-            </w:r>
-            <w:r>
-              <w:rPr>
-                <w:rFonts w:ascii="Times New Roman" w:hAnsi="Times New Roman" w:cs="Times New Roman"/>
-                <w:sz w:val="26"/>
-                <w:szCs w:val="26"/>
-              </w:rPr>
-              <w:br/>
-            </w:r>
-            <w:r>
-              <w:rPr>
-                <w:rFonts w:ascii="Times New Roman" w:hAnsi="Times New Roman" w:cs="Times New Roman"/>
-                <w:sz w:val="26"/>
-                <w:szCs w:val="26"/>
-              </w:rPr>
-              <w:br/>
-              <w:t>Task flow by process:</w:t>
-            </w:r>
-            <w:r>
-              <w:rPr>
-                <w:rFonts w:ascii="Times New Roman" w:hAnsi="Times New Roman" w:cs="Times New Roman"/>
-                <w:sz w:val="26"/>
-                <w:szCs w:val="26"/>
-              </w:rPr>
-              <w:br/>
-              <w:t xml:space="preserve">{{ </w:t>
-            </w:r>
             <w:proofErr w:type="spellStart"/>
-            <w:r>
-              <w:rPr>
-                <w:rFonts w:ascii="Times New Roman" w:hAnsi="Times New Roman" w:cs="Times New Roman"/>
-                <w:sz w:val="26"/>
-                <w:szCs w:val="26"/>
-              </w:rPr>
-              <w:t>task_flow_text|default</w:t>
-            </w:r>
             <w:proofErr w:type="spellEnd"/>
-            <w:r>
-              <w:rPr>
-                <w:rFonts w:ascii="Times New Roman" w:hAnsi="Times New Roman" w:cs="Times New Roman"/>
-                <w:sz w:val="26"/>
-                <w:szCs w:val="26"/>
-              </w:rPr>
-              <w:t>('') }}</w:t>
-            </w:r>
-            <w:r>
-              <w:rPr>
-                <w:rFonts w:ascii="Times New Roman" w:hAnsi="Times New Roman" w:cs="Times New Roman"/>
-                <w:sz w:val="26"/>
-                <w:szCs w:val="26"/>
-              </w:rPr>
-              <w:br/>
-            </w:r>
-            <w:r>
-              <w:rPr>
-                <w:rFonts w:ascii="Times New Roman" w:hAnsi="Times New Roman" w:cs="Times New Roman"/>
-                <w:sz w:val="26"/>
-                <w:szCs w:val="26"/>
-              </w:rPr>
-              <w:br/>
-              <w:t>Connected systems:</w:t>
-            </w:r>
-            <w:r>
-              <w:rPr>
-                <w:rFonts w:ascii="Times New Roman" w:hAnsi="Times New Roman" w:cs="Times New Roman"/>
-                <w:sz w:val="26"/>
-                <w:szCs w:val="26"/>
-              </w:rPr>
-              <w:br/>
-              <w:t xml:space="preserve">{{ </w:t>
-            </w:r>
             <w:proofErr w:type="spellStart"/>
-            <w:r>
-              <w:rPr>
-                <w:rFonts w:ascii="Times New Roman" w:hAnsi="Times New Roman" w:cs="Times New Roman"/>
-                <w:sz w:val="26"/>
-                <w:szCs w:val="26"/>
-              </w:rPr>
-              <w:t>connected_systems_text|default</w:t>
-            </w:r>
             <w:proofErr w:type="spellEnd"/>
-            <w:r>
-              <w:rPr>
-                <w:rFonts w:ascii="Times New Roman" w:hAnsi="Times New Roman" w:cs="Times New Roman"/>
-                <w:sz w:val="26"/>
-                <w:szCs w:val="26"/>
-              </w:rPr>
-              <w:t>('') }}</w:t>
-            </w:r>
-            <w:r>
-              <w:rPr>
-                <w:rFonts w:ascii="Times New Roman" w:hAnsi="Times New Roman" w:cs="Times New Roman"/>
-                <w:sz w:val="26"/>
-                <w:szCs w:val="26"/>
-              </w:rPr>
-              <w:br/>
-            </w:r>
-            <w:r>
-              <w:rPr>
-                <w:rFonts w:ascii="Times New Roman" w:hAnsi="Times New Roman" w:cs="Times New Roman"/>
-                <w:sz w:val="26"/>
-                <w:szCs w:val="26"/>
-              </w:rPr>
-              <w:br/>
-              <w:t>Status feedback returned by EP:</w:t>
-            </w:r>
-            <w:r>
-              <w:rPr>
-                <w:rFonts w:ascii="Times New Roman" w:hAnsi="Times New Roman" w:cs="Times New Roman"/>
-                <w:sz w:val="26"/>
-                <w:szCs w:val="26"/>
-              </w:rPr>
-              <w:br/>
-              <w:t xml:space="preserve">{{ </w:t>
-            </w:r>
             <w:proofErr w:type="spellStart"/>
-            <w:r>
-              <w:rPr>
-                <w:rFonts w:ascii="Times New Roman" w:hAnsi="Times New Roman" w:cs="Times New Roman"/>
-                <w:sz w:val="26"/>
-                <w:szCs w:val="26"/>
-              </w:rPr>
-              <w:t>status_feedback_text|default</w:t>
-            </w:r>
             <w:proofErr w:type="spellEnd"/>
-            <w:r>
-              <w:rPr>
-                <w:rFonts w:ascii="Times New Roman" w:hAnsi="Times New Roman" w:cs="Times New Roman"/>
-                <w:sz w:val="26"/>
-                <w:szCs w:val="26"/>
-              </w:rPr>
-              <w:t>('') }}</w:t>
-            </w:r>
-            <w:r>
-              <w:rPr>
-                <w:rFonts w:ascii="Times New Roman" w:hAnsi="Times New Roman" w:cs="Times New Roman"/>
-                <w:sz w:val="26"/>
-                <w:szCs w:val="26"/>
-              </w:rPr>
-              <w:br/>
-            </w:r>
-            <w:r>
-              <w:rPr>
-                <w:rFonts w:ascii="Times New Roman" w:hAnsi="Times New Roman" w:cs="Times New Roman"/>
-                <w:sz w:val="26"/>
-                <w:szCs w:val="26"/>
-              </w:rPr>
-              <w:br/>
-              <w:t>Key data exchanged:</w:t>
-            </w:r>
-            <w:r>
-              <w:rPr>
-                <w:rFonts w:ascii="Times New Roman" w:hAnsi="Times New Roman" w:cs="Times New Roman"/>
-                <w:sz w:val="26"/>
-                <w:szCs w:val="26"/>
-              </w:rPr>
-              <w:br/>
-              <w:t xml:space="preserve">{{ </w:t>
-            </w:r>
             <w:proofErr w:type="spellStart"/>
-            <w:r>
-              <w:rPr>
-                <w:rFonts w:ascii="Times New Roman" w:hAnsi="Times New Roman" w:cs="Times New Roman"/>
-                <w:sz w:val="26"/>
-                <w:szCs w:val="26"/>
-              </w:rPr>
-              <w:t>key_data_exchange_text|default</w:t>
-            </w:r>
             <w:proofErr w:type="spellEnd"/>
-            <w:r>
-              <w:rPr>
-                <w:rFonts w:ascii="Times New Roman" w:hAnsi="Times New Roman" w:cs="Times New Roman"/>
-                <w:sz w:val="26"/>
-                <w:szCs w:val="26"/>
-              </w:rPr>
-              <w:t>('') }}</w:t>
-            </w:r>
-            <w:r>
-              <w:rPr>
-                <w:rFonts w:ascii="Times New Roman" w:hAnsi="Times New Roman" w:cs="Times New Roman"/>
-                <w:sz w:val="26"/>
-                <w:szCs w:val="26"/>
-              </w:rPr>
-              <w:br/>
-            </w:r>
-            <w:r>
-              <w:rPr>
-                <w:rFonts w:ascii="Times New Roman" w:hAnsi="Times New Roman" w:cs="Times New Roman"/>
-                <w:sz w:val="26"/>
-                <w:szCs w:val="26"/>
-              </w:rPr>
-              <w:br/>
-              <w:t>Connection / interface details:</w:t>
-            </w:r>
-            <w:r>
-              <w:rPr>
-                <w:rFonts w:ascii="Times New Roman" w:hAnsi="Times New Roman" w:cs="Times New Roman"/>
-                <w:sz w:val="26"/>
-                <w:szCs w:val="26"/>
-              </w:rPr>
-              <w:br/>
-              <w:t xml:space="preserve">{{ </w:t>
-            </w:r>
             <w:proofErr w:type="spellStart"/>
-            <w:r>
-              <w:rPr>
-                <w:rFonts w:ascii="Times New Roman" w:hAnsi="Times New Roman" w:cs="Times New Roman"/>
-                <w:sz w:val="26"/>
-                <w:szCs w:val="26"/>
-              </w:rPr>
-              <w:t>connections_details|default</w:t>
-            </w:r>
             <w:proofErr w:type="spellEnd"/>
-            <w:r>
-              <w:rPr>
-                <w:rFonts w:ascii="Times New Roman" w:hAnsi="Times New Roman" w:cs="Times New Roman"/>
-                <w:sz w:val="26"/>
-                <w:szCs w:val="26"/>
-              </w:rPr>
-              <w:t>('') }}</w:t>
-            </w:r>
-            <w:r>
-              <w:rPr>
-                <w:rFonts w:ascii="Times New Roman" w:hAnsi="Times New Roman" w:cs="Times New Roman"/>
-                <w:sz w:val="26"/>
-                <w:szCs w:val="26"/>
-              </w:rPr>
-              <w:br/>
-            </w:r>
-            <w:r>
-              <w:rPr>
-                <w:rFonts w:ascii="Times New Roman" w:hAnsi="Times New Roman" w:cs="Times New Roman"/>
-                <w:sz w:val="26"/>
-                <w:szCs w:val="26"/>
-              </w:rPr>
-              <w:br/>
-              <w:t>Additional notes:</w:t>
-            </w:r>
-            <w:r>
-              <w:rPr>
-                <w:rFonts w:ascii="Times New Roman" w:hAnsi="Times New Roman" w:cs="Times New Roman"/>
-                <w:sz w:val="26"/>
-                <w:szCs w:val="26"/>
-              </w:rPr>
-              <w:br/>
-              <w:t xml:space="preserve">{{ </w:t>
-            </w:r>
             <w:proofErr w:type="spellStart"/>
-            <w:r>
-              <w:rPr>
-                <w:rFonts w:ascii="Times New Roman" w:hAnsi="Times New Roman" w:cs="Times New Roman"/>
-                <w:sz w:val="26"/>
-                <w:szCs w:val="26"/>
-              </w:rPr>
-              <w:t>data_flow_additional_notes|default</w:t>
-            </w:r>
             <w:proofErr w:type="spellEnd"/>
             <w:r>
-              <w:rPr>
-                <w:rFonts w:ascii="Times New Roman" w:hAnsi="Times New Roman" w:cs="Times New Roman"/>
-                <w:sz w:val="26"/>
-                <w:szCs w:val="26"/>
-              </w:rPr>
-              <w:t>('') }}</w:t>
+              <w:t xml:space="preserve">{{ data_flow_display_text|default('') }}</w:t>
             </w:r>
           </w:p>
         </w:tc>
@@ -5650,21 +4573,7 @@
               </w:rPr>
             </w:pPr>
             <w:r>
-              <w:rPr>
-                <w:rFonts w:ascii="Times New Roman" w:eastAsiaTheme="minorEastAsia" w:hAnsi="Times New Roman" w:cs="Times New Roman"/>
-                <w:sz w:val="22"/>
-                <w:szCs w:val="22"/>
-              </w:rPr>
-              <w:t xml:space="preserve">Truck type </w:t>
-            </w:r>
-            <w:r>
-              <w:rPr>
-                <w:rFonts w:ascii="Times New Roman" w:eastAsiaTheme="minorEastAsia" w:hAnsi="Times New Roman" w:cs="Times New Roman"/>
-                <w:sz w:val="22"/>
-                <w:szCs w:val="22"/>
-              </w:rPr>
-              <w:lastRenderedPageBreak/>
-              <w:t>depending on delivery time and EP technical preference</w:t>
+              <w:t xml:space="preserve">{{ recommendation_text|default('') }}</w:t>
             </w:r>
           </w:p>
         </w:tc>
@@ -5772,6 +4681,9 @@
                 <w:szCs w:val="22"/>
               </w:rPr>
             </w:pPr>
+            <w:r>
+              <w:t xml:space="preserve">{{ xpl_recommendation|default('') }}</w:t>
+            </w:r>
           </w:p>
         </w:tc>
         <w:tc>
@@ -5879,6 +4791,9 @@
                 <w:szCs w:val="22"/>
               </w:rPr>
             </w:pPr>
+            <w:r>
+              <w:t xml:space="preserve">{{ dasp_info|default('') }}</w:t>
+            </w:r>
           </w:p>
         </w:tc>
         <w:tc>

</xml_diff>